<commit_message>
Se añadieron los registros del 19/9/26 a la bitacora
</commit_message>
<xml_diff>
--- a/documentacion/Documentación Externa (Not final).docx
+++ b/documentacion/Documentación Externa (Not final).docx
@@ -2162,15 +2162,126 @@
               <w:jc w:val="center"/>
               <w:rPr>
                 <w:rFonts w:ascii="Times New Roman" w:hAnsi="Times New Roman" w:cs="Times New Roman"/>
-                <w:sz w:val="28"/>
-                <w:szCs w:val="28"/>
               </w:rPr>
             </w:pPr>
             <w:r>
               <w:rPr>
                 <w:rFonts w:ascii="Times New Roman" w:hAnsi="Times New Roman" w:cs="Times New Roman"/>
               </w:rPr>
-              <w:t>6:30pm -</w:t>
+              <w:t xml:space="preserve">6:30pm </w:t>
+            </w:r>
+            <w:r>
+              <w:rPr>
+                <w:rFonts w:ascii="Times New Roman" w:hAnsi="Times New Roman" w:cs="Times New Roman"/>
+              </w:rPr>
+              <w:t>– 7:28 pm</w:t>
+            </w:r>
+          </w:p>
+          <w:p>
+            <w:pPr>
+              <w:jc w:val="center"/>
+              <w:rPr>
+                <w:rFonts w:ascii="Times New Roman" w:hAnsi="Times New Roman" w:cs="Times New Roman"/>
+              </w:rPr>
+            </w:pPr>
+            <w:r>
+              <w:rPr>
+                <w:rFonts w:ascii="Times New Roman" w:hAnsi="Times New Roman" w:cs="Times New Roman"/>
+              </w:rPr>
+              <w:t xml:space="preserve">(58 minutos) </w:t>
+            </w:r>
+          </w:p>
+          <w:p>
+            <w:pPr>
+              <w:rPr>
+                <w:rFonts w:ascii="Times New Roman" w:hAnsi="Times New Roman" w:cs="Times New Roman"/>
+              </w:rPr>
+            </w:pPr>
+            <w:r>
+              <w:rPr>
+                <w:rFonts w:ascii="Times New Roman" w:hAnsi="Times New Roman" w:cs="Times New Roman"/>
+              </w:rPr>
+              <w:t>Leyendo de nuevo la práctica, para usar git y GitHub, arreglando errores con las carpetas</w:t>
+            </w:r>
+          </w:p>
+          <w:p>
+            <w:pPr>
+              <w:jc w:val="center"/>
+              <w:rPr>
+                <w:rFonts w:ascii="Times New Roman" w:hAnsi="Times New Roman" w:cs="Times New Roman"/>
+              </w:rPr>
+            </w:pPr>
+          </w:p>
+          <w:p>
+            <w:pPr>
+              <w:jc w:val="center"/>
+              <w:rPr>
+                <w:rFonts w:ascii="Times New Roman" w:hAnsi="Times New Roman" w:cs="Times New Roman"/>
+              </w:rPr>
+            </w:pPr>
+            <w:r>
+              <w:rPr>
+                <w:rFonts w:ascii="Times New Roman" w:hAnsi="Times New Roman" w:cs="Times New Roman"/>
+              </w:rPr>
+              <w:t>7:30</w:t>
+            </w:r>
+            <w:r>
+              <w:rPr>
+                <w:rFonts w:ascii="Times New Roman" w:hAnsi="Times New Roman" w:cs="Times New Roman"/>
+              </w:rPr>
+              <w:t>pm</w:t>
+            </w:r>
+            <w:r>
+              <w:rPr>
+                <w:rFonts w:ascii="Times New Roman" w:hAnsi="Times New Roman" w:cs="Times New Roman"/>
+              </w:rPr>
+              <w:t xml:space="preserve"> </w:t>
+            </w:r>
+            <w:r>
+              <w:rPr>
+                <w:rFonts w:ascii="Times New Roman" w:hAnsi="Times New Roman" w:cs="Times New Roman"/>
+              </w:rPr>
+              <w:t>–</w:t>
+            </w:r>
+            <w:r>
+              <w:rPr>
+                <w:rFonts w:ascii="Times New Roman" w:hAnsi="Times New Roman" w:cs="Times New Roman"/>
+              </w:rPr>
+              <w:t xml:space="preserve"> </w:t>
+            </w:r>
+            <w:r>
+              <w:rPr>
+                <w:rFonts w:ascii="Times New Roman" w:hAnsi="Times New Roman" w:cs="Times New Roman"/>
+              </w:rPr>
+              <w:t>8:20pm</w:t>
+            </w:r>
+          </w:p>
+          <w:p>
+            <w:pPr>
+              <w:jc w:val="center"/>
+              <w:rPr>
+                <w:rFonts w:ascii="Times New Roman" w:hAnsi="Times New Roman" w:cs="Times New Roman"/>
+              </w:rPr>
+            </w:pPr>
+            <w:r>
+              <w:rPr>
+                <w:rFonts w:ascii="Times New Roman" w:hAnsi="Times New Roman" w:cs="Times New Roman"/>
+              </w:rPr>
+              <w:t>(50 minutos)</w:t>
+            </w:r>
+          </w:p>
+          <w:p>
+            <w:pPr>
+              <w:jc w:val="center"/>
+              <w:rPr>
+                <w:rFonts w:ascii="Times New Roman" w:hAnsi="Times New Roman" w:cs="Times New Roman"/>
+              </w:rPr>
+            </w:pPr>
+            <w:r>
+              <w:rPr>
+                <w:rFonts w:ascii="Times New Roman" w:hAnsi="Times New Roman" w:cs="Times New Roman"/>
+              </w:rPr>
+              <w:t>Trabaje en el menú principal y plantee la idea de como manejar el sistema de usuarios y contraseñas</w:t>
             </w:r>
           </w:p>
         </w:tc>
@@ -2643,7 +2754,6 @@
           <w:sz w:val="32"/>
           <w:szCs w:val="32"/>
         </w:rPr>
-        <w:lastRenderedPageBreak/>
         <w:t xml:space="preserve">Conclusiones </w:t>
       </w:r>
     </w:p>
@@ -3396,6 +3506,7 @@
   <w:style w:type="character" w:default="1" w:styleId="Fuentedeprrafopredeter">
     <w:name w:val="Default Paragraph Font"/>
     <w:uiPriority w:val="1"/>
+    <w:semiHidden/>
     <w:unhideWhenUsed/>
   </w:style>
   <w:style w:type="table" w:default="1" w:styleId="Tablanormal">

</xml_diff>

<commit_message>
Seguir trabajando las ideas para el sistema de contraseñas
</commit_message>
<xml_diff>
--- a/documentacion/Documentación Externa (Not final).docx
+++ b/documentacion/Documentación Externa (Not final).docx
@@ -2379,6 +2379,204 @@
                 <w:rFonts w:ascii="Times New Roman" w:hAnsi="Times New Roman" w:cs="Times New Roman"/>
               </w:rPr>
               <w:t>Documentación Externa (Un Word editable por el momento)</w:t>
+            </w:r>
+          </w:p>
+        </w:tc>
+      </w:tr>
+      <w:tr>
+        <w:trPr>
+          <w:trHeight w:val="398"/>
+        </w:trPr>
+        <w:tc>
+          <w:tcPr>
+            <w:tcW w:w="2942" w:type="dxa"/>
+          </w:tcPr>
+          <w:p>
+            <w:pPr>
+              <w:jc w:val="center"/>
+              <w:rPr>
+                <w:rFonts w:ascii="Times New Roman" w:hAnsi="Times New Roman" w:cs="Times New Roman"/>
+              </w:rPr>
+            </w:pPr>
+            <w:r>
+              <w:rPr>
+                <w:rFonts w:ascii="Times New Roman" w:hAnsi="Times New Roman" w:cs="Times New Roman"/>
+              </w:rPr>
+              <w:t>22/9/2026</w:t>
+            </w:r>
+          </w:p>
+        </w:tc>
+        <w:tc>
+          <w:tcPr>
+            <w:tcW w:w="2943" w:type="dxa"/>
+          </w:tcPr>
+          <w:p>
+            <w:pPr>
+              <w:jc w:val="center"/>
+              <w:rPr>
+                <w:rFonts w:ascii="Times New Roman" w:hAnsi="Times New Roman" w:cs="Times New Roman"/>
+              </w:rPr>
+            </w:pPr>
+            <w:r>
+              <w:rPr>
+                <w:rFonts w:ascii="Times New Roman" w:hAnsi="Times New Roman" w:cs="Times New Roman"/>
+              </w:rPr>
+              <w:t>6:10</w:t>
+            </w:r>
+            <w:r>
+              <w:rPr>
+                <w:rFonts w:ascii="Times New Roman" w:hAnsi="Times New Roman" w:cs="Times New Roman"/>
+              </w:rPr>
+              <w:t>pm</w:t>
+            </w:r>
+            <w:r>
+              <w:rPr>
+                <w:rFonts w:ascii="Times New Roman" w:hAnsi="Times New Roman" w:cs="Times New Roman"/>
+              </w:rPr>
+              <w:t xml:space="preserve"> </w:t>
+            </w:r>
+            <w:r>
+              <w:rPr>
+                <w:rFonts w:ascii="Times New Roman" w:hAnsi="Times New Roman" w:cs="Times New Roman"/>
+              </w:rPr>
+              <w:t>–</w:t>
+            </w:r>
+            <w:r>
+              <w:rPr>
+                <w:rFonts w:ascii="Times New Roman" w:hAnsi="Times New Roman" w:cs="Times New Roman"/>
+              </w:rPr>
+              <w:t xml:space="preserve"> </w:t>
+            </w:r>
+            <w:r>
+              <w:rPr>
+                <w:rFonts w:ascii="Times New Roman" w:hAnsi="Times New Roman" w:cs="Times New Roman"/>
+              </w:rPr>
+              <w:t>7:02pm</w:t>
+            </w:r>
+            <w:r>
+              <w:rPr>
+                <w:rFonts w:ascii="Times New Roman" w:hAnsi="Times New Roman" w:cs="Times New Roman"/>
+              </w:rPr>
+              <w:br/>
+              <w:t>(52 minutos)</w:t>
+            </w:r>
+          </w:p>
+          <w:p>
+            <w:pPr>
+              <w:jc w:val="center"/>
+              <w:rPr>
+                <w:rFonts w:ascii="Times New Roman" w:hAnsi="Times New Roman" w:cs="Times New Roman"/>
+              </w:rPr>
+            </w:pPr>
+            <w:r>
+              <w:rPr>
+                <w:rFonts w:ascii="Times New Roman" w:hAnsi="Times New Roman" w:cs="Times New Roman"/>
+              </w:rPr>
+              <w:t>Avance del sistema de contraseña (concepto)</w:t>
+            </w:r>
+          </w:p>
+          <w:p>
+            <w:pPr>
+              <w:jc w:val="center"/>
+              <w:rPr>
+                <w:rFonts w:ascii="Times New Roman" w:hAnsi="Times New Roman" w:cs="Times New Roman"/>
+              </w:rPr>
+            </w:pPr>
+          </w:p>
+          <w:p>
+            <w:pPr>
+              <w:jc w:val="center"/>
+              <w:rPr>
+                <w:rFonts w:ascii="Times New Roman" w:hAnsi="Times New Roman" w:cs="Times New Roman"/>
+              </w:rPr>
+            </w:pPr>
+            <w:r>
+              <w:rPr>
+                <w:rFonts w:ascii="Times New Roman" w:hAnsi="Times New Roman" w:cs="Times New Roman"/>
+              </w:rPr>
+              <w:t xml:space="preserve">7:03pm </w:t>
+            </w:r>
+            <w:r>
+              <w:rPr>
+                <w:rFonts w:ascii="Times New Roman" w:hAnsi="Times New Roman" w:cs="Times New Roman"/>
+              </w:rPr>
+              <w:t>–</w:t>
+            </w:r>
+            <w:r>
+              <w:rPr>
+                <w:rFonts w:ascii="Times New Roman" w:hAnsi="Times New Roman" w:cs="Times New Roman"/>
+              </w:rPr>
+              <w:t xml:space="preserve"> </w:t>
+            </w:r>
+            <w:r>
+              <w:rPr>
+                <w:rFonts w:ascii="Times New Roman" w:hAnsi="Times New Roman" w:cs="Times New Roman"/>
+              </w:rPr>
+              <w:t>7:15pm</w:t>
+            </w:r>
+          </w:p>
+          <w:p>
+            <w:pPr>
+              <w:jc w:val="center"/>
+              <w:rPr>
+                <w:rFonts w:ascii="Times New Roman" w:hAnsi="Times New Roman" w:cs="Times New Roman"/>
+              </w:rPr>
+            </w:pPr>
+            <w:r>
+              <w:rPr>
+                <w:rFonts w:ascii="Times New Roman" w:hAnsi="Times New Roman" w:cs="Times New Roman"/>
+              </w:rPr>
+              <w:t>(12 minutos)</w:t>
+            </w:r>
+          </w:p>
+          <w:p>
+            <w:pPr>
+              <w:jc w:val="center"/>
+              <w:rPr>
+                <w:rFonts w:ascii="Times New Roman" w:hAnsi="Times New Roman" w:cs="Times New Roman"/>
+              </w:rPr>
+            </w:pPr>
+            <w:r>
+              <w:rPr>
+                <w:rFonts w:ascii="Times New Roman" w:hAnsi="Times New Roman" w:cs="Times New Roman"/>
+              </w:rPr>
+              <w:t xml:space="preserve">Intentar crearlo ya con el archivo </w:t>
+            </w:r>
+          </w:p>
+        </w:tc>
+        <w:tc>
+          <w:tcPr>
+            <w:tcW w:w="2943" w:type="dxa"/>
+          </w:tcPr>
+          <w:p>
+            <w:pPr>
+              <w:rPr>
+                <w:rFonts w:ascii="Times New Roman" w:hAnsi="Times New Roman" w:cs="Times New Roman"/>
+              </w:rPr>
+            </w:pPr>
+            <w:r>
+              <w:rPr>
+                <w:rFonts w:ascii="Times New Roman" w:hAnsi="Times New Roman" w:cs="Times New Roman"/>
+              </w:rPr>
+              <w:t>Avanzar con el sistema de inicio de sesión (admin)</w:t>
+            </w:r>
+            <w:r>
+              <w:rPr>
+                <w:rFonts w:ascii="Times New Roman" w:hAnsi="Times New Roman" w:cs="Times New Roman"/>
+              </w:rPr>
+              <w:br/>
+            </w:r>
+            <w:r>
+              <w:rPr>
+                <w:rFonts w:ascii="Times New Roman" w:hAnsi="Times New Roman" w:cs="Times New Roman"/>
+              </w:rPr>
+              <w:br/>
+            </w:r>
+            <w:r>
+              <w:rPr>
+                <w:rFonts w:ascii="Times New Roman" w:hAnsi="Times New Roman" w:cs="Times New Roman"/>
+              </w:rPr>
+              <w:t>Se intento lograr que el archivo se maneje con listas, por ahora lo dejo incompleto y en un archivo separado.</w:t>
             </w:r>
           </w:p>
         </w:tc>

</xml_diff>

<commit_message>
23/9/2026, se terminan de crear los 3 menús principales
</commit_message>
<xml_diff>
--- a/documentacion/Documentación Externa (Not final).docx
+++ b/documentacion/Documentación Externa (Not final).docx
@@ -2578,6 +2578,157 @@
               </w:rPr>
               <w:t>Se intento lograr que el archivo se maneje con listas, por ahora lo dejo incompleto y en un archivo separado.</w:t>
             </w:r>
+          </w:p>
+        </w:tc>
+      </w:tr>
+      <w:tr>
+        <w:trPr>
+          <w:trHeight w:val="398"/>
+        </w:trPr>
+        <w:tc>
+          <w:tcPr>
+            <w:tcW w:w="2942" w:type="dxa"/>
+          </w:tcPr>
+          <w:p>
+            <w:pPr>
+              <w:jc w:val="center"/>
+              <w:rPr>
+                <w:rFonts w:ascii="Times New Roman" w:hAnsi="Times New Roman" w:cs="Times New Roman"/>
+              </w:rPr>
+            </w:pPr>
+            <w:r>
+              <w:rPr>
+                <w:rFonts w:ascii="Times New Roman" w:hAnsi="Times New Roman" w:cs="Times New Roman"/>
+              </w:rPr>
+              <w:t>23/9/2026</w:t>
+            </w:r>
+          </w:p>
+        </w:tc>
+        <w:tc>
+          <w:tcPr>
+            <w:tcW w:w="2943" w:type="dxa"/>
+          </w:tcPr>
+          <w:p>
+            <w:pPr>
+              <w:jc w:val="center"/>
+              <w:rPr>
+                <w:rFonts w:ascii="Times New Roman" w:hAnsi="Times New Roman" w:cs="Times New Roman"/>
+              </w:rPr>
+            </w:pPr>
+            <w:r>
+              <w:rPr>
+                <w:rFonts w:ascii="Times New Roman" w:hAnsi="Times New Roman" w:cs="Times New Roman"/>
+              </w:rPr>
+              <w:t xml:space="preserve">4:10pm </w:t>
+            </w:r>
+            <w:r>
+              <w:rPr>
+                <w:rFonts w:ascii="Times New Roman" w:hAnsi="Times New Roman" w:cs="Times New Roman"/>
+              </w:rPr>
+              <w:t>– 5.13pm</w:t>
+            </w:r>
+          </w:p>
+          <w:p>
+            <w:pPr>
+              <w:jc w:val="center"/>
+              <w:rPr>
+                <w:rFonts w:ascii="Times New Roman" w:hAnsi="Times New Roman" w:cs="Times New Roman"/>
+              </w:rPr>
+            </w:pPr>
+            <w:r>
+              <w:rPr>
+                <w:rFonts w:ascii="Times New Roman" w:hAnsi="Times New Roman" w:cs="Times New Roman"/>
+              </w:rPr>
+              <w:t>(1 hora, 3 minutos)</w:t>
+            </w:r>
+          </w:p>
+          <w:p>
+            <w:pPr>
+              <w:rPr>
+                <w:rFonts w:ascii="Times New Roman" w:hAnsi="Times New Roman" w:cs="Times New Roman"/>
+              </w:rPr>
+            </w:pPr>
+          </w:p>
+        </w:tc>
+        <w:tc>
+          <w:tcPr>
+            <w:tcW w:w="2943" w:type="dxa"/>
+          </w:tcPr>
+          <w:p>
+            <w:pPr>
+              <w:rPr>
+                <w:rFonts w:ascii="Times New Roman" w:hAnsi="Times New Roman" w:cs="Times New Roman"/>
+              </w:rPr>
+            </w:pPr>
+            <w:r>
+              <w:rPr>
+                <w:rFonts w:ascii="Times New Roman" w:hAnsi="Times New Roman" w:cs="Times New Roman"/>
+              </w:rPr>
+              <w:t>Se terminan de crear los tres menús principales ( Menu principal, admin, usuario)</w:t>
+            </w:r>
+          </w:p>
+          <w:p>
+            <w:pPr>
+              <w:rPr>
+                <w:rFonts w:ascii="Times New Roman" w:hAnsi="Times New Roman" w:cs="Times New Roman"/>
+              </w:rPr>
+            </w:pPr>
+          </w:p>
+          <w:p>
+            <w:pPr>
+              <w:rPr>
+                <w:rFonts w:ascii="Times New Roman" w:hAnsi="Times New Roman" w:cs="Times New Roman"/>
+              </w:rPr>
+            </w:pPr>
+            <w:r>
+              <w:rPr>
+                <w:rFonts w:ascii="Times New Roman" w:hAnsi="Times New Roman" w:cs="Times New Roman"/>
+              </w:rPr>
+              <w:t>Los menús se trataron de crear de varios modos, pero al final me decidí hacerlos con un while y condicionarlos con True y False</w:t>
+            </w:r>
+          </w:p>
+        </w:tc>
+      </w:tr>
+      <w:tr>
+        <w:trPr>
+          <w:trHeight w:val="398"/>
+        </w:trPr>
+        <w:tc>
+          <w:tcPr>
+            <w:tcW w:w="2942" w:type="dxa"/>
+          </w:tcPr>
+          <w:p>
+            <w:pPr>
+              <w:jc w:val="center"/>
+              <w:rPr>
+                <w:rFonts w:ascii="Times New Roman" w:hAnsi="Times New Roman" w:cs="Times New Roman"/>
+              </w:rPr>
+            </w:pPr>
+          </w:p>
+        </w:tc>
+        <w:tc>
+          <w:tcPr>
+            <w:tcW w:w="2943" w:type="dxa"/>
+          </w:tcPr>
+          <w:p>
+            <w:pPr>
+              <w:jc w:val="center"/>
+              <w:rPr>
+                <w:rFonts w:ascii="Times New Roman" w:hAnsi="Times New Roman" w:cs="Times New Roman"/>
+              </w:rPr>
+            </w:pPr>
+          </w:p>
+        </w:tc>
+        <w:tc>
+          <w:tcPr>
+            <w:tcW w:w="2943" w:type="dxa"/>
+          </w:tcPr>
+          <w:p>
+            <w:pPr>
+              <w:rPr>
+                <w:rFonts w:ascii="Times New Roman" w:hAnsi="Times New Roman" w:cs="Times New Roman"/>
+              </w:rPr>
+            </w:pPr>
           </w:p>
         </w:tc>
       </w:tr>

</xml_diff>

<commit_message>
Se terminan de implementar las contraseña a los menús
</commit_message>
<xml_diff>
--- a/documentacion/Documentación Externa (Not final).docx
+++ b/documentacion/Documentación Externa (Not final).docx
@@ -2704,6 +2704,12 @@
                 <w:rFonts w:ascii="Times New Roman" w:hAnsi="Times New Roman" w:cs="Times New Roman"/>
               </w:rPr>
             </w:pPr>
+            <w:r>
+              <w:rPr>
+                <w:rFonts w:ascii="Times New Roman" w:hAnsi="Times New Roman" w:cs="Times New Roman"/>
+              </w:rPr>
+              <w:t>28/9/2026</w:t>
+            </w:r>
           </w:p>
         </w:tc>
         <w:tc>
@@ -2717,6 +2723,54 @@
                 <w:rFonts w:ascii="Times New Roman" w:hAnsi="Times New Roman" w:cs="Times New Roman"/>
               </w:rPr>
             </w:pPr>
+            <w:r>
+              <w:rPr>
+                <w:rFonts w:ascii="Times New Roman" w:hAnsi="Times New Roman" w:cs="Times New Roman"/>
+              </w:rPr>
+              <w:t xml:space="preserve">3:00pm </w:t>
+            </w:r>
+            <w:r>
+              <w:rPr>
+                <w:rFonts w:ascii="Times New Roman" w:hAnsi="Times New Roman" w:cs="Times New Roman"/>
+              </w:rPr>
+              <w:t>– 3:24pm</w:t>
+            </w:r>
+          </w:p>
+          <w:p>
+            <w:pPr>
+              <w:jc w:val="center"/>
+              <w:rPr>
+                <w:rFonts w:ascii="Times New Roman" w:hAnsi="Times New Roman" w:cs="Times New Roman"/>
+              </w:rPr>
+            </w:pPr>
+            <w:r>
+              <w:rPr>
+                <w:rFonts w:ascii="Times New Roman" w:hAnsi="Times New Roman" w:cs="Times New Roman"/>
+              </w:rPr>
+              <w:t>(24 minutos)</w:t>
+            </w:r>
+          </w:p>
+          <w:p>
+            <w:pPr>
+              <w:jc w:val="center"/>
+              <w:rPr>
+                <w:rFonts w:ascii="Times New Roman" w:hAnsi="Times New Roman" w:cs="Times New Roman"/>
+              </w:rPr>
+            </w:pPr>
+          </w:p>
+          <w:p>
+            <w:pPr>
+              <w:jc w:val="center"/>
+              <w:rPr>
+                <w:rFonts w:ascii="Times New Roman" w:hAnsi="Times New Roman" w:cs="Times New Roman"/>
+              </w:rPr>
+            </w:pPr>
+            <w:r>
+              <w:rPr>
+                <w:rFonts w:ascii="Times New Roman" w:hAnsi="Times New Roman" w:cs="Times New Roman"/>
+              </w:rPr>
+              <w:t xml:space="preserve">3:25pm - </w:t>
+            </w:r>
           </w:p>
         </w:tc>
         <w:tc>
@@ -2729,6 +2783,12 @@
                 <w:rFonts w:ascii="Times New Roman" w:hAnsi="Times New Roman" w:cs="Times New Roman"/>
               </w:rPr>
             </w:pPr>
+            <w:r>
+              <w:rPr>
+                <w:rFonts w:ascii="Times New Roman" w:hAnsi="Times New Roman" w:cs="Times New Roman"/>
+              </w:rPr>
+              <w:t xml:space="preserve">Se terminan las contraseñas de manera que se conecten con los menús de manera satisfactoria </w:t>
+            </w:r>
           </w:p>
         </w:tc>
       </w:tr>

</xml_diff>

<commit_message>
Se agregan la función auxiliar y la función principal de agregar modelos al programa (agregar_modelos() aun necesita trabajarse)
</commit_message>
<xml_diff>
--- a/documentacion/Documentación Externa (Not final).docx
+++ b/documentacion/Documentación Externa (Not final).docx
@@ -2141,6 +2141,54 @@
               <w:jc w:val="center"/>
               <w:rPr>
                 <w:rFonts w:ascii="Times New Roman" w:hAnsi="Times New Roman" w:cs="Times New Roman"/>
+              </w:rPr>
+            </w:pPr>
+          </w:p>
+          <w:p>
+            <w:pPr>
+              <w:jc w:val="center"/>
+              <w:rPr>
+                <w:rFonts w:ascii="Times New Roman" w:hAnsi="Times New Roman" w:cs="Times New Roman"/>
+              </w:rPr>
+            </w:pPr>
+          </w:p>
+          <w:p>
+            <w:pPr>
+              <w:jc w:val="center"/>
+              <w:rPr>
+                <w:rFonts w:ascii="Times New Roman" w:hAnsi="Times New Roman" w:cs="Times New Roman"/>
+              </w:rPr>
+            </w:pPr>
+          </w:p>
+          <w:p>
+            <w:pPr>
+              <w:jc w:val="center"/>
+              <w:rPr>
+                <w:rFonts w:ascii="Times New Roman" w:hAnsi="Times New Roman" w:cs="Times New Roman"/>
+              </w:rPr>
+            </w:pPr>
+          </w:p>
+          <w:p>
+            <w:pPr>
+              <w:jc w:val="center"/>
+              <w:rPr>
+                <w:rFonts w:ascii="Times New Roman" w:hAnsi="Times New Roman" w:cs="Times New Roman"/>
+              </w:rPr>
+            </w:pPr>
+          </w:p>
+          <w:p>
+            <w:pPr>
+              <w:jc w:val="center"/>
+              <w:rPr>
+                <w:rFonts w:ascii="Times New Roman" w:hAnsi="Times New Roman" w:cs="Times New Roman"/>
+              </w:rPr>
+            </w:pPr>
+          </w:p>
+          <w:p>
+            <w:pPr>
+              <w:jc w:val="center"/>
+              <w:rPr>
+                <w:rFonts w:ascii="Times New Roman" w:hAnsi="Times New Roman" w:cs="Times New Roman"/>
                 <w:sz w:val="28"/>
                 <w:szCs w:val="28"/>
               </w:rPr>
@@ -2281,7 +2329,21 @@
               <w:rPr>
                 <w:rFonts w:ascii="Times New Roman" w:hAnsi="Times New Roman" w:cs="Times New Roman"/>
               </w:rPr>
-              <w:t>Trabaje en el menú principal y plantee la idea de como manejar el sistema de usuarios y contraseñas</w:t>
+              <w:t xml:space="preserve">Trabaje en el menú principal y plantee la idea de </w:t>
+            </w:r>
+            <w:proofErr w:type="spellStart"/>
+            <w:r>
+              <w:rPr>
+                <w:rFonts w:ascii="Times New Roman" w:hAnsi="Times New Roman" w:cs="Times New Roman"/>
+              </w:rPr>
+              <w:t>como</w:t>
+            </w:r>
+            <w:proofErr w:type="spellEnd"/>
+            <w:r>
+              <w:rPr>
+                <w:rFonts w:ascii="Times New Roman" w:hAnsi="Times New Roman" w:cs="Times New Roman"/>
+              </w:rPr>
+              <w:t xml:space="preserve"> manejar el sistema de usuarios y contraseñas</w:t>
             </w:r>
           </w:p>
         </w:tc>
@@ -2398,6 +2460,38 @@
                 <w:rFonts w:ascii="Times New Roman" w:hAnsi="Times New Roman" w:cs="Times New Roman"/>
               </w:rPr>
             </w:pPr>
+          </w:p>
+          <w:p>
+            <w:pPr>
+              <w:jc w:val="center"/>
+              <w:rPr>
+                <w:rFonts w:ascii="Times New Roman" w:hAnsi="Times New Roman" w:cs="Times New Roman"/>
+              </w:rPr>
+            </w:pPr>
+          </w:p>
+          <w:p>
+            <w:pPr>
+              <w:jc w:val="center"/>
+              <w:rPr>
+                <w:rFonts w:ascii="Times New Roman" w:hAnsi="Times New Roman" w:cs="Times New Roman"/>
+              </w:rPr>
+            </w:pPr>
+          </w:p>
+          <w:p>
+            <w:pPr>
+              <w:jc w:val="center"/>
+              <w:rPr>
+                <w:rFonts w:ascii="Times New Roman" w:hAnsi="Times New Roman" w:cs="Times New Roman"/>
+              </w:rPr>
+            </w:pPr>
+          </w:p>
+          <w:p>
+            <w:pPr>
+              <w:jc w:val="center"/>
+              <w:rPr>
+                <w:rFonts w:ascii="Times New Roman" w:hAnsi="Times New Roman" w:cs="Times New Roman"/>
+              </w:rPr>
+            </w:pPr>
             <w:r>
               <w:rPr>
                 <w:rFonts w:ascii="Times New Roman" w:hAnsi="Times New Roman" w:cs="Times New Roman"/>
@@ -2596,6 +2690,38 @@
                 <w:rFonts w:ascii="Times New Roman" w:hAnsi="Times New Roman" w:cs="Times New Roman"/>
               </w:rPr>
             </w:pPr>
+          </w:p>
+          <w:p>
+            <w:pPr>
+              <w:jc w:val="center"/>
+              <w:rPr>
+                <w:rFonts w:ascii="Times New Roman" w:hAnsi="Times New Roman" w:cs="Times New Roman"/>
+              </w:rPr>
+            </w:pPr>
+          </w:p>
+          <w:p>
+            <w:pPr>
+              <w:jc w:val="center"/>
+              <w:rPr>
+                <w:rFonts w:ascii="Times New Roman" w:hAnsi="Times New Roman" w:cs="Times New Roman"/>
+              </w:rPr>
+            </w:pPr>
+          </w:p>
+          <w:p>
+            <w:pPr>
+              <w:jc w:val="center"/>
+              <w:rPr>
+                <w:rFonts w:ascii="Times New Roman" w:hAnsi="Times New Roman" w:cs="Times New Roman"/>
+              </w:rPr>
+            </w:pPr>
+          </w:p>
+          <w:p>
+            <w:pPr>
+              <w:jc w:val="center"/>
+              <w:rPr>
+                <w:rFonts w:ascii="Times New Roman" w:hAnsi="Times New Roman" w:cs="Times New Roman"/>
+              </w:rPr>
+            </w:pPr>
             <w:r>
               <w:rPr>
                 <w:rFonts w:ascii="Times New Roman" w:hAnsi="Times New Roman" w:cs="Times New Roman"/>
@@ -2704,6 +2830,14 @@
                 <w:rFonts w:ascii="Times New Roman" w:hAnsi="Times New Roman" w:cs="Times New Roman"/>
               </w:rPr>
             </w:pPr>
+          </w:p>
+          <w:p>
+            <w:pPr>
+              <w:jc w:val="center"/>
+              <w:rPr>
+                <w:rFonts w:ascii="Times New Roman" w:hAnsi="Times New Roman" w:cs="Times New Roman"/>
+              </w:rPr>
+            </w:pPr>
             <w:r>
               <w:rPr>
                 <w:rFonts w:ascii="Times New Roman" w:hAnsi="Times New Roman" w:cs="Times New Roman"/>
@@ -2765,12 +2899,6 @@
                 <w:rFonts w:ascii="Times New Roman" w:hAnsi="Times New Roman" w:cs="Times New Roman"/>
               </w:rPr>
             </w:pPr>
-            <w:r>
-              <w:rPr>
-                <w:rFonts w:ascii="Times New Roman" w:hAnsi="Times New Roman" w:cs="Times New Roman"/>
-              </w:rPr>
-              <w:t xml:space="preserve">3:25pm - </w:t>
-            </w:r>
           </w:p>
         </w:tc>
         <w:tc>
@@ -2789,6 +2917,802 @@
               </w:rPr>
               <w:t xml:space="preserve">Se terminan las contraseñas de manera que se conecten con los menús de manera satisfactoria </w:t>
             </w:r>
+          </w:p>
+        </w:tc>
+      </w:tr>
+      <w:tr>
+        <w:trPr>
+          <w:trHeight w:val="2835"/>
+        </w:trPr>
+        <w:tc>
+          <w:tcPr>
+            <w:tcW w:w="2942" w:type="dxa"/>
+          </w:tcPr>
+          <w:p>
+            <w:pPr>
+              <w:rPr>
+                <w:rFonts w:ascii="Times New Roman" w:hAnsi="Times New Roman" w:cs="Times New Roman"/>
+              </w:rPr>
+            </w:pPr>
+          </w:p>
+          <w:p>
+            <w:pPr>
+              <w:jc w:val="center"/>
+              <w:rPr>
+                <w:rFonts w:ascii="Times New Roman" w:hAnsi="Times New Roman" w:cs="Times New Roman"/>
+              </w:rPr>
+            </w:pPr>
+          </w:p>
+          <w:p>
+            <w:pPr>
+              <w:jc w:val="center"/>
+              <w:rPr>
+                <w:rFonts w:ascii="Times New Roman" w:hAnsi="Times New Roman" w:cs="Times New Roman"/>
+              </w:rPr>
+            </w:pPr>
+          </w:p>
+          <w:p>
+            <w:pPr>
+              <w:jc w:val="center"/>
+              <w:rPr>
+                <w:rFonts w:ascii="Times New Roman" w:hAnsi="Times New Roman" w:cs="Times New Roman"/>
+              </w:rPr>
+            </w:pPr>
+          </w:p>
+          <w:p>
+            <w:pPr>
+              <w:jc w:val="center"/>
+              <w:rPr>
+                <w:rFonts w:ascii="Times New Roman" w:hAnsi="Times New Roman" w:cs="Times New Roman"/>
+              </w:rPr>
+            </w:pPr>
+            <w:r>
+              <w:rPr>
+                <w:rFonts w:ascii="Times New Roman" w:hAnsi="Times New Roman" w:cs="Times New Roman"/>
+              </w:rPr>
+              <w:t>29/9/2026</w:t>
+            </w:r>
+          </w:p>
+        </w:tc>
+        <w:tc>
+          <w:tcPr>
+            <w:tcW w:w="2943" w:type="dxa"/>
+          </w:tcPr>
+          <w:p>
+            <w:pPr>
+              <w:rPr>
+                <w:rFonts w:ascii="Times New Roman" w:hAnsi="Times New Roman" w:cs="Times New Roman"/>
+              </w:rPr>
+            </w:pPr>
+          </w:p>
+          <w:p>
+            <w:pPr>
+              <w:jc w:val="center"/>
+              <w:rPr>
+                <w:rFonts w:ascii="Times New Roman" w:hAnsi="Times New Roman" w:cs="Times New Roman"/>
+              </w:rPr>
+            </w:pPr>
+            <w:r>
+              <w:rPr>
+                <w:rFonts w:ascii="Times New Roman" w:hAnsi="Times New Roman" w:cs="Times New Roman"/>
+              </w:rPr>
+              <w:t xml:space="preserve">3:20pm </w:t>
+            </w:r>
+            <w:r>
+              <w:rPr>
+                <w:rFonts w:ascii="Times New Roman" w:hAnsi="Times New Roman" w:cs="Times New Roman"/>
+              </w:rPr>
+              <w:t>–</w:t>
+            </w:r>
+            <w:r>
+              <w:rPr>
+                <w:rFonts w:ascii="Times New Roman" w:hAnsi="Times New Roman" w:cs="Times New Roman"/>
+              </w:rPr>
+              <w:t xml:space="preserve"> </w:t>
+            </w:r>
+            <w:r>
+              <w:rPr>
+                <w:rFonts w:ascii="Times New Roman" w:hAnsi="Times New Roman" w:cs="Times New Roman"/>
+              </w:rPr>
+              <w:t>3:25pm</w:t>
+            </w:r>
+          </w:p>
+          <w:p>
+            <w:pPr>
+              <w:jc w:val="center"/>
+              <w:rPr>
+                <w:rFonts w:ascii="Times New Roman" w:hAnsi="Times New Roman" w:cs="Times New Roman"/>
+              </w:rPr>
+            </w:pPr>
+            <w:r>
+              <w:rPr>
+                <w:rFonts w:ascii="Times New Roman" w:hAnsi="Times New Roman" w:cs="Times New Roman"/>
+              </w:rPr>
+              <w:t>(5 minutos)</w:t>
+            </w:r>
+          </w:p>
+          <w:p>
+            <w:pPr>
+              <w:jc w:val="center"/>
+              <w:rPr>
+                <w:rFonts w:ascii="Times New Roman" w:hAnsi="Times New Roman" w:cs="Times New Roman"/>
+              </w:rPr>
+            </w:pPr>
+            <w:r>
+              <w:rPr>
+                <w:rFonts w:ascii="Times New Roman" w:hAnsi="Times New Roman" w:cs="Times New Roman"/>
+              </w:rPr>
+              <w:t>Arreglar confusión</w:t>
+            </w:r>
+          </w:p>
+          <w:p>
+            <w:pPr>
+              <w:jc w:val="center"/>
+              <w:rPr>
+                <w:rFonts w:ascii="Times New Roman" w:hAnsi="Times New Roman" w:cs="Times New Roman"/>
+              </w:rPr>
+            </w:pPr>
+          </w:p>
+          <w:p>
+            <w:pPr>
+              <w:jc w:val="center"/>
+              <w:rPr>
+                <w:rFonts w:ascii="Times New Roman" w:hAnsi="Times New Roman" w:cs="Times New Roman"/>
+              </w:rPr>
+            </w:pPr>
+          </w:p>
+          <w:p>
+            <w:pPr>
+              <w:jc w:val="center"/>
+              <w:rPr>
+                <w:rFonts w:ascii="Times New Roman" w:hAnsi="Times New Roman" w:cs="Times New Roman"/>
+              </w:rPr>
+            </w:pPr>
+            <w:r>
+              <w:rPr>
+                <w:rFonts w:ascii="Times New Roman" w:hAnsi="Times New Roman" w:cs="Times New Roman"/>
+              </w:rPr>
+              <w:t xml:space="preserve">3:25 pm </w:t>
+            </w:r>
+            <w:r>
+              <w:rPr>
+                <w:rFonts w:ascii="Times New Roman" w:hAnsi="Times New Roman" w:cs="Times New Roman"/>
+              </w:rPr>
+              <w:t>–</w:t>
+            </w:r>
+            <w:r>
+              <w:rPr>
+                <w:rFonts w:ascii="Times New Roman" w:hAnsi="Times New Roman" w:cs="Times New Roman"/>
+              </w:rPr>
+              <w:t xml:space="preserve"> </w:t>
+            </w:r>
+            <w:r>
+              <w:rPr>
+                <w:rFonts w:ascii="Times New Roman" w:hAnsi="Times New Roman" w:cs="Times New Roman"/>
+              </w:rPr>
+              <w:t>4:20pm</w:t>
+            </w:r>
+          </w:p>
+          <w:p>
+            <w:pPr>
+              <w:jc w:val="center"/>
+              <w:rPr>
+                <w:rFonts w:ascii="Times New Roman" w:hAnsi="Times New Roman" w:cs="Times New Roman"/>
+              </w:rPr>
+            </w:pPr>
+            <w:r>
+              <w:rPr>
+                <w:rFonts w:ascii="Times New Roman" w:hAnsi="Times New Roman" w:cs="Times New Roman"/>
+              </w:rPr>
+              <w:t>(55 minutos)</w:t>
+            </w:r>
+          </w:p>
+          <w:p>
+            <w:pPr>
+              <w:jc w:val="center"/>
+              <w:rPr>
+                <w:rFonts w:ascii="Times New Roman" w:hAnsi="Times New Roman" w:cs="Times New Roman"/>
+              </w:rPr>
+            </w:pPr>
+            <w:r>
+              <w:rPr>
+                <w:rFonts w:ascii="Times New Roman" w:hAnsi="Times New Roman" w:cs="Times New Roman"/>
+              </w:rPr>
+              <w:t>Trabajo de lógica</w:t>
+            </w:r>
+          </w:p>
+        </w:tc>
+        <w:tc>
+          <w:tcPr>
+            <w:tcW w:w="2943" w:type="dxa"/>
+          </w:tcPr>
+          <w:p>
+            <w:pPr>
+              <w:rPr>
+                <w:rFonts w:ascii="Times New Roman" w:hAnsi="Times New Roman" w:cs="Times New Roman"/>
+              </w:rPr>
+            </w:pPr>
+            <w:r>
+              <w:rPr>
+                <w:rFonts w:ascii="Times New Roman" w:hAnsi="Times New Roman" w:cs="Times New Roman"/>
+              </w:rPr>
+              <w:t>Se arregla la confusión de ponerle el login al sistema de usuarios en vez de al de admin</w:t>
+            </w:r>
+            <w:r>
+              <w:rPr>
+                <w:rFonts w:ascii="Times New Roman" w:hAnsi="Times New Roman" w:cs="Times New Roman"/>
+              </w:rPr>
+              <w:t>.</w:t>
+            </w:r>
+          </w:p>
+          <w:p>
+            <w:pPr>
+              <w:rPr>
+                <w:rFonts w:ascii="Times New Roman" w:hAnsi="Times New Roman" w:cs="Times New Roman"/>
+              </w:rPr>
+            </w:pPr>
+          </w:p>
+          <w:p>
+            <w:pPr>
+              <w:rPr>
+                <w:rFonts w:ascii="Times New Roman" w:hAnsi="Times New Roman" w:cs="Times New Roman"/>
+              </w:rPr>
+            </w:pPr>
+          </w:p>
+          <w:p>
+            <w:pPr>
+              <w:rPr>
+                <w:rFonts w:ascii="Times New Roman" w:hAnsi="Times New Roman" w:cs="Times New Roman"/>
+              </w:rPr>
+            </w:pPr>
+            <w:r>
+              <w:rPr>
+                <w:rFonts w:ascii="Times New Roman" w:hAnsi="Times New Roman" w:cs="Times New Roman"/>
+              </w:rPr>
+              <w:t>Trabajar en la lógica para las funciones de gestión de modelos</w:t>
+            </w:r>
+          </w:p>
+          <w:p>
+            <w:pPr>
+              <w:rPr>
+                <w:rFonts w:ascii="Times New Roman" w:hAnsi="Times New Roman" w:cs="Times New Roman"/>
+              </w:rPr>
+            </w:pPr>
+          </w:p>
+        </w:tc>
+      </w:tr>
+      <w:tr>
+        <w:trPr>
+          <w:trHeight w:val="3827"/>
+        </w:trPr>
+        <w:tc>
+          <w:tcPr>
+            <w:tcW w:w="2942" w:type="dxa"/>
+          </w:tcPr>
+          <w:p>
+            <w:pPr>
+              <w:jc w:val="center"/>
+              <w:rPr>
+                <w:rFonts w:ascii="Times New Roman" w:hAnsi="Times New Roman" w:cs="Times New Roman"/>
+              </w:rPr>
+            </w:pPr>
+          </w:p>
+          <w:p>
+            <w:pPr>
+              <w:jc w:val="center"/>
+              <w:rPr>
+                <w:rFonts w:ascii="Times New Roman" w:hAnsi="Times New Roman" w:cs="Times New Roman"/>
+              </w:rPr>
+            </w:pPr>
+          </w:p>
+          <w:p>
+            <w:pPr>
+              <w:jc w:val="center"/>
+              <w:rPr>
+                <w:rFonts w:ascii="Times New Roman" w:hAnsi="Times New Roman" w:cs="Times New Roman"/>
+              </w:rPr>
+            </w:pPr>
+          </w:p>
+          <w:p>
+            <w:pPr>
+              <w:jc w:val="center"/>
+              <w:rPr>
+                <w:rFonts w:ascii="Times New Roman" w:hAnsi="Times New Roman" w:cs="Times New Roman"/>
+              </w:rPr>
+            </w:pPr>
+          </w:p>
+          <w:p>
+            <w:pPr>
+              <w:jc w:val="center"/>
+              <w:rPr>
+                <w:rFonts w:ascii="Times New Roman" w:hAnsi="Times New Roman" w:cs="Times New Roman"/>
+              </w:rPr>
+            </w:pPr>
+          </w:p>
+          <w:p>
+            <w:pPr>
+              <w:jc w:val="center"/>
+              <w:rPr>
+                <w:rFonts w:ascii="Times New Roman" w:hAnsi="Times New Roman" w:cs="Times New Roman"/>
+              </w:rPr>
+            </w:pPr>
+          </w:p>
+          <w:p>
+            <w:pPr>
+              <w:jc w:val="center"/>
+              <w:rPr>
+                <w:rFonts w:ascii="Times New Roman" w:hAnsi="Times New Roman" w:cs="Times New Roman"/>
+              </w:rPr>
+            </w:pPr>
+            <w:r>
+              <w:rPr>
+                <w:rFonts w:ascii="Times New Roman" w:hAnsi="Times New Roman" w:cs="Times New Roman"/>
+              </w:rPr>
+              <w:t>30/9/2026</w:t>
+            </w:r>
+          </w:p>
+        </w:tc>
+        <w:tc>
+          <w:tcPr>
+            <w:tcW w:w="2943" w:type="dxa"/>
+          </w:tcPr>
+          <w:p>
+            <w:pPr>
+              <w:jc w:val="center"/>
+              <w:rPr>
+                <w:rFonts w:ascii="Times New Roman" w:hAnsi="Times New Roman" w:cs="Times New Roman"/>
+              </w:rPr>
+            </w:pPr>
+          </w:p>
+          <w:p>
+            <w:pPr>
+              <w:jc w:val="center"/>
+              <w:rPr>
+                <w:rFonts w:ascii="Times New Roman" w:hAnsi="Times New Roman" w:cs="Times New Roman"/>
+              </w:rPr>
+            </w:pPr>
+            <w:r>
+              <w:rPr>
+                <w:rFonts w:ascii="Times New Roman" w:hAnsi="Times New Roman" w:cs="Times New Roman"/>
+              </w:rPr>
+              <w:t>10:00am – 10:40am</w:t>
+            </w:r>
+            <w:r>
+              <w:rPr>
+                <w:rFonts w:ascii="Times New Roman" w:hAnsi="Times New Roman" w:cs="Times New Roman"/>
+              </w:rPr>
+              <w:br/>
+              <w:t>(40 minutos)</w:t>
+            </w:r>
+          </w:p>
+          <w:p>
+            <w:pPr>
+              <w:jc w:val="center"/>
+              <w:rPr>
+                <w:rFonts w:ascii="Times New Roman" w:hAnsi="Times New Roman" w:cs="Times New Roman"/>
+              </w:rPr>
+            </w:pPr>
+            <w:r>
+              <w:rPr>
+                <w:rFonts w:ascii="Times New Roman" w:hAnsi="Times New Roman" w:cs="Times New Roman"/>
+              </w:rPr>
+              <w:t>Trabajo lógica</w:t>
+            </w:r>
+            <w:r>
+              <w:rPr>
+                <w:rFonts w:ascii="Times New Roman" w:hAnsi="Times New Roman" w:cs="Times New Roman"/>
+              </w:rPr>
+              <w:t xml:space="preserve"> y creación de función auxiliar</w:t>
+            </w:r>
+          </w:p>
+          <w:p>
+            <w:pPr>
+              <w:jc w:val="center"/>
+              <w:rPr>
+                <w:rFonts w:ascii="Times New Roman" w:hAnsi="Times New Roman" w:cs="Times New Roman"/>
+              </w:rPr>
+            </w:pPr>
+          </w:p>
+          <w:p>
+            <w:pPr>
+              <w:rPr>
+                <w:rFonts w:ascii="Times New Roman" w:hAnsi="Times New Roman" w:cs="Times New Roman"/>
+              </w:rPr>
+            </w:pPr>
+          </w:p>
+          <w:p>
+            <w:pPr>
+              <w:jc w:val="center"/>
+              <w:rPr>
+                <w:rFonts w:ascii="Times New Roman" w:hAnsi="Times New Roman" w:cs="Times New Roman"/>
+              </w:rPr>
+            </w:pPr>
+            <w:r>
+              <w:rPr>
+                <w:rFonts w:ascii="Times New Roman" w:hAnsi="Times New Roman" w:cs="Times New Roman"/>
+              </w:rPr>
+              <w:t xml:space="preserve">10:50am </w:t>
+            </w:r>
+            <w:r>
+              <w:rPr>
+                <w:rFonts w:ascii="Times New Roman" w:hAnsi="Times New Roman" w:cs="Times New Roman"/>
+              </w:rPr>
+              <w:t>–</w:t>
+            </w:r>
+            <w:r>
+              <w:rPr>
+                <w:rFonts w:ascii="Times New Roman" w:hAnsi="Times New Roman" w:cs="Times New Roman"/>
+              </w:rPr>
+              <w:t xml:space="preserve"> </w:t>
+            </w:r>
+            <w:r>
+              <w:rPr>
+                <w:rFonts w:ascii="Times New Roman" w:hAnsi="Times New Roman" w:cs="Times New Roman"/>
+              </w:rPr>
+              <w:t>11:47am</w:t>
+            </w:r>
+          </w:p>
+          <w:p>
+            <w:pPr>
+              <w:jc w:val="center"/>
+              <w:rPr>
+                <w:rFonts w:ascii="Times New Roman" w:hAnsi="Times New Roman" w:cs="Times New Roman"/>
+              </w:rPr>
+            </w:pPr>
+            <w:r>
+              <w:rPr>
+                <w:rFonts w:ascii="Times New Roman" w:hAnsi="Times New Roman" w:cs="Times New Roman"/>
+              </w:rPr>
+              <w:t>(57 minutos)</w:t>
+            </w:r>
+          </w:p>
+          <w:p>
+            <w:pPr>
+              <w:jc w:val="center"/>
+              <w:rPr>
+                <w:rFonts w:ascii="Times New Roman" w:hAnsi="Times New Roman" w:cs="Times New Roman"/>
+              </w:rPr>
+            </w:pPr>
+            <w:r>
+              <w:rPr>
+                <w:rFonts w:ascii="Times New Roman" w:hAnsi="Times New Roman" w:cs="Times New Roman"/>
+              </w:rPr>
+              <w:t xml:space="preserve">Conectar auxiliar con la función principal </w:t>
+            </w:r>
+          </w:p>
+          <w:p>
+            <w:pPr>
+              <w:jc w:val="center"/>
+              <w:rPr>
+                <w:rFonts w:ascii="Times New Roman" w:hAnsi="Times New Roman" w:cs="Times New Roman"/>
+              </w:rPr>
+            </w:pPr>
+          </w:p>
+          <w:p>
+            <w:pPr>
+              <w:jc w:val="center"/>
+              <w:rPr>
+                <w:rFonts w:ascii="Times New Roman" w:hAnsi="Times New Roman" w:cs="Times New Roman"/>
+              </w:rPr>
+            </w:pPr>
+          </w:p>
+          <w:p>
+            <w:pPr>
+              <w:jc w:val="center"/>
+              <w:rPr>
+                <w:rFonts w:ascii="Times New Roman" w:hAnsi="Times New Roman" w:cs="Times New Roman"/>
+              </w:rPr>
+            </w:pPr>
+          </w:p>
+          <w:p>
+            <w:pPr>
+              <w:jc w:val="center"/>
+              <w:rPr>
+                <w:rFonts w:ascii="Times New Roman" w:hAnsi="Times New Roman" w:cs="Times New Roman"/>
+              </w:rPr>
+            </w:pPr>
+            <w:r>
+              <w:rPr>
+                <w:rFonts w:ascii="Times New Roman" w:hAnsi="Times New Roman" w:cs="Times New Roman"/>
+              </w:rPr>
+              <w:t xml:space="preserve">11:50am </w:t>
+            </w:r>
+            <w:r>
+              <w:rPr>
+                <w:rFonts w:ascii="Times New Roman" w:hAnsi="Times New Roman" w:cs="Times New Roman"/>
+              </w:rPr>
+              <w:t>–</w:t>
+            </w:r>
+            <w:r>
+              <w:rPr>
+                <w:rFonts w:ascii="Times New Roman" w:hAnsi="Times New Roman" w:cs="Times New Roman"/>
+              </w:rPr>
+              <w:t xml:space="preserve"> </w:t>
+            </w:r>
+            <w:r>
+              <w:rPr>
+                <w:rFonts w:ascii="Times New Roman" w:hAnsi="Times New Roman" w:cs="Times New Roman"/>
+              </w:rPr>
+              <w:t>12:05pm</w:t>
+            </w:r>
+          </w:p>
+          <w:p>
+            <w:pPr>
+              <w:jc w:val="center"/>
+              <w:rPr>
+                <w:rFonts w:ascii="Times New Roman" w:hAnsi="Times New Roman" w:cs="Times New Roman"/>
+              </w:rPr>
+            </w:pPr>
+            <w:r>
+              <w:rPr>
+                <w:rFonts w:ascii="Times New Roman" w:hAnsi="Times New Roman" w:cs="Times New Roman"/>
+              </w:rPr>
+              <w:t>(15 minutos)</w:t>
+            </w:r>
+          </w:p>
+          <w:p>
+            <w:pPr>
+              <w:jc w:val="center"/>
+              <w:rPr>
+                <w:rFonts w:ascii="Times New Roman" w:hAnsi="Times New Roman" w:cs="Times New Roman"/>
+              </w:rPr>
+            </w:pPr>
+            <w:r>
+              <w:rPr>
+                <w:rFonts w:ascii="Times New Roman" w:hAnsi="Times New Roman" w:cs="Times New Roman"/>
+              </w:rPr>
+              <w:t xml:space="preserve">Se agregan las funciones de inclusión de modelos al archivo principal </w:t>
+            </w:r>
+          </w:p>
+        </w:tc>
+        <w:tc>
+          <w:tcPr>
+            <w:tcW w:w="2943" w:type="dxa"/>
+          </w:tcPr>
+          <w:p>
+            <w:pPr>
+              <w:rPr>
+                <w:rFonts w:ascii="Times New Roman" w:hAnsi="Times New Roman" w:cs="Times New Roman"/>
+              </w:rPr>
+            </w:pPr>
+            <w:r>
+              <w:rPr>
+                <w:rFonts w:ascii="Times New Roman" w:hAnsi="Times New Roman" w:cs="Times New Roman"/>
+              </w:rPr>
+              <w:t>Se crea una función que nos ayudara a detectar repeticiones en un archivo txt deseado</w:t>
+            </w:r>
+            <w:r>
+              <w:rPr>
+                <w:rFonts w:ascii="Times New Roman" w:hAnsi="Times New Roman" w:cs="Times New Roman"/>
+              </w:rPr>
+              <w:br/>
+              <w:t>detectar_repetidos()</w:t>
+            </w:r>
+          </w:p>
+          <w:p>
+            <w:pPr>
+              <w:rPr>
+                <w:rFonts w:ascii="Times New Roman" w:hAnsi="Times New Roman" w:cs="Times New Roman"/>
+              </w:rPr>
+            </w:pPr>
+          </w:p>
+          <w:p>
+            <w:pPr>
+              <w:rPr>
+                <w:rFonts w:ascii="Times New Roman" w:hAnsi="Times New Roman" w:cs="Times New Roman"/>
+              </w:rPr>
+            </w:pPr>
+          </w:p>
+          <w:p>
+            <w:pPr>
+              <w:rPr>
+                <w:rFonts w:ascii="Times New Roman" w:hAnsi="Times New Roman" w:cs="Times New Roman"/>
+              </w:rPr>
+            </w:pPr>
+            <w:r>
+              <w:rPr>
+                <w:rFonts w:ascii="Times New Roman" w:hAnsi="Times New Roman" w:cs="Times New Roman"/>
+              </w:rPr>
+              <w:t>Se crea la función de agregar modelos, por ahora solo pide los inputs, pero valida que los modelos no se repitan.</w:t>
+            </w:r>
+          </w:p>
+          <w:p>
+            <w:pPr>
+              <w:rPr>
+                <w:rFonts w:ascii="Times New Roman" w:hAnsi="Times New Roman" w:cs="Times New Roman"/>
+              </w:rPr>
+            </w:pPr>
+          </w:p>
+          <w:p>
+            <w:pPr>
+              <w:rPr>
+                <w:rFonts w:ascii="Times New Roman" w:hAnsi="Times New Roman" w:cs="Times New Roman"/>
+              </w:rPr>
+            </w:pPr>
+          </w:p>
+          <w:p>
+            <w:pPr>
+              <w:rPr>
+                <w:rFonts w:ascii="Times New Roman" w:hAnsi="Times New Roman" w:cs="Times New Roman"/>
+              </w:rPr>
+            </w:pPr>
+          </w:p>
+          <w:p>
+            <w:pPr>
+              <w:rPr>
+                <w:rFonts w:ascii="Times New Roman" w:hAnsi="Times New Roman" w:cs="Times New Roman"/>
+              </w:rPr>
+            </w:pPr>
+            <w:r>
+              <w:rPr>
+                <w:rFonts w:ascii="Times New Roman" w:hAnsi="Times New Roman" w:cs="Times New Roman"/>
+              </w:rPr>
+              <w:t>Se agregan las nuevas funciones de detección de repetidos y la adición de modelos a el archivo del programa principal</w:t>
+            </w:r>
+          </w:p>
+        </w:tc>
+      </w:tr>
+      <w:tr>
+        <w:trPr>
+          <w:trHeight w:val="3827"/>
+        </w:trPr>
+        <w:tc>
+          <w:tcPr>
+            <w:tcW w:w="2942" w:type="dxa"/>
+          </w:tcPr>
+          <w:p>
+            <w:pPr>
+              <w:rPr>
+                <w:rFonts w:ascii="Times New Roman" w:hAnsi="Times New Roman" w:cs="Times New Roman"/>
+              </w:rPr>
+            </w:pPr>
+          </w:p>
+        </w:tc>
+        <w:tc>
+          <w:tcPr>
+            <w:tcW w:w="2943" w:type="dxa"/>
+          </w:tcPr>
+          <w:p>
+            <w:pPr>
+              <w:rPr>
+                <w:rFonts w:ascii="Times New Roman" w:hAnsi="Times New Roman" w:cs="Times New Roman"/>
+              </w:rPr>
+            </w:pPr>
+          </w:p>
+        </w:tc>
+        <w:tc>
+          <w:tcPr>
+            <w:tcW w:w="2943" w:type="dxa"/>
+          </w:tcPr>
+          <w:p>
+            <w:pPr>
+              <w:rPr>
+                <w:rFonts w:ascii="Times New Roman" w:hAnsi="Times New Roman" w:cs="Times New Roman"/>
+              </w:rPr>
+            </w:pPr>
+          </w:p>
+        </w:tc>
+      </w:tr>
+      <w:tr>
+        <w:trPr>
+          <w:trHeight w:val="3827"/>
+        </w:trPr>
+        <w:tc>
+          <w:tcPr>
+            <w:tcW w:w="2942" w:type="dxa"/>
+          </w:tcPr>
+          <w:p>
+            <w:pPr>
+              <w:rPr>
+                <w:rFonts w:ascii="Times New Roman" w:hAnsi="Times New Roman" w:cs="Times New Roman"/>
+              </w:rPr>
+            </w:pPr>
+          </w:p>
+        </w:tc>
+        <w:tc>
+          <w:tcPr>
+            <w:tcW w:w="2943" w:type="dxa"/>
+          </w:tcPr>
+          <w:p>
+            <w:pPr>
+              <w:rPr>
+                <w:rFonts w:ascii="Times New Roman" w:hAnsi="Times New Roman" w:cs="Times New Roman"/>
+              </w:rPr>
+            </w:pPr>
+          </w:p>
+        </w:tc>
+        <w:tc>
+          <w:tcPr>
+            <w:tcW w:w="2943" w:type="dxa"/>
+          </w:tcPr>
+          <w:p>
+            <w:pPr>
+              <w:rPr>
+                <w:rFonts w:ascii="Times New Roman" w:hAnsi="Times New Roman" w:cs="Times New Roman"/>
+              </w:rPr>
+            </w:pPr>
+          </w:p>
+        </w:tc>
+      </w:tr>
+      <w:tr>
+        <w:trPr>
+          <w:trHeight w:val="3827"/>
+        </w:trPr>
+        <w:tc>
+          <w:tcPr>
+            <w:tcW w:w="2942" w:type="dxa"/>
+          </w:tcPr>
+          <w:p>
+            <w:pPr>
+              <w:rPr>
+                <w:rFonts w:ascii="Times New Roman" w:hAnsi="Times New Roman" w:cs="Times New Roman"/>
+              </w:rPr>
+            </w:pPr>
+          </w:p>
+        </w:tc>
+        <w:tc>
+          <w:tcPr>
+            <w:tcW w:w="2943" w:type="dxa"/>
+          </w:tcPr>
+          <w:p>
+            <w:pPr>
+              <w:rPr>
+                <w:rFonts w:ascii="Times New Roman" w:hAnsi="Times New Roman" w:cs="Times New Roman"/>
+              </w:rPr>
+            </w:pPr>
+          </w:p>
+        </w:tc>
+        <w:tc>
+          <w:tcPr>
+            <w:tcW w:w="2943" w:type="dxa"/>
+          </w:tcPr>
+          <w:p>
+            <w:pPr>
+              <w:rPr>
+                <w:rFonts w:ascii="Times New Roman" w:hAnsi="Times New Roman" w:cs="Times New Roman"/>
+              </w:rPr>
+            </w:pPr>
+          </w:p>
+        </w:tc>
+      </w:tr>
+      <w:tr>
+        <w:trPr>
+          <w:trHeight w:val="3827"/>
+        </w:trPr>
+        <w:tc>
+          <w:tcPr>
+            <w:tcW w:w="2942" w:type="dxa"/>
+          </w:tcPr>
+          <w:p>
+            <w:pPr>
+              <w:rPr>
+                <w:rFonts w:ascii="Times New Roman" w:hAnsi="Times New Roman" w:cs="Times New Roman"/>
+              </w:rPr>
+            </w:pPr>
+          </w:p>
+        </w:tc>
+        <w:tc>
+          <w:tcPr>
+            <w:tcW w:w="2943" w:type="dxa"/>
+          </w:tcPr>
+          <w:p>
+            <w:pPr>
+              <w:rPr>
+                <w:rFonts w:ascii="Times New Roman" w:hAnsi="Times New Roman" w:cs="Times New Roman"/>
+              </w:rPr>
+            </w:pPr>
+          </w:p>
+        </w:tc>
+        <w:tc>
+          <w:tcPr>
+            <w:tcW w:w="2943" w:type="dxa"/>
+          </w:tcPr>
+          <w:p>
+            <w:pPr>
+              <w:rPr>
+                <w:rFonts w:ascii="Times New Roman" w:hAnsi="Times New Roman" w:cs="Times New Roman"/>
+              </w:rPr>
+            </w:pPr>
           </w:p>
         </w:tc>
       </w:tr>
@@ -3190,6 +4114,56 @@
     </w:sectPr>
   </w:body>
 </w:document>
+</file>
+
+<file path=word/endnotes.xml><?xml version="1.0" encoding="utf-8"?>
+<w:endnotes xmlns:wpc="http://schemas.microsoft.com/office/word/2010/wordprocessingCanvas" xmlns:cx="http://schemas.microsoft.com/office/drawing/2014/chartex" xmlns:cx1="http://schemas.microsoft.com/office/drawing/2015/9/8/chartex" xmlns:cx2="http://schemas.microsoft.com/office/drawing/2015/10/21/chartex" xmlns:cx3="http://schemas.microsoft.com/office/drawing/2016/5/9/chartex" xmlns:cx4="http://schemas.microsoft.com/office/drawing/2016/5/10/chartex" xmlns:cx5="http://schemas.microsoft.com/office/drawing/2016/5/11/chartex" xmlns:cx6="http://schemas.microsoft.com/office/drawing/2016/5/12/chartex" xmlns:cx7="http://schemas.microsoft.com/office/drawing/2016/5/13/chartex" xmlns:cx8="http://schemas.microsoft.com/office/drawing/2016/5/14/chartex" xmlns:mc="http://schemas.openxmlformats.org/markup-compatibility/2006" xmlns:aink="http://schemas.microsoft.com/office/drawing/2016/ink" xmlns:am3d="http://schemas.microsoft.com/office/drawing/2017/model3d" xmlns:o="urn:schemas-microsoft-com:office:office" xmlns:oel="http://schemas.microsoft.com/office/2019/extlst" xmlns:r="http://schemas.openxmlformats.org/officeDocument/2006/relationships" xmlns:m="http://schemas.openxmlformats.org/officeDocument/2006/math" xmlns:v="urn:schemas-microsoft-com:vml" xmlns:wp14="http://schemas.microsoft.com/office/word/2010/wordprocessingDrawing" xmlns:wp="http://schemas.openxmlformats.org/drawingml/2006/wordprocessingDrawing" xmlns:w10="urn:schemas-microsoft-com:office:word" xmlns:w="http://schemas.openxmlformats.org/wordprocessingml/2006/main" xmlns:w14="http://schemas.microsoft.com/office/word/2010/wordml" xmlns:w15="http://schemas.microsoft.com/office/word/2012/wordml" xmlns:w16cex="http://schemas.microsoft.com/office/word/2018/wordml/cex" xmlns:w16cid="http://schemas.microsoft.com/office/word/2016/wordml/cid" xmlns:w16="http://schemas.microsoft.com/office/word/2018/wordml" xmlns:w16sdtdh="http://schemas.microsoft.com/office/word/2020/wordml/sdtdatahash" xmlns:w16se="http://schemas.microsoft.com/office/word/2015/wordml/symex" xmlns:wpg="http://schemas.microsoft.com/office/word/2010/wordprocessingGroup" xmlns:wpi="http://schemas.microsoft.com/office/word/2010/wordprocessingInk" xmlns:wne="http://schemas.microsoft.com/office/word/2006/wordml" xmlns:wps="http://schemas.microsoft.com/office/word/2010/wordprocessingShape" mc:Ignorable="w14 w15 w16se w16cid w16 w16cex w16sdtdh wp14">
+  <w:endnote w:type="separator" w:id="-1">
+    <w:p>
+      <w:pPr>
+        <w:spacing w:after="0" w:line="240" w:lineRule="auto"/>
+      </w:pPr>
+      <w:r>
+        <w:separator/>
+      </w:r>
+    </w:p>
+  </w:endnote>
+  <w:endnote w:type="continuationSeparator" w:id="0">
+    <w:p>
+      <w:pPr>
+        <w:spacing w:after="0" w:line="240" w:lineRule="auto"/>
+      </w:pPr>
+      <w:r>
+        <w:continuationSeparator/>
+      </w:r>
+    </w:p>
+  </w:endnote>
+</w:endnotes>
+</file>
+
+<file path=word/footnotes.xml><?xml version="1.0" encoding="utf-8"?>
+<w:footnotes xmlns:wpc="http://schemas.microsoft.com/office/word/2010/wordprocessingCanvas" xmlns:cx="http://schemas.microsoft.com/office/drawing/2014/chartex" xmlns:cx1="http://schemas.microsoft.com/office/drawing/2015/9/8/chartex" xmlns:cx2="http://schemas.microsoft.com/office/drawing/2015/10/21/chartex" xmlns:cx3="http://schemas.microsoft.com/office/drawing/2016/5/9/chartex" xmlns:cx4="http://schemas.microsoft.com/office/drawing/2016/5/10/chartex" xmlns:cx5="http://schemas.microsoft.com/office/drawing/2016/5/11/chartex" xmlns:cx6="http://schemas.microsoft.com/office/drawing/2016/5/12/chartex" xmlns:cx7="http://schemas.microsoft.com/office/drawing/2016/5/13/chartex" xmlns:cx8="http://schemas.microsoft.com/office/drawing/2016/5/14/chartex" xmlns:mc="http://schemas.openxmlformats.org/markup-compatibility/2006" xmlns:aink="http://schemas.microsoft.com/office/drawing/2016/ink" xmlns:am3d="http://schemas.microsoft.com/office/drawing/2017/model3d" xmlns:o="urn:schemas-microsoft-com:office:office" xmlns:oel="http://schemas.microsoft.com/office/2019/extlst" xmlns:r="http://schemas.openxmlformats.org/officeDocument/2006/relationships" xmlns:m="http://schemas.openxmlformats.org/officeDocument/2006/math" xmlns:v="urn:schemas-microsoft-com:vml" xmlns:wp14="http://schemas.microsoft.com/office/word/2010/wordprocessingDrawing" xmlns:wp="http://schemas.openxmlformats.org/drawingml/2006/wordprocessingDrawing" xmlns:w10="urn:schemas-microsoft-com:office:word" xmlns:w="http://schemas.openxmlformats.org/wordprocessingml/2006/main" xmlns:w14="http://schemas.microsoft.com/office/word/2010/wordml" xmlns:w15="http://schemas.microsoft.com/office/word/2012/wordml" xmlns:w16cex="http://schemas.microsoft.com/office/word/2018/wordml/cex" xmlns:w16cid="http://schemas.microsoft.com/office/word/2016/wordml/cid" xmlns:w16="http://schemas.microsoft.com/office/word/2018/wordml" xmlns:w16sdtdh="http://schemas.microsoft.com/office/word/2020/wordml/sdtdatahash" xmlns:w16se="http://schemas.microsoft.com/office/word/2015/wordml/symex" xmlns:wpg="http://schemas.microsoft.com/office/word/2010/wordprocessingGroup" xmlns:wpi="http://schemas.microsoft.com/office/word/2010/wordprocessingInk" xmlns:wne="http://schemas.microsoft.com/office/word/2006/wordml" xmlns:wps="http://schemas.microsoft.com/office/word/2010/wordprocessingShape" mc:Ignorable="w14 w15 w16se w16cid w16 w16cex w16sdtdh wp14">
+  <w:footnote w:type="separator" w:id="-1">
+    <w:p>
+      <w:pPr>
+        <w:spacing w:after="0" w:line="240" w:lineRule="auto"/>
+      </w:pPr>
+      <w:r>
+        <w:separator/>
+      </w:r>
+    </w:p>
+  </w:footnote>
+  <w:footnote w:type="continuationSeparator" w:id="0">
+    <w:p>
+      <w:pPr>
+        <w:spacing w:after="0" w:line="240" w:lineRule="auto"/>
+      </w:pPr>
+      <w:r>
+        <w:continuationSeparator/>
+      </w:r>
+    </w:p>
+  </w:footnote>
+</w:footnotes>
 </file>
 
 <file path=word/numbering.xml><?xml version="1.0" encoding="utf-8"?>
@@ -4248,6 +5222,50 @@
       </w:tblBorders>
     </w:tblPr>
   </w:style>
+  <w:style w:type="paragraph" w:styleId="Encabezado">
+    <w:name w:val="header"/>
+    <w:basedOn w:val="Normal"/>
+    <w:link w:val="EncabezadoCar"/>
+    <w:uiPriority w:val="99"/>
+    <w:unhideWhenUsed/>
+    <w:rsid w:val="0030610A"/>
+    <w:pPr>
+      <w:tabs>
+        <w:tab w:val="center" w:pos="4419"/>
+        <w:tab w:val="right" w:pos="8838"/>
+      </w:tabs>
+      <w:spacing w:after="0" w:line="240" w:lineRule="auto"/>
+    </w:pPr>
+  </w:style>
+  <w:style w:type="character" w:customStyle="1" w:styleId="EncabezadoCar">
+    <w:name w:val="Encabezado Car"/>
+    <w:basedOn w:val="Fuentedeprrafopredeter"/>
+    <w:link w:val="Encabezado"/>
+    <w:uiPriority w:val="99"/>
+    <w:rsid w:val="0030610A"/>
+  </w:style>
+  <w:style w:type="paragraph" w:styleId="Piedepgina">
+    <w:name w:val="footer"/>
+    <w:basedOn w:val="Normal"/>
+    <w:link w:val="PiedepginaCar"/>
+    <w:uiPriority w:val="99"/>
+    <w:unhideWhenUsed/>
+    <w:rsid w:val="0030610A"/>
+    <w:pPr>
+      <w:tabs>
+        <w:tab w:val="center" w:pos="4419"/>
+        <w:tab w:val="right" w:pos="8838"/>
+      </w:tabs>
+      <w:spacing w:after="0" w:line="240" w:lineRule="auto"/>
+    </w:pPr>
+  </w:style>
+  <w:style w:type="character" w:customStyle="1" w:styleId="PiedepginaCar">
+    <w:name w:val="Pie de página Car"/>
+    <w:basedOn w:val="Fuentedeprrafopredeter"/>
+    <w:link w:val="Piedepgina"/>
+    <w:uiPriority w:val="99"/>
+    <w:rsid w:val="0030610A"/>
+  </w:style>
 </w:styles>
 </file>
 
@@ -4544,4 +5562,16 @@
     </a:ext>
   </a:extLst>
 </a:theme>
+</file>
+
+<file path=customXml/item1.xml><?xml version="1.0" encoding="utf-8"?>
+<b:Sources xmlns:b="http://schemas.openxmlformats.org/officeDocument/2006/bibliography" xmlns="http://schemas.openxmlformats.org/officeDocument/2006/bibliography" SelectedStyle="\APASixthEditionOfficeOnline.xsl" StyleName="APA" Version="6"/>
+</file>
+
+<file path=customXml/itemProps1.xml><?xml version="1.0" encoding="utf-8"?>
+<ds:datastoreItem xmlns:ds="http://schemas.openxmlformats.org/officeDocument/2006/customXml" ds:itemID="{55A15639-E3BA-469F-B446-8F6FF3A8044A}">
+  <ds:schemaRefs>
+    <ds:schemaRef ds:uri="http://schemas.openxmlformats.org/officeDocument/2006/bibliography"/>
+  </ds:schemaRefs>
+</ds:datastoreItem>
 </file>
</xml_diff>

<commit_message>
Se termina de trabajar agregar_modelos() y se termino eliminar_modelos() (Faltan sus validaciones)
</commit_message>
<xml_diff>
--- a/documentacion/Documentación Externa (Not final).docx
+++ b/documentacion/Documentación Externa (Not final).docx
@@ -2329,21 +2329,7 @@
               <w:rPr>
                 <w:rFonts w:ascii="Times New Roman" w:hAnsi="Times New Roman" w:cs="Times New Roman"/>
               </w:rPr>
-              <w:t xml:space="preserve">Trabaje en el menú principal y plantee la idea de </w:t>
-            </w:r>
-            <w:proofErr w:type="spellStart"/>
-            <w:r>
-              <w:rPr>
-                <w:rFonts w:ascii="Times New Roman" w:hAnsi="Times New Roman" w:cs="Times New Roman"/>
-              </w:rPr>
-              <w:t>como</w:t>
-            </w:r>
-            <w:proofErr w:type="spellEnd"/>
-            <w:r>
-              <w:rPr>
-                <w:rFonts w:ascii="Times New Roman" w:hAnsi="Times New Roman" w:cs="Times New Roman"/>
-              </w:rPr>
-              <w:t xml:space="preserve"> manejar el sistema de usuarios y contraseñas</w:t>
+              <w:t>Trabaje en el menú principal y plantee la idea de como manejar el sistema de usuarios y contraseñas</w:t>
             </w:r>
           </w:p>
         </w:tc>
@@ -3567,6 +3553,55 @@
               </w:rPr>
             </w:pPr>
           </w:p>
+          <w:p>
+            <w:pPr>
+              <w:rPr>
+                <w:rFonts w:ascii="Times New Roman" w:hAnsi="Times New Roman" w:cs="Times New Roman"/>
+              </w:rPr>
+            </w:pPr>
+          </w:p>
+          <w:p>
+            <w:pPr>
+              <w:rPr>
+                <w:rFonts w:ascii="Times New Roman" w:hAnsi="Times New Roman" w:cs="Times New Roman"/>
+              </w:rPr>
+            </w:pPr>
+          </w:p>
+          <w:p>
+            <w:pPr>
+              <w:rPr>
+                <w:rFonts w:ascii="Times New Roman" w:hAnsi="Times New Roman" w:cs="Times New Roman"/>
+              </w:rPr>
+            </w:pPr>
+          </w:p>
+          <w:p>
+            <w:pPr>
+              <w:rPr>
+                <w:rFonts w:ascii="Times New Roman" w:hAnsi="Times New Roman" w:cs="Times New Roman"/>
+              </w:rPr>
+            </w:pPr>
+          </w:p>
+          <w:p>
+            <w:pPr>
+              <w:rPr>
+                <w:rFonts w:ascii="Times New Roman" w:hAnsi="Times New Roman" w:cs="Times New Roman"/>
+              </w:rPr>
+            </w:pPr>
+          </w:p>
+          <w:p>
+            <w:pPr>
+              <w:jc w:val="center"/>
+              <w:rPr>
+                <w:rFonts w:ascii="Times New Roman" w:hAnsi="Times New Roman" w:cs="Times New Roman"/>
+              </w:rPr>
+            </w:pPr>
+            <w:r>
+              <w:rPr>
+                <w:rFonts w:ascii="Times New Roman" w:hAnsi="Times New Roman" w:cs="Times New Roman"/>
+              </w:rPr>
+              <w:t>1/10/2026</w:t>
+            </w:r>
+          </w:p>
         </w:tc>
         <w:tc>
           <w:tcPr>
@@ -3574,6 +3609,160 @@
           </w:tcPr>
           <w:p>
             <w:pPr>
+              <w:jc w:val="center"/>
+              <w:rPr>
+                <w:rFonts w:ascii="Times New Roman" w:hAnsi="Times New Roman" w:cs="Times New Roman"/>
+              </w:rPr>
+            </w:pPr>
+            <w:r>
+              <w:rPr>
+                <w:rFonts w:ascii="Times New Roman" w:hAnsi="Times New Roman" w:cs="Times New Roman"/>
+              </w:rPr>
+              <w:t xml:space="preserve">5:50pm </w:t>
+            </w:r>
+            <w:r>
+              <w:rPr>
+                <w:rFonts w:ascii="Times New Roman" w:hAnsi="Times New Roman" w:cs="Times New Roman"/>
+              </w:rPr>
+              <w:t>–</w:t>
+            </w:r>
+            <w:r>
+              <w:rPr>
+                <w:rFonts w:ascii="Times New Roman" w:hAnsi="Times New Roman" w:cs="Times New Roman"/>
+              </w:rPr>
+              <w:t xml:space="preserve"> </w:t>
+            </w:r>
+            <w:r>
+              <w:rPr>
+                <w:rFonts w:ascii="Times New Roman" w:hAnsi="Times New Roman" w:cs="Times New Roman"/>
+              </w:rPr>
+              <w:t>6:06pm</w:t>
+            </w:r>
+            <w:r>
+              <w:rPr>
+                <w:rFonts w:ascii="Times New Roman" w:hAnsi="Times New Roman" w:cs="Times New Roman"/>
+              </w:rPr>
+              <w:br/>
+              <w:t>(16 minutos)</w:t>
+            </w:r>
+          </w:p>
+          <w:p>
+            <w:pPr>
+              <w:jc w:val="center"/>
+              <w:rPr>
+                <w:rFonts w:ascii="Times New Roman" w:hAnsi="Times New Roman" w:cs="Times New Roman"/>
+              </w:rPr>
+            </w:pPr>
+          </w:p>
+          <w:p>
+            <w:pPr>
+              <w:jc w:val="center"/>
+              <w:rPr>
+                <w:rFonts w:ascii="Times New Roman" w:hAnsi="Times New Roman" w:cs="Times New Roman"/>
+              </w:rPr>
+            </w:pPr>
+          </w:p>
+          <w:p>
+            <w:pPr>
+              <w:jc w:val="center"/>
+              <w:rPr>
+                <w:rFonts w:ascii="Times New Roman" w:hAnsi="Times New Roman" w:cs="Times New Roman"/>
+              </w:rPr>
+            </w:pPr>
+          </w:p>
+          <w:p>
+            <w:pPr>
+              <w:jc w:val="center"/>
+              <w:rPr>
+                <w:rFonts w:ascii="Times New Roman" w:hAnsi="Times New Roman" w:cs="Times New Roman"/>
+              </w:rPr>
+            </w:pPr>
+            <w:r>
+              <w:rPr>
+                <w:rFonts w:ascii="Times New Roman" w:hAnsi="Times New Roman" w:cs="Times New Roman"/>
+              </w:rPr>
+              <w:t xml:space="preserve">6:07pm </w:t>
+            </w:r>
+            <w:r>
+              <w:rPr>
+                <w:rFonts w:ascii="Times New Roman" w:hAnsi="Times New Roman" w:cs="Times New Roman"/>
+              </w:rPr>
+              <w:t>–</w:t>
+            </w:r>
+            <w:r>
+              <w:rPr>
+                <w:rFonts w:ascii="Times New Roman" w:hAnsi="Times New Roman" w:cs="Times New Roman"/>
+              </w:rPr>
+              <w:t xml:space="preserve"> </w:t>
+            </w:r>
+            <w:r>
+              <w:rPr>
+                <w:rFonts w:ascii="Times New Roman" w:hAnsi="Times New Roman" w:cs="Times New Roman"/>
+              </w:rPr>
+              <w:t>6:32pm</w:t>
+            </w:r>
+          </w:p>
+          <w:p>
+            <w:pPr>
+              <w:jc w:val="center"/>
+              <w:rPr>
+                <w:rFonts w:ascii="Times New Roman" w:hAnsi="Times New Roman" w:cs="Times New Roman"/>
+              </w:rPr>
+            </w:pPr>
+            <w:r>
+              <w:rPr>
+                <w:rFonts w:ascii="Times New Roman" w:hAnsi="Times New Roman" w:cs="Times New Roman"/>
+              </w:rPr>
+              <w:t>(25 minutos)</w:t>
+            </w:r>
+          </w:p>
+          <w:p>
+            <w:pPr>
+              <w:jc w:val="center"/>
+              <w:rPr>
+                <w:rFonts w:ascii="Times New Roman" w:hAnsi="Times New Roman" w:cs="Times New Roman"/>
+              </w:rPr>
+            </w:pPr>
+          </w:p>
+          <w:p>
+            <w:pPr>
+              <w:jc w:val="center"/>
+              <w:rPr>
+                <w:rFonts w:ascii="Times New Roman" w:hAnsi="Times New Roman" w:cs="Times New Roman"/>
+              </w:rPr>
+            </w:pPr>
+          </w:p>
+          <w:p>
+            <w:pPr>
+              <w:jc w:val="center"/>
+              <w:rPr>
+                <w:rFonts w:ascii="Times New Roman" w:hAnsi="Times New Roman" w:cs="Times New Roman"/>
+              </w:rPr>
+            </w:pPr>
+          </w:p>
+          <w:p>
+            <w:pPr>
+              <w:jc w:val="center"/>
+              <w:rPr>
+                <w:rFonts w:ascii="Times New Roman" w:hAnsi="Times New Roman" w:cs="Times New Roman"/>
+              </w:rPr>
+            </w:pPr>
+            <w:r>
+              <w:rPr>
+                <w:rFonts w:ascii="Times New Roman" w:hAnsi="Times New Roman" w:cs="Times New Roman"/>
+              </w:rPr>
+              <w:t>9:00pm – 9:37</w:t>
+            </w:r>
+            <w:r>
+              <w:rPr>
+                <w:rFonts w:ascii="Times New Roman" w:hAnsi="Times New Roman" w:cs="Times New Roman"/>
+              </w:rPr>
+              <w:br/>
+              <w:t>(37 minutos)</w:t>
+            </w:r>
+          </w:p>
+          <w:p>
+            <w:pPr>
               <w:rPr>
                 <w:rFonts w:ascii="Times New Roman" w:hAnsi="Times New Roman" w:cs="Times New Roman"/>
               </w:rPr>
@@ -3590,6 +3779,65 @@
                 <w:rFonts w:ascii="Times New Roman" w:hAnsi="Times New Roman" w:cs="Times New Roman"/>
               </w:rPr>
             </w:pPr>
+            <w:r>
+              <w:rPr>
+                <w:rFonts w:ascii="Times New Roman" w:hAnsi="Times New Roman" w:cs="Times New Roman"/>
+              </w:rPr>
+              <w:t>Agregar modelos se termina y ya funciona correctamente</w:t>
+            </w:r>
+          </w:p>
+          <w:p>
+            <w:pPr>
+              <w:rPr>
+                <w:rFonts w:ascii="Times New Roman" w:hAnsi="Times New Roman" w:cs="Times New Roman"/>
+              </w:rPr>
+            </w:pPr>
+          </w:p>
+          <w:p>
+            <w:pPr>
+              <w:rPr>
+                <w:rFonts w:ascii="Times New Roman" w:hAnsi="Times New Roman" w:cs="Times New Roman"/>
+              </w:rPr>
+            </w:pPr>
+          </w:p>
+          <w:p>
+            <w:pPr>
+              <w:rPr>
+                <w:rFonts w:ascii="Times New Roman" w:hAnsi="Times New Roman" w:cs="Times New Roman"/>
+              </w:rPr>
+            </w:pPr>
+            <w:r>
+              <w:rPr>
+                <w:rFonts w:ascii="Times New Roman" w:hAnsi="Times New Roman" w:cs="Times New Roman"/>
+              </w:rPr>
+              <w:t>Se agrega la función de eliminar modelos a media, se guarda lo que queremos, pero aún no borramos lo que no queremos</w:t>
+            </w:r>
+            <w:r>
+              <w:rPr>
+                <w:rFonts w:ascii="Times New Roman" w:hAnsi="Times New Roman" w:cs="Times New Roman"/>
+              </w:rPr>
+              <w:t>.</w:t>
+            </w:r>
+          </w:p>
+          <w:p>
+            <w:pPr>
+              <w:rPr>
+                <w:rFonts w:ascii="Times New Roman" w:hAnsi="Times New Roman" w:cs="Times New Roman"/>
+              </w:rPr>
+            </w:pPr>
+          </w:p>
+          <w:p>
+            <w:pPr>
+              <w:rPr>
+                <w:rFonts w:ascii="Times New Roman" w:hAnsi="Times New Roman" w:cs="Times New Roman"/>
+              </w:rPr>
+            </w:pPr>
+            <w:r>
+              <w:rPr>
+                <w:rFonts w:ascii="Times New Roman" w:hAnsi="Times New Roman" w:cs="Times New Roman"/>
+              </w:rPr>
+              <w:t>Se termino la función de eliminar modelos y se corrigieron sus errores.</w:t>
+            </w:r>
           </w:p>
         </w:tc>
       </w:tr>

</xml_diff>

<commit_message>
Se agrego la función modificar_modelos() y se ordeno un poco mejor el código (Separar Menus de las funciones)
</commit_message>
<xml_diff>
--- a/documentacion/Documentación Externa (Not final).docx
+++ b/documentacion/Documentación Externa (Not final).docx
@@ -3851,10 +3851,65 @@
           </w:tcPr>
           <w:p>
             <w:pPr>
-              <w:rPr>
-                <w:rFonts w:ascii="Times New Roman" w:hAnsi="Times New Roman" w:cs="Times New Roman"/>
-              </w:rPr>
-            </w:pPr>
+              <w:jc w:val="center"/>
+              <w:rPr>
+                <w:rFonts w:ascii="Times New Roman" w:hAnsi="Times New Roman" w:cs="Times New Roman"/>
+              </w:rPr>
+            </w:pPr>
+          </w:p>
+          <w:p>
+            <w:pPr>
+              <w:jc w:val="center"/>
+              <w:rPr>
+                <w:rFonts w:ascii="Times New Roman" w:hAnsi="Times New Roman" w:cs="Times New Roman"/>
+              </w:rPr>
+            </w:pPr>
+          </w:p>
+          <w:p>
+            <w:pPr>
+              <w:jc w:val="center"/>
+              <w:rPr>
+                <w:rFonts w:ascii="Times New Roman" w:hAnsi="Times New Roman" w:cs="Times New Roman"/>
+              </w:rPr>
+            </w:pPr>
+          </w:p>
+          <w:p>
+            <w:pPr>
+              <w:jc w:val="center"/>
+              <w:rPr>
+                <w:rFonts w:ascii="Times New Roman" w:hAnsi="Times New Roman" w:cs="Times New Roman"/>
+              </w:rPr>
+            </w:pPr>
+          </w:p>
+          <w:p>
+            <w:pPr>
+              <w:jc w:val="center"/>
+              <w:rPr>
+                <w:rFonts w:ascii="Times New Roman" w:hAnsi="Times New Roman" w:cs="Times New Roman"/>
+              </w:rPr>
+            </w:pPr>
+          </w:p>
+          <w:p>
+            <w:pPr>
+              <w:jc w:val="center"/>
+              <w:rPr>
+                <w:rFonts w:ascii="Times New Roman" w:hAnsi="Times New Roman" w:cs="Times New Roman"/>
+              </w:rPr>
+            </w:pPr>
+          </w:p>
+          <w:p>
+            <w:pPr>
+              <w:jc w:val="center"/>
+              <w:rPr>
+                <w:rFonts w:ascii="Times New Roman" w:hAnsi="Times New Roman" w:cs="Times New Roman"/>
+              </w:rPr>
+            </w:pPr>
+            <w:r>
+              <w:rPr>
+                <w:rFonts w:ascii="Times New Roman" w:hAnsi="Times New Roman" w:cs="Times New Roman"/>
+              </w:rPr>
+              <w:t>2/10/2026</w:t>
+            </w:r>
           </w:p>
         </w:tc>
         <w:tc>
@@ -3863,10 +3918,65 @@
           </w:tcPr>
           <w:p>
             <w:pPr>
-              <w:rPr>
-                <w:rFonts w:ascii="Times New Roman" w:hAnsi="Times New Roman" w:cs="Times New Roman"/>
-              </w:rPr>
-            </w:pPr>
+              <w:jc w:val="center"/>
+              <w:rPr>
+                <w:rFonts w:ascii="Times New Roman" w:hAnsi="Times New Roman" w:cs="Times New Roman"/>
+              </w:rPr>
+            </w:pPr>
+          </w:p>
+          <w:p>
+            <w:pPr>
+              <w:jc w:val="center"/>
+              <w:rPr>
+                <w:rFonts w:ascii="Times New Roman" w:hAnsi="Times New Roman" w:cs="Times New Roman"/>
+              </w:rPr>
+            </w:pPr>
+          </w:p>
+          <w:p>
+            <w:pPr>
+              <w:jc w:val="center"/>
+              <w:rPr>
+                <w:rFonts w:ascii="Times New Roman" w:hAnsi="Times New Roman" w:cs="Times New Roman"/>
+              </w:rPr>
+            </w:pPr>
+            <w:r>
+              <w:rPr>
+                <w:rFonts w:ascii="Times New Roman" w:hAnsi="Times New Roman" w:cs="Times New Roman"/>
+              </w:rPr>
+              <w:t xml:space="preserve">9:08am </w:t>
+            </w:r>
+            <w:r>
+              <w:rPr>
+                <w:rFonts w:ascii="Times New Roman" w:hAnsi="Times New Roman" w:cs="Times New Roman"/>
+              </w:rPr>
+              <w:t>–</w:t>
+            </w:r>
+            <w:r>
+              <w:rPr>
+                <w:rFonts w:ascii="Times New Roman" w:hAnsi="Times New Roman" w:cs="Times New Roman"/>
+              </w:rPr>
+              <w:t xml:space="preserve"> </w:t>
+            </w:r>
+            <w:r>
+              <w:rPr>
+                <w:rFonts w:ascii="Times New Roman" w:hAnsi="Times New Roman" w:cs="Times New Roman"/>
+              </w:rPr>
+              <w:t>9:35am</w:t>
+            </w:r>
+          </w:p>
+          <w:p>
+            <w:pPr>
+              <w:jc w:val="center"/>
+              <w:rPr>
+                <w:rFonts w:ascii="Times New Roman" w:hAnsi="Times New Roman" w:cs="Times New Roman"/>
+              </w:rPr>
+            </w:pPr>
+            <w:r>
+              <w:rPr>
+                <w:rFonts w:ascii="Times New Roman" w:hAnsi="Times New Roman" w:cs="Times New Roman"/>
+              </w:rPr>
+              <w:t>(27 minutos)</w:t>
+            </w:r>
           </w:p>
         </w:tc>
         <w:tc>
@@ -3879,6 +3989,12 @@
                 <w:rFonts w:ascii="Times New Roman" w:hAnsi="Times New Roman" w:cs="Times New Roman"/>
               </w:rPr>
             </w:pPr>
+            <w:r>
+              <w:rPr>
+                <w:rFonts w:ascii="Times New Roman" w:hAnsi="Times New Roman" w:cs="Times New Roman"/>
+              </w:rPr>
+              <w:t>Se crea la función de modificar un modelo, también se intento darle una vista más ordenada al código.</w:t>
+            </w:r>
           </w:p>
         </w:tc>
       </w:tr>

</xml_diff>

<commit_message>
Se agrega la función mostrar_modelos() y se completa todo el apartado de modelos en el menú de administración
</commit_message>
<xml_diff>
--- a/documentacion/Documentación Externa (Not final).docx
+++ b/documentacion/Documentación Externa (Not final).docx
@@ -2329,7 +2329,21 @@
               <w:rPr>
                 <w:rFonts w:ascii="Times New Roman" w:hAnsi="Times New Roman" w:cs="Times New Roman"/>
               </w:rPr>
-              <w:t>Trabaje en el menú principal y plantee la idea de como manejar el sistema de usuarios y contraseñas</w:t>
+              <w:t xml:space="preserve">Trabaje en el menú principal y plantee la idea de </w:t>
+            </w:r>
+            <w:proofErr w:type="spellStart"/>
+            <w:r>
+              <w:rPr>
+                <w:rFonts w:ascii="Times New Roman" w:hAnsi="Times New Roman" w:cs="Times New Roman"/>
+              </w:rPr>
+              <w:t>como</w:t>
+            </w:r>
+            <w:proofErr w:type="spellEnd"/>
+            <w:r>
+              <w:rPr>
+                <w:rFonts w:ascii="Times New Roman" w:hAnsi="Times New Roman" w:cs="Times New Roman"/>
+              </w:rPr>
+              <w:t xml:space="preserve"> manejar el sistema de usuarios y contraseñas</w:t>
             </w:r>
           </w:p>
         </w:tc>
@@ -3921,45 +3935,52 @@
               <w:jc w:val="center"/>
               <w:rPr>
                 <w:rFonts w:ascii="Times New Roman" w:hAnsi="Times New Roman" w:cs="Times New Roman"/>
-              </w:rPr>
-            </w:pPr>
-          </w:p>
-          <w:p>
-            <w:pPr>
-              <w:jc w:val="center"/>
-              <w:rPr>
-                <w:rFonts w:ascii="Times New Roman" w:hAnsi="Times New Roman" w:cs="Times New Roman"/>
-              </w:rPr>
-            </w:pPr>
-          </w:p>
-          <w:p>
-            <w:pPr>
-              <w:jc w:val="center"/>
-              <w:rPr>
-                <w:rFonts w:ascii="Times New Roman" w:hAnsi="Times New Roman" w:cs="Times New Roman"/>
-              </w:rPr>
-            </w:pPr>
-            <w:r>
-              <w:rPr>
-                <w:rFonts w:ascii="Times New Roman" w:hAnsi="Times New Roman" w:cs="Times New Roman"/>
+                <w:lang w:val="en-US"/>
+              </w:rPr>
+            </w:pPr>
+          </w:p>
+          <w:p>
+            <w:pPr>
+              <w:jc w:val="center"/>
+              <w:rPr>
+                <w:rFonts w:ascii="Times New Roman" w:hAnsi="Times New Roman" w:cs="Times New Roman"/>
+                <w:lang w:val="en-US"/>
+              </w:rPr>
+            </w:pPr>
+          </w:p>
+          <w:p>
+            <w:pPr>
+              <w:jc w:val="center"/>
+              <w:rPr>
+                <w:rFonts w:ascii="Times New Roman" w:hAnsi="Times New Roman" w:cs="Times New Roman"/>
+                <w:lang w:val="en-US"/>
+              </w:rPr>
+            </w:pPr>
+            <w:r>
+              <w:rPr>
+                <w:rFonts w:ascii="Times New Roman" w:hAnsi="Times New Roman" w:cs="Times New Roman"/>
+                <w:lang w:val="en-US"/>
               </w:rPr>
               <w:t xml:space="preserve">9:08am </w:t>
             </w:r>
             <w:r>
               <w:rPr>
                 <w:rFonts w:ascii="Times New Roman" w:hAnsi="Times New Roman" w:cs="Times New Roman"/>
+                <w:lang w:val="en-US"/>
               </w:rPr>
               <w:t>–</w:t>
             </w:r>
             <w:r>
               <w:rPr>
                 <w:rFonts w:ascii="Times New Roman" w:hAnsi="Times New Roman" w:cs="Times New Roman"/>
+                <w:lang w:val="en-US"/>
               </w:rPr>
               <w:t xml:space="preserve"> </w:t>
             </w:r>
             <w:r>
               <w:rPr>
                 <w:rFonts w:ascii="Times New Roman" w:hAnsi="Times New Roman" w:cs="Times New Roman"/>
+                <w:lang w:val="en-US"/>
               </w:rPr>
               <w:t>9:35am</w:t>
             </w:r>
@@ -3969,13 +3990,122 @@
               <w:jc w:val="center"/>
               <w:rPr>
                 <w:rFonts w:ascii="Times New Roman" w:hAnsi="Times New Roman" w:cs="Times New Roman"/>
-              </w:rPr>
-            </w:pPr>
-            <w:r>
-              <w:rPr>
-                <w:rFonts w:ascii="Times New Roman" w:hAnsi="Times New Roman" w:cs="Times New Roman"/>
+                <w:lang w:val="en-US"/>
+              </w:rPr>
+            </w:pPr>
+            <w:r>
+              <w:rPr>
+                <w:rFonts w:ascii="Times New Roman" w:hAnsi="Times New Roman" w:cs="Times New Roman"/>
+                <w:lang w:val="en-US"/>
               </w:rPr>
               <w:t>(27 minutos)</w:t>
+            </w:r>
+          </w:p>
+          <w:p>
+            <w:pPr>
+              <w:jc w:val="center"/>
+              <w:rPr>
+                <w:rFonts w:ascii="Times New Roman" w:hAnsi="Times New Roman" w:cs="Times New Roman"/>
+                <w:lang w:val="en-US"/>
+              </w:rPr>
+            </w:pPr>
+          </w:p>
+          <w:p>
+            <w:pPr>
+              <w:jc w:val="center"/>
+              <w:rPr>
+                <w:rFonts w:ascii="Times New Roman" w:hAnsi="Times New Roman" w:cs="Times New Roman"/>
+                <w:lang w:val="en-US"/>
+              </w:rPr>
+            </w:pPr>
+          </w:p>
+          <w:p>
+            <w:pPr>
+              <w:jc w:val="center"/>
+              <w:rPr>
+                <w:rFonts w:ascii="Times New Roman" w:hAnsi="Times New Roman" w:cs="Times New Roman"/>
+                <w:lang w:val="en-US"/>
+              </w:rPr>
+            </w:pPr>
+          </w:p>
+          <w:p>
+            <w:pPr>
+              <w:jc w:val="center"/>
+              <w:rPr>
+                <w:rFonts w:ascii="Times New Roman" w:hAnsi="Times New Roman" w:cs="Times New Roman"/>
+                <w:lang w:val="en-US"/>
+              </w:rPr>
+            </w:pPr>
+          </w:p>
+          <w:p>
+            <w:pPr>
+              <w:jc w:val="center"/>
+              <w:rPr>
+                <w:rFonts w:ascii="Times New Roman" w:hAnsi="Times New Roman" w:cs="Times New Roman"/>
+                <w:lang w:val="en-US"/>
+              </w:rPr>
+            </w:pPr>
+          </w:p>
+          <w:p>
+            <w:pPr>
+              <w:jc w:val="center"/>
+              <w:rPr>
+                <w:rFonts w:ascii="Times New Roman" w:hAnsi="Times New Roman" w:cs="Times New Roman"/>
+                <w:lang w:val="en-US"/>
+              </w:rPr>
+            </w:pPr>
+          </w:p>
+          <w:p>
+            <w:pPr>
+              <w:jc w:val="center"/>
+              <w:rPr>
+                <w:rFonts w:ascii="Times New Roman" w:hAnsi="Times New Roman" w:cs="Times New Roman"/>
+                <w:lang w:val="en-US"/>
+              </w:rPr>
+            </w:pPr>
+            <w:r>
+              <w:rPr>
+                <w:rFonts w:ascii="Times New Roman" w:hAnsi="Times New Roman" w:cs="Times New Roman"/>
+                <w:lang w:val="en-US"/>
+              </w:rPr>
+              <w:t xml:space="preserve">10:00am </w:t>
+            </w:r>
+            <w:r>
+              <w:rPr>
+                <w:rFonts w:ascii="Times New Roman" w:hAnsi="Times New Roman" w:cs="Times New Roman"/>
+                <w:lang w:val="en-US"/>
+              </w:rPr>
+              <w:t>– 10:40</w:t>
+            </w:r>
+            <w:r>
+              <w:rPr>
+                <w:rFonts w:ascii="Times New Roman" w:hAnsi="Times New Roman" w:cs="Times New Roman"/>
+                <w:lang w:val="en-US"/>
+              </w:rPr>
+              <w:t>am</w:t>
+            </w:r>
+          </w:p>
+          <w:p>
+            <w:pPr>
+              <w:jc w:val="center"/>
+              <w:rPr>
+                <w:rFonts w:ascii="Times New Roman" w:hAnsi="Times New Roman" w:cs="Times New Roman"/>
+                <w:lang w:val="en-US"/>
+              </w:rPr>
+            </w:pPr>
+            <w:r>
+              <w:rPr>
+                <w:rFonts w:ascii="Times New Roman" w:hAnsi="Times New Roman" w:cs="Times New Roman"/>
+                <w:lang w:val="en-US"/>
+              </w:rPr>
+              <w:t>(40 minutos)</w:t>
+            </w:r>
+            <w:r>
+              <w:rPr>
+                <w:rFonts w:ascii="Times New Roman" w:hAnsi="Times New Roman" w:cs="Times New Roman"/>
+                <w:lang w:val="en-US"/>
+              </w:rPr>
+              <w:t xml:space="preserve"> </w:t>
             </w:r>
           </w:p>
         </w:tc>
@@ -3993,8 +4123,74 @@
               <w:rPr>
                 <w:rFonts w:ascii="Times New Roman" w:hAnsi="Times New Roman" w:cs="Times New Roman"/>
               </w:rPr>
-              <w:t>Se crea la función de modificar un modelo, también se intento darle una vista más ordenada al código.</w:t>
-            </w:r>
+              <w:t xml:space="preserve">Se crea la función de modificar un modelo, también se </w:t>
+            </w:r>
+            <w:r>
+              <w:rPr>
+                <w:rFonts w:ascii="Times New Roman" w:hAnsi="Times New Roman" w:cs="Times New Roman"/>
+              </w:rPr>
+              <w:t>intentó</w:t>
+            </w:r>
+            <w:r>
+              <w:rPr>
+                <w:rFonts w:ascii="Times New Roman" w:hAnsi="Times New Roman" w:cs="Times New Roman"/>
+              </w:rPr>
+              <w:t xml:space="preserve"> darle una vista más ordenada al código.</w:t>
+            </w:r>
+          </w:p>
+          <w:p>
+            <w:pPr>
+              <w:rPr>
+                <w:rFonts w:ascii="Times New Roman" w:hAnsi="Times New Roman" w:cs="Times New Roman"/>
+              </w:rPr>
+            </w:pPr>
+          </w:p>
+          <w:p>
+            <w:pPr>
+              <w:rPr>
+                <w:rFonts w:ascii="Times New Roman" w:hAnsi="Times New Roman" w:cs="Times New Roman"/>
+              </w:rPr>
+            </w:pPr>
+          </w:p>
+          <w:p>
+            <w:pPr>
+              <w:rPr>
+                <w:rFonts w:ascii="Times New Roman" w:hAnsi="Times New Roman" w:cs="Times New Roman"/>
+              </w:rPr>
+            </w:pPr>
+            <w:r>
+              <w:rPr>
+                <w:rFonts w:ascii="Times New Roman" w:hAnsi="Times New Roman" w:cs="Times New Roman"/>
+              </w:rPr>
+              <w:t>Se termina la función de mostrar los modelos y se conectan todas al menú de manera que cada una sirva y puedan trabajar juntas.</w:t>
+            </w:r>
+          </w:p>
+          <w:p>
+            <w:pPr>
+              <w:rPr>
+                <w:rFonts w:ascii="Times New Roman" w:hAnsi="Times New Roman" w:cs="Times New Roman"/>
+              </w:rPr>
+            </w:pPr>
+            <w:r>
+              <w:rPr>
+                <w:rFonts w:ascii="Times New Roman" w:hAnsi="Times New Roman" w:cs="Times New Roman"/>
+              </w:rPr>
+              <w:t>(FALTA VALIDAR CASOS)</w:t>
+            </w:r>
+          </w:p>
+          <w:p>
+            <w:pPr>
+              <w:rPr>
+                <w:rFonts w:ascii="Times New Roman" w:hAnsi="Times New Roman" w:cs="Times New Roman"/>
+              </w:rPr>
+            </w:pPr>
+          </w:p>
+          <w:p>
+            <w:pPr>
+              <w:rPr>
+                <w:rFonts w:ascii="Times New Roman" w:hAnsi="Times New Roman" w:cs="Times New Roman"/>
+              </w:rPr>
+            </w:pPr>
           </w:p>
         </w:tc>
       </w:tr>

</xml_diff>

<commit_message>
Se mejora la documnetación externa y se termina la función de incluir unidades
</commit_message>
<xml_diff>
--- a/documentacion/Documentación Externa (Not final).docx
+++ b/documentacion/Documentación Externa (Not final).docx
@@ -15,7 +15,9 @@
           <w:lang w:val="es-ES"/>
         </w:rPr>
       </w:pPr>
-      <w:r>
+    </w:p>
+    <w:p>
+      <w:pPr>
         <w:rPr>
           <w:rFonts w:ascii="Times New Roman" w:hAnsi="Times New Roman" w:cs="Times New Roman"/>
           <w:b/>
@@ -26,7 +28,67 @@
           <w:szCs w:val="32"/>
           <w:lang w:val="es-ES"/>
         </w:rPr>
-        <w:t>Instituto Tecnológico de Costa Rica</w:t>
+      </w:pPr>
+      <w:r>
+        <w:rPr>
+          <w:rFonts w:ascii="Times New Roman" w:hAnsi="Times New Roman" w:cs="Times New Roman"/>
+          <w:b/>
+          <w:bCs/>
+          <w:i/>
+          <w:iCs/>
+          <w:noProof/>
+          <w:sz w:val="32"/>
+          <w:szCs w:val="32"/>
+          <w:lang w:val="es-ES"/>
+        </w:rPr>
+        <w:drawing>
+          <wp:inline distT="0" distB="0" distL="0" distR="0" wp14:anchorId="5CD762C7" wp14:editId="503015F4">
+            <wp:extent cx="5612130" cy="1304290"/>
+            <wp:effectExtent l="0" t="0" r="7620" b="0"/>
+            <wp:docPr id="1" name="Imagen 1"/>
+            <wp:cNvGraphicFramePr>
+              <a:graphicFrameLocks xmlns:a="http://schemas.openxmlformats.org/drawingml/2006/main" noChangeAspect="1"/>
+            </wp:cNvGraphicFramePr>
+            <a:graphic xmlns:a="http://schemas.openxmlformats.org/drawingml/2006/main">
+              <a:graphicData uri="http://schemas.openxmlformats.org/drawingml/2006/picture">
+                <pic:pic xmlns:pic="http://schemas.openxmlformats.org/drawingml/2006/picture">
+                  <pic:nvPicPr>
+                    <pic:cNvPr id="0" name="Picture 1"/>
+                    <pic:cNvPicPr>
+                      <a:picLocks noChangeAspect="1" noChangeArrowheads="1"/>
+                    </pic:cNvPicPr>
+                  </pic:nvPicPr>
+                  <pic:blipFill>
+                    <a:blip r:embed="rId8">
+                      <a:extLst>
+                        <a:ext uri="{28A0092B-C50C-407E-A947-70E740481C1C}">
+                          <a14:useLocalDpi xmlns:a14="http://schemas.microsoft.com/office/drawing/2010/main" val="0"/>
+                        </a:ext>
+                      </a:extLst>
+                    </a:blip>
+                    <a:srcRect/>
+                    <a:stretch>
+                      <a:fillRect/>
+                    </a:stretch>
+                  </pic:blipFill>
+                  <pic:spPr bwMode="auto">
+                    <a:xfrm>
+                      <a:off x="0" y="0"/>
+                      <a:ext cx="5612130" cy="1304290"/>
+                    </a:xfrm>
+                    <a:prstGeom prst="rect">
+                      <a:avLst/>
+                    </a:prstGeom>
+                    <a:noFill/>
+                    <a:ln>
+                      <a:noFill/>
+                    </a:ln>
+                  </pic:spPr>
+                </pic:pic>
+              </a:graphicData>
+            </a:graphic>
+          </wp:inline>
+        </w:drawing>
       </w:r>
     </w:p>
     <w:p>
@@ -42,7 +104,9 @@
           <w:lang w:val="es-ES"/>
         </w:rPr>
       </w:pPr>
-      <w:r>
+    </w:p>
+    <w:p>
+      <w:pPr>
         <w:rPr>
           <w:rFonts w:ascii="Times New Roman" w:hAnsi="Times New Roman" w:cs="Times New Roman"/>
           <w:b/>
@@ -53,11 +117,11 @@
           <w:szCs w:val="32"/>
           <w:lang w:val="es-ES"/>
         </w:rPr>
-        <w:t>II Semestre, 2026</w:t>
-      </w:r>
-    </w:p>
-    <w:p>
-      <w:pPr>
+      </w:pPr>
+    </w:p>
+    <w:p>
+      <w:pPr>
+        <w:jc w:val="center"/>
         <w:rPr>
           <w:rFonts w:ascii="Times New Roman" w:hAnsi="Times New Roman" w:cs="Times New Roman"/>
           <w:b/>
@@ -80,11 +144,12 @@
           <w:szCs w:val="32"/>
           <w:lang w:val="es-ES"/>
         </w:rPr>
-        <w:t xml:space="preserve">Taller de Programación </w:t>
-      </w:r>
-    </w:p>
-    <w:p>
-      <w:pPr>
+        <w:t>II Semestre, 2026</w:t>
+      </w:r>
+    </w:p>
+    <w:p>
+      <w:pPr>
+        <w:jc w:val="center"/>
         <w:rPr>
           <w:rFonts w:ascii="Times New Roman" w:hAnsi="Times New Roman" w:cs="Times New Roman"/>
           <w:b/>
@@ -107,22 +172,12 @@
           <w:szCs w:val="32"/>
           <w:lang w:val="es-ES"/>
         </w:rPr>
-        <w:t>Proyecto #1 – Sistema de Gestión de Transporte Público</w:t>
-      </w:r>
-    </w:p>
-    <w:p>
-      <w:pPr>
-        <w:rPr>
-          <w:rFonts w:ascii="Times New Roman" w:hAnsi="Times New Roman" w:cs="Times New Roman"/>
-          <w:b/>
-          <w:bCs/>
-          <w:i/>
-          <w:iCs/>
-          <w:sz w:val="32"/>
-          <w:szCs w:val="32"/>
-        </w:rPr>
-      </w:pPr>
-      <w:r>
+        <w:t>Taller de Programación</w:t>
+      </w:r>
+    </w:p>
+    <w:p>
+      <w:pPr>
+        <w:jc w:val="center"/>
         <w:rPr>
           <w:rFonts w:ascii="Times New Roman" w:hAnsi="Times New Roman" w:cs="Times New Roman"/>
           <w:b/>
@@ -133,36 +188,19 @@
           <w:szCs w:val="32"/>
           <w:lang w:val="es-ES"/>
         </w:rPr>
-        <w:t>Profesor</w:t>
-      </w:r>
-      <w:r>
-        <w:rPr>
-          <w:rFonts w:ascii="Times New Roman" w:hAnsi="Times New Roman" w:cs="Times New Roman"/>
+      </w:pPr>
+      <w:r>
+        <w:rPr>
+          <w:rFonts w:ascii="Times New Roman" w:hAnsi="Times New Roman" w:cs="Times New Roman"/>
+          <w:b/>
+          <w:bCs/>
           <w:i/>
           <w:iCs/>
           <w:sz w:val="32"/>
           <w:szCs w:val="32"/>
           <w:lang w:val="es-ES"/>
         </w:rPr>
-        <w:t xml:space="preserve">: </w:t>
-      </w:r>
-      <w:r>
-        <w:rPr>
-          <w:rFonts w:ascii="Times New Roman" w:hAnsi="Times New Roman" w:cs="Times New Roman"/>
-          <w:i/>
-          <w:iCs/>
-          <w:sz w:val="32"/>
-          <w:szCs w:val="32"/>
-        </w:rPr>
-        <w:t xml:space="preserve"> </w:t>
-      </w:r>
-      <w:r>
-        <w:rPr>
-          <w:rFonts w:ascii="Times New Roman" w:hAnsi="Times New Roman" w:cs="Times New Roman"/>
-          <w:sz w:val="32"/>
-          <w:szCs w:val="32"/>
-        </w:rPr>
-        <w:t>Ing. Jean Carlos Miranda Fajardo</w:t>
+        <w:t>Proyecto #1 – Sistema de Gestión de Transporte Público</w:t>
       </w:r>
     </w:p>
     <w:p>
@@ -183,14 +221,6 @@
       <w:pPr>
         <w:rPr>
           <w:rFonts w:ascii="Times New Roman" w:hAnsi="Times New Roman" w:cs="Times New Roman"/>
-          <w:sz w:val="32"/>
-          <w:szCs w:val="32"/>
-          <w:lang w:val="es-ES"/>
-        </w:rPr>
-      </w:pPr>
-      <w:r>
-        <w:rPr>
-          <w:rFonts w:ascii="Times New Roman" w:hAnsi="Times New Roman" w:cs="Times New Roman"/>
           <w:b/>
           <w:bCs/>
           <w:i/>
@@ -199,28 +229,10 @@
           <w:szCs w:val="32"/>
           <w:lang w:val="es-ES"/>
         </w:rPr>
-        <w:t xml:space="preserve">Estudiante: </w:t>
-      </w:r>
-      <w:r>
-        <w:rPr>
-          <w:rFonts w:ascii="Times New Roman" w:hAnsi="Times New Roman" w:cs="Times New Roman"/>
-          <w:sz w:val="32"/>
-          <w:szCs w:val="32"/>
-          <w:lang w:val="es-ES"/>
-        </w:rPr>
-        <w:t>Kristian Araya Valverde</w:t>
-      </w:r>
-    </w:p>
-    <w:p>
-      <w:pPr>
-        <w:rPr>
-          <w:rFonts w:ascii="Times New Roman" w:hAnsi="Times New Roman" w:cs="Times New Roman"/>
-          <w:sz w:val="32"/>
-          <w:szCs w:val="32"/>
-          <w:lang w:val="es-ES"/>
-        </w:rPr>
-      </w:pPr>
-      <w:r>
+      </w:pPr>
+    </w:p>
+    <w:p>
+      <w:pPr>
         <w:rPr>
           <w:rFonts w:ascii="Times New Roman" w:hAnsi="Times New Roman" w:cs="Times New Roman"/>
           <w:b/>
@@ -231,22 +243,30 @@
           <w:szCs w:val="32"/>
           <w:lang w:val="es-ES"/>
         </w:rPr>
-        <w:t xml:space="preserve">Carné: </w:t>
-      </w:r>
-      <w:r>
-        <w:rPr>
-          <w:rFonts w:ascii="Times New Roman" w:hAnsi="Times New Roman" w:cs="Times New Roman"/>
+      </w:pPr>
+    </w:p>
+    <w:p>
+      <w:pPr>
+        <w:rPr>
+          <w:rFonts w:ascii="Times New Roman" w:hAnsi="Times New Roman" w:cs="Times New Roman"/>
+          <w:b/>
+          <w:bCs/>
+          <w:i/>
+          <w:iCs/>
           <w:sz w:val="32"/>
           <w:szCs w:val="32"/>
           <w:lang w:val="es-ES"/>
         </w:rPr>
-        <w:t>2026094656</w:t>
-      </w:r>
-    </w:p>
-    <w:p>
-      <w:pPr>
-        <w:rPr>
-          <w:rFonts w:ascii="Times New Roman" w:hAnsi="Times New Roman" w:cs="Times New Roman"/>
+      </w:pPr>
+    </w:p>
+    <w:p>
+      <w:pPr>
+        <w:rPr>
+          <w:rFonts w:ascii="Times New Roman" w:hAnsi="Times New Roman" w:cs="Times New Roman"/>
+          <w:b/>
+          <w:bCs/>
+          <w:i/>
+          <w:iCs/>
           <w:sz w:val="32"/>
           <w:szCs w:val="32"/>
           <w:lang w:val="es-ES"/>
@@ -257,6 +277,10 @@
       <w:pPr>
         <w:rPr>
           <w:rFonts w:ascii="Times New Roman" w:hAnsi="Times New Roman" w:cs="Times New Roman"/>
+          <w:b/>
+          <w:bCs/>
+          <w:i/>
+          <w:iCs/>
           <w:sz w:val="32"/>
           <w:szCs w:val="32"/>
           <w:lang w:val="es-ES"/>
@@ -267,6 +291,10 @@
       <w:pPr>
         <w:rPr>
           <w:rFonts w:ascii="Times New Roman" w:hAnsi="Times New Roman" w:cs="Times New Roman"/>
+          <w:b/>
+          <w:bCs/>
+          <w:i/>
+          <w:iCs/>
           <w:sz w:val="32"/>
           <w:szCs w:val="32"/>
           <w:lang w:val="es-ES"/>
@@ -277,6 +305,10 @@
       <w:pPr>
         <w:rPr>
           <w:rFonts w:ascii="Times New Roman" w:hAnsi="Times New Roman" w:cs="Times New Roman"/>
+          <w:b/>
+          <w:bCs/>
+          <w:i/>
+          <w:iCs/>
           <w:sz w:val="32"/>
           <w:szCs w:val="32"/>
           <w:lang w:val="es-ES"/>
@@ -287,6 +319,10 @@
       <w:pPr>
         <w:rPr>
           <w:rFonts w:ascii="Times New Roman" w:hAnsi="Times New Roman" w:cs="Times New Roman"/>
+          <w:b/>
+          <w:bCs/>
+          <w:i/>
+          <w:iCs/>
           <w:sz w:val="32"/>
           <w:szCs w:val="32"/>
           <w:lang w:val="es-ES"/>
@@ -295,26 +331,63 @@
     </w:p>
     <w:p>
       <w:pPr>
-        <w:rPr>
-          <w:rFonts w:ascii="Times New Roman" w:hAnsi="Times New Roman" w:cs="Times New Roman"/>
+        <w:jc w:val="center"/>
+        <w:rPr>
+          <w:rFonts w:ascii="Times New Roman" w:hAnsi="Times New Roman" w:cs="Times New Roman"/>
+          <w:b/>
+          <w:bCs/>
+          <w:i/>
+          <w:iCs/>
+          <w:sz w:val="32"/>
+          <w:szCs w:val="32"/>
+        </w:rPr>
+      </w:pPr>
+      <w:r>
+        <w:rPr>
+          <w:rFonts w:ascii="Times New Roman" w:hAnsi="Times New Roman" w:cs="Times New Roman"/>
+          <w:b/>
+          <w:bCs/>
+          <w:i/>
+          <w:iCs/>
           <w:sz w:val="32"/>
           <w:szCs w:val="32"/>
           <w:lang w:val="es-ES"/>
         </w:rPr>
-      </w:pPr>
-    </w:p>
-    <w:p>
-      <w:pPr>
-        <w:rPr>
-          <w:rFonts w:ascii="Times New Roman" w:hAnsi="Times New Roman" w:cs="Times New Roman"/>
+        <w:t>Profesor</w:t>
+      </w:r>
+      <w:r>
+        <w:rPr>
+          <w:rFonts w:ascii="Times New Roman" w:hAnsi="Times New Roman" w:cs="Times New Roman"/>
+          <w:i/>
+          <w:iCs/>
           <w:sz w:val="32"/>
           <w:szCs w:val="32"/>
           <w:lang w:val="es-ES"/>
         </w:rPr>
-      </w:pPr>
-    </w:p>
-    <w:p>
-      <w:pPr>
+        <w:t xml:space="preserve">: </w:t>
+      </w:r>
+      <w:r>
+        <w:rPr>
+          <w:rFonts w:ascii="Times New Roman" w:hAnsi="Times New Roman" w:cs="Times New Roman"/>
+          <w:i/>
+          <w:iCs/>
+          <w:sz w:val="32"/>
+          <w:szCs w:val="32"/>
+        </w:rPr>
+        <w:t xml:space="preserve"> </w:t>
+      </w:r>
+      <w:r>
+        <w:rPr>
+          <w:rFonts w:ascii="Times New Roman" w:hAnsi="Times New Roman" w:cs="Times New Roman"/>
+          <w:sz w:val="32"/>
+          <w:szCs w:val="32"/>
+        </w:rPr>
+        <w:t>Ing. Jean Carlos Miranda Fajardo</w:t>
+      </w:r>
+    </w:p>
+    <w:p>
+      <w:pPr>
+        <w:jc w:val="center"/>
         <w:rPr>
           <w:rFonts w:ascii="Times New Roman" w:hAnsi="Times New Roman" w:cs="Times New Roman"/>
           <w:sz w:val="32"/>
@@ -322,29 +395,32 @@
           <w:lang w:val="es-ES"/>
         </w:rPr>
       </w:pPr>
-    </w:p>
-    <w:p>
-      <w:pPr>
-        <w:rPr>
-          <w:rFonts w:ascii="Times New Roman" w:hAnsi="Times New Roman" w:cs="Times New Roman"/>
+      <w:r>
+        <w:rPr>
+          <w:rFonts w:ascii="Times New Roman" w:hAnsi="Times New Roman" w:cs="Times New Roman"/>
+          <w:b/>
+          <w:bCs/>
+          <w:i/>
+          <w:iCs/>
           <w:sz w:val="32"/>
           <w:szCs w:val="32"/>
           <w:lang w:val="es-ES"/>
         </w:rPr>
-      </w:pPr>
-    </w:p>
-    <w:p>
-      <w:pPr>
+        <w:t xml:space="preserve">Estudiante: </w:t>
+      </w:r>
+      <w:r>
         <w:rPr>
           <w:rFonts w:ascii="Times New Roman" w:hAnsi="Times New Roman" w:cs="Times New Roman"/>
           <w:sz w:val="32"/>
           <w:szCs w:val="32"/>
           <w:lang w:val="es-ES"/>
         </w:rPr>
-      </w:pPr>
-    </w:p>
-    <w:p>
-      <w:pPr>
+        <w:t>Kristian Araya Valverde</w:t>
+      </w:r>
+    </w:p>
+    <w:p>
+      <w:pPr>
+        <w:jc w:val="center"/>
         <w:rPr>
           <w:rFonts w:ascii="Times New Roman" w:hAnsi="Times New Roman" w:cs="Times New Roman"/>
           <w:sz w:val="32"/>
@@ -352,29 +428,32 @@
           <w:lang w:val="es-ES"/>
         </w:rPr>
       </w:pPr>
-    </w:p>
-    <w:p>
-      <w:pPr>
-        <w:rPr>
-          <w:rFonts w:ascii="Times New Roman" w:hAnsi="Times New Roman" w:cs="Times New Roman"/>
+      <w:r>
+        <w:rPr>
+          <w:rFonts w:ascii="Times New Roman" w:hAnsi="Times New Roman" w:cs="Times New Roman"/>
+          <w:b/>
+          <w:bCs/>
+          <w:i/>
+          <w:iCs/>
           <w:sz w:val="32"/>
           <w:szCs w:val="32"/>
           <w:lang w:val="es-ES"/>
         </w:rPr>
-      </w:pPr>
-    </w:p>
-    <w:p>
-      <w:pPr>
+        <w:t xml:space="preserve">Carné: </w:t>
+      </w:r>
+      <w:r>
         <w:rPr>
           <w:rFonts w:ascii="Times New Roman" w:hAnsi="Times New Roman" w:cs="Times New Roman"/>
           <w:sz w:val="32"/>
           <w:szCs w:val="32"/>
           <w:lang w:val="es-ES"/>
         </w:rPr>
-      </w:pPr>
-    </w:p>
-    <w:p>
-      <w:pPr>
+        <w:t>2026094656</w:t>
+      </w:r>
+    </w:p>
+    <w:p>
+      <w:pPr>
+        <w:jc w:val="center"/>
         <w:rPr>
           <w:rFonts w:ascii="Times New Roman" w:hAnsi="Times New Roman" w:cs="Times New Roman"/>
           <w:sz w:val="32"/>
@@ -382,6 +461,19 @@
           <w:lang w:val="es-ES"/>
         </w:rPr>
       </w:pPr>
+      <w:r>
+        <w:rPr>
+          <w:rFonts w:ascii="Times New Roman" w:hAnsi="Times New Roman" w:cs="Times New Roman"/>
+          <w:b/>
+          <w:bCs/>
+          <w:sz w:val="32"/>
+          <w:szCs w:val="32"/>
+          <w:highlight w:val="yellow"/>
+          <w:lang w:val="es-ES"/>
+        </w:rPr>
+        <w:lastRenderedPageBreak/>
+        <w:t>Índice</w:t>
+      </w:r>
     </w:p>
     <w:p>
       <w:pPr>
@@ -393,18 +485,17 @@
           <w:lang w:val="es-ES"/>
         </w:rPr>
       </w:pPr>
-      <w:r>
-        <w:rPr>
-          <w:rFonts w:ascii="Times New Roman" w:hAnsi="Times New Roman" w:cs="Times New Roman"/>
-          <w:b/>
-          <w:bCs/>
+    </w:p>
+    <w:p>
+      <w:pPr>
+        <w:jc w:val="center"/>
+        <w:rPr>
+          <w:rFonts w:ascii="Times New Roman" w:hAnsi="Times New Roman" w:cs="Times New Roman"/>
           <w:sz w:val="32"/>
           <w:szCs w:val="32"/>
           <w:lang w:val="es-ES"/>
         </w:rPr>
-        <w:lastRenderedPageBreak/>
-        <w:t xml:space="preserve">Índice </w:t>
-      </w:r>
+      </w:pPr>
     </w:p>
     <w:p>
       <w:pPr>
@@ -620,20 +711,648 @@
         <w:jc w:val="center"/>
         <w:rPr>
           <w:rFonts w:ascii="Times New Roman" w:hAnsi="Times New Roman" w:cs="Times New Roman"/>
+          <w:b/>
+          <w:bCs/>
           <w:sz w:val="32"/>
           <w:szCs w:val="32"/>
           <w:lang w:val="es-ES"/>
         </w:rPr>
       </w:pPr>
-    </w:p>
-    <w:p>
-      <w:pPr>
-        <w:jc w:val="center"/>
-        <w:rPr>
-          <w:rFonts w:ascii="Times New Roman" w:hAnsi="Times New Roman" w:cs="Times New Roman"/>
+      <w:r>
+        <w:rPr>
+          <w:rFonts w:ascii="Times New Roman" w:hAnsi="Times New Roman" w:cs="Times New Roman"/>
+          <w:b/>
+          <w:bCs/>
           <w:sz w:val="32"/>
           <w:szCs w:val="32"/>
+          <w:highlight w:val="yellow"/>
           <w:lang w:val="es-ES"/>
+        </w:rPr>
+        <w:lastRenderedPageBreak/>
+        <w:t>Manual de Usuario</w:t>
+      </w:r>
+    </w:p>
+    <w:p>
+      <w:pPr>
+        <w:jc w:val="center"/>
+        <w:rPr>
+          <w:rFonts w:ascii="Times New Roman" w:hAnsi="Times New Roman" w:cs="Times New Roman"/>
+          <w:sz w:val="28"/>
+          <w:szCs w:val="28"/>
+        </w:rPr>
+      </w:pPr>
+      <w:r>
+        <w:rPr>
+          <w:rFonts w:ascii="Times New Roman" w:hAnsi="Times New Roman" w:cs="Times New Roman"/>
+          <w:sz w:val="28"/>
+          <w:szCs w:val="28"/>
+        </w:rPr>
+        <w:t>I</w:t>
+      </w:r>
+      <w:r>
+        <w:rPr>
+          <w:rFonts w:ascii="Times New Roman" w:hAnsi="Times New Roman" w:cs="Times New Roman"/>
+          <w:sz w:val="28"/>
+          <w:szCs w:val="28"/>
+        </w:rPr>
+        <w:t>nstrucciones de compilación, ejecución y uso</w:t>
+      </w:r>
+    </w:p>
+    <w:p>
+      <w:pPr>
+        <w:jc w:val="center"/>
+        <w:rPr>
+          <w:rFonts w:ascii="Times New Roman" w:hAnsi="Times New Roman" w:cs="Times New Roman"/>
+          <w:sz w:val="28"/>
+          <w:szCs w:val="28"/>
+        </w:rPr>
+      </w:pPr>
+    </w:p>
+    <w:p>
+      <w:pPr>
+        <w:jc w:val="both"/>
+        <w:rPr>
+          <w:rFonts w:ascii="Times New Roman" w:hAnsi="Times New Roman" w:cs="Times New Roman"/>
+          <w:sz w:val="28"/>
+          <w:szCs w:val="28"/>
+        </w:rPr>
+      </w:pPr>
+      <w:r>
+        <w:rPr>
+          <w:rFonts w:ascii="Times New Roman" w:hAnsi="Times New Roman" w:cs="Times New Roman"/>
+          <w:sz w:val="28"/>
+          <w:szCs w:val="28"/>
+        </w:rPr>
+        <w:t>Antes de siquiera pensar en utilizar el programa, debemos asegurarnos de tener descargada la versión más reciente del IDLE de Python</w:t>
+      </w:r>
+      <w:r>
+        <w:rPr>
+          <w:rFonts w:ascii="Times New Roman" w:hAnsi="Times New Roman" w:cs="Times New Roman"/>
+          <w:sz w:val="28"/>
+          <w:szCs w:val="28"/>
+        </w:rPr>
+        <w:t xml:space="preserve">, una vez la tenemos, vamos al repositorio de GitHub (enviado por la persona estudiante) y descargamos todo el proyecto. </w:t>
+      </w:r>
+    </w:p>
+    <w:p>
+      <w:pPr>
+        <w:jc w:val="both"/>
+        <w:rPr>
+          <w:rFonts w:ascii="Times New Roman" w:hAnsi="Times New Roman" w:cs="Times New Roman"/>
+          <w:sz w:val="28"/>
+          <w:szCs w:val="28"/>
+        </w:rPr>
+      </w:pPr>
+      <w:r>
+        <w:rPr>
+          <w:rFonts w:ascii="Times New Roman" w:hAnsi="Times New Roman" w:cs="Times New Roman"/>
+          <w:sz w:val="28"/>
+          <w:szCs w:val="28"/>
+        </w:rPr>
+        <w:t xml:space="preserve">Una vez descargado veremos que tenemos 2 carpetas: La documentación (en la que se incluye este archivo que usted </w:t>
+      </w:r>
+      <w:r>
+        <w:rPr>
+          <w:rFonts w:ascii="Times New Roman" w:hAnsi="Times New Roman" w:cs="Times New Roman"/>
+          <w:sz w:val="28"/>
+          <w:szCs w:val="28"/>
+        </w:rPr>
+        <w:t>está</w:t>
+      </w:r>
+      <w:r>
+        <w:rPr>
+          <w:rFonts w:ascii="Times New Roman" w:hAnsi="Times New Roman" w:cs="Times New Roman"/>
+          <w:sz w:val="28"/>
+          <w:szCs w:val="28"/>
+        </w:rPr>
+        <w:t xml:space="preserve"> leyendo) y el Programa, el cual trae el archivo </w:t>
+      </w:r>
+      <w:r>
+        <w:rPr>
+          <w:rFonts w:ascii="Times New Roman" w:hAnsi="Times New Roman" w:cs="Times New Roman"/>
+          <w:b/>
+          <w:bCs/>
+          <w:sz w:val="28"/>
+          <w:szCs w:val="28"/>
+        </w:rPr>
+        <w:t>proyecto_1_transporte_público</w:t>
+      </w:r>
+      <w:r>
+        <w:rPr>
+          <w:rFonts w:ascii="Times New Roman" w:hAnsi="Times New Roman" w:cs="Times New Roman"/>
+          <w:b/>
+          <w:bCs/>
+          <w:sz w:val="28"/>
+          <w:szCs w:val="28"/>
+        </w:rPr>
+        <w:t xml:space="preserve">.py </w:t>
+      </w:r>
+      <w:r>
+        <w:rPr>
+          <w:rFonts w:ascii="Times New Roman" w:hAnsi="Times New Roman" w:cs="Times New Roman"/>
+          <w:sz w:val="28"/>
+          <w:szCs w:val="28"/>
+        </w:rPr>
+        <w:t>y todos los archivos.txt que este necesita par su necesaria y efectiva ejecución.</w:t>
+      </w:r>
+    </w:p>
+    <w:p>
+      <w:pPr>
+        <w:jc w:val="both"/>
+        <w:rPr>
+          <w:rFonts w:ascii="Times New Roman" w:hAnsi="Times New Roman" w:cs="Times New Roman"/>
+          <w:sz w:val="28"/>
+          <w:szCs w:val="28"/>
+        </w:rPr>
+      </w:pPr>
+    </w:p>
+    <w:p>
+      <w:pPr>
+        <w:jc w:val="both"/>
+        <w:rPr>
+          <w:rFonts w:ascii="Times New Roman" w:hAnsi="Times New Roman" w:cs="Times New Roman"/>
+          <w:sz w:val="28"/>
+          <w:szCs w:val="28"/>
+        </w:rPr>
+      </w:pPr>
+      <w:r>
+        <w:rPr>
+          <w:rFonts w:ascii="Times New Roman" w:hAnsi="Times New Roman" w:cs="Times New Roman"/>
+          <w:sz w:val="28"/>
+          <w:szCs w:val="28"/>
+        </w:rPr>
+        <w:t>PASOS:</w:t>
+      </w:r>
+    </w:p>
+    <w:p>
+      <w:pPr>
+        <w:jc w:val="both"/>
+        <w:rPr>
+          <w:rFonts w:ascii="Times New Roman" w:hAnsi="Times New Roman" w:cs="Times New Roman"/>
+          <w:sz w:val="28"/>
+          <w:szCs w:val="28"/>
+        </w:rPr>
+      </w:pPr>
+      <w:r>
+        <w:rPr>
+          <w:rFonts w:ascii="Times New Roman" w:hAnsi="Times New Roman" w:cs="Times New Roman"/>
+          <w:sz w:val="28"/>
+          <w:szCs w:val="28"/>
+        </w:rPr>
+        <w:t xml:space="preserve">1 – Abra el IDLE de Python y en la esquina superior izquierda identifique el boton de </w:t>
+      </w:r>
+      <w:r>
+        <w:rPr>
+          <w:rFonts w:ascii="Times New Roman" w:hAnsi="Times New Roman" w:cs="Times New Roman"/>
+          <w:b/>
+          <w:bCs/>
+          <w:sz w:val="28"/>
+          <w:szCs w:val="28"/>
+        </w:rPr>
+        <w:t>File</w:t>
+      </w:r>
+      <w:r>
+        <w:rPr>
+          <w:rFonts w:ascii="Times New Roman" w:hAnsi="Times New Roman" w:cs="Times New Roman"/>
+          <w:sz w:val="28"/>
+          <w:szCs w:val="28"/>
+        </w:rPr>
+        <w:t xml:space="preserve">, una vez ahí haga clic en </w:t>
+      </w:r>
+      <w:r>
+        <w:rPr>
+          <w:rFonts w:ascii="Times New Roman" w:hAnsi="Times New Roman" w:cs="Times New Roman"/>
+          <w:b/>
+          <w:bCs/>
+          <w:sz w:val="28"/>
+          <w:szCs w:val="28"/>
+        </w:rPr>
+        <w:t xml:space="preserve">Open </w:t>
+      </w:r>
+      <w:r>
+        <w:rPr>
+          <w:rFonts w:ascii="Times New Roman" w:hAnsi="Times New Roman" w:cs="Times New Roman"/>
+          <w:sz w:val="28"/>
+          <w:szCs w:val="28"/>
+        </w:rPr>
+        <w:t>y busque la carpeta donde está el archivo.py del proyecto.</w:t>
+      </w:r>
+    </w:p>
+    <w:p>
+      <w:pPr>
+        <w:jc w:val="both"/>
+        <w:rPr>
+          <w:rFonts w:ascii="Times New Roman" w:hAnsi="Times New Roman" w:cs="Times New Roman"/>
+          <w:b/>
+          <w:bCs/>
+          <w:sz w:val="28"/>
+          <w:szCs w:val="28"/>
+        </w:rPr>
+      </w:pPr>
+      <w:r>
+        <w:rPr>
+          <w:rFonts w:ascii="Times New Roman" w:hAnsi="Times New Roman" w:cs="Times New Roman"/>
+          <w:sz w:val="28"/>
+          <w:szCs w:val="28"/>
+        </w:rPr>
+        <w:t xml:space="preserve">2 – Una ve este esté abierto, podrá ver el código y arriba en la barra una opción llamada </w:t>
+      </w:r>
+      <w:r>
+        <w:rPr>
+          <w:rFonts w:ascii="Times New Roman" w:hAnsi="Times New Roman" w:cs="Times New Roman"/>
+          <w:b/>
+          <w:bCs/>
+          <w:sz w:val="28"/>
+          <w:szCs w:val="28"/>
+        </w:rPr>
+        <w:t>Run</w:t>
+      </w:r>
+      <w:r>
+        <w:rPr>
+          <w:rFonts w:ascii="Times New Roman" w:hAnsi="Times New Roman" w:cs="Times New Roman"/>
+          <w:sz w:val="28"/>
+          <w:szCs w:val="28"/>
+        </w:rPr>
+        <w:t xml:space="preserve">, en esta haga clic en </w:t>
+      </w:r>
+      <w:r>
+        <w:rPr>
+          <w:rFonts w:ascii="Times New Roman" w:hAnsi="Times New Roman" w:cs="Times New Roman"/>
+          <w:b/>
+          <w:bCs/>
+          <w:sz w:val="28"/>
+          <w:szCs w:val="28"/>
+        </w:rPr>
+        <w:t>Run Module (en caso de pedirlo, guarde el archivo)</w:t>
+      </w:r>
+    </w:p>
+    <w:p>
+      <w:pPr>
+        <w:jc w:val="both"/>
+        <w:rPr>
+          <w:rFonts w:ascii="Times New Roman" w:hAnsi="Times New Roman" w:cs="Times New Roman"/>
+          <w:sz w:val="28"/>
+          <w:szCs w:val="28"/>
+        </w:rPr>
+      </w:pPr>
+      <w:r>
+        <w:rPr>
+          <w:rFonts w:ascii="Times New Roman" w:hAnsi="Times New Roman" w:cs="Times New Roman"/>
+          <w:sz w:val="28"/>
+          <w:szCs w:val="28"/>
+        </w:rPr>
+        <w:t>3- Una vez en ejecución se le presentara un menú como este en la consola IDLE:</w:t>
+      </w:r>
+    </w:p>
+    <w:p>
+      <w:pPr>
+        <w:jc w:val="both"/>
+        <w:rPr>
+          <w:rFonts w:ascii="Times New Roman" w:hAnsi="Times New Roman" w:cs="Times New Roman"/>
+          <w:sz w:val="28"/>
+          <w:szCs w:val="28"/>
+        </w:rPr>
+      </w:pPr>
+    </w:p>
+    <w:p>
+      <w:pPr>
+        <w:jc w:val="both"/>
+        <w:rPr>
+          <w:rFonts w:ascii="Times New Roman" w:hAnsi="Times New Roman" w:cs="Times New Roman"/>
+          <w:b/>
+          <w:bCs/>
+        </w:rPr>
+      </w:pPr>
+      <w:r>
+        <w:rPr>
+          <w:rFonts w:ascii="Times New Roman" w:hAnsi="Times New Roman" w:cs="Times New Roman"/>
+          <w:b/>
+          <w:bCs/>
+        </w:rPr>
+        <w:t>Bienvenidos al Sistema TP</w:t>
+      </w:r>
+    </w:p>
+    <w:p>
+      <w:pPr>
+        <w:jc w:val="both"/>
+        <w:rPr>
+          <w:rFonts w:ascii="Times New Roman" w:hAnsi="Times New Roman" w:cs="Times New Roman"/>
+          <w:b/>
+          <w:bCs/>
+        </w:rPr>
+      </w:pPr>
+    </w:p>
+    <w:p>
+      <w:pPr>
+        <w:jc w:val="both"/>
+        <w:rPr>
+          <w:rFonts w:ascii="Times New Roman" w:hAnsi="Times New Roman" w:cs="Times New Roman"/>
+          <w:b/>
+          <w:bCs/>
+        </w:rPr>
+      </w:pPr>
+      <w:r>
+        <w:rPr>
+          <w:rFonts w:ascii="Times New Roman" w:hAnsi="Times New Roman" w:cs="Times New Roman"/>
+          <w:b/>
+          <w:bCs/>
+        </w:rPr>
+        <w:t>=== MENÚ PRINCIPAL ===</w:t>
+      </w:r>
+    </w:p>
+    <w:p>
+      <w:pPr>
+        <w:jc w:val="both"/>
+        <w:rPr>
+          <w:rFonts w:ascii="Times New Roman" w:hAnsi="Times New Roman" w:cs="Times New Roman"/>
+          <w:b/>
+          <w:bCs/>
+        </w:rPr>
+      </w:pPr>
+      <w:r>
+        <w:rPr>
+          <w:rFonts w:ascii="Times New Roman" w:hAnsi="Times New Roman" w:cs="Times New Roman"/>
+          <w:b/>
+          <w:bCs/>
+        </w:rPr>
+        <w:t>(1) Opciones Administrativas</w:t>
+      </w:r>
+    </w:p>
+    <w:p>
+      <w:pPr>
+        <w:jc w:val="both"/>
+        <w:rPr>
+          <w:rFonts w:ascii="Times New Roman" w:hAnsi="Times New Roman" w:cs="Times New Roman"/>
+          <w:b/>
+          <w:bCs/>
+        </w:rPr>
+      </w:pPr>
+      <w:r>
+        <w:rPr>
+          <w:rFonts w:ascii="Times New Roman" w:hAnsi="Times New Roman" w:cs="Times New Roman"/>
+          <w:b/>
+          <w:bCs/>
+        </w:rPr>
+        <w:t>(2) Opciones de Usuario</w:t>
+      </w:r>
+    </w:p>
+    <w:p>
+      <w:pPr>
+        <w:jc w:val="both"/>
+        <w:rPr>
+          <w:rFonts w:ascii="Times New Roman" w:hAnsi="Times New Roman" w:cs="Times New Roman"/>
+          <w:b/>
+          <w:bCs/>
+        </w:rPr>
+      </w:pPr>
+      <w:r>
+        <w:rPr>
+          <w:rFonts w:ascii="Times New Roman" w:hAnsi="Times New Roman" w:cs="Times New Roman"/>
+          <w:b/>
+          <w:bCs/>
+        </w:rPr>
+        <w:t>(3) Salir</w:t>
+      </w:r>
+    </w:p>
+    <w:p>
+      <w:pPr>
+        <w:jc w:val="both"/>
+        <w:rPr>
+          <w:rFonts w:ascii="Times New Roman" w:hAnsi="Times New Roman" w:cs="Times New Roman"/>
+          <w:b/>
+          <w:bCs/>
+        </w:rPr>
+      </w:pPr>
+      <w:r>
+        <w:rPr>
+          <w:rFonts w:ascii="Times New Roman" w:hAnsi="Times New Roman" w:cs="Times New Roman"/>
+          <w:b/>
+          <w:bCs/>
+        </w:rPr>
+        <w:t>Elija una opcion</w:t>
+      </w:r>
+    </w:p>
+    <w:p>
+      <w:pPr>
+        <w:jc w:val="both"/>
+        <w:rPr>
+          <w:rFonts w:ascii="Times New Roman" w:hAnsi="Times New Roman" w:cs="Times New Roman"/>
+          <w:sz w:val="28"/>
+          <w:szCs w:val="28"/>
+        </w:rPr>
+      </w:pPr>
+      <w:r>
+        <w:rPr>
+          <w:rFonts w:ascii="Times New Roman" w:hAnsi="Times New Roman" w:cs="Times New Roman"/>
+          <w:sz w:val="28"/>
+          <w:szCs w:val="28"/>
+        </w:rPr>
+        <w:lastRenderedPageBreak/>
+        <w:t xml:space="preserve">4 </w:t>
+      </w:r>
+      <w:r>
+        <w:rPr>
+          <w:rFonts w:ascii="Times New Roman" w:hAnsi="Times New Roman" w:cs="Times New Roman"/>
+          <w:sz w:val="28"/>
+          <w:szCs w:val="28"/>
+        </w:rPr>
+        <w:t>–</w:t>
+      </w:r>
+      <w:r>
+        <w:rPr>
+          <w:rFonts w:ascii="Times New Roman" w:hAnsi="Times New Roman" w:cs="Times New Roman"/>
+          <w:sz w:val="28"/>
+          <w:szCs w:val="28"/>
+        </w:rPr>
+        <w:t xml:space="preserve"> En la parte de abajo debe de ingresar el número de la opción que desea ejecutar, en caso de ingresar un número no válido se le va a informar, las opciones tienen las siguientes funciones:</w:t>
+      </w:r>
+    </w:p>
+    <w:p>
+      <w:pPr>
+        <w:pStyle w:val="Prrafodelista"/>
+        <w:numPr>
+          <w:ilvl w:val="0"/>
+          <w:numId w:val="2"/>
+        </w:numPr>
+        <w:jc w:val="both"/>
+        <w:rPr>
+          <w:rFonts w:ascii="Times New Roman" w:hAnsi="Times New Roman" w:cs="Times New Roman"/>
+          <w:sz w:val="28"/>
+          <w:szCs w:val="28"/>
+        </w:rPr>
+      </w:pPr>
+      <w:r>
+        <w:rPr>
+          <w:rFonts w:ascii="Times New Roman" w:hAnsi="Times New Roman" w:cs="Times New Roman"/>
+          <w:sz w:val="28"/>
+          <w:szCs w:val="28"/>
+        </w:rPr>
+        <w:t>Opciones Administrativas: Da ingreso al menú de administración de la empresa transportadora, (</w:t>
+      </w:r>
+      <w:r>
+        <w:rPr>
+          <w:rFonts w:ascii="Times New Roman" w:hAnsi="Times New Roman" w:cs="Times New Roman"/>
+          <w:b/>
+          <w:bCs/>
+          <w:sz w:val="28"/>
+          <w:szCs w:val="28"/>
+        </w:rPr>
+        <w:t>IMPORTANTE:</w:t>
+      </w:r>
+      <w:r>
+        <w:rPr>
+          <w:rFonts w:ascii="Times New Roman" w:hAnsi="Times New Roman" w:cs="Times New Roman"/>
+          <w:sz w:val="28"/>
+          <w:szCs w:val="28"/>
+        </w:rPr>
+        <w:t xml:space="preserve"> Para ingresar a este menú debe de tener una clave y una contraseña autorizadas, las cuales se sitúan en el archivo “login.txt”) más detalles sobre </w:t>
+      </w:r>
+      <w:r>
+        <w:rPr>
+          <w:rFonts w:ascii="Times New Roman" w:hAnsi="Times New Roman" w:cs="Times New Roman"/>
+          <w:sz w:val="28"/>
+          <w:szCs w:val="28"/>
+        </w:rPr>
+        <w:t>este</w:t>
+      </w:r>
+      <w:r>
+        <w:rPr>
+          <w:rFonts w:ascii="Times New Roman" w:hAnsi="Times New Roman" w:cs="Times New Roman"/>
+          <w:sz w:val="28"/>
+          <w:szCs w:val="28"/>
+        </w:rPr>
+        <w:t xml:space="preserve"> menú más adelante.</w:t>
+      </w:r>
+    </w:p>
+    <w:p>
+      <w:pPr>
+        <w:pStyle w:val="Prrafodelista"/>
+        <w:ind w:left="810"/>
+        <w:jc w:val="both"/>
+        <w:rPr>
+          <w:rFonts w:ascii="Times New Roman" w:hAnsi="Times New Roman" w:cs="Times New Roman"/>
+          <w:sz w:val="28"/>
+          <w:szCs w:val="28"/>
+        </w:rPr>
+      </w:pPr>
+    </w:p>
+    <w:p>
+      <w:pPr>
+        <w:pStyle w:val="Prrafodelista"/>
+        <w:numPr>
+          <w:ilvl w:val="0"/>
+          <w:numId w:val="2"/>
+        </w:numPr>
+        <w:jc w:val="both"/>
+        <w:rPr>
+          <w:rFonts w:ascii="Times New Roman" w:hAnsi="Times New Roman" w:cs="Times New Roman"/>
+          <w:sz w:val="28"/>
+          <w:szCs w:val="28"/>
+        </w:rPr>
+      </w:pPr>
+      <w:r>
+        <w:rPr>
+          <w:rFonts w:ascii="Times New Roman" w:hAnsi="Times New Roman" w:cs="Times New Roman"/>
+          <w:sz w:val="28"/>
+          <w:szCs w:val="28"/>
+        </w:rPr>
+        <w:t>Opciones de Usuario: Da ingreso al menú para usuarios de la plataforma, este es el menú común, pues no se necesita de ninguna clave o usuario para ingresar a este.</w:t>
+      </w:r>
+      <w:r>
+        <w:rPr>
+          <w:rFonts w:ascii="Times New Roman" w:hAnsi="Times New Roman" w:cs="Times New Roman"/>
+          <w:sz w:val="28"/>
+          <w:szCs w:val="28"/>
+        </w:rPr>
+        <w:t xml:space="preserve"> (</w:t>
+      </w:r>
+      <w:r>
+        <w:rPr>
+          <w:rFonts w:ascii="Times New Roman" w:hAnsi="Times New Roman" w:cs="Times New Roman"/>
+          <w:b/>
+          <w:bCs/>
+          <w:sz w:val="28"/>
+          <w:szCs w:val="28"/>
+        </w:rPr>
+        <w:t>AVISO:</w:t>
+      </w:r>
+      <w:r>
+        <w:rPr>
+          <w:rFonts w:ascii="Times New Roman" w:hAnsi="Times New Roman" w:cs="Times New Roman"/>
+          <w:sz w:val="28"/>
+          <w:szCs w:val="28"/>
+        </w:rPr>
+        <w:t xml:space="preserve"> Hasta este momento, este menú solo existe en representación gráfica, ninguna de sus opciones tiene una utilidad)</w:t>
+      </w:r>
+    </w:p>
+    <w:p>
+      <w:pPr>
+        <w:jc w:val="both"/>
+        <w:rPr>
+          <w:rFonts w:ascii="Times New Roman" w:hAnsi="Times New Roman" w:cs="Times New Roman"/>
+          <w:sz w:val="28"/>
+          <w:szCs w:val="28"/>
+        </w:rPr>
+      </w:pPr>
+    </w:p>
+    <w:p>
+      <w:pPr>
+        <w:pStyle w:val="Prrafodelista"/>
+        <w:numPr>
+          <w:ilvl w:val="0"/>
+          <w:numId w:val="2"/>
+        </w:numPr>
+        <w:jc w:val="both"/>
+        <w:rPr>
+          <w:rFonts w:ascii="Times New Roman" w:hAnsi="Times New Roman" w:cs="Times New Roman"/>
+          <w:sz w:val="28"/>
+          <w:szCs w:val="28"/>
+        </w:rPr>
+      </w:pPr>
+      <w:r>
+        <w:rPr>
+          <w:rFonts w:ascii="Times New Roman" w:hAnsi="Times New Roman" w:cs="Times New Roman"/>
+          <w:sz w:val="28"/>
+          <w:szCs w:val="28"/>
+        </w:rPr>
+        <w:t xml:space="preserve">Salir: Termina el programa, no cierra el IDLE, simplemente termina la función </w:t>
+      </w:r>
+      <w:r>
+        <w:rPr>
+          <w:rFonts w:ascii="Times New Roman" w:hAnsi="Times New Roman" w:cs="Times New Roman"/>
+          <w:b/>
+          <w:bCs/>
+          <w:sz w:val="28"/>
+          <w:szCs w:val="28"/>
+        </w:rPr>
+        <w:t>menu_</w:t>
+      </w:r>
+      <w:r>
+        <w:rPr>
+          <w:rFonts w:ascii="Times New Roman" w:hAnsi="Times New Roman" w:cs="Times New Roman"/>
+          <w:b/>
+          <w:bCs/>
+          <w:sz w:val="28"/>
+          <w:szCs w:val="28"/>
+        </w:rPr>
+        <w:t>principal()</w:t>
+      </w:r>
+      <w:r>
+        <w:rPr>
+          <w:rFonts w:ascii="Times New Roman" w:hAnsi="Times New Roman" w:cs="Times New Roman"/>
+          <w:sz w:val="28"/>
+          <w:szCs w:val="28"/>
+        </w:rPr>
+        <w:t>, la cuál es la que se inicia apenas corres el código.</w:t>
+      </w:r>
+    </w:p>
+    <w:p>
+      <w:pPr>
+        <w:jc w:val="both"/>
+        <w:rPr>
+          <w:rFonts w:ascii="Times New Roman" w:hAnsi="Times New Roman" w:cs="Times New Roman"/>
+          <w:sz w:val="28"/>
+          <w:szCs w:val="28"/>
         </w:rPr>
       </w:pPr>
     </w:p>
@@ -646,7 +1365,6 @@
           <w:bCs/>
           <w:sz w:val="32"/>
           <w:szCs w:val="32"/>
-          <w:lang w:val="es-ES"/>
         </w:rPr>
       </w:pPr>
       <w:r>
@@ -656,278 +1374,898 @@
           <w:bCs/>
           <w:sz w:val="32"/>
           <w:szCs w:val="32"/>
-          <w:lang w:val="es-ES"/>
+          <w:highlight w:val="yellow"/>
+        </w:rPr>
+        <w:t>Menú de Opciones Administrativas</w:t>
+      </w:r>
+    </w:p>
+    <w:p>
+      <w:pPr>
+        <w:jc w:val="both"/>
+        <w:rPr>
+          <w:rFonts w:ascii="Times New Roman" w:hAnsi="Times New Roman" w:cs="Times New Roman"/>
+          <w:sz w:val="28"/>
+          <w:szCs w:val="28"/>
+        </w:rPr>
+      </w:pPr>
+      <w:r>
+        <w:rPr>
+          <w:rFonts w:ascii="Times New Roman" w:hAnsi="Times New Roman" w:cs="Times New Roman"/>
+          <w:sz w:val="28"/>
+          <w:szCs w:val="28"/>
+        </w:rPr>
+        <w:t xml:space="preserve">Cuando ingresemos por primera vez a este menú, nos vamos a topar con el siguiente display: </w:t>
+      </w:r>
+    </w:p>
+    <w:p>
+      <w:pPr>
+        <w:jc w:val="both"/>
+        <w:rPr>
+          <w:rFonts w:ascii="Times New Roman" w:hAnsi="Times New Roman" w:cs="Times New Roman"/>
+        </w:rPr>
+      </w:pPr>
+    </w:p>
+    <w:p>
+      <w:pPr>
+        <w:jc w:val="both"/>
+        <w:rPr>
+          <w:rFonts w:ascii="Times New Roman" w:hAnsi="Times New Roman" w:cs="Times New Roman"/>
+          <w:b/>
+          <w:bCs/>
+        </w:rPr>
+      </w:pPr>
+      <w:r>
+        <w:rPr>
+          <w:rFonts w:ascii="Times New Roman" w:hAnsi="Times New Roman" w:cs="Times New Roman"/>
+          <w:b/>
+          <w:bCs/>
+        </w:rPr>
+        <w:t>Menú de administradores, porfavor ingrese sus credenciales</w:t>
+      </w:r>
+    </w:p>
+    <w:p>
+      <w:pPr>
+        <w:jc w:val="both"/>
+        <w:rPr>
+          <w:rFonts w:ascii="Times New Roman" w:hAnsi="Times New Roman" w:cs="Times New Roman"/>
+          <w:b/>
+          <w:bCs/>
+        </w:rPr>
+      </w:pPr>
+      <w:r>
+        <w:rPr>
+          <w:rFonts w:ascii="Times New Roman" w:hAnsi="Times New Roman" w:cs="Times New Roman"/>
+          <w:b/>
+          <w:bCs/>
+        </w:rPr>
+        <w:t xml:space="preserve">Usuario: </w:t>
+      </w:r>
+    </w:p>
+    <w:p>
+      <w:pPr>
+        <w:jc w:val="both"/>
+        <w:rPr>
+          <w:rFonts w:ascii="Times New Roman" w:hAnsi="Times New Roman" w:cs="Times New Roman"/>
+          <w:b/>
+          <w:bCs/>
+        </w:rPr>
+      </w:pPr>
+      <w:r>
+        <w:rPr>
+          <w:rFonts w:ascii="Times New Roman" w:hAnsi="Times New Roman" w:cs="Times New Roman"/>
+          <w:b/>
+          <w:bCs/>
+        </w:rPr>
+        <w:t>Contraseña:</w:t>
+      </w:r>
+    </w:p>
+    <w:p>
+      <w:pPr>
+        <w:jc w:val="both"/>
+        <w:rPr>
+          <w:rFonts w:ascii="Times New Roman" w:hAnsi="Times New Roman" w:cs="Times New Roman"/>
+        </w:rPr>
+      </w:pPr>
+    </w:p>
+    <w:p>
+      <w:pPr>
+        <w:jc w:val="both"/>
+        <w:rPr>
+          <w:rFonts w:ascii="Times New Roman" w:hAnsi="Times New Roman" w:cs="Times New Roman"/>
+        </w:rPr>
+      </w:pPr>
+    </w:p>
+    <w:p>
+      <w:pPr>
+        <w:jc w:val="both"/>
+        <w:rPr>
+          <w:rFonts w:ascii="Times New Roman" w:hAnsi="Times New Roman" w:cs="Times New Roman"/>
+        </w:rPr>
+      </w:pPr>
+    </w:p>
+    <w:p>
+      <w:pPr>
+        <w:jc w:val="both"/>
+        <w:rPr>
+          <w:rFonts w:ascii="Times New Roman" w:hAnsi="Times New Roman" w:cs="Times New Roman"/>
+        </w:rPr>
+      </w:pPr>
+    </w:p>
+    <w:p>
+      <w:pPr>
+        <w:jc w:val="both"/>
+        <w:rPr>
+          <w:rFonts w:ascii="Times New Roman" w:hAnsi="Times New Roman" w:cs="Times New Roman"/>
+          <w:sz w:val="28"/>
+          <w:szCs w:val="28"/>
+        </w:rPr>
+      </w:pPr>
+      <w:r>
+        <w:rPr>
+          <w:rFonts w:ascii="Times New Roman" w:hAnsi="Times New Roman" w:cs="Times New Roman"/>
+          <w:sz w:val="28"/>
+          <w:szCs w:val="28"/>
         </w:rPr>
         <w:lastRenderedPageBreak/>
-        <w:t>Manual de Usuario</w:t>
-      </w:r>
-    </w:p>
-    <w:p>
-      <w:pPr>
-        <w:jc w:val="center"/>
-        <w:rPr>
-          <w:rFonts w:ascii="Times New Roman" w:hAnsi="Times New Roman" w:cs="Times New Roman"/>
-          <w:sz w:val="28"/>
-          <w:szCs w:val="28"/>
-        </w:rPr>
-      </w:pPr>
-      <w:r>
-        <w:rPr>
-          <w:rFonts w:ascii="Times New Roman" w:hAnsi="Times New Roman" w:cs="Times New Roman"/>
-          <w:sz w:val="28"/>
-          <w:szCs w:val="28"/>
-        </w:rPr>
-        <w:t>I</w:t>
-      </w:r>
-      <w:r>
-        <w:rPr>
-          <w:rFonts w:ascii="Times New Roman" w:hAnsi="Times New Roman" w:cs="Times New Roman"/>
-          <w:sz w:val="28"/>
-          <w:szCs w:val="28"/>
-        </w:rPr>
-        <w:t>nstrucciones de compilación, ejecución y uso</w:t>
-      </w:r>
-    </w:p>
-    <w:p>
-      <w:pPr>
-        <w:jc w:val="center"/>
-        <w:rPr>
-          <w:rFonts w:ascii="Times New Roman" w:hAnsi="Times New Roman" w:cs="Times New Roman"/>
-          <w:sz w:val="28"/>
-          <w:szCs w:val="28"/>
-        </w:rPr>
-      </w:pPr>
-    </w:p>
-    <w:p>
-      <w:pPr>
-        <w:jc w:val="center"/>
-        <w:rPr>
-          <w:rFonts w:ascii="Times New Roman" w:hAnsi="Times New Roman" w:cs="Times New Roman"/>
-          <w:sz w:val="28"/>
-          <w:szCs w:val="28"/>
-        </w:rPr>
-      </w:pPr>
-    </w:p>
-    <w:p>
-      <w:pPr>
-        <w:jc w:val="center"/>
-        <w:rPr>
-          <w:rFonts w:ascii="Times New Roman" w:hAnsi="Times New Roman" w:cs="Times New Roman"/>
-          <w:sz w:val="28"/>
-          <w:szCs w:val="28"/>
-        </w:rPr>
-      </w:pPr>
-    </w:p>
-    <w:p>
-      <w:pPr>
-        <w:jc w:val="center"/>
-        <w:rPr>
-          <w:rFonts w:ascii="Times New Roman" w:hAnsi="Times New Roman" w:cs="Times New Roman"/>
-          <w:sz w:val="28"/>
-          <w:szCs w:val="28"/>
-        </w:rPr>
-      </w:pPr>
-    </w:p>
-    <w:p>
-      <w:pPr>
-        <w:jc w:val="center"/>
-        <w:rPr>
-          <w:rFonts w:ascii="Times New Roman" w:hAnsi="Times New Roman" w:cs="Times New Roman"/>
-          <w:sz w:val="28"/>
-          <w:szCs w:val="28"/>
-        </w:rPr>
-      </w:pPr>
-    </w:p>
-    <w:p>
-      <w:pPr>
-        <w:jc w:val="center"/>
-        <w:rPr>
-          <w:rFonts w:ascii="Times New Roman" w:hAnsi="Times New Roman" w:cs="Times New Roman"/>
-          <w:sz w:val="28"/>
-          <w:szCs w:val="28"/>
-        </w:rPr>
-      </w:pPr>
-    </w:p>
-    <w:p>
-      <w:pPr>
-        <w:jc w:val="center"/>
-        <w:rPr>
-          <w:rFonts w:ascii="Times New Roman" w:hAnsi="Times New Roman" w:cs="Times New Roman"/>
-          <w:sz w:val="28"/>
-          <w:szCs w:val="28"/>
-        </w:rPr>
-      </w:pPr>
-    </w:p>
-    <w:p>
-      <w:pPr>
-        <w:jc w:val="center"/>
-        <w:rPr>
-          <w:rFonts w:ascii="Times New Roman" w:hAnsi="Times New Roman" w:cs="Times New Roman"/>
-          <w:sz w:val="28"/>
-          <w:szCs w:val="28"/>
-        </w:rPr>
-      </w:pPr>
-    </w:p>
-    <w:p>
-      <w:pPr>
-        <w:jc w:val="center"/>
-        <w:rPr>
-          <w:rFonts w:ascii="Times New Roman" w:hAnsi="Times New Roman" w:cs="Times New Roman"/>
-          <w:sz w:val="28"/>
-          <w:szCs w:val="28"/>
-        </w:rPr>
-      </w:pPr>
-    </w:p>
-    <w:p>
-      <w:pPr>
-        <w:jc w:val="center"/>
-        <w:rPr>
-          <w:rFonts w:ascii="Times New Roman" w:hAnsi="Times New Roman" w:cs="Times New Roman"/>
-          <w:sz w:val="28"/>
-          <w:szCs w:val="28"/>
-        </w:rPr>
-      </w:pPr>
-    </w:p>
-    <w:p>
-      <w:pPr>
-        <w:jc w:val="center"/>
-        <w:rPr>
-          <w:rFonts w:ascii="Times New Roman" w:hAnsi="Times New Roman" w:cs="Times New Roman"/>
-          <w:sz w:val="28"/>
-          <w:szCs w:val="28"/>
-        </w:rPr>
-      </w:pPr>
-    </w:p>
-    <w:p>
-      <w:pPr>
-        <w:jc w:val="center"/>
-        <w:rPr>
-          <w:rFonts w:ascii="Times New Roman" w:hAnsi="Times New Roman" w:cs="Times New Roman"/>
-          <w:sz w:val="28"/>
-          <w:szCs w:val="28"/>
-        </w:rPr>
-      </w:pPr>
-    </w:p>
-    <w:p>
-      <w:pPr>
-        <w:jc w:val="center"/>
-        <w:rPr>
-          <w:rFonts w:ascii="Times New Roman" w:hAnsi="Times New Roman" w:cs="Times New Roman"/>
-          <w:sz w:val="28"/>
-          <w:szCs w:val="28"/>
-        </w:rPr>
-      </w:pPr>
-    </w:p>
-    <w:p>
-      <w:pPr>
-        <w:jc w:val="center"/>
-        <w:rPr>
-          <w:rFonts w:ascii="Times New Roman" w:hAnsi="Times New Roman" w:cs="Times New Roman"/>
-          <w:sz w:val="28"/>
-          <w:szCs w:val="28"/>
-        </w:rPr>
-      </w:pPr>
-    </w:p>
-    <w:p>
-      <w:pPr>
-        <w:jc w:val="center"/>
-        <w:rPr>
-          <w:rFonts w:ascii="Times New Roman" w:hAnsi="Times New Roman" w:cs="Times New Roman"/>
-          <w:sz w:val="28"/>
-          <w:szCs w:val="28"/>
-        </w:rPr>
-      </w:pPr>
-    </w:p>
-    <w:p>
-      <w:pPr>
-        <w:jc w:val="center"/>
-        <w:rPr>
-          <w:rFonts w:ascii="Times New Roman" w:hAnsi="Times New Roman" w:cs="Times New Roman"/>
-          <w:sz w:val="28"/>
-          <w:szCs w:val="28"/>
-        </w:rPr>
-      </w:pPr>
-    </w:p>
-    <w:p>
-      <w:pPr>
-        <w:jc w:val="center"/>
-        <w:rPr>
-          <w:rFonts w:ascii="Times New Roman" w:hAnsi="Times New Roman" w:cs="Times New Roman"/>
-          <w:sz w:val="28"/>
-          <w:szCs w:val="28"/>
-        </w:rPr>
-      </w:pPr>
-    </w:p>
-    <w:p>
-      <w:pPr>
-        <w:jc w:val="center"/>
-        <w:rPr>
-          <w:rFonts w:ascii="Times New Roman" w:hAnsi="Times New Roman" w:cs="Times New Roman"/>
-          <w:sz w:val="28"/>
-          <w:szCs w:val="28"/>
-        </w:rPr>
-      </w:pPr>
-    </w:p>
-    <w:p>
-      <w:pPr>
-        <w:jc w:val="center"/>
-        <w:rPr>
-          <w:rFonts w:ascii="Times New Roman" w:hAnsi="Times New Roman" w:cs="Times New Roman"/>
-          <w:sz w:val="28"/>
-          <w:szCs w:val="28"/>
-        </w:rPr>
-      </w:pPr>
-    </w:p>
-    <w:p>
-      <w:pPr>
-        <w:jc w:val="center"/>
-        <w:rPr>
-          <w:rFonts w:ascii="Times New Roman" w:hAnsi="Times New Roman" w:cs="Times New Roman"/>
-          <w:sz w:val="28"/>
-          <w:szCs w:val="28"/>
-        </w:rPr>
-      </w:pPr>
-    </w:p>
-    <w:p>
-      <w:pPr>
-        <w:jc w:val="center"/>
-        <w:rPr>
-          <w:rFonts w:ascii="Times New Roman" w:hAnsi="Times New Roman" w:cs="Times New Roman"/>
-          <w:sz w:val="28"/>
-          <w:szCs w:val="28"/>
-        </w:rPr>
-      </w:pPr>
-    </w:p>
-    <w:p>
-      <w:pPr>
-        <w:jc w:val="center"/>
-        <w:rPr>
-          <w:rFonts w:ascii="Times New Roman" w:hAnsi="Times New Roman" w:cs="Times New Roman"/>
-          <w:sz w:val="28"/>
-          <w:szCs w:val="28"/>
-        </w:rPr>
-      </w:pPr>
-    </w:p>
-    <w:p>
-      <w:pPr>
-        <w:jc w:val="center"/>
-        <w:rPr>
-          <w:rFonts w:ascii="Times New Roman" w:hAnsi="Times New Roman" w:cs="Times New Roman"/>
-          <w:b/>
-          <w:bCs/>
-          <w:sz w:val="28"/>
-          <w:szCs w:val="28"/>
-        </w:rPr>
-      </w:pPr>
-      <w:r>
-        <w:rPr>
-          <w:rFonts w:ascii="Times New Roman" w:hAnsi="Times New Roman" w:cs="Times New Roman"/>
-          <w:b/>
-          <w:bCs/>
-          <w:sz w:val="28"/>
-          <w:szCs w:val="28"/>
+        <w:t xml:space="preserve">En esta parte, usted deberá de ingresar sus credenciales para poder acceder al menú de administración, esto porque desde este menú se pueden hacer operaciones importantes como el manejo de modelos, unidades, fechas de salida e incluso credenciales de conductores, por lo que un usuario normal no debe de ser capaz de acceder aquí. En caso de que se ingrese mal algún parámetro, no se le dira al usuario que ingreso mal, esto por razones de seguridad, solo se le da un mensaje genérico (Usuario o contraseña incorrectos, vuelva a intentarlo), en caso de que sean correctas, se abre paso al menú de administración el cual se ve </w:t>
+      </w:r>
+      <w:r>
+        <w:rPr>
+          <w:rFonts w:ascii="Times New Roman" w:hAnsi="Times New Roman" w:cs="Times New Roman"/>
+          <w:sz w:val="28"/>
+          <w:szCs w:val="28"/>
+        </w:rPr>
+        <w:t>así</w:t>
+      </w:r>
+      <w:r>
+        <w:rPr>
+          <w:rFonts w:ascii="Times New Roman" w:hAnsi="Times New Roman" w:cs="Times New Roman"/>
+          <w:sz w:val="28"/>
+          <w:szCs w:val="28"/>
+        </w:rPr>
+        <w:t xml:space="preserve">: </w:t>
+      </w:r>
+    </w:p>
+    <w:p>
+      <w:pPr>
+        <w:jc w:val="both"/>
+        <w:rPr>
+          <w:rFonts w:ascii="Times New Roman" w:hAnsi="Times New Roman" w:cs="Times New Roman"/>
+          <w:sz w:val="28"/>
+          <w:szCs w:val="28"/>
+        </w:rPr>
+      </w:pPr>
+    </w:p>
+    <w:p>
+      <w:pPr>
+        <w:jc w:val="both"/>
+        <w:rPr>
+          <w:rFonts w:ascii="Times New Roman" w:hAnsi="Times New Roman" w:cs="Times New Roman"/>
+          <w:b/>
+          <w:bCs/>
+        </w:rPr>
+      </w:pPr>
+      <w:r>
+        <w:rPr>
+          <w:rFonts w:ascii="Times New Roman" w:hAnsi="Times New Roman" w:cs="Times New Roman"/>
+          <w:b/>
+          <w:bCs/>
+        </w:rPr>
+        <w:t>¡Bienvenido!</w:t>
+      </w:r>
+    </w:p>
+    <w:p>
+      <w:pPr>
+        <w:jc w:val="both"/>
+        <w:rPr>
+          <w:rFonts w:ascii="Times New Roman" w:hAnsi="Times New Roman" w:cs="Times New Roman"/>
+          <w:b/>
+          <w:bCs/>
+        </w:rPr>
+      </w:pPr>
+    </w:p>
+    <w:p>
+      <w:pPr>
+        <w:jc w:val="both"/>
+        <w:rPr>
+          <w:rFonts w:ascii="Times New Roman" w:hAnsi="Times New Roman" w:cs="Times New Roman"/>
+          <w:b/>
+          <w:bCs/>
+        </w:rPr>
+      </w:pPr>
+      <w:r>
+        <w:rPr>
+          <w:rFonts w:ascii="Times New Roman" w:hAnsi="Times New Roman" w:cs="Times New Roman"/>
+          <w:b/>
+          <w:bCs/>
+        </w:rPr>
+        <w:t>=== MENÚ ADMINISTRATIVO ===</w:t>
+      </w:r>
+    </w:p>
+    <w:p>
+      <w:pPr>
+        <w:jc w:val="both"/>
+        <w:rPr>
+          <w:rFonts w:ascii="Times New Roman" w:hAnsi="Times New Roman" w:cs="Times New Roman"/>
+          <w:b/>
+          <w:bCs/>
+        </w:rPr>
+      </w:pPr>
+      <w:r>
+        <w:rPr>
+          <w:rFonts w:ascii="Times New Roman" w:hAnsi="Times New Roman" w:cs="Times New Roman"/>
+          <w:b/>
+          <w:bCs/>
+        </w:rPr>
+        <w:t>(11) Gestión de modelos de autobús</w:t>
+      </w:r>
+    </w:p>
+    <w:p>
+      <w:pPr>
+        <w:jc w:val="both"/>
+        <w:rPr>
+          <w:rFonts w:ascii="Times New Roman" w:hAnsi="Times New Roman" w:cs="Times New Roman"/>
+          <w:b/>
+          <w:bCs/>
+        </w:rPr>
+      </w:pPr>
+      <w:r>
+        <w:rPr>
+          <w:rFonts w:ascii="Times New Roman" w:hAnsi="Times New Roman" w:cs="Times New Roman"/>
+          <w:b/>
+          <w:bCs/>
+        </w:rPr>
+        <w:t>(12) Gestión de unidades</w:t>
+      </w:r>
+    </w:p>
+    <w:p>
+      <w:pPr>
+        <w:jc w:val="both"/>
+        <w:rPr>
+          <w:rFonts w:ascii="Times New Roman" w:hAnsi="Times New Roman" w:cs="Times New Roman"/>
+          <w:b/>
+          <w:bCs/>
+        </w:rPr>
+      </w:pPr>
+      <w:r>
+        <w:rPr>
+          <w:rFonts w:ascii="Times New Roman" w:hAnsi="Times New Roman" w:cs="Times New Roman"/>
+          <w:b/>
+          <w:bCs/>
+        </w:rPr>
+        <w:t>(13) Gestión de conductores</w:t>
+      </w:r>
+    </w:p>
+    <w:p>
+      <w:pPr>
+        <w:jc w:val="both"/>
+        <w:rPr>
+          <w:rFonts w:ascii="Times New Roman" w:hAnsi="Times New Roman" w:cs="Times New Roman"/>
+          <w:b/>
+          <w:bCs/>
+        </w:rPr>
+      </w:pPr>
+      <w:r>
+        <w:rPr>
+          <w:rFonts w:ascii="Times New Roman" w:hAnsi="Times New Roman" w:cs="Times New Roman"/>
+          <w:b/>
+          <w:bCs/>
+        </w:rPr>
+        <w:t>(14) Gestión de rutas</w:t>
+      </w:r>
+    </w:p>
+    <w:p>
+      <w:pPr>
+        <w:jc w:val="both"/>
+        <w:rPr>
+          <w:rFonts w:ascii="Times New Roman" w:hAnsi="Times New Roman" w:cs="Times New Roman"/>
+          <w:b/>
+          <w:bCs/>
+        </w:rPr>
+      </w:pPr>
+      <w:r>
+        <w:rPr>
+          <w:rFonts w:ascii="Times New Roman" w:hAnsi="Times New Roman" w:cs="Times New Roman"/>
+          <w:b/>
+          <w:bCs/>
+        </w:rPr>
+        <w:t>(15) Gestión de paradas por ruta</w:t>
+      </w:r>
+    </w:p>
+    <w:p>
+      <w:pPr>
+        <w:jc w:val="both"/>
+        <w:rPr>
+          <w:rFonts w:ascii="Times New Roman" w:hAnsi="Times New Roman" w:cs="Times New Roman"/>
+          <w:b/>
+          <w:bCs/>
+        </w:rPr>
+      </w:pPr>
+      <w:r>
+        <w:rPr>
+          <w:rFonts w:ascii="Times New Roman" w:hAnsi="Times New Roman" w:cs="Times New Roman"/>
+          <w:b/>
+          <w:bCs/>
+        </w:rPr>
+        <w:t>(16) Programación de salidas</w:t>
+      </w:r>
+    </w:p>
+    <w:p>
+      <w:pPr>
+        <w:jc w:val="both"/>
+        <w:rPr>
+          <w:rFonts w:ascii="Times New Roman" w:hAnsi="Times New Roman" w:cs="Times New Roman"/>
+          <w:b/>
+          <w:bCs/>
+        </w:rPr>
+      </w:pPr>
+      <w:r>
+        <w:rPr>
+          <w:rFonts w:ascii="Times New Roman" w:hAnsi="Times New Roman" w:cs="Times New Roman"/>
+          <w:b/>
+          <w:bCs/>
+        </w:rPr>
+        <w:t>(17) Consultar historial de abordajes</w:t>
+      </w:r>
+    </w:p>
+    <w:p>
+      <w:pPr>
+        <w:jc w:val="both"/>
+        <w:rPr>
+          <w:rFonts w:ascii="Times New Roman" w:hAnsi="Times New Roman" w:cs="Times New Roman"/>
+          <w:b/>
+          <w:bCs/>
+        </w:rPr>
+      </w:pPr>
+      <w:r>
+        <w:rPr>
+          <w:rFonts w:ascii="Times New Roman" w:hAnsi="Times New Roman" w:cs="Times New Roman"/>
+          <w:b/>
+          <w:bCs/>
+        </w:rPr>
+        <w:t>(18) Regresar al menú principal</w:t>
+      </w:r>
+    </w:p>
+    <w:p>
+      <w:pPr>
+        <w:jc w:val="both"/>
+        <w:rPr>
+          <w:rFonts w:ascii="Times New Roman" w:hAnsi="Times New Roman" w:cs="Times New Roman"/>
+          <w:b/>
+          <w:bCs/>
+        </w:rPr>
+      </w:pPr>
+      <w:r>
+        <w:rPr>
+          <w:rFonts w:ascii="Times New Roman" w:hAnsi="Times New Roman" w:cs="Times New Roman"/>
+          <w:b/>
+          <w:bCs/>
+        </w:rPr>
+        <w:t>Elija una opción:</w:t>
+      </w:r>
+    </w:p>
+    <w:p>
+      <w:pPr>
+        <w:jc w:val="both"/>
+        <w:rPr>
+          <w:rFonts w:ascii="Times New Roman" w:hAnsi="Times New Roman" w:cs="Times New Roman"/>
+          <w:b/>
+          <w:bCs/>
+        </w:rPr>
+      </w:pPr>
+    </w:p>
+    <w:p>
+      <w:pPr>
+        <w:jc w:val="both"/>
+        <w:rPr>
+          <w:rFonts w:ascii="Times New Roman" w:hAnsi="Times New Roman" w:cs="Times New Roman"/>
+          <w:sz w:val="28"/>
+          <w:szCs w:val="28"/>
+        </w:rPr>
+      </w:pPr>
+      <w:r>
+        <w:rPr>
+          <w:rFonts w:ascii="Times New Roman" w:hAnsi="Times New Roman" w:cs="Times New Roman"/>
+          <w:sz w:val="28"/>
+          <w:szCs w:val="28"/>
+        </w:rPr>
+        <w:t xml:space="preserve">Aquí en elegir una opción, podemos elegir una de las que ahí se muestran, de las cuales vamos a describir que puede hacer cada una de ellas: </w:t>
+      </w:r>
+    </w:p>
+    <w:p>
+      <w:pPr>
+        <w:jc w:val="both"/>
+        <w:rPr>
+          <w:rFonts w:ascii="Times New Roman" w:hAnsi="Times New Roman" w:cs="Times New Roman"/>
+        </w:rPr>
+      </w:pPr>
+    </w:p>
+    <w:p>
+      <w:pPr>
+        <w:jc w:val="both"/>
+        <w:rPr>
+          <w:rFonts w:ascii="Times New Roman" w:hAnsi="Times New Roman" w:cs="Times New Roman"/>
+        </w:rPr>
+      </w:pPr>
+    </w:p>
+    <w:p>
+      <w:pPr>
+        <w:jc w:val="both"/>
+        <w:rPr>
+          <w:rFonts w:ascii="Times New Roman" w:hAnsi="Times New Roman" w:cs="Times New Roman"/>
+        </w:rPr>
+      </w:pPr>
+    </w:p>
+    <w:p>
+      <w:pPr>
+        <w:jc w:val="both"/>
+        <w:rPr>
+          <w:rFonts w:ascii="Times New Roman" w:hAnsi="Times New Roman" w:cs="Times New Roman"/>
+        </w:rPr>
+      </w:pPr>
+    </w:p>
+    <w:p>
+      <w:pPr>
+        <w:jc w:val="both"/>
+        <w:rPr>
+          <w:rFonts w:ascii="Times New Roman" w:hAnsi="Times New Roman" w:cs="Times New Roman"/>
+        </w:rPr>
+      </w:pPr>
+      <w:r>
+        <w:rPr>
+          <w:rFonts w:ascii="Times New Roman" w:hAnsi="Times New Roman" w:cs="Times New Roman"/>
+          <w:b/>
+          <w:bCs/>
         </w:rPr>
         <w:lastRenderedPageBreak/>
+        <w:t>(11) Gestión de modelos de autobús</w:t>
+      </w:r>
+      <w:r>
+        <w:rPr>
+          <w:rFonts w:ascii="Times New Roman" w:hAnsi="Times New Roman" w:cs="Times New Roman"/>
+          <w:b/>
+          <w:bCs/>
+        </w:rPr>
+        <w:t xml:space="preserve">: </w:t>
+      </w:r>
+      <w:r>
+        <w:rPr>
+          <w:rFonts w:ascii="Times New Roman" w:hAnsi="Times New Roman" w:cs="Times New Roman"/>
+        </w:rPr>
+        <w:t xml:space="preserve">Una vez entremos a este modo se nos presentan las opciones: </w:t>
+      </w:r>
+    </w:p>
+    <w:p>
+      <w:pPr>
+        <w:jc w:val="both"/>
+        <w:rPr>
+          <w:rFonts w:ascii="Times New Roman" w:hAnsi="Times New Roman" w:cs="Times New Roman"/>
+          <w:b/>
+          <w:bCs/>
+        </w:rPr>
+      </w:pPr>
+      <w:r>
+        <w:rPr>
+          <w:rFonts w:ascii="Times New Roman" w:hAnsi="Times New Roman" w:cs="Times New Roman"/>
+          <w:b/>
+          <w:bCs/>
+        </w:rPr>
+        <w:t>=== GESTIÓN DE MODELOS DE AUTOBÚS ===</w:t>
+      </w:r>
+    </w:p>
+    <w:p>
+      <w:pPr>
+        <w:jc w:val="both"/>
+        <w:rPr>
+          <w:rFonts w:ascii="Times New Roman" w:hAnsi="Times New Roman" w:cs="Times New Roman"/>
+          <w:b/>
+          <w:bCs/>
+        </w:rPr>
+      </w:pPr>
+      <w:r>
+        <w:rPr>
+          <w:rFonts w:ascii="Times New Roman" w:hAnsi="Times New Roman" w:cs="Times New Roman"/>
+          <w:b/>
+          <w:bCs/>
+        </w:rPr>
+        <w:t>(1) Incluir modelo</w:t>
+      </w:r>
+    </w:p>
+    <w:p>
+      <w:pPr>
+        <w:jc w:val="both"/>
+        <w:rPr>
+          <w:rFonts w:ascii="Times New Roman" w:hAnsi="Times New Roman" w:cs="Times New Roman"/>
+          <w:b/>
+          <w:bCs/>
+        </w:rPr>
+      </w:pPr>
+      <w:r>
+        <w:rPr>
+          <w:rFonts w:ascii="Times New Roman" w:hAnsi="Times New Roman" w:cs="Times New Roman"/>
+          <w:b/>
+          <w:bCs/>
+        </w:rPr>
+        <w:t>(2) Eliminar modelo</w:t>
+      </w:r>
+    </w:p>
+    <w:p>
+      <w:pPr>
+        <w:jc w:val="both"/>
+        <w:rPr>
+          <w:rFonts w:ascii="Times New Roman" w:hAnsi="Times New Roman" w:cs="Times New Roman"/>
+          <w:b/>
+          <w:bCs/>
+        </w:rPr>
+      </w:pPr>
+      <w:r>
+        <w:rPr>
+          <w:rFonts w:ascii="Times New Roman" w:hAnsi="Times New Roman" w:cs="Times New Roman"/>
+          <w:b/>
+          <w:bCs/>
+        </w:rPr>
+        <w:t>(3) Modificar modelo</w:t>
+      </w:r>
+    </w:p>
+    <w:p>
+      <w:pPr>
+        <w:jc w:val="both"/>
+        <w:rPr>
+          <w:rFonts w:ascii="Times New Roman" w:hAnsi="Times New Roman" w:cs="Times New Roman"/>
+          <w:b/>
+          <w:bCs/>
+        </w:rPr>
+      </w:pPr>
+      <w:r>
+        <w:rPr>
+          <w:rFonts w:ascii="Times New Roman" w:hAnsi="Times New Roman" w:cs="Times New Roman"/>
+          <w:b/>
+          <w:bCs/>
+        </w:rPr>
+        <w:t>(4) Mostrar modelos</w:t>
+      </w:r>
+    </w:p>
+    <w:p>
+      <w:pPr>
+        <w:jc w:val="both"/>
+        <w:rPr>
+          <w:rFonts w:ascii="Times New Roman" w:hAnsi="Times New Roman" w:cs="Times New Roman"/>
+          <w:b/>
+          <w:bCs/>
+        </w:rPr>
+      </w:pPr>
+      <w:r>
+        <w:rPr>
+          <w:rFonts w:ascii="Times New Roman" w:hAnsi="Times New Roman" w:cs="Times New Roman"/>
+          <w:b/>
+          <w:bCs/>
+        </w:rPr>
+        <w:t>(5) Volver</w:t>
+      </w:r>
+    </w:p>
+    <w:p>
+      <w:pPr>
+        <w:jc w:val="both"/>
+        <w:rPr>
+          <w:rFonts w:ascii="Times New Roman" w:hAnsi="Times New Roman" w:cs="Times New Roman"/>
+          <w:b/>
+          <w:bCs/>
+        </w:rPr>
+      </w:pPr>
+      <w:r>
+        <w:rPr>
+          <w:rFonts w:ascii="Times New Roman" w:hAnsi="Times New Roman" w:cs="Times New Roman"/>
+          <w:b/>
+          <w:bCs/>
+        </w:rPr>
+        <w:t>Elija una opción:</w:t>
+      </w:r>
+    </w:p>
+    <w:p>
+      <w:pPr>
+        <w:jc w:val="both"/>
+        <w:rPr>
+          <w:rFonts w:ascii="Times New Roman" w:hAnsi="Times New Roman" w:cs="Times New Roman"/>
+          <w:b/>
+          <w:bCs/>
+        </w:rPr>
+      </w:pPr>
+    </w:p>
+    <w:p>
+      <w:pPr>
+        <w:jc w:val="both"/>
+        <w:rPr>
+          <w:rFonts w:ascii="Times New Roman" w:hAnsi="Times New Roman" w:cs="Times New Roman"/>
+          <w:sz w:val="28"/>
+          <w:szCs w:val="28"/>
+        </w:rPr>
+      </w:pPr>
+      <w:r>
+        <w:rPr>
+          <w:rFonts w:ascii="Times New Roman" w:hAnsi="Times New Roman" w:cs="Times New Roman"/>
+          <w:sz w:val="28"/>
+          <w:szCs w:val="28"/>
+        </w:rPr>
+        <w:t>(1</w:t>
+      </w:r>
+      <w:r>
+        <w:rPr>
+          <w:rFonts w:ascii="Times New Roman" w:hAnsi="Times New Roman" w:cs="Times New Roman"/>
+          <w:sz w:val="28"/>
+          <w:szCs w:val="28"/>
+        </w:rPr>
+        <w:t xml:space="preserve">) </w:t>
+      </w:r>
+      <w:r>
+        <w:rPr>
+          <w:rFonts w:ascii="Times New Roman" w:hAnsi="Times New Roman" w:cs="Times New Roman"/>
+          <w:sz w:val="28"/>
+          <w:szCs w:val="28"/>
+        </w:rPr>
+        <w:t>Incluir modelo</w:t>
+      </w:r>
+      <w:r>
+        <w:rPr>
+          <w:rFonts w:ascii="Times New Roman" w:hAnsi="Times New Roman" w:cs="Times New Roman"/>
+          <w:sz w:val="28"/>
+          <w:szCs w:val="28"/>
+        </w:rPr>
+        <w:t>: Esta opción nos permite agregar un nuevo modelo de autobús a el archivo “modelos.txt”, para agregar un nuevo modelo, el programa le pedirá los siguientes datos: Un modelo, una marca, cantidad de asientos y cantidad de espacios a pie</w:t>
+      </w:r>
+      <w:r>
+        <w:rPr>
+          <w:rFonts w:ascii="Times New Roman" w:hAnsi="Times New Roman" w:cs="Times New Roman"/>
+          <w:sz w:val="28"/>
+          <w:szCs w:val="28"/>
+        </w:rPr>
+        <w:t>. (</w:t>
+      </w:r>
+      <w:r>
+        <w:rPr>
+          <w:rFonts w:ascii="Times New Roman" w:hAnsi="Times New Roman" w:cs="Times New Roman"/>
+          <w:i/>
+          <w:iCs/>
+          <w:sz w:val="28"/>
+          <w:szCs w:val="28"/>
+        </w:rPr>
+        <w:t>Ninguna de estas tiene validaciones, así que es importante saber que, si usted ingresa por ejemplo “Mercedes” en cantidad de asientos, se lo va a aceptar</w:t>
+      </w:r>
+      <w:r>
+        <w:rPr>
+          <w:rFonts w:ascii="Times New Roman" w:hAnsi="Times New Roman" w:cs="Times New Roman"/>
+          <w:sz w:val="28"/>
+          <w:szCs w:val="28"/>
+        </w:rPr>
+        <w:t>)</w:t>
+      </w:r>
+    </w:p>
+    <w:p>
+      <w:pPr>
+        <w:jc w:val="both"/>
+        <w:rPr>
+          <w:rFonts w:ascii="Times New Roman" w:hAnsi="Times New Roman" w:cs="Times New Roman"/>
+        </w:rPr>
+      </w:pPr>
+    </w:p>
+    <w:p>
+      <w:pPr>
+        <w:jc w:val="center"/>
+        <w:rPr>
+          <w:rFonts w:ascii="Times New Roman" w:hAnsi="Times New Roman" w:cs="Times New Roman"/>
+          <w:sz w:val="28"/>
+          <w:szCs w:val="28"/>
+        </w:rPr>
+      </w:pPr>
+    </w:p>
+    <w:p>
+      <w:pPr>
+        <w:jc w:val="center"/>
+        <w:rPr>
+          <w:rFonts w:ascii="Times New Roman" w:hAnsi="Times New Roman" w:cs="Times New Roman"/>
+          <w:sz w:val="28"/>
+          <w:szCs w:val="28"/>
+        </w:rPr>
+      </w:pPr>
+    </w:p>
+    <w:p>
+      <w:pPr>
+        <w:jc w:val="center"/>
+        <w:rPr>
+          <w:rFonts w:ascii="Times New Roman" w:hAnsi="Times New Roman" w:cs="Times New Roman"/>
+          <w:sz w:val="28"/>
+          <w:szCs w:val="28"/>
+        </w:rPr>
+      </w:pPr>
+    </w:p>
+    <w:p>
+      <w:pPr>
+        <w:jc w:val="center"/>
+        <w:rPr>
+          <w:rFonts w:ascii="Times New Roman" w:hAnsi="Times New Roman" w:cs="Times New Roman"/>
+          <w:sz w:val="28"/>
+          <w:szCs w:val="28"/>
+        </w:rPr>
+      </w:pPr>
+    </w:p>
+    <w:p>
+      <w:pPr>
+        <w:jc w:val="center"/>
+        <w:rPr>
+          <w:rFonts w:ascii="Times New Roman" w:hAnsi="Times New Roman" w:cs="Times New Roman"/>
+          <w:sz w:val="28"/>
+          <w:szCs w:val="28"/>
+        </w:rPr>
+      </w:pPr>
+    </w:p>
+    <w:p>
+      <w:pPr>
+        <w:jc w:val="center"/>
+        <w:rPr>
+          <w:rFonts w:ascii="Times New Roman" w:hAnsi="Times New Roman" w:cs="Times New Roman"/>
+          <w:sz w:val="28"/>
+          <w:szCs w:val="28"/>
+        </w:rPr>
+      </w:pPr>
+    </w:p>
+    <w:p>
+      <w:pPr>
+        <w:jc w:val="center"/>
+        <w:rPr>
+          <w:rFonts w:ascii="Times New Roman" w:hAnsi="Times New Roman" w:cs="Times New Roman"/>
+          <w:sz w:val="28"/>
+          <w:szCs w:val="28"/>
+        </w:rPr>
+      </w:pPr>
+    </w:p>
+    <w:p>
+      <w:pPr>
+        <w:jc w:val="center"/>
+        <w:rPr>
+          <w:rFonts w:ascii="Times New Roman" w:hAnsi="Times New Roman" w:cs="Times New Roman"/>
+          <w:sz w:val="28"/>
+          <w:szCs w:val="28"/>
+        </w:rPr>
+      </w:pPr>
+    </w:p>
+    <w:p>
+      <w:pPr>
+        <w:jc w:val="center"/>
+        <w:rPr>
+          <w:rFonts w:ascii="Times New Roman" w:hAnsi="Times New Roman" w:cs="Times New Roman"/>
+          <w:sz w:val="28"/>
+          <w:szCs w:val="28"/>
+        </w:rPr>
+      </w:pPr>
+    </w:p>
+    <w:p>
+      <w:pPr>
+        <w:jc w:val="center"/>
+        <w:rPr>
+          <w:rFonts w:ascii="Times New Roman" w:hAnsi="Times New Roman" w:cs="Times New Roman"/>
+          <w:sz w:val="28"/>
+          <w:szCs w:val="28"/>
+        </w:rPr>
+      </w:pPr>
+    </w:p>
+    <w:p>
+      <w:pPr>
+        <w:jc w:val="center"/>
+        <w:rPr>
+          <w:rFonts w:ascii="Times New Roman" w:hAnsi="Times New Roman" w:cs="Times New Roman"/>
+          <w:sz w:val="28"/>
+          <w:szCs w:val="28"/>
+        </w:rPr>
+      </w:pPr>
+    </w:p>
+    <w:p>
+      <w:pPr>
+        <w:jc w:val="center"/>
+        <w:rPr>
+          <w:rFonts w:ascii="Times New Roman" w:hAnsi="Times New Roman" w:cs="Times New Roman"/>
+          <w:sz w:val="28"/>
+          <w:szCs w:val="28"/>
+        </w:rPr>
+      </w:pPr>
+    </w:p>
+    <w:p>
+      <w:pPr>
+        <w:jc w:val="center"/>
+        <w:rPr>
+          <w:rFonts w:ascii="Times New Roman" w:hAnsi="Times New Roman" w:cs="Times New Roman"/>
+          <w:sz w:val="28"/>
+          <w:szCs w:val="28"/>
+        </w:rPr>
+      </w:pPr>
+    </w:p>
+    <w:p>
+      <w:pPr>
+        <w:jc w:val="center"/>
+        <w:rPr>
+          <w:rFonts w:ascii="Times New Roman" w:hAnsi="Times New Roman" w:cs="Times New Roman"/>
+          <w:sz w:val="28"/>
+          <w:szCs w:val="28"/>
+        </w:rPr>
+      </w:pPr>
+    </w:p>
+    <w:p>
+      <w:pPr>
+        <w:jc w:val="center"/>
+        <w:rPr>
+          <w:rFonts w:ascii="Times New Roman" w:hAnsi="Times New Roman" w:cs="Times New Roman"/>
+          <w:sz w:val="28"/>
+          <w:szCs w:val="28"/>
+        </w:rPr>
+      </w:pPr>
+    </w:p>
+    <w:p>
+      <w:pPr>
+        <w:jc w:val="center"/>
+        <w:rPr>
+          <w:rFonts w:ascii="Times New Roman" w:hAnsi="Times New Roman" w:cs="Times New Roman"/>
+          <w:sz w:val="28"/>
+          <w:szCs w:val="28"/>
+        </w:rPr>
+      </w:pPr>
+    </w:p>
+    <w:p>
+      <w:pPr>
+        <w:jc w:val="center"/>
+        <w:rPr>
+          <w:rFonts w:ascii="Times New Roman" w:hAnsi="Times New Roman" w:cs="Times New Roman"/>
+          <w:sz w:val="28"/>
+          <w:szCs w:val="28"/>
+        </w:rPr>
+      </w:pPr>
+    </w:p>
+    <w:p>
+      <w:pPr>
+        <w:jc w:val="center"/>
+        <w:rPr>
+          <w:rFonts w:ascii="Times New Roman" w:hAnsi="Times New Roman" w:cs="Times New Roman"/>
+          <w:sz w:val="28"/>
+          <w:szCs w:val="28"/>
+        </w:rPr>
+      </w:pPr>
+    </w:p>
+    <w:p>
+      <w:pPr>
+        <w:jc w:val="center"/>
+        <w:rPr>
+          <w:rFonts w:ascii="Times New Roman" w:hAnsi="Times New Roman" w:cs="Times New Roman"/>
+          <w:sz w:val="28"/>
+          <w:szCs w:val="28"/>
+        </w:rPr>
+      </w:pPr>
+    </w:p>
+    <w:p>
+      <w:pPr>
+        <w:jc w:val="center"/>
+        <w:rPr>
+          <w:rFonts w:ascii="Times New Roman" w:hAnsi="Times New Roman" w:cs="Times New Roman"/>
+          <w:sz w:val="28"/>
+          <w:szCs w:val="28"/>
+        </w:rPr>
+      </w:pPr>
+    </w:p>
+    <w:p>
+      <w:pPr>
+        <w:jc w:val="center"/>
+        <w:rPr>
+          <w:rFonts w:ascii="Times New Roman" w:hAnsi="Times New Roman" w:cs="Times New Roman"/>
+          <w:b/>
+          <w:bCs/>
+          <w:sz w:val="28"/>
+          <w:szCs w:val="28"/>
+        </w:rPr>
+      </w:pPr>
+      <w:r>
+        <w:rPr>
+          <w:rFonts w:ascii="Times New Roman" w:hAnsi="Times New Roman" w:cs="Times New Roman"/>
+          <w:b/>
+          <w:bCs/>
+          <w:sz w:val="28"/>
+          <w:szCs w:val="28"/>
+        </w:rPr>
         <w:t>Descripción del Problema</w:t>
       </w:r>
     </w:p>
@@ -945,288 +2283,220 @@
     </w:p>
     <w:p>
       <w:pPr>
-        <w:jc w:val="center"/>
-        <w:rPr>
-          <w:rFonts w:ascii="Times New Roman" w:hAnsi="Times New Roman" w:cs="Times New Roman"/>
-          <w:b/>
-          <w:bCs/>
-          <w:sz w:val="28"/>
-          <w:szCs w:val="28"/>
-        </w:rPr>
-      </w:pPr>
-    </w:p>
-    <w:p>
-      <w:pPr>
-        <w:jc w:val="center"/>
-        <w:rPr>
-          <w:rFonts w:ascii="Times New Roman" w:hAnsi="Times New Roman" w:cs="Times New Roman"/>
-          <w:b/>
-          <w:bCs/>
-          <w:sz w:val="28"/>
-          <w:szCs w:val="28"/>
-        </w:rPr>
-      </w:pPr>
-    </w:p>
-    <w:p>
-      <w:pPr>
-        <w:jc w:val="center"/>
-        <w:rPr>
-          <w:rFonts w:ascii="Times New Roman" w:hAnsi="Times New Roman" w:cs="Times New Roman"/>
-          <w:b/>
-          <w:bCs/>
-          <w:sz w:val="28"/>
-          <w:szCs w:val="28"/>
-        </w:rPr>
-      </w:pPr>
-    </w:p>
-    <w:p>
-      <w:pPr>
-        <w:jc w:val="center"/>
-        <w:rPr>
-          <w:rFonts w:ascii="Times New Roman" w:hAnsi="Times New Roman" w:cs="Times New Roman"/>
-          <w:b/>
-          <w:bCs/>
-          <w:sz w:val="28"/>
-          <w:szCs w:val="28"/>
-        </w:rPr>
-      </w:pPr>
-    </w:p>
-    <w:p>
-      <w:pPr>
-        <w:jc w:val="center"/>
-        <w:rPr>
-          <w:rFonts w:ascii="Times New Roman" w:hAnsi="Times New Roman" w:cs="Times New Roman"/>
-          <w:b/>
-          <w:bCs/>
-          <w:sz w:val="28"/>
-          <w:szCs w:val="28"/>
-        </w:rPr>
-      </w:pPr>
-    </w:p>
-    <w:p>
-      <w:pPr>
-        <w:jc w:val="center"/>
-        <w:rPr>
-          <w:rFonts w:ascii="Times New Roman" w:hAnsi="Times New Roman" w:cs="Times New Roman"/>
-          <w:b/>
-          <w:bCs/>
-          <w:sz w:val="28"/>
-          <w:szCs w:val="28"/>
-        </w:rPr>
-      </w:pPr>
-    </w:p>
-    <w:p>
-      <w:pPr>
-        <w:jc w:val="center"/>
-        <w:rPr>
-          <w:rFonts w:ascii="Times New Roman" w:hAnsi="Times New Roman" w:cs="Times New Roman"/>
-          <w:b/>
-          <w:bCs/>
-          <w:sz w:val="28"/>
-          <w:szCs w:val="28"/>
-        </w:rPr>
-      </w:pPr>
-    </w:p>
-    <w:p>
-      <w:pPr>
-        <w:jc w:val="center"/>
-        <w:rPr>
-          <w:rFonts w:ascii="Times New Roman" w:hAnsi="Times New Roman" w:cs="Times New Roman"/>
-          <w:b/>
-          <w:bCs/>
-          <w:sz w:val="28"/>
-          <w:szCs w:val="28"/>
-        </w:rPr>
-      </w:pPr>
-    </w:p>
-    <w:p>
-      <w:pPr>
-        <w:jc w:val="center"/>
-        <w:rPr>
-          <w:rFonts w:ascii="Times New Roman" w:hAnsi="Times New Roman" w:cs="Times New Roman"/>
-          <w:b/>
-          <w:bCs/>
-          <w:sz w:val="28"/>
-          <w:szCs w:val="28"/>
-        </w:rPr>
-      </w:pPr>
-    </w:p>
-    <w:p>
-      <w:pPr>
-        <w:jc w:val="center"/>
-        <w:rPr>
-          <w:rFonts w:ascii="Times New Roman" w:hAnsi="Times New Roman" w:cs="Times New Roman"/>
-          <w:b/>
-          <w:bCs/>
-          <w:sz w:val="28"/>
-          <w:szCs w:val="28"/>
-        </w:rPr>
-      </w:pPr>
-    </w:p>
-    <w:p>
-      <w:pPr>
-        <w:jc w:val="center"/>
-        <w:rPr>
-          <w:rFonts w:ascii="Times New Roman" w:hAnsi="Times New Roman" w:cs="Times New Roman"/>
-          <w:b/>
-          <w:bCs/>
-          <w:sz w:val="28"/>
-          <w:szCs w:val="28"/>
-        </w:rPr>
-      </w:pPr>
-    </w:p>
-    <w:p>
-      <w:pPr>
-        <w:jc w:val="center"/>
-        <w:rPr>
-          <w:rFonts w:ascii="Times New Roman" w:hAnsi="Times New Roman" w:cs="Times New Roman"/>
-          <w:b/>
-          <w:bCs/>
-          <w:sz w:val="28"/>
-          <w:szCs w:val="28"/>
-        </w:rPr>
-      </w:pPr>
-    </w:p>
-    <w:p>
-      <w:pPr>
-        <w:jc w:val="center"/>
-        <w:rPr>
-          <w:rFonts w:ascii="Times New Roman" w:hAnsi="Times New Roman" w:cs="Times New Roman"/>
-          <w:b/>
-          <w:bCs/>
-          <w:sz w:val="28"/>
-          <w:szCs w:val="28"/>
-        </w:rPr>
-      </w:pPr>
-    </w:p>
-    <w:p>
-      <w:pPr>
-        <w:jc w:val="center"/>
-        <w:rPr>
-          <w:rFonts w:ascii="Times New Roman" w:hAnsi="Times New Roman" w:cs="Times New Roman"/>
-          <w:b/>
-          <w:bCs/>
-          <w:sz w:val="28"/>
-          <w:szCs w:val="28"/>
-        </w:rPr>
-      </w:pPr>
-    </w:p>
-    <w:p>
-      <w:pPr>
-        <w:jc w:val="center"/>
-        <w:rPr>
-          <w:rFonts w:ascii="Times New Roman" w:hAnsi="Times New Roman" w:cs="Times New Roman"/>
-          <w:b/>
-          <w:bCs/>
-          <w:sz w:val="28"/>
-          <w:szCs w:val="28"/>
-        </w:rPr>
-      </w:pPr>
-    </w:p>
-    <w:p>
-      <w:pPr>
-        <w:jc w:val="center"/>
-        <w:rPr>
-          <w:rFonts w:ascii="Times New Roman" w:hAnsi="Times New Roman" w:cs="Times New Roman"/>
-          <w:b/>
-          <w:bCs/>
-          <w:sz w:val="28"/>
-          <w:szCs w:val="28"/>
-        </w:rPr>
-      </w:pPr>
-    </w:p>
-    <w:p>
-      <w:pPr>
-        <w:jc w:val="center"/>
-        <w:rPr>
-          <w:rFonts w:ascii="Times New Roman" w:hAnsi="Times New Roman" w:cs="Times New Roman"/>
-          <w:b/>
-          <w:bCs/>
-          <w:sz w:val="28"/>
-          <w:szCs w:val="28"/>
-        </w:rPr>
-      </w:pPr>
-    </w:p>
-    <w:p>
-      <w:pPr>
-        <w:jc w:val="center"/>
-        <w:rPr>
-          <w:rFonts w:ascii="Times New Roman" w:hAnsi="Times New Roman" w:cs="Times New Roman"/>
-          <w:b/>
-          <w:bCs/>
-          <w:sz w:val="28"/>
-          <w:szCs w:val="28"/>
-        </w:rPr>
-      </w:pPr>
-    </w:p>
-    <w:p>
-      <w:pPr>
-        <w:jc w:val="center"/>
-        <w:rPr>
-          <w:rFonts w:ascii="Times New Roman" w:hAnsi="Times New Roman" w:cs="Times New Roman"/>
-          <w:b/>
-          <w:bCs/>
-          <w:sz w:val="28"/>
-          <w:szCs w:val="28"/>
-        </w:rPr>
-      </w:pPr>
-    </w:p>
-    <w:p>
-      <w:pPr>
-        <w:jc w:val="center"/>
-        <w:rPr>
-          <w:rFonts w:ascii="Times New Roman" w:hAnsi="Times New Roman" w:cs="Times New Roman"/>
-          <w:b/>
-          <w:bCs/>
-          <w:sz w:val="28"/>
-          <w:szCs w:val="28"/>
-        </w:rPr>
-      </w:pPr>
-    </w:p>
-    <w:p>
-      <w:pPr>
-        <w:jc w:val="center"/>
-        <w:rPr>
-          <w:rFonts w:ascii="Times New Roman" w:hAnsi="Times New Roman" w:cs="Times New Roman"/>
-          <w:b/>
-          <w:bCs/>
-          <w:sz w:val="28"/>
-          <w:szCs w:val="28"/>
-        </w:rPr>
-      </w:pPr>
-    </w:p>
-    <w:p>
-      <w:pPr>
-        <w:jc w:val="center"/>
-        <w:rPr>
-          <w:rFonts w:ascii="Times New Roman" w:hAnsi="Times New Roman" w:cs="Times New Roman"/>
-          <w:b/>
-          <w:bCs/>
-          <w:sz w:val="28"/>
-          <w:szCs w:val="28"/>
-        </w:rPr>
-      </w:pPr>
-    </w:p>
-    <w:p>
-      <w:pPr>
-        <w:jc w:val="center"/>
-        <w:rPr>
-          <w:rFonts w:ascii="Times New Roman" w:hAnsi="Times New Roman" w:cs="Times New Roman"/>
-          <w:b/>
-          <w:bCs/>
-          <w:sz w:val="28"/>
-          <w:szCs w:val="28"/>
-        </w:rPr>
-      </w:pPr>
-      <w:r>
-        <w:rPr>
-          <w:rFonts w:ascii="Times New Roman" w:hAnsi="Times New Roman" w:cs="Times New Roman"/>
-          <w:b/>
-          <w:bCs/>
-          <w:sz w:val="28"/>
-          <w:szCs w:val="28"/>
-        </w:rPr>
-        <w:lastRenderedPageBreak/>
+        <w:jc w:val="both"/>
+        <w:rPr>
+          <w:rFonts w:ascii="Times New Roman" w:hAnsi="Times New Roman" w:cs="Times New Roman"/>
+        </w:rPr>
+      </w:pPr>
+      <w:r>
+        <w:rPr>
+          <w:rFonts w:ascii="Times New Roman" w:hAnsi="Times New Roman" w:cs="Times New Roman"/>
+        </w:rPr>
+        <w:t>Se le solicita al estudiante diseñar una aplicación que trabaje en la consola IDLE de Python que simule un programa de operaciones para una empresa de transporte público, dicho sistema tiene que tener varias funciones de 2 lados: Administración y de Usuarios.</w:t>
+      </w:r>
+    </w:p>
+    <w:p>
+      <w:pPr>
+        <w:jc w:val="both"/>
+        <w:rPr>
+          <w:rFonts w:ascii="Times New Roman" w:hAnsi="Times New Roman" w:cs="Times New Roman"/>
+        </w:rPr>
+      </w:pPr>
+      <w:r>
+        <w:rPr>
+          <w:rFonts w:ascii="Times New Roman" w:hAnsi="Times New Roman" w:cs="Times New Roman"/>
+        </w:rPr>
+        <w:t xml:space="preserve">Para las funciones administrativas se requieren una gran variedad de funciones que nos ayuden a manejar todos los posibles escenarios que ocurran en el sistema, como, por ejemplo: Tener que registrar, eliminar o modificar unidades del transporte, así como asignarles sus debidos conductores. Poder crear rutas donde operaran las unidades, con intervalos de tiempo que tengan sentido y sean fáciles de comprender. En general debemos </w:t>
+      </w:r>
+      <w:r>
+        <w:rPr>
+          <w:rFonts w:ascii="Times New Roman" w:hAnsi="Times New Roman" w:cs="Times New Roman"/>
+        </w:rPr>
+        <w:t>ser capaces</w:t>
+      </w:r>
+      <w:r>
+        <w:rPr>
+          <w:rFonts w:ascii="Times New Roman" w:hAnsi="Times New Roman" w:cs="Times New Roman"/>
+        </w:rPr>
+        <w:t xml:space="preserve"> de manejar toda la logística de la empresa desde aquí, controlar las unidades, los conductores y las rutas, también un historial de que reservaciones se han hecho y cuanto dinero se ha recaudado hasta el momento.</w:t>
+      </w:r>
+    </w:p>
+    <w:p>
+      <w:pPr>
+        <w:jc w:val="both"/>
+        <w:rPr>
+          <w:rFonts w:ascii="Times New Roman" w:hAnsi="Times New Roman" w:cs="Times New Roman"/>
+        </w:rPr>
+      </w:pPr>
+      <w:r>
+        <w:rPr>
+          <w:rFonts w:ascii="Times New Roman" w:hAnsi="Times New Roman" w:cs="Times New Roman"/>
+        </w:rPr>
+        <w:t>Por otro lado, para nuestras funciones como usuario, debemos tener la capacidad de poder consultar cuales son las salidas programadas por la empresa, de querer ir en una de ellas, debemos de poder registrar nuestro abordaje al sistema, usando nuestro nombre y con ello elegir la cantidad de asientos que vayamos a necesitar, con esto también debemos de ser capaces de cancelar nuestra reservación en caso de que lo requiramos.</w:t>
+      </w:r>
+    </w:p>
+    <w:p>
+      <w:pPr>
+        <w:jc w:val="center"/>
+        <w:rPr>
+          <w:rFonts w:ascii="Times New Roman" w:hAnsi="Times New Roman" w:cs="Times New Roman"/>
+          <w:b/>
+          <w:bCs/>
+          <w:sz w:val="28"/>
+          <w:szCs w:val="28"/>
+        </w:rPr>
+      </w:pPr>
+    </w:p>
+    <w:p>
+      <w:pPr>
+        <w:jc w:val="center"/>
+        <w:rPr>
+          <w:rFonts w:ascii="Times New Roman" w:hAnsi="Times New Roman" w:cs="Times New Roman"/>
+          <w:b/>
+          <w:bCs/>
+          <w:sz w:val="28"/>
+          <w:szCs w:val="28"/>
+        </w:rPr>
+      </w:pPr>
+    </w:p>
+    <w:p>
+      <w:pPr>
+        <w:jc w:val="center"/>
+        <w:rPr>
+          <w:rFonts w:ascii="Times New Roman" w:hAnsi="Times New Roman" w:cs="Times New Roman"/>
+          <w:b/>
+          <w:bCs/>
+          <w:sz w:val="28"/>
+          <w:szCs w:val="28"/>
+        </w:rPr>
+      </w:pPr>
+    </w:p>
+    <w:p>
+      <w:pPr>
+        <w:jc w:val="center"/>
+        <w:rPr>
+          <w:rFonts w:ascii="Times New Roman" w:hAnsi="Times New Roman" w:cs="Times New Roman"/>
+          <w:b/>
+          <w:bCs/>
+          <w:sz w:val="28"/>
+          <w:szCs w:val="28"/>
+        </w:rPr>
+      </w:pPr>
+    </w:p>
+    <w:p>
+      <w:pPr>
+        <w:jc w:val="center"/>
+        <w:rPr>
+          <w:rFonts w:ascii="Times New Roman" w:hAnsi="Times New Roman" w:cs="Times New Roman"/>
+          <w:b/>
+          <w:bCs/>
+          <w:sz w:val="28"/>
+          <w:szCs w:val="28"/>
+        </w:rPr>
+      </w:pPr>
+    </w:p>
+    <w:p>
+      <w:pPr>
+        <w:jc w:val="center"/>
+        <w:rPr>
+          <w:rFonts w:ascii="Times New Roman" w:hAnsi="Times New Roman" w:cs="Times New Roman"/>
+          <w:b/>
+          <w:bCs/>
+          <w:sz w:val="28"/>
+          <w:szCs w:val="28"/>
+        </w:rPr>
+      </w:pPr>
+    </w:p>
+    <w:p>
+      <w:pPr>
+        <w:jc w:val="center"/>
+        <w:rPr>
+          <w:rFonts w:ascii="Times New Roman" w:hAnsi="Times New Roman" w:cs="Times New Roman"/>
+          <w:b/>
+          <w:bCs/>
+          <w:sz w:val="28"/>
+          <w:szCs w:val="28"/>
+        </w:rPr>
+      </w:pPr>
+    </w:p>
+    <w:p>
+      <w:pPr>
+        <w:jc w:val="center"/>
+        <w:rPr>
+          <w:rFonts w:ascii="Times New Roman" w:hAnsi="Times New Roman" w:cs="Times New Roman"/>
+          <w:b/>
+          <w:bCs/>
+          <w:sz w:val="28"/>
+          <w:szCs w:val="28"/>
+        </w:rPr>
+      </w:pPr>
+    </w:p>
+    <w:p>
+      <w:pPr>
+        <w:jc w:val="center"/>
+        <w:rPr>
+          <w:rFonts w:ascii="Times New Roman" w:hAnsi="Times New Roman" w:cs="Times New Roman"/>
+          <w:b/>
+          <w:bCs/>
+          <w:sz w:val="28"/>
+          <w:szCs w:val="28"/>
+        </w:rPr>
+      </w:pPr>
+    </w:p>
+    <w:p>
+      <w:pPr>
+        <w:jc w:val="center"/>
+        <w:rPr>
+          <w:rFonts w:ascii="Times New Roman" w:hAnsi="Times New Roman" w:cs="Times New Roman"/>
+          <w:b/>
+          <w:bCs/>
+          <w:sz w:val="28"/>
+          <w:szCs w:val="28"/>
+        </w:rPr>
+      </w:pPr>
+    </w:p>
+    <w:p>
+      <w:pPr>
+        <w:jc w:val="center"/>
+        <w:rPr>
+          <w:rFonts w:ascii="Times New Roman" w:hAnsi="Times New Roman" w:cs="Times New Roman"/>
+          <w:b/>
+          <w:bCs/>
+          <w:sz w:val="28"/>
+          <w:szCs w:val="28"/>
+        </w:rPr>
+      </w:pPr>
+    </w:p>
+    <w:p>
+      <w:pPr>
+        <w:rPr>
+          <w:rFonts w:ascii="Times New Roman" w:hAnsi="Times New Roman" w:cs="Times New Roman"/>
+          <w:b/>
+          <w:bCs/>
+          <w:sz w:val="28"/>
+          <w:szCs w:val="28"/>
+        </w:rPr>
+      </w:pPr>
+    </w:p>
+    <w:p>
+      <w:pPr>
+        <w:jc w:val="center"/>
+        <w:rPr>
+          <w:rFonts w:ascii="Times New Roman" w:hAnsi="Times New Roman" w:cs="Times New Roman"/>
+          <w:b/>
+          <w:bCs/>
+          <w:sz w:val="28"/>
+          <w:szCs w:val="28"/>
+        </w:rPr>
+      </w:pPr>
+      <w:r>
+        <w:rPr>
+          <w:rFonts w:ascii="Times New Roman" w:hAnsi="Times New Roman" w:cs="Times New Roman"/>
+          <w:b/>
+          <w:bCs/>
+          <w:sz w:val="28"/>
+          <w:szCs w:val="28"/>
+        </w:rPr>
         <w:t>Diseño del progra</w:t>
       </w:r>
       <w:r>
@@ -1505,7 +2775,6 @@
           <w:sz w:val="28"/>
           <w:szCs w:val="28"/>
         </w:rPr>
-        <w:lastRenderedPageBreak/>
         <w:t>Librerías Usadas</w:t>
       </w:r>
     </w:p>
@@ -1804,7 +3073,6 @@
           <w:sz w:val="28"/>
           <w:szCs w:val="28"/>
         </w:rPr>
-        <w:lastRenderedPageBreak/>
         <w:t>Análisis de Resultados</w:t>
       </w:r>
     </w:p>
@@ -2065,7 +3333,6 @@
           <w:sz w:val="28"/>
           <w:szCs w:val="28"/>
         </w:rPr>
-        <w:lastRenderedPageBreak/>
         <w:t>Bitácora de Trabajo</w:t>
       </w:r>
     </w:p>
@@ -2331,14 +3598,12 @@
               </w:rPr>
               <w:t xml:space="preserve">Trabaje en el menú principal y plantee la idea de </w:t>
             </w:r>
-            <w:proofErr w:type="spellStart"/>
-            <w:r>
-              <w:rPr>
-                <w:rFonts w:ascii="Times New Roman" w:hAnsi="Times New Roman" w:cs="Times New Roman"/>
-              </w:rPr>
-              <w:t>como</w:t>
-            </w:r>
-            <w:proofErr w:type="spellEnd"/>
+            <w:r>
+              <w:rPr>
+                <w:rFonts w:ascii="Times New Roman" w:hAnsi="Times New Roman" w:cs="Times New Roman"/>
+              </w:rPr>
+              <w:t>cómo</w:t>
+            </w:r>
             <w:r>
               <w:rPr>
                 <w:rFonts w:ascii="Times New Roman" w:hAnsi="Times New Roman" w:cs="Times New Roman"/>
@@ -2620,6 +3885,7 @@
               <w:rPr>
                 <w:rFonts w:ascii="Times New Roman" w:hAnsi="Times New Roman" w:cs="Times New Roman"/>
               </w:rPr>
+              <w:lastRenderedPageBreak/>
               <w:t>(12 minutos)</w:t>
             </w:r>
           </w:p>
@@ -2652,6 +3918,7 @@
               <w:rPr>
                 <w:rFonts w:ascii="Times New Roman" w:hAnsi="Times New Roman" w:cs="Times New Roman"/>
               </w:rPr>
+              <w:lastRenderedPageBreak/>
               <w:t>Avanzar con el sistema de inicio de sesión (admin)</w:t>
             </w:r>
             <w:r>
@@ -2670,7 +3937,14 @@
               <w:rPr>
                 <w:rFonts w:ascii="Times New Roman" w:hAnsi="Times New Roman" w:cs="Times New Roman"/>
               </w:rPr>
-              <w:t>Se intento lograr que el archivo se maneje con listas, por ahora lo dejo incompleto y en un archivo separado.</w:t>
+              <w:t xml:space="preserve">Se intento lograr que el archivo se maneje con listas, por ahora lo dejo </w:t>
+            </w:r>
+            <w:r>
+              <w:rPr>
+                <w:rFonts w:ascii="Times New Roman" w:hAnsi="Times New Roman" w:cs="Times New Roman"/>
+              </w:rPr>
+              <w:lastRenderedPageBreak/>
+              <w:t>incompleto y en un archivo separado.</w:t>
             </w:r>
           </w:p>
         </w:tc>
@@ -2741,6 +4015,38 @@
                 <w:rFonts w:ascii="Times New Roman" w:hAnsi="Times New Roman" w:cs="Times New Roman"/>
               </w:rPr>
             </w:pPr>
+          </w:p>
+          <w:p>
+            <w:pPr>
+              <w:jc w:val="center"/>
+              <w:rPr>
+                <w:rFonts w:ascii="Times New Roman" w:hAnsi="Times New Roman" w:cs="Times New Roman"/>
+              </w:rPr>
+            </w:pPr>
+          </w:p>
+          <w:p>
+            <w:pPr>
+              <w:jc w:val="center"/>
+              <w:rPr>
+                <w:rFonts w:ascii="Times New Roman" w:hAnsi="Times New Roman" w:cs="Times New Roman"/>
+              </w:rPr>
+            </w:pPr>
+          </w:p>
+          <w:p>
+            <w:pPr>
+              <w:jc w:val="center"/>
+              <w:rPr>
+                <w:rFonts w:ascii="Times New Roman" w:hAnsi="Times New Roman" w:cs="Times New Roman"/>
+              </w:rPr>
+            </w:pPr>
+          </w:p>
+          <w:p>
+            <w:pPr>
+              <w:jc w:val="center"/>
+              <w:rPr>
+                <w:rFonts w:ascii="Times New Roman" w:hAnsi="Times New Roman" w:cs="Times New Roman"/>
+              </w:rPr>
+            </w:pPr>
             <w:r>
               <w:rPr>
                 <w:rFonts w:ascii="Times New Roman" w:hAnsi="Times New Roman" w:cs="Times New Roman"/>
@@ -2857,6 +4163,22 @@
                 <w:rFonts w:ascii="Times New Roman" w:hAnsi="Times New Roman" w:cs="Times New Roman"/>
               </w:rPr>
             </w:pPr>
+          </w:p>
+          <w:p>
+            <w:pPr>
+              <w:jc w:val="center"/>
+              <w:rPr>
+                <w:rFonts w:ascii="Times New Roman" w:hAnsi="Times New Roman" w:cs="Times New Roman"/>
+              </w:rPr>
+            </w:pPr>
+          </w:p>
+          <w:p>
+            <w:pPr>
+              <w:jc w:val="center"/>
+              <w:rPr>
+                <w:rFonts w:ascii="Times New Roman" w:hAnsi="Times New Roman" w:cs="Times New Roman"/>
+              </w:rPr>
+            </w:pPr>
             <w:r>
               <w:rPr>
                 <w:rFonts w:ascii="Times New Roman" w:hAnsi="Times New Roman" w:cs="Times New Roman"/>
@@ -3411,6 +4733,62 @@
                 <w:rFonts w:ascii="Times New Roman" w:hAnsi="Times New Roman" w:cs="Times New Roman"/>
               </w:rPr>
             </w:pPr>
+          </w:p>
+          <w:p>
+            <w:pPr>
+              <w:jc w:val="center"/>
+              <w:rPr>
+                <w:rFonts w:ascii="Times New Roman" w:hAnsi="Times New Roman" w:cs="Times New Roman"/>
+              </w:rPr>
+            </w:pPr>
+          </w:p>
+          <w:p>
+            <w:pPr>
+              <w:jc w:val="center"/>
+              <w:rPr>
+                <w:rFonts w:ascii="Times New Roman" w:hAnsi="Times New Roman" w:cs="Times New Roman"/>
+              </w:rPr>
+            </w:pPr>
+          </w:p>
+          <w:p>
+            <w:pPr>
+              <w:jc w:val="center"/>
+              <w:rPr>
+                <w:rFonts w:ascii="Times New Roman" w:hAnsi="Times New Roman" w:cs="Times New Roman"/>
+              </w:rPr>
+            </w:pPr>
+          </w:p>
+          <w:p>
+            <w:pPr>
+              <w:jc w:val="center"/>
+              <w:rPr>
+                <w:rFonts w:ascii="Times New Roman" w:hAnsi="Times New Roman" w:cs="Times New Roman"/>
+              </w:rPr>
+            </w:pPr>
+          </w:p>
+          <w:p>
+            <w:pPr>
+              <w:jc w:val="center"/>
+              <w:rPr>
+                <w:rFonts w:ascii="Times New Roman" w:hAnsi="Times New Roman" w:cs="Times New Roman"/>
+              </w:rPr>
+            </w:pPr>
+          </w:p>
+          <w:p>
+            <w:pPr>
+              <w:jc w:val="center"/>
+              <w:rPr>
+                <w:rFonts w:ascii="Times New Roman" w:hAnsi="Times New Roman" w:cs="Times New Roman"/>
+              </w:rPr>
+            </w:pPr>
+          </w:p>
+          <w:p>
+            <w:pPr>
+              <w:jc w:val="center"/>
+              <w:rPr>
+                <w:rFonts w:ascii="Times New Roman" w:hAnsi="Times New Roman" w:cs="Times New Roman"/>
+              </w:rPr>
+            </w:pPr>
             <w:r>
               <w:rPr>
                 <w:rFonts w:ascii="Times New Roman" w:hAnsi="Times New Roman" w:cs="Times New Roman"/>
@@ -3479,6 +4857,7 @@
               <w:rPr>
                 <w:rFonts w:ascii="Times New Roman" w:hAnsi="Times New Roman" w:cs="Times New Roman"/>
               </w:rPr>
+              <w:lastRenderedPageBreak/>
               <w:t>Se crea una función que nos ayudara a detectar repeticiones en un archivo txt deseado</w:t>
             </w:r>
             <w:r>
@@ -3515,6 +4894,41 @@
               </w:rPr>
               <w:t>Se crea la función de agregar modelos, por ahora solo pide los inputs, pero valida que los modelos no se repitan.</w:t>
             </w:r>
+          </w:p>
+          <w:p>
+            <w:pPr>
+              <w:rPr>
+                <w:rFonts w:ascii="Times New Roman" w:hAnsi="Times New Roman" w:cs="Times New Roman"/>
+              </w:rPr>
+            </w:pPr>
+          </w:p>
+          <w:p>
+            <w:pPr>
+              <w:rPr>
+                <w:rFonts w:ascii="Times New Roman" w:hAnsi="Times New Roman" w:cs="Times New Roman"/>
+              </w:rPr>
+            </w:pPr>
+          </w:p>
+          <w:p>
+            <w:pPr>
+              <w:rPr>
+                <w:rFonts w:ascii="Times New Roman" w:hAnsi="Times New Roman" w:cs="Times New Roman"/>
+              </w:rPr>
+            </w:pPr>
+          </w:p>
+          <w:p>
+            <w:pPr>
+              <w:rPr>
+                <w:rFonts w:ascii="Times New Roman" w:hAnsi="Times New Roman" w:cs="Times New Roman"/>
+              </w:rPr>
+            </w:pPr>
+          </w:p>
+          <w:p>
+            <w:pPr>
+              <w:rPr>
+                <w:rFonts w:ascii="Times New Roman" w:hAnsi="Times New Roman" w:cs="Times New Roman"/>
+              </w:rPr>
+            </w:pPr>
           </w:p>
           <w:p>
             <w:pPr>
@@ -3569,27 +4983,63 @@
           </w:p>
           <w:p>
             <w:pPr>
-              <w:rPr>
-                <w:rFonts w:ascii="Times New Roman" w:hAnsi="Times New Roman" w:cs="Times New Roman"/>
-              </w:rPr>
-            </w:pPr>
-          </w:p>
-          <w:p>
-            <w:pPr>
-              <w:rPr>
-                <w:rFonts w:ascii="Times New Roman" w:hAnsi="Times New Roman" w:cs="Times New Roman"/>
-              </w:rPr>
-            </w:pPr>
-          </w:p>
-          <w:p>
-            <w:pPr>
-              <w:rPr>
-                <w:rFonts w:ascii="Times New Roman" w:hAnsi="Times New Roman" w:cs="Times New Roman"/>
-              </w:rPr>
-            </w:pPr>
-          </w:p>
-          <w:p>
-            <w:pPr>
+              <w:jc w:val="center"/>
+              <w:rPr>
+                <w:rFonts w:ascii="Times New Roman" w:hAnsi="Times New Roman" w:cs="Times New Roman"/>
+              </w:rPr>
+            </w:pPr>
+          </w:p>
+          <w:p>
+            <w:pPr>
+              <w:jc w:val="center"/>
+              <w:rPr>
+                <w:rFonts w:ascii="Times New Roman" w:hAnsi="Times New Roman" w:cs="Times New Roman"/>
+              </w:rPr>
+            </w:pPr>
+          </w:p>
+          <w:p>
+            <w:pPr>
+              <w:jc w:val="center"/>
+              <w:rPr>
+                <w:rFonts w:ascii="Times New Roman" w:hAnsi="Times New Roman" w:cs="Times New Roman"/>
+              </w:rPr>
+            </w:pPr>
+          </w:p>
+          <w:p>
+            <w:pPr>
+              <w:jc w:val="center"/>
+              <w:rPr>
+                <w:rFonts w:ascii="Times New Roman" w:hAnsi="Times New Roman" w:cs="Times New Roman"/>
+              </w:rPr>
+            </w:pPr>
+          </w:p>
+          <w:p>
+            <w:pPr>
+              <w:jc w:val="center"/>
+              <w:rPr>
+                <w:rFonts w:ascii="Times New Roman" w:hAnsi="Times New Roman" w:cs="Times New Roman"/>
+              </w:rPr>
+            </w:pPr>
+          </w:p>
+          <w:p>
+            <w:pPr>
+              <w:jc w:val="center"/>
+              <w:rPr>
+                <w:rFonts w:ascii="Times New Roman" w:hAnsi="Times New Roman" w:cs="Times New Roman"/>
+              </w:rPr>
+            </w:pPr>
+          </w:p>
+          <w:p>
+            <w:pPr>
+              <w:jc w:val="center"/>
+              <w:rPr>
+                <w:rFonts w:ascii="Times New Roman" w:hAnsi="Times New Roman" w:cs="Times New Roman"/>
+              </w:rPr>
+            </w:pPr>
+          </w:p>
+          <w:p>
+            <w:pPr>
+              <w:jc w:val="center"/>
               <w:rPr>
                 <w:rFonts w:ascii="Times New Roman" w:hAnsi="Times New Roman" w:cs="Times New Roman"/>
               </w:rPr>
@@ -3628,6 +5078,14 @@
                 <w:rFonts w:ascii="Times New Roman" w:hAnsi="Times New Roman" w:cs="Times New Roman"/>
               </w:rPr>
             </w:pPr>
+          </w:p>
+          <w:p>
+            <w:pPr>
+              <w:jc w:val="center"/>
+              <w:rPr>
+                <w:rFonts w:ascii="Times New Roman" w:hAnsi="Times New Roman" w:cs="Times New Roman"/>
+              </w:rPr>
+            </w:pPr>
             <w:r>
               <w:rPr>
                 <w:rFonts w:ascii="Times New Roman" w:hAnsi="Times New Roman" w:cs="Times New Roman"/>
@@ -3667,6 +5125,28 @@
                 <w:rFonts w:ascii="Times New Roman" w:hAnsi="Times New Roman" w:cs="Times New Roman"/>
               </w:rPr>
             </w:pPr>
+            <w:r>
+              <w:rPr>
+                <w:rFonts w:ascii="Times New Roman" w:hAnsi="Times New Roman" w:cs="Times New Roman"/>
+              </w:rPr>
+              <w:t>Agregar modelos se termina</w:t>
+            </w:r>
+          </w:p>
+          <w:p>
+            <w:pPr>
+              <w:jc w:val="center"/>
+              <w:rPr>
+                <w:rFonts w:ascii="Times New Roman" w:hAnsi="Times New Roman" w:cs="Times New Roman"/>
+              </w:rPr>
+            </w:pPr>
+          </w:p>
+          <w:p>
+            <w:pPr>
+              <w:jc w:val="center"/>
+              <w:rPr>
+                <w:rFonts w:ascii="Times New Roman" w:hAnsi="Times New Roman" w:cs="Times New Roman"/>
+              </w:rPr>
+            </w:pPr>
           </w:p>
           <w:p>
             <w:pPr>
@@ -3737,6 +5217,76 @@
                 <w:rFonts w:ascii="Times New Roman" w:hAnsi="Times New Roman" w:cs="Times New Roman"/>
               </w:rPr>
             </w:pPr>
+            <w:r>
+              <w:rPr>
+                <w:rFonts w:ascii="Times New Roman" w:hAnsi="Times New Roman" w:cs="Times New Roman"/>
+              </w:rPr>
+              <w:t>Se trabaja la función de eliminar modelos()</w:t>
+            </w:r>
+          </w:p>
+          <w:p>
+            <w:pPr>
+              <w:jc w:val="center"/>
+              <w:rPr>
+                <w:rFonts w:ascii="Times New Roman" w:hAnsi="Times New Roman" w:cs="Times New Roman"/>
+              </w:rPr>
+            </w:pPr>
+          </w:p>
+          <w:p>
+            <w:pPr>
+              <w:jc w:val="center"/>
+              <w:rPr>
+                <w:rFonts w:ascii="Times New Roman" w:hAnsi="Times New Roman" w:cs="Times New Roman"/>
+              </w:rPr>
+            </w:pPr>
+          </w:p>
+          <w:p>
+            <w:pPr>
+              <w:jc w:val="center"/>
+              <w:rPr>
+                <w:rFonts w:ascii="Times New Roman" w:hAnsi="Times New Roman" w:cs="Times New Roman"/>
+              </w:rPr>
+            </w:pPr>
+          </w:p>
+          <w:p>
+            <w:pPr>
+              <w:jc w:val="center"/>
+              <w:rPr>
+                <w:rFonts w:ascii="Times New Roman" w:hAnsi="Times New Roman" w:cs="Times New Roman"/>
+              </w:rPr>
+            </w:pPr>
+          </w:p>
+          <w:p>
+            <w:pPr>
+              <w:jc w:val="center"/>
+              <w:rPr>
+                <w:rFonts w:ascii="Times New Roman" w:hAnsi="Times New Roman" w:cs="Times New Roman"/>
+              </w:rPr>
+            </w:pPr>
+          </w:p>
+          <w:p>
+            <w:pPr>
+              <w:jc w:val="center"/>
+              <w:rPr>
+                <w:rFonts w:ascii="Times New Roman" w:hAnsi="Times New Roman" w:cs="Times New Roman"/>
+              </w:rPr>
+            </w:pPr>
+          </w:p>
+          <w:p>
+            <w:pPr>
+              <w:jc w:val="center"/>
+              <w:rPr>
+                <w:rFonts w:ascii="Times New Roman" w:hAnsi="Times New Roman" w:cs="Times New Roman"/>
+              </w:rPr>
+            </w:pPr>
+          </w:p>
+          <w:p>
+            <w:pPr>
+              <w:jc w:val="center"/>
+              <w:rPr>
+                <w:rFonts w:ascii="Times New Roman" w:hAnsi="Times New Roman" w:cs="Times New Roman"/>
+              </w:rPr>
+            </w:pPr>
           </w:p>
           <w:p>
             <w:pPr>
@@ -3766,6 +5316,12 @@
                 <w:rFonts w:ascii="Times New Roman" w:hAnsi="Times New Roman" w:cs="Times New Roman"/>
               </w:rPr>
               <w:t>9:00pm – 9:37</w:t>
+            </w:r>
+            <w:r>
+              <w:rPr>
+                <w:rFonts w:ascii="Times New Roman" w:hAnsi="Times New Roman" w:cs="Times New Roman"/>
+              </w:rPr>
+              <w:t>pm</w:t>
             </w:r>
             <w:r>
               <w:rPr>
@@ -3773,6 +5329,20 @@
               </w:rPr>
               <w:br/>
               <w:t>(37 minutos)</w:t>
+            </w:r>
+          </w:p>
+          <w:p>
+            <w:pPr>
+              <w:jc w:val="center"/>
+              <w:rPr>
+                <w:rFonts w:ascii="Times New Roman" w:hAnsi="Times New Roman" w:cs="Times New Roman"/>
+              </w:rPr>
+            </w:pPr>
+            <w:r>
+              <w:rPr>
+                <w:rFonts w:ascii="Times New Roman" w:hAnsi="Times New Roman" w:cs="Times New Roman"/>
+              </w:rPr>
+              <w:t>Finalización de la función eliminar modelos</w:t>
             </w:r>
           </w:p>
           <w:p>
@@ -3799,6 +5369,19 @@
               </w:rPr>
               <w:t>Agregar modelos se termina y ya funciona correctamente</w:t>
             </w:r>
+            <w:r>
+              <w:rPr>
+                <w:rFonts w:ascii="Times New Roman" w:hAnsi="Times New Roman" w:cs="Times New Roman"/>
+              </w:rPr>
+              <w:t>, solo hacen falta sus validaciones</w:t>
+            </w:r>
+          </w:p>
+          <w:p>
+            <w:pPr>
+              <w:rPr>
+                <w:rFonts w:ascii="Times New Roman" w:hAnsi="Times New Roman" w:cs="Times New Roman"/>
+              </w:rPr>
+            </w:pPr>
           </w:p>
           <w:p>
             <w:pPr>
@@ -3846,11 +5429,73 @@
                 <w:rFonts w:ascii="Times New Roman" w:hAnsi="Times New Roman" w:cs="Times New Roman"/>
               </w:rPr>
             </w:pPr>
+          </w:p>
+          <w:p>
+            <w:pPr>
+              <w:rPr>
+                <w:rFonts w:ascii="Times New Roman" w:hAnsi="Times New Roman" w:cs="Times New Roman"/>
+              </w:rPr>
+            </w:pPr>
+          </w:p>
+          <w:p>
+            <w:pPr>
+              <w:rPr>
+                <w:rFonts w:ascii="Times New Roman" w:hAnsi="Times New Roman" w:cs="Times New Roman"/>
+              </w:rPr>
+            </w:pPr>
+          </w:p>
+          <w:p>
+            <w:pPr>
+              <w:rPr>
+                <w:rFonts w:ascii="Times New Roman" w:hAnsi="Times New Roman" w:cs="Times New Roman"/>
+              </w:rPr>
+            </w:pPr>
+          </w:p>
+          <w:p>
+            <w:pPr>
+              <w:rPr>
+                <w:rFonts w:ascii="Times New Roman" w:hAnsi="Times New Roman" w:cs="Times New Roman"/>
+              </w:rPr>
+            </w:pPr>
+          </w:p>
+          <w:p>
+            <w:pPr>
+              <w:rPr>
+                <w:rFonts w:ascii="Times New Roman" w:hAnsi="Times New Roman" w:cs="Times New Roman"/>
+              </w:rPr>
+            </w:pPr>
+          </w:p>
+          <w:p>
+            <w:pPr>
+              <w:rPr>
+                <w:rFonts w:ascii="Times New Roman" w:hAnsi="Times New Roman" w:cs="Times New Roman"/>
+              </w:rPr>
+            </w:pPr>
+          </w:p>
+          <w:p>
+            <w:pPr>
+              <w:rPr>
+                <w:rFonts w:ascii="Times New Roman" w:hAnsi="Times New Roman" w:cs="Times New Roman"/>
+              </w:rPr>
+            </w:pPr>
+          </w:p>
+          <w:p>
+            <w:pPr>
+              <w:rPr>
+                <w:rFonts w:ascii="Times New Roman" w:hAnsi="Times New Roman" w:cs="Times New Roman"/>
+              </w:rPr>
+            </w:pPr>
             <w:r>
               <w:rPr>
                 <w:rFonts w:ascii="Times New Roman" w:hAnsi="Times New Roman" w:cs="Times New Roman"/>
               </w:rPr>
               <w:t>Se termino la función de eliminar modelos y se corrigieron sus errores.</w:t>
+            </w:r>
+            <w:r>
+              <w:rPr>
+                <w:rFonts w:ascii="Times New Roman" w:hAnsi="Times New Roman" w:cs="Times New Roman"/>
+              </w:rPr>
+              <w:t xml:space="preserve"> Hace falta de sus validaciones respectivas</w:t>
             </w:r>
           </w:p>
         </w:tc>
@@ -3918,6 +5563,14 @@
                 <w:rFonts w:ascii="Times New Roman" w:hAnsi="Times New Roman" w:cs="Times New Roman"/>
               </w:rPr>
             </w:pPr>
+          </w:p>
+          <w:p>
+            <w:pPr>
+              <w:jc w:val="center"/>
+              <w:rPr>
+                <w:rFonts w:ascii="Times New Roman" w:hAnsi="Times New Roman" w:cs="Times New Roman"/>
+              </w:rPr>
+            </w:pPr>
             <w:r>
               <w:rPr>
                 <w:rFonts w:ascii="Times New Roman" w:hAnsi="Times New Roman" w:cs="Times New Roman"/>
@@ -4039,7 +5692,6 @@
           </w:p>
           <w:p>
             <w:pPr>
-              <w:jc w:val="center"/>
               <w:rPr>
                 <w:rFonts w:ascii="Times New Roman" w:hAnsi="Times New Roman" w:cs="Times New Roman"/>
                 <w:lang w:val="en-US"/>
@@ -4100,13 +5752,131 @@
               </w:rPr>
               <w:t>(40 minutos)</w:t>
             </w:r>
-            <w:r>
+          </w:p>
+          <w:p>
+            <w:pPr>
+              <w:jc w:val="center"/>
               <w:rPr>
                 <w:rFonts w:ascii="Times New Roman" w:hAnsi="Times New Roman" w:cs="Times New Roman"/>
                 <w:lang w:val="en-US"/>
               </w:rPr>
+            </w:pPr>
+          </w:p>
+          <w:p>
+            <w:pPr>
+              <w:jc w:val="center"/>
+              <w:rPr>
+                <w:rFonts w:ascii="Times New Roman" w:hAnsi="Times New Roman" w:cs="Times New Roman"/>
+                <w:lang w:val="en-US"/>
+              </w:rPr>
+            </w:pPr>
+          </w:p>
+          <w:p>
+            <w:pPr>
+              <w:jc w:val="center"/>
+              <w:rPr>
+                <w:rFonts w:ascii="Times New Roman" w:hAnsi="Times New Roman" w:cs="Times New Roman"/>
+                <w:lang w:val="en-US"/>
+              </w:rPr>
+            </w:pPr>
+          </w:p>
+          <w:p>
+            <w:pPr>
+              <w:jc w:val="center"/>
+              <w:rPr>
+                <w:rFonts w:ascii="Times New Roman" w:hAnsi="Times New Roman" w:cs="Times New Roman"/>
+                <w:lang w:val="en-US"/>
+              </w:rPr>
+            </w:pPr>
+          </w:p>
+          <w:p>
+            <w:pPr>
+              <w:jc w:val="center"/>
+              <w:rPr>
+                <w:rFonts w:ascii="Times New Roman" w:hAnsi="Times New Roman" w:cs="Times New Roman"/>
+                <w:lang w:val="en-US"/>
+              </w:rPr>
+            </w:pPr>
+          </w:p>
+          <w:p>
+            <w:pPr>
+              <w:jc w:val="center"/>
+              <w:rPr>
+                <w:rFonts w:ascii="Times New Roman" w:hAnsi="Times New Roman" w:cs="Times New Roman"/>
+                <w:lang w:val="en-US"/>
+              </w:rPr>
+            </w:pPr>
+          </w:p>
+          <w:p>
+            <w:pPr>
+              <w:jc w:val="center"/>
+              <w:rPr>
+                <w:rFonts w:ascii="Times New Roman" w:hAnsi="Times New Roman" w:cs="Times New Roman"/>
+                <w:lang w:val="en-US"/>
+              </w:rPr>
+            </w:pPr>
+            <w:r>
+              <w:rPr>
+                <w:rFonts w:ascii="Times New Roman" w:hAnsi="Times New Roman" w:cs="Times New Roman"/>
+                <w:lang w:val="en-US"/>
+              </w:rPr>
+              <w:t xml:space="preserve">3:00pm </w:t>
+            </w:r>
+            <w:r>
+              <w:rPr>
+                <w:rFonts w:ascii="Times New Roman" w:hAnsi="Times New Roman" w:cs="Times New Roman"/>
+                <w:lang w:val="en-US"/>
+              </w:rPr>
+              <w:t>–</w:t>
+            </w:r>
+            <w:r>
+              <w:rPr>
+                <w:rFonts w:ascii="Times New Roman" w:hAnsi="Times New Roman" w:cs="Times New Roman"/>
+                <w:lang w:val="en-US"/>
+              </w:rPr>
               <w:t xml:space="preserve"> </w:t>
             </w:r>
+            <w:r>
+              <w:rPr>
+                <w:rFonts w:ascii="Times New Roman" w:hAnsi="Times New Roman" w:cs="Times New Roman"/>
+                <w:lang w:val="en-US"/>
+              </w:rPr>
+              <w:t>4:40pm</w:t>
+            </w:r>
+          </w:p>
+          <w:p>
+            <w:pPr>
+              <w:jc w:val="center"/>
+              <w:rPr>
+                <w:rFonts w:ascii="Times New Roman" w:hAnsi="Times New Roman" w:cs="Times New Roman"/>
+                <w:lang w:val="en-US"/>
+              </w:rPr>
+            </w:pPr>
+            <w:r>
+              <w:rPr>
+                <w:rFonts w:ascii="Times New Roman" w:hAnsi="Times New Roman" w:cs="Times New Roman"/>
+                <w:lang w:val="en-US"/>
+              </w:rPr>
+              <w:t>(1 hora, 40 minutos)</w:t>
+            </w:r>
+          </w:p>
+          <w:p>
+            <w:pPr>
+              <w:jc w:val="center"/>
+              <w:rPr>
+                <w:rFonts w:ascii="Times New Roman" w:hAnsi="Times New Roman" w:cs="Times New Roman"/>
+                <w:lang w:val="en-US"/>
+              </w:rPr>
+            </w:pPr>
+          </w:p>
+          <w:p>
+            <w:pPr>
+              <w:jc w:val="center"/>
+              <w:rPr>
+                <w:rFonts w:ascii="Times New Roman" w:hAnsi="Times New Roman" w:cs="Times New Roman"/>
+                <w:lang w:val="en-US"/>
+              </w:rPr>
+            </w:pPr>
           </w:p>
         </w:tc>
         <w:tc>
@@ -4119,6 +5889,13 @@
                 <w:rFonts w:ascii="Times New Roman" w:hAnsi="Times New Roman" w:cs="Times New Roman"/>
               </w:rPr>
             </w:pPr>
+          </w:p>
+          <w:p>
+            <w:pPr>
+              <w:rPr>
+                <w:rFonts w:ascii="Times New Roman" w:hAnsi="Times New Roman" w:cs="Times New Roman"/>
+              </w:rPr>
+            </w:pPr>
             <w:r>
               <w:rPr>
                 <w:rFonts w:ascii="Times New Roman" w:hAnsi="Times New Roman" w:cs="Times New Roman"/>
@@ -4191,6 +5968,32 @@
                 <w:rFonts w:ascii="Times New Roman" w:hAnsi="Times New Roman" w:cs="Times New Roman"/>
               </w:rPr>
             </w:pPr>
+          </w:p>
+          <w:p>
+            <w:pPr>
+              <w:rPr>
+                <w:rFonts w:ascii="Times New Roman" w:hAnsi="Times New Roman" w:cs="Times New Roman"/>
+              </w:rPr>
+            </w:pPr>
+          </w:p>
+          <w:p>
+            <w:pPr>
+              <w:rPr>
+                <w:rFonts w:ascii="Times New Roman" w:hAnsi="Times New Roman" w:cs="Times New Roman"/>
+              </w:rPr>
+            </w:pPr>
+            <w:r>
+              <w:rPr>
+                <w:rFonts w:ascii="Times New Roman" w:hAnsi="Times New Roman" w:cs="Times New Roman"/>
+              </w:rPr>
+              <w:t>Editar el documento, trabajar en el un poco, también inicio creando, incluir unidade</w:t>
+            </w:r>
+            <w:r>
+              <w:rPr>
+                <w:rFonts w:ascii="Times New Roman" w:hAnsi="Times New Roman" w:cs="Times New Roman"/>
+              </w:rPr>
+              <w:t>s, la cual dio problemas debido a que debe de llamar 2 archivos diferentes.</w:t>
+            </w:r>
           </w:p>
         </w:tc>
       </w:tr>
@@ -4729,6 +6532,184 @@
 <file path=word/numbering.xml><?xml version="1.0" encoding="utf-8"?>
 <w:numbering xmlns:wpc="http://schemas.microsoft.com/office/word/2010/wordprocessingCanvas" xmlns:cx="http://schemas.microsoft.com/office/drawing/2014/chartex" xmlns:cx1="http://schemas.microsoft.com/office/drawing/2015/9/8/chartex" xmlns:cx2="http://schemas.microsoft.com/office/drawing/2015/10/21/chartex" xmlns:cx3="http://schemas.microsoft.com/office/drawing/2016/5/9/chartex" xmlns:cx4="http://schemas.microsoft.com/office/drawing/2016/5/10/chartex" xmlns:cx5="http://schemas.microsoft.com/office/drawing/2016/5/11/chartex" xmlns:cx6="http://schemas.microsoft.com/office/drawing/2016/5/12/chartex" xmlns:cx7="http://schemas.microsoft.com/office/drawing/2016/5/13/chartex" xmlns:cx8="http://schemas.microsoft.com/office/drawing/2016/5/14/chartex" xmlns:mc="http://schemas.openxmlformats.org/markup-compatibility/2006" xmlns:aink="http://schemas.microsoft.com/office/drawing/2016/ink" xmlns:am3d="http://schemas.microsoft.com/office/drawing/2017/model3d" xmlns:o="urn:schemas-microsoft-com:office:office" xmlns:oel="http://schemas.microsoft.com/office/2019/extlst" xmlns:r="http://schemas.openxmlformats.org/officeDocument/2006/relationships" xmlns:m="http://schemas.openxmlformats.org/officeDocument/2006/math" xmlns:v="urn:schemas-microsoft-com:vml" xmlns:wp14="http://schemas.microsoft.com/office/word/2010/wordprocessingDrawing" xmlns:wp="http://schemas.openxmlformats.org/drawingml/2006/wordprocessingDrawing" xmlns:w10="urn:schemas-microsoft-com:office:word" xmlns:w="http://schemas.openxmlformats.org/wordprocessingml/2006/main" xmlns:w14="http://schemas.microsoft.com/office/word/2010/wordml" xmlns:w15="http://schemas.microsoft.com/office/word/2012/wordml" xmlns:w16cex="http://schemas.microsoft.com/office/word/2018/wordml/cex" xmlns:w16cid="http://schemas.microsoft.com/office/word/2016/wordml/cid" xmlns:w16="http://schemas.microsoft.com/office/word/2018/wordml" xmlns:w16sdtdh="http://schemas.microsoft.com/office/word/2020/wordml/sdtdatahash" xmlns:w16se="http://schemas.microsoft.com/office/word/2015/wordml/symex" xmlns:wpg="http://schemas.microsoft.com/office/word/2010/wordprocessingGroup" xmlns:wpi="http://schemas.microsoft.com/office/word/2010/wordprocessingInk" xmlns:wne="http://schemas.microsoft.com/office/word/2006/wordml" xmlns:wps="http://schemas.microsoft.com/office/word/2010/wordprocessingShape" mc:Ignorable="w14 w15 w16se w16cid w16 w16cex w16sdtdh wp14">
   <w:abstractNum w:abstractNumId="0" w15:restartNumberingAfterBreak="0">
+    <w:nsid w:val="0DE707A4"/>
+    <w:multiLevelType w:val="hybridMultilevel"/>
+    <w:tmpl w:val="E218766C"/>
+    <w:lvl w:ilvl="0" w:tplc="421E0F3C">
+      <w:start w:val="1"/>
+      <w:numFmt w:val="decimal"/>
+      <w:lvlText w:val="(%1)"/>
+      <w:lvlJc w:val="left"/>
+      <w:pPr>
+        <w:ind w:left="810" w:hanging="450"/>
+      </w:pPr>
+      <w:rPr>
+        <w:rFonts w:hint="default"/>
+      </w:rPr>
+    </w:lvl>
+    <w:lvl w:ilvl="1" w:tplc="140A0019" w:tentative="1">
+      <w:start w:val="1"/>
+      <w:numFmt w:val="lowerLetter"/>
+      <w:lvlText w:val="%2."/>
+      <w:lvlJc w:val="left"/>
+      <w:pPr>
+        <w:ind w:left="1440" w:hanging="360"/>
+      </w:pPr>
+    </w:lvl>
+    <w:lvl w:ilvl="2" w:tplc="140A001B" w:tentative="1">
+      <w:start w:val="1"/>
+      <w:numFmt w:val="lowerRoman"/>
+      <w:lvlText w:val="%3."/>
+      <w:lvlJc w:val="right"/>
+      <w:pPr>
+        <w:ind w:left="2160" w:hanging="180"/>
+      </w:pPr>
+    </w:lvl>
+    <w:lvl w:ilvl="3" w:tplc="140A000F" w:tentative="1">
+      <w:start w:val="1"/>
+      <w:numFmt w:val="decimal"/>
+      <w:lvlText w:val="%4."/>
+      <w:lvlJc w:val="left"/>
+      <w:pPr>
+        <w:ind w:left="2880" w:hanging="360"/>
+      </w:pPr>
+    </w:lvl>
+    <w:lvl w:ilvl="4" w:tplc="140A0019" w:tentative="1">
+      <w:start w:val="1"/>
+      <w:numFmt w:val="lowerLetter"/>
+      <w:lvlText w:val="%5."/>
+      <w:lvlJc w:val="left"/>
+      <w:pPr>
+        <w:ind w:left="3600" w:hanging="360"/>
+      </w:pPr>
+    </w:lvl>
+    <w:lvl w:ilvl="5" w:tplc="140A001B" w:tentative="1">
+      <w:start w:val="1"/>
+      <w:numFmt w:val="lowerRoman"/>
+      <w:lvlText w:val="%6."/>
+      <w:lvlJc w:val="right"/>
+      <w:pPr>
+        <w:ind w:left="4320" w:hanging="180"/>
+      </w:pPr>
+    </w:lvl>
+    <w:lvl w:ilvl="6" w:tplc="140A000F" w:tentative="1">
+      <w:start w:val="1"/>
+      <w:numFmt w:val="decimal"/>
+      <w:lvlText w:val="%7."/>
+      <w:lvlJc w:val="left"/>
+      <w:pPr>
+        <w:ind w:left="5040" w:hanging="360"/>
+      </w:pPr>
+    </w:lvl>
+    <w:lvl w:ilvl="7" w:tplc="140A0019" w:tentative="1">
+      <w:start w:val="1"/>
+      <w:numFmt w:val="lowerLetter"/>
+      <w:lvlText w:val="%8."/>
+      <w:lvlJc w:val="left"/>
+      <w:pPr>
+        <w:ind w:left="5760" w:hanging="360"/>
+      </w:pPr>
+    </w:lvl>
+    <w:lvl w:ilvl="8" w:tplc="140A001B" w:tentative="1">
+      <w:start w:val="1"/>
+      <w:numFmt w:val="lowerRoman"/>
+      <w:lvlText w:val="%9."/>
+      <w:lvlJc w:val="right"/>
+      <w:pPr>
+        <w:ind w:left="6480" w:hanging="180"/>
+      </w:pPr>
+    </w:lvl>
+  </w:abstractNum>
+  <w:abstractNum w:abstractNumId="1" w15:restartNumberingAfterBreak="0">
+    <w:nsid w:val="18CA2085"/>
+    <w:multiLevelType w:val="hybridMultilevel"/>
+    <w:tmpl w:val="19AC2E22"/>
+    <w:lvl w:ilvl="0" w:tplc="7C1EF2EE">
+      <w:start w:val="1"/>
+      <w:numFmt w:val="decimal"/>
+      <w:lvlText w:val="(%1)"/>
+      <w:lvlJc w:val="left"/>
+      <w:pPr>
+        <w:ind w:left="720" w:hanging="360"/>
+      </w:pPr>
+      <w:rPr>
+        <w:rFonts w:hint="default"/>
+      </w:rPr>
+    </w:lvl>
+    <w:lvl w:ilvl="1" w:tplc="140A0019" w:tentative="1">
+      <w:start w:val="1"/>
+      <w:numFmt w:val="lowerLetter"/>
+      <w:lvlText w:val="%2."/>
+      <w:lvlJc w:val="left"/>
+      <w:pPr>
+        <w:ind w:left="1440" w:hanging="360"/>
+      </w:pPr>
+    </w:lvl>
+    <w:lvl w:ilvl="2" w:tplc="140A001B" w:tentative="1">
+      <w:start w:val="1"/>
+      <w:numFmt w:val="lowerRoman"/>
+      <w:lvlText w:val="%3."/>
+      <w:lvlJc w:val="right"/>
+      <w:pPr>
+        <w:ind w:left="2160" w:hanging="180"/>
+      </w:pPr>
+    </w:lvl>
+    <w:lvl w:ilvl="3" w:tplc="140A000F" w:tentative="1">
+      <w:start w:val="1"/>
+      <w:numFmt w:val="decimal"/>
+      <w:lvlText w:val="%4."/>
+      <w:lvlJc w:val="left"/>
+      <w:pPr>
+        <w:ind w:left="2880" w:hanging="360"/>
+      </w:pPr>
+    </w:lvl>
+    <w:lvl w:ilvl="4" w:tplc="140A0019" w:tentative="1">
+      <w:start w:val="1"/>
+      <w:numFmt w:val="lowerLetter"/>
+      <w:lvlText w:val="%5."/>
+      <w:lvlJc w:val="left"/>
+      <w:pPr>
+        <w:ind w:left="3600" w:hanging="360"/>
+      </w:pPr>
+    </w:lvl>
+    <w:lvl w:ilvl="5" w:tplc="140A001B" w:tentative="1">
+      <w:start w:val="1"/>
+      <w:numFmt w:val="lowerRoman"/>
+      <w:lvlText w:val="%6."/>
+      <w:lvlJc w:val="right"/>
+      <w:pPr>
+        <w:ind w:left="4320" w:hanging="180"/>
+      </w:pPr>
+    </w:lvl>
+    <w:lvl w:ilvl="6" w:tplc="140A000F" w:tentative="1">
+      <w:start w:val="1"/>
+      <w:numFmt w:val="decimal"/>
+      <w:lvlText w:val="%7."/>
+      <w:lvlJc w:val="left"/>
+      <w:pPr>
+        <w:ind w:left="5040" w:hanging="360"/>
+      </w:pPr>
+    </w:lvl>
+    <w:lvl w:ilvl="7" w:tplc="140A0019" w:tentative="1">
+      <w:start w:val="1"/>
+      <w:numFmt w:val="lowerLetter"/>
+      <w:lvlText w:val="%8."/>
+      <w:lvlJc w:val="left"/>
+      <w:pPr>
+        <w:ind w:left="5760" w:hanging="360"/>
+      </w:pPr>
+    </w:lvl>
+    <w:lvl w:ilvl="8" w:tplc="140A001B" w:tentative="1">
+      <w:start w:val="1"/>
+      <w:numFmt w:val="lowerRoman"/>
+      <w:lvlText w:val="%9."/>
+      <w:lvlJc w:val="right"/>
+      <w:pPr>
+        <w:ind w:left="6480" w:hanging="180"/>
+      </w:pPr>
+    </w:lvl>
+  </w:abstractNum>
+  <w:abstractNum w:abstractNumId="2" w15:restartNumberingAfterBreak="0">
     <w:nsid w:val="43D74454"/>
     <w:multiLevelType w:val="hybridMultilevel"/>
     <w:tmpl w:val="82AEAE96"/>
@@ -4840,8 +6821,106 @@
       </w:rPr>
     </w:lvl>
   </w:abstractNum>
+  <w:abstractNum w:abstractNumId="3" w15:restartNumberingAfterBreak="0">
+    <w:nsid w:val="7A3E6A95"/>
+    <w:multiLevelType w:val="hybridMultilevel"/>
+    <w:tmpl w:val="42F05424"/>
+    <w:lvl w:ilvl="0" w:tplc="B9547C7C">
+      <w:start w:val="1"/>
+      <w:numFmt w:val="decimal"/>
+      <w:lvlText w:val="(%1)"/>
+      <w:lvlJc w:val="left"/>
+      <w:pPr>
+        <w:ind w:left="720" w:hanging="360"/>
+      </w:pPr>
+      <w:rPr>
+        <w:rFonts w:hint="default"/>
+      </w:rPr>
+    </w:lvl>
+    <w:lvl w:ilvl="1" w:tplc="140A0019" w:tentative="1">
+      <w:start w:val="1"/>
+      <w:numFmt w:val="lowerLetter"/>
+      <w:lvlText w:val="%2."/>
+      <w:lvlJc w:val="left"/>
+      <w:pPr>
+        <w:ind w:left="1440" w:hanging="360"/>
+      </w:pPr>
+    </w:lvl>
+    <w:lvl w:ilvl="2" w:tplc="140A001B" w:tentative="1">
+      <w:start w:val="1"/>
+      <w:numFmt w:val="lowerRoman"/>
+      <w:lvlText w:val="%3."/>
+      <w:lvlJc w:val="right"/>
+      <w:pPr>
+        <w:ind w:left="2160" w:hanging="180"/>
+      </w:pPr>
+    </w:lvl>
+    <w:lvl w:ilvl="3" w:tplc="140A000F" w:tentative="1">
+      <w:start w:val="1"/>
+      <w:numFmt w:val="decimal"/>
+      <w:lvlText w:val="%4."/>
+      <w:lvlJc w:val="left"/>
+      <w:pPr>
+        <w:ind w:left="2880" w:hanging="360"/>
+      </w:pPr>
+    </w:lvl>
+    <w:lvl w:ilvl="4" w:tplc="140A0019" w:tentative="1">
+      <w:start w:val="1"/>
+      <w:numFmt w:val="lowerLetter"/>
+      <w:lvlText w:val="%5."/>
+      <w:lvlJc w:val="left"/>
+      <w:pPr>
+        <w:ind w:left="3600" w:hanging="360"/>
+      </w:pPr>
+    </w:lvl>
+    <w:lvl w:ilvl="5" w:tplc="140A001B" w:tentative="1">
+      <w:start w:val="1"/>
+      <w:numFmt w:val="lowerRoman"/>
+      <w:lvlText w:val="%6."/>
+      <w:lvlJc w:val="right"/>
+      <w:pPr>
+        <w:ind w:left="4320" w:hanging="180"/>
+      </w:pPr>
+    </w:lvl>
+    <w:lvl w:ilvl="6" w:tplc="140A000F" w:tentative="1">
+      <w:start w:val="1"/>
+      <w:numFmt w:val="decimal"/>
+      <w:lvlText w:val="%7."/>
+      <w:lvlJc w:val="left"/>
+      <w:pPr>
+        <w:ind w:left="5040" w:hanging="360"/>
+      </w:pPr>
+    </w:lvl>
+    <w:lvl w:ilvl="7" w:tplc="140A0019" w:tentative="1">
+      <w:start w:val="1"/>
+      <w:numFmt w:val="lowerLetter"/>
+      <w:lvlText w:val="%8."/>
+      <w:lvlJc w:val="left"/>
+      <w:pPr>
+        <w:ind w:left="5760" w:hanging="360"/>
+      </w:pPr>
+    </w:lvl>
+    <w:lvl w:ilvl="8" w:tplc="140A001B" w:tentative="1">
+      <w:start w:val="1"/>
+      <w:numFmt w:val="lowerRoman"/>
+      <w:lvlText w:val="%9."/>
+      <w:lvlJc w:val="right"/>
+      <w:pPr>
+        <w:ind w:left="6480" w:hanging="180"/>
+      </w:pPr>
+    </w:lvl>
+  </w:abstractNum>
   <w:num w:numId="1" w16cid:durableId="1279412794">
+    <w:abstractNumId w:val="2"/>
+  </w:num>
+  <w:num w:numId="2" w16cid:durableId="2025595476">
     <w:abstractNumId w:val="0"/>
+  </w:num>
+  <w:num w:numId="3" w16cid:durableId="358046377">
+    <w:abstractNumId w:val="3"/>
+  </w:num>
+  <w:num w:numId="4" w16cid:durableId="1384211233">
+    <w:abstractNumId w:val="1"/>
   </w:num>
 </w:numbering>
 </file>

</xml_diff>

<commit_message>
Se termina de desarollar inicialmente todas las funciones del manejo de unidades (sin validaciones)
</commit_message>
<xml_diff>
--- a/documentacion/Documentación Externa (Not final).docx
+++ b/documentacion/Documentación Externa (Not final).docx
@@ -853,7 +853,25 @@
           <w:sz w:val="28"/>
           <w:szCs w:val="28"/>
         </w:rPr>
-        <w:t>y todos los archivos.txt que este necesita par su necesaria y efectiva ejecución.</w:t>
+        <w:t xml:space="preserve">y todos los archivos.txt que este necesita </w:t>
+      </w:r>
+      <w:proofErr w:type="spellStart"/>
+      <w:r>
+        <w:rPr>
+          <w:rFonts w:ascii="Times New Roman" w:hAnsi="Times New Roman" w:cs="Times New Roman"/>
+          <w:sz w:val="28"/>
+          <w:szCs w:val="28"/>
+        </w:rPr>
+        <w:t>par</w:t>
+      </w:r>
+      <w:proofErr w:type="spellEnd"/>
+      <w:r>
+        <w:rPr>
+          <w:rFonts w:ascii="Times New Roman" w:hAnsi="Times New Roman" w:cs="Times New Roman"/>
+          <w:sz w:val="28"/>
+          <w:szCs w:val="28"/>
+        </w:rPr>
+        <w:t xml:space="preserve"> su necesaria y efectiva ejecución.</w:t>
       </w:r>
     </w:p>
     <w:p>
@@ -2318,7 +2336,21 @@
         <w:rPr>
           <w:rFonts w:ascii="Times New Roman" w:hAnsi="Times New Roman" w:cs="Times New Roman"/>
         </w:rPr>
-        <w:t xml:space="preserve"> de manejar toda la logística de la empresa desde aquí, controlar las unidades, los conductores y las rutas, también un historial de que reservaciones se han hecho y cuanto dinero se ha recaudado hasta el momento.</w:t>
+        <w:t xml:space="preserve"> de manejar toda la logística de la empresa desde aquí, controlar las unidades, los conductores y las rutas, también un historial de que reservaciones se han hecho y </w:t>
+      </w:r>
+      <w:proofErr w:type="spellStart"/>
+      <w:r>
+        <w:rPr>
+          <w:rFonts w:ascii="Times New Roman" w:hAnsi="Times New Roman" w:cs="Times New Roman"/>
+        </w:rPr>
+        <w:t>cuanto</w:t>
+      </w:r>
+      <w:proofErr w:type="spellEnd"/>
+      <w:r>
+        <w:rPr>
+          <w:rFonts w:ascii="Times New Roman" w:hAnsi="Times New Roman" w:cs="Times New Roman"/>
+        </w:rPr>
+        <w:t xml:space="preserve"> dinero se ha recaudado hasta el momento.</w:t>
       </w:r>
     </w:p>
     <w:p>
@@ -4116,8 +4148,16 @@
               <w:rPr>
                 <w:rFonts w:ascii="Times New Roman" w:hAnsi="Times New Roman" w:cs="Times New Roman"/>
               </w:rPr>
-              <w:t>Los menús se trataron de crear de varios modos, pero al final me decidí hacerlos con un while y condicionarlos con True y False</w:t>
-            </w:r>
+              <w:t xml:space="preserve">Los menús se trataron de crear de varios modos, pero al final me decidí hacerlos con un while y condicionarlos con True y </w:t>
+            </w:r>
+            <w:proofErr w:type="gramStart"/>
+            <w:r>
+              <w:rPr>
+                <w:rFonts w:ascii="Times New Roman" w:hAnsi="Times New Roman" w:cs="Times New Roman"/>
+              </w:rPr>
+              <w:t>False</w:t>
+            </w:r>
+            <w:proofErr w:type="gramEnd"/>
           </w:p>
         </w:tc>
       </w:tr>
@@ -5571,6 +5611,94 @@
                 <w:rFonts w:ascii="Times New Roman" w:hAnsi="Times New Roman" w:cs="Times New Roman"/>
               </w:rPr>
             </w:pPr>
+          </w:p>
+          <w:p>
+            <w:pPr>
+              <w:jc w:val="center"/>
+              <w:rPr>
+                <w:rFonts w:ascii="Times New Roman" w:hAnsi="Times New Roman" w:cs="Times New Roman"/>
+              </w:rPr>
+            </w:pPr>
+          </w:p>
+          <w:p>
+            <w:pPr>
+              <w:jc w:val="center"/>
+              <w:rPr>
+                <w:rFonts w:ascii="Times New Roman" w:hAnsi="Times New Roman" w:cs="Times New Roman"/>
+              </w:rPr>
+            </w:pPr>
+          </w:p>
+          <w:p>
+            <w:pPr>
+              <w:jc w:val="center"/>
+              <w:rPr>
+                <w:rFonts w:ascii="Times New Roman" w:hAnsi="Times New Roman" w:cs="Times New Roman"/>
+              </w:rPr>
+            </w:pPr>
+          </w:p>
+          <w:p>
+            <w:pPr>
+              <w:jc w:val="center"/>
+              <w:rPr>
+                <w:rFonts w:ascii="Times New Roman" w:hAnsi="Times New Roman" w:cs="Times New Roman"/>
+              </w:rPr>
+            </w:pPr>
+          </w:p>
+          <w:p>
+            <w:pPr>
+              <w:jc w:val="center"/>
+              <w:rPr>
+                <w:rFonts w:ascii="Times New Roman" w:hAnsi="Times New Roman" w:cs="Times New Roman"/>
+              </w:rPr>
+            </w:pPr>
+          </w:p>
+          <w:p>
+            <w:pPr>
+              <w:jc w:val="center"/>
+              <w:rPr>
+                <w:rFonts w:ascii="Times New Roman" w:hAnsi="Times New Roman" w:cs="Times New Roman"/>
+              </w:rPr>
+            </w:pPr>
+          </w:p>
+          <w:p>
+            <w:pPr>
+              <w:jc w:val="center"/>
+              <w:rPr>
+                <w:rFonts w:ascii="Times New Roman" w:hAnsi="Times New Roman" w:cs="Times New Roman"/>
+              </w:rPr>
+            </w:pPr>
+          </w:p>
+          <w:p>
+            <w:pPr>
+              <w:jc w:val="center"/>
+              <w:rPr>
+                <w:rFonts w:ascii="Times New Roman" w:hAnsi="Times New Roman" w:cs="Times New Roman"/>
+              </w:rPr>
+            </w:pPr>
+          </w:p>
+          <w:p>
+            <w:pPr>
+              <w:jc w:val="center"/>
+              <w:rPr>
+                <w:rFonts w:ascii="Times New Roman" w:hAnsi="Times New Roman" w:cs="Times New Roman"/>
+              </w:rPr>
+            </w:pPr>
+          </w:p>
+          <w:p>
+            <w:pPr>
+              <w:jc w:val="center"/>
+              <w:rPr>
+                <w:rFonts w:ascii="Times New Roman" w:hAnsi="Times New Roman" w:cs="Times New Roman"/>
+              </w:rPr>
+            </w:pPr>
+          </w:p>
+          <w:p>
+            <w:pPr>
+              <w:jc w:val="center"/>
+              <w:rPr>
+                <w:rFonts w:ascii="Times New Roman" w:hAnsi="Times New Roman" w:cs="Times New Roman"/>
+              </w:rPr>
+            </w:pPr>
             <w:r>
               <w:rPr>
                 <w:rFonts w:ascii="Times New Roman" w:hAnsi="Times New Roman" w:cs="Times New Roman"/>
@@ -5812,6 +5940,168 @@
               <w:jc w:val="center"/>
               <w:rPr>
                 <w:rFonts w:ascii="Times New Roman" w:hAnsi="Times New Roman" w:cs="Times New Roman"/>
+              </w:rPr>
+            </w:pPr>
+            <w:r>
+              <w:rPr>
+                <w:rFonts w:ascii="Times New Roman" w:hAnsi="Times New Roman" w:cs="Times New Roman"/>
+              </w:rPr>
+              <w:t xml:space="preserve">3:00pm </w:t>
+            </w:r>
+            <w:r>
+              <w:rPr>
+                <w:rFonts w:ascii="Times New Roman" w:hAnsi="Times New Roman" w:cs="Times New Roman"/>
+              </w:rPr>
+              <w:t>–</w:t>
+            </w:r>
+            <w:r>
+              <w:rPr>
+                <w:rFonts w:ascii="Times New Roman" w:hAnsi="Times New Roman" w:cs="Times New Roman"/>
+              </w:rPr>
+              <w:t xml:space="preserve"> </w:t>
+            </w:r>
+            <w:r>
+              <w:rPr>
+                <w:rFonts w:ascii="Times New Roman" w:hAnsi="Times New Roman" w:cs="Times New Roman"/>
+              </w:rPr>
+              <w:t>4:40pm</w:t>
+            </w:r>
+          </w:p>
+          <w:p>
+            <w:pPr>
+              <w:jc w:val="center"/>
+              <w:rPr>
+                <w:rFonts w:ascii="Times New Roman" w:hAnsi="Times New Roman" w:cs="Times New Roman"/>
+              </w:rPr>
+            </w:pPr>
+            <w:r>
+              <w:rPr>
+                <w:rFonts w:ascii="Times New Roman" w:hAnsi="Times New Roman" w:cs="Times New Roman"/>
+              </w:rPr>
+              <w:t>(1 hora, 40 minutos)</w:t>
+            </w:r>
+          </w:p>
+          <w:p>
+            <w:pPr>
+              <w:jc w:val="center"/>
+              <w:rPr>
+                <w:rFonts w:ascii="Times New Roman" w:hAnsi="Times New Roman" w:cs="Times New Roman"/>
+              </w:rPr>
+            </w:pPr>
+          </w:p>
+          <w:p>
+            <w:pPr>
+              <w:jc w:val="center"/>
+              <w:rPr>
+                <w:rFonts w:ascii="Times New Roman" w:hAnsi="Times New Roman" w:cs="Times New Roman"/>
+              </w:rPr>
+            </w:pPr>
+          </w:p>
+          <w:p>
+            <w:pPr>
+              <w:jc w:val="center"/>
+              <w:rPr>
+                <w:rFonts w:ascii="Times New Roman" w:hAnsi="Times New Roman" w:cs="Times New Roman"/>
+              </w:rPr>
+            </w:pPr>
+          </w:p>
+          <w:p>
+            <w:pPr>
+              <w:jc w:val="center"/>
+              <w:rPr>
+                <w:rFonts w:ascii="Times New Roman" w:hAnsi="Times New Roman" w:cs="Times New Roman"/>
+              </w:rPr>
+            </w:pPr>
+          </w:p>
+          <w:p>
+            <w:pPr>
+              <w:jc w:val="center"/>
+              <w:rPr>
+                <w:rFonts w:ascii="Times New Roman" w:hAnsi="Times New Roman" w:cs="Times New Roman"/>
+              </w:rPr>
+            </w:pPr>
+          </w:p>
+          <w:p>
+            <w:pPr>
+              <w:jc w:val="center"/>
+              <w:rPr>
+                <w:rFonts w:ascii="Times New Roman" w:hAnsi="Times New Roman" w:cs="Times New Roman"/>
+              </w:rPr>
+            </w:pPr>
+          </w:p>
+          <w:p>
+            <w:pPr>
+              <w:jc w:val="center"/>
+              <w:rPr>
+                <w:rFonts w:ascii="Times New Roman" w:hAnsi="Times New Roman" w:cs="Times New Roman"/>
+              </w:rPr>
+            </w:pPr>
+          </w:p>
+          <w:p>
+            <w:pPr>
+              <w:jc w:val="center"/>
+              <w:rPr>
+                <w:rFonts w:ascii="Times New Roman" w:hAnsi="Times New Roman" w:cs="Times New Roman"/>
+              </w:rPr>
+            </w:pPr>
+          </w:p>
+          <w:p>
+            <w:pPr>
+              <w:jc w:val="center"/>
+              <w:rPr>
+                <w:rFonts w:ascii="Times New Roman" w:hAnsi="Times New Roman" w:cs="Times New Roman"/>
+              </w:rPr>
+            </w:pPr>
+          </w:p>
+          <w:p>
+            <w:pPr>
+              <w:jc w:val="center"/>
+              <w:rPr>
+                <w:rFonts w:ascii="Times New Roman" w:hAnsi="Times New Roman" w:cs="Times New Roman"/>
+              </w:rPr>
+            </w:pPr>
+          </w:p>
+          <w:p>
+            <w:pPr>
+              <w:jc w:val="center"/>
+              <w:rPr>
+                <w:rFonts w:ascii="Times New Roman" w:hAnsi="Times New Roman" w:cs="Times New Roman"/>
+              </w:rPr>
+            </w:pPr>
+          </w:p>
+          <w:p>
+            <w:pPr>
+              <w:jc w:val="center"/>
+              <w:rPr>
+                <w:rFonts w:ascii="Times New Roman" w:hAnsi="Times New Roman" w:cs="Times New Roman"/>
+              </w:rPr>
+            </w:pPr>
+          </w:p>
+          <w:p>
+            <w:pPr>
+              <w:jc w:val="center"/>
+              <w:rPr>
+                <w:rFonts w:ascii="Times New Roman" w:hAnsi="Times New Roman" w:cs="Times New Roman"/>
+              </w:rPr>
+            </w:pPr>
+            <w:r>
+              <w:rPr>
+                <w:rFonts w:ascii="Times New Roman" w:hAnsi="Times New Roman" w:cs="Times New Roman"/>
+              </w:rPr>
+              <w:t xml:space="preserve">7:25pm – </w:t>
+            </w:r>
+            <w:r>
+              <w:rPr>
+                <w:rFonts w:ascii="Times New Roman" w:hAnsi="Times New Roman" w:cs="Times New Roman"/>
+              </w:rPr>
+              <w:t>8:34pm</w:t>
+            </w:r>
+          </w:p>
+          <w:p>
+            <w:pPr>
+              <w:jc w:val="center"/>
+              <w:rPr>
+                <w:rFonts w:ascii="Times New Roman" w:hAnsi="Times New Roman" w:cs="Times New Roman"/>
                 <w:lang w:val="en-US"/>
               </w:rPr>
             </w:pPr>
@@ -5820,63 +6110,22 @@
                 <w:rFonts w:ascii="Times New Roman" w:hAnsi="Times New Roman" w:cs="Times New Roman"/>
                 <w:lang w:val="en-US"/>
               </w:rPr>
-              <w:t xml:space="preserve">3:00pm </w:t>
+              <w:t>(</w:t>
             </w:r>
             <w:r>
               <w:rPr>
                 <w:rFonts w:ascii="Times New Roman" w:hAnsi="Times New Roman" w:cs="Times New Roman"/>
                 <w:lang w:val="en-US"/>
               </w:rPr>
-              <w:t>–</w:t>
+              <w:t>1 hora, 9 minutos</w:t>
             </w:r>
             <w:r>
               <w:rPr>
                 <w:rFonts w:ascii="Times New Roman" w:hAnsi="Times New Roman" w:cs="Times New Roman"/>
                 <w:lang w:val="en-US"/>
               </w:rPr>
-              <w:t xml:space="preserve"> </w:t>
-            </w:r>
-            <w:r>
-              <w:rPr>
-                <w:rFonts w:ascii="Times New Roman" w:hAnsi="Times New Roman" w:cs="Times New Roman"/>
-                <w:lang w:val="en-US"/>
-              </w:rPr>
-              <w:t>4:40pm</w:t>
-            </w:r>
-          </w:p>
-          <w:p>
-            <w:pPr>
-              <w:jc w:val="center"/>
-              <w:rPr>
-                <w:rFonts w:ascii="Times New Roman" w:hAnsi="Times New Roman" w:cs="Times New Roman"/>
-                <w:lang w:val="en-US"/>
-              </w:rPr>
-            </w:pPr>
-            <w:r>
-              <w:rPr>
-                <w:rFonts w:ascii="Times New Roman" w:hAnsi="Times New Roman" w:cs="Times New Roman"/>
-                <w:lang w:val="en-US"/>
-              </w:rPr>
-              <w:t>(1 hora, 40 minutos)</w:t>
-            </w:r>
-          </w:p>
-          <w:p>
-            <w:pPr>
-              <w:jc w:val="center"/>
-              <w:rPr>
-                <w:rFonts w:ascii="Times New Roman" w:hAnsi="Times New Roman" w:cs="Times New Roman"/>
-                <w:lang w:val="en-US"/>
-              </w:rPr>
-            </w:pPr>
-          </w:p>
-          <w:p>
-            <w:pPr>
-              <w:jc w:val="center"/>
-              <w:rPr>
-                <w:rFonts w:ascii="Times New Roman" w:hAnsi="Times New Roman" w:cs="Times New Roman"/>
-                <w:lang w:val="en-US"/>
-              </w:rPr>
-            </w:pPr>
+              <w:t>)</w:t>
+            </w:r>
           </w:p>
         </w:tc>
         <w:tc>
@@ -5994,6 +6243,118 @@
               </w:rPr>
               <w:t>s, la cual dio problemas debido a que debe de llamar 2 archivos diferentes.</w:t>
             </w:r>
+          </w:p>
+          <w:p>
+            <w:pPr>
+              <w:rPr>
+                <w:rFonts w:ascii="Times New Roman" w:hAnsi="Times New Roman" w:cs="Times New Roman"/>
+              </w:rPr>
+            </w:pPr>
+          </w:p>
+          <w:p>
+            <w:pPr>
+              <w:rPr>
+                <w:rFonts w:ascii="Times New Roman" w:hAnsi="Times New Roman" w:cs="Times New Roman"/>
+              </w:rPr>
+            </w:pPr>
+          </w:p>
+          <w:p>
+            <w:pPr>
+              <w:rPr>
+                <w:rFonts w:ascii="Times New Roman" w:hAnsi="Times New Roman" w:cs="Times New Roman"/>
+              </w:rPr>
+            </w:pPr>
+          </w:p>
+          <w:p>
+            <w:pPr>
+              <w:rPr>
+                <w:rFonts w:ascii="Times New Roman" w:hAnsi="Times New Roman" w:cs="Times New Roman"/>
+              </w:rPr>
+            </w:pPr>
+          </w:p>
+          <w:p>
+            <w:pPr>
+              <w:rPr>
+                <w:rFonts w:ascii="Times New Roman" w:hAnsi="Times New Roman" w:cs="Times New Roman"/>
+              </w:rPr>
+            </w:pPr>
+            <w:r>
+              <w:rPr>
+                <w:rFonts w:ascii="Times New Roman" w:hAnsi="Times New Roman" w:cs="Times New Roman"/>
+              </w:rPr>
+              <w:t xml:space="preserve">Se crea </w:t>
+            </w:r>
+            <w:r>
+              <w:rPr>
+                <w:rFonts w:ascii="Times New Roman" w:hAnsi="Times New Roman" w:cs="Times New Roman"/>
+              </w:rPr>
+              <w:t>las funciones</w:t>
+            </w:r>
+            <w:r>
+              <w:rPr>
+                <w:rFonts w:ascii="Times New Roman" w:hAnsi="Times New Roman" w:cs="Times New Roman"/>
+              </w:rPr>
+              <w:t xml:space="preserve"> para eliminar unidades</w:t>
+            </w:r>
+            <w:r>
+              <w:rPr>
+                <w:rFonts w:ascii="Times New Roman" w:hAnsi="Times New Roman" w:cs="Times New Roman"/>
+              </w:rPr>
+              <w:t>, mostrar unidades y modificar unidades</w:t>
+            </w:r>
+            <w:r>
+              <w:rPr>
+                <w:rFonts w:ascii="Times New Roman" w:hAnsi="Times New Roman" w:cs="Times New Roman"/>
+              </w:rPr>
+              <w:t xml:space="preserve">, </w:t>
+            </w:r>
+            <w:r>
+              <w:rPr>
+                <w:rFonts w:ascii="Times New Roman" w:hAnsi="Times New Roman" w:cs="Times New Roman"/>
+              </w:rPr>
+              <w:t xml:space="preserve">se conectan al menú principal y ya funcionan entre ellas, </w:t>
+            </w:r>
+            <w:r>
+              <w:rPr>
+                <w:rFonts w:ascii="Times New Roman" w:hAnsi="Times New Roman" w:cs="Times New Roman"/>
+              </w:rPr>
+              <w:t>sin sus validaciones por el momento</w:t>
+            </w:r>
+          </w:p>
+          <w:p>
+            <w:pPr>
+              <w:rPr>
+                <w:rFonts w:ascii="Times New Roman" w:hAnsi="Times New Roman" w:cs="Times New Roman"/>
+              </w:rPr>
+            </w:pPr>
+          </w:p>
+          <w:p>
+            <w:pPr>
+              <w:rPr>
+                <w:rFonts w:ascii="Times New Roman" w:hAnsi="Times New Roman" w:cs="Times New Roman"/>
+              </w:rPr>
+            </w:pPr>
+          </w:p>
+          <w:p>
+            <w:pPr>
+              <w:rPr>
+                <w:rFonts w:ascii="Times New Roman" w:hAnsi="Times New Roman" w:cs="Times New Roman"/>
+              </w:rPr>
+            </w:pPr>
+          </w:p>
+          <w:p>
+            <w:pPr>
+              <w:rPr>
+                <w:rFonts w:ascii="Times New Roman" w:hAnsi="Times New Roman" w:cs="Times New Roman"/>
+              </w:rPr>
+            </w:pPr>
+          </w:p>
+          <w:p>
+            <w:pPr>
+              <w:rPr>
+                <w:rFonts w:ascii="Times New Roman" w:hAnsi="Times New Roman" w:cs="Times New Roman"/>
+              </w:rPr>
+            </w:pPr>
           </w:p>
         </w:tc>
       </w:tr>

</xml_diff>

<commit_message>
Se completaron las funciones de gestión de modelos (solo hacen faltas de sus respectivas validaciones)
</commit_message>
<xml_diff>
--- a/documentacion/Documentación Externa (Not final).docx
+++ b/documentacion/Documentación Externa (Not final).docx
@@ -6368,10 +6368,65 @@
           </w:tcPr>
           <w:p>
             <w:pPr>
-              <w:rPr>
-                <w:rFonts w:ascii="Times New Roman" w:hAnsi="Times New Roman" w:cs="Times New Roman"/>
-              </w:rPr>
-            </w:pPr>
+              <w:jc w:val="center"/>
+              <w:rPr>
+                <w:rFonts w:ascii="Times New Roman" w:hAnsi="Times New Roman" w:cs="Times New Roman"/>
+              </w:rPr>
+            </w:pPr>
+          </w:p>
+          <w:p>
+            <w:pPr>
+              <w:jc w:val="center"/>
+              <w:rPr>
+                <w:rFonts w:ascii="Times New Roman" w:hAnsi="Times New Roman" w:cs="Times New Roman"/>
+              </w:rPr>
+            </w:pPr>
+          </w:p>
+          <w:p>
+            <w:pPr>
+              <w:jc w:val="center"/>
+              <w:rPr>
+                <w:rFonts w:ascii="Times New Roman" w:hAnsi="Times New Roman" w:cs="Times New Roman"/>
+              </w:rPr>
+            </w:pPr>
+          </w:p>
+          <w:p>
+            <w:pPr>
+              <w:jc w:val="center"/>
+              <w:rPr>
+                <w:rFonts w:ascii="Times New Roman" w:hAnsi="Times New Roman" w:cs="Times New Roman"/>
+              </w:rPr>
+            </w:pPr>
+          </w:p>
+          <w:p>
+            <w:pPr>
+              <w:jc w:val="center"/>
+              <w:rPr>
+                <w:rFonts w:ascii="Times New Roman" w:hAnsi="Times New Roman" w:cs="Times New Roman"/>
+              </w:rPr>
+            </w:pPr>
+          </w:p>
+          <w:p>
+            <w:pPr>
+              <w:jc w:val="center"/>
+              <w:rPr>
+                <w:rFonts w:ascii="Times New Roman" w:hAnsi="Times New Roman" w:cs="Times New Roman"/>
+              </w:rPr>
+            </w:pPr>
+          </w:p>
+          <w:p>
+            <w:pPr>
+              <w:jc w:val="center"/>
+              <w:rPr>
+                <w:rFonts w:ascii="Times New Roman" w:hAnsi="Times New Roman" w:cs="Times New Roman"/>
+              </w:rPr>
+            </w:pPr>
+            <w:r>
+              <w:rPr>
+                <w:rFonts w:ascii="Times New Roman" w:hAnsi="Times New Roman" w:cs="Times New Roman"/>
+              </w:rPr>
+              <w:t>2/10/2026</w:t>
+            </w:r>
           </w:p>
         </w:tc>
         <w:tc>
@@ -6380,10 +6435,89 @@
           </w:tcPr>
           <w:p>
             <w:pPr>
-              <w:rPr>
-                <w:rFonts w:ascii="Times New Roman" w:hAnsi="Times New Roman" w:cs="Times New Roman"/>
-              </w:rPr>
-            </w:pPr>
+              <w:jc w:val="center"/>
+              <w:rPr>
+                <w:rFonts w:ascii="Times New Roman" w:hAnsi="Times New Roman" w:cs="Times New Roman"/>
+              </w:rPr>
+            </w:pPr>
+          </w:p>
+          <w:p>
+            <w:pPr>
+              <w:jc w:val="center"/>
+              <w:rPr>
+                <w:rFonts w:ascii="Times New Roman" w:hAnsi="Times New Roman" w:cs="Times New Roman"/>
+              </w:rPr>
+            </w:pPr>
+          </w:p>
+          <w:p>
+            <w:pPr>
+              <w:jc w:val="center"/>
+              <w:rPr>
+                <w:rFonts w:ascii="Times New Roman" w:hAnsi="Times New Roman" w:cs="Times New Roman"/>
+              </w:rPr>
+            </w:pPr>
+          </w:p>
+          <w:p>
+            <w:pPr>
+              <w:jc w:val="center"/>
+              <w:rPr>
+                <w:rFonts w:ascii="Times New Roman" w:hAnsi="Times New Roman" w:cs="Times New Roman"/>
+              </w:rPr>
+            </w:pPr>
+          </w:p>
+          <w:p>
+            <w:pPr>
+              <w:jc w:val="center"/>
+              <w:rPr>
+                <w:rFonts w:ascii="Times New Roman" w:hAnsi="Times New Roman" w:cs="Times New Roman"/>
+              </w:rPr>
+            </w:pPr>
+          </w:p>
+          <w:p>
+            <w:pPr>
+              <w:jc w:val="center"/>
+              <w:rPr>
+                <w:rFonts w:ascii="Times New Roman" w:hAnsi="Times New Roman" w:cs="Times New Roman"/>
+              </w:rPr>
+            </w:pPr>
+            <w:r>
+              <w:rPr>
+                <w:rFonts w:ascii="Times New Roman" w:hAnsi="Times New Roman" w:cs="Times New Roman"/>
+              </w:rPr>
+              <w:t xml:space="preserve">9:00pm </w:t>
+            </w:r>
+            <w:r>
+              <w:rPr>
+                <w:rFonts w:ascii="Times New Roman" w:hAnsi="Times New Roman" w:cs="Times New Roman"/>
+              </w:rPr>
+              <w:t>–</w:t>
+            </w:r>
+            <w:r>
+              <w:rPr>
+                <w:rFonts w:ascii="Times New Roman" w:hAnsi="Times New Roman" w:cs="Times New Roman"/>
+              </w:rPr>
+              <w:t xml:space="preserve"> </w:t>
+            </w:r>
+            <w:r>
+              <w:rPr>
+                <w:rFonts w:ascii="Times New Roman" w:hAnsi="Times New Roman" w:cs="Times New Roman"/>
+              </w:rPr>
+              <w:t>10:07pm</w:t>
+            </w:r>
+          </w:p>
+          <w:p>
+            <w:pPr>
+              <w:jc w:val="center"/>
+              <w:rPr>
+                <w:rFonts w:ascii="Times New Roman" w:hAnsi="Times New Roman" w:cs="Times New Roman"/>
+              </w:rPr>
+            </w:pPr>
+            <w:r>
+              <w:rPr>
+                <w:rFonts w:ascii="Times New Roman" w:hAnsi="Times New Roman" w:cs="Times New Roman"/>
+              </w:rPr>
+              <w:t>(1 hora, 7 minutos)</w:t>
+            </w:r>
           </w:p>
         </w:tc>
         <w:tc>
@@ -6396,6 +6530,19 @@
                 <w:rFonts w:ascii="Times New Roman" w:hAnsi="Times New Roman" w:cs="Times New Roman"/>
               </w:rPr>
             </w:pPr>
+          </w:p>
+          <w:p>
+            <w:pPr>
+              <w:rPr>
+                <w:rFonts w:ascii="Times New Roman" w:hAnsi="Times New Roman" w:cs="Times New Roman"/>
+              </w:rPr>
+            </w:pPr>
+            <w:r>
+              <w:rPr>
+                <w:rFonts w:ascii="Times New Roman" w:hAnsi="Times New Roman" w:cs="Times New Roman"/>
+              </w:rPr>
+              <w:t>Se crean todas las funciones de la gestión de conductores, incluir, eliminar, modificar y mostrar conductores. Se enlazan al menú principal para que sea posible usarlas de manera eficaz. No tienen sus validaciones completas.</w:t>
+            </w:r>
           </w:p>
         </w:tc>
       </w:tr>

</xml_diff>

<commit_message>
Se modificaron los menús, se quitaron lineas de código ineccesarias como llamadas recursivas
</commit_message>
<xml_diff>
--- a/documentacion/Documentación Externa (Not final).docx
+++ b/documentacion/Documentación Externa (Not final).docx
@@ -853,25 +853,7 @@
           <w:sz w:val="28"/>
           <w:szCs w:val="28"/>
         </w:rPr>
-        <w:t xml:space="preserve">y todos los archivos.txt que este necesita </w:t>
-      </w:r>
-      <w:proofErr w:type="spellStart"/>
-      <w:r>
-        <w:rPr>
-          <w:rFonts w:ascii="Times New Roman" w:hAnsi="Times New Roman" w:cs="Times New Roman"/>
-          <w:sz w:val="28"/>
-          <w:szCs w:val="28"/>
-        </w:rPr>
-        <w:t>par</w:t>
-      </w:r>
-      <w:proofErr w:type="spellEnd"/>
-      <w:r>
-        <w:rPr>
-          <w:rFonts w:ascii="Times New Roman" w:hAnsi="Times New Roman" w:cs="Times New Roman"/>
-          <w:sz w:val="28"/>
-          <w:szCs w:val="28"/>
-        </w:rPr>
-        <w:t xml:space="preserve"> su necesaria y efectiva ejecución.</w:t>
+        <w:t>y todos los archivos.txt que este necesita par su necesaria y efectiva ejecución.</w:t>
       </w:r>
     </w:p>
     <w:p>
@@ -2336,21 +2318,7 @@
         <w:rPr>
           <w:rFonts w:ascii="Times New Roman" w:hAnsi="Times New Roman" w:cs="Times New Roman"/>
         </w:rPr>
-        <w:t xml:space="preserve"> de manejar toda la logística de la empresa desde aquí, controlar las unidades, los conductores y las rutas, también un historial de que reservaciones se han hecho y </w:t>
-      </w:r>
-      <w:proofErr w:type="spellStart"/>
-      <w:r>
-        <w:rPr>
-          <w:rFonts w:ascii="Times New Roman" w:hAnsi="Times New Roman" w:cs="Times New Roman"/>
-        </w:rPr>
-        <w:t>cuanto</w:t>
-      </w:r>
-      <w:proofErr w:type="spellEnd"/>
-      <w:r>
-        <w:rPr>
-          <w:rFonts w:ascii="Times New Roman" w:hAnsi="Times New Roman" w:cs="Times New Roman"/>
-        </w:rPr>
-        <w:t xml:space="preserve"> dinero se ha recaudado hasta el momento.</w:t>
+        <w:t xml:space="preserve"> de manejar toda la logística de la empresa desde aquí, controlar las unidades, los conductores y las rutas, también un historial de que reservaciones se han hecho y cuanto dinero se ha recaudado hasta el momento.</w:t>
       </w:r>
     </w:p>
     <w:p>
@@ -4148,16 +4116,8 @@
               <w:rPr>
                 <w:rFonts w:ascii="Times New Roman" w:hAnsi="Times New Roman" w:cs="Times New Roman"/>
               </w:rPr>
-              <w:t xml:space="preserve">Los menús se trataron de crear de varios modos, pero al final me decidí hacerlos con un while y condicionarlos con True y </w:t>
-            </w:r>
-            <w:proofErr w:type="gramStart"/>
-            <w:r>
-              <w:rPr>
-                <w:rFonts w:ascii="Times New Roman" w:hAnsi="Times New Roman" w:cs="Times New Roman"/>
-              </w:rPr>
-              <w:t>False</w:t>
-            </w:r>
-            <w:proofErr w:type="gramEnd"/>
+              <w:t>Los menús se trataron de crear de varios modos, pero al final me decidí hacerlos con un while y condicionarlos con True y False</w:t>
+            </w:r>
           </w:p>
         </w:tc>
       </w:tr>
@@ -6561,6 +6521,56 @@
               </w:rPr>
             </w:pPr>
           </w:p>
+          <w:p>
+            <w:pPr>
+              <w:rPr>
+                <w:rFonts w:ascii="Times New Roman" w:hAnsi="Times New Roman" w:cs="Times New Roman"/>
+              </w:rPr>
+            </w:pPr>
+          </w:p>
+          <w:p>
+            <w:pPr>
+              <w:rPr>
+                <w:rFonts w:ascii="Times New Roman" w:hAnsi="Times New Roman" w:cs="Times New Roman"/>
+              </w:rPr>
+            </w:pPr>
+          </w:p>
+          <w:p>
+            <w:pPr>
+              <w:rPr>
+                <w:rFonts w:ascii="Times New Roman" w:hAnsi="Times New Roman" w:cs="Times New Roman"/>
+              </w:rPr>
+            </w:pPr>
+          </w:p>
+          <w:p>
+            <w:pPr>
+              <w:rPr>
+                <w:rFonts w:ascii="Times New Roman" w:hAnsi="Times New Roman" w:cs="Times New Roman"/>
+              </w:rPr>
+            </w:pPr>
+          </w:p>
+          <w:p>
+            <w:pPr>
+              <w:jc w:val="center"/>
+              <w:rPr>
+                <w:rFonts w:ascii="Times New Roman" w:hAnsi="Times New Roman" w:cs="Times New Roman"/>
+              </w:rPr>
+            </w:pPr>
+          </w:p>
+          <w:p>
+            <w:pPr>
+              <w:jc w:val="center"/>
+              <w:rPr>
+                <w:rFonts w:ascii="Times New Roman" w:hAnsi="Times New Roman" w:cs="Times New Roman"/>
+              </w:rPr>
+            </w:pPr>
+            <w:r>
+              <w:rPr>
+                <w:rFonts w:ascii="Times New Roman" w:hAnsi="Times New Roman" w:cs="Times New Roman"/>
+              </w:rPr>
+              <w:t>3/10/2026</w:t>
+            </w:r>
+          </w:p>
         </w:tc>
         <w:tc>
           <w:tcPr>
@@ -6573,6 +6583,334 @@
               </w:rPr>
             </w:pPr>
           </w:p>
+          <w:p>
+            <w:pPr>
+              <w:rPr>
+                <w:rFonts w:ascii="Times New Roman" w:hAnsi="Times New Roman" w:cs="Times New Roman"/>
+              </w:rPr>
+            </w:pPr>
+          </w:p>
+          <w:p>
+            <w:pPr>
+              <w:jc w:val="center"/>
+              <w:rPr>
+                <w:rFonts w:ascii="Times New Roman" w:hAnsi="Times New Roman" w:cs="Times New Roman"/>
+              </w:rPr>
+            </w:pPr>
+          </w:p>
+          <w:p>
+            <w:pPr>
+              <w:jc w:val="center"/>
+              <w:rPr>
+                <w:rFonts w:ascii="Times New Roman" w:hAnsi="Times New Roman" w:cs="Times New Roman"/>
+              </w:rPr>
+            </w:pPr>
+          </w:p>
+          <w:p>
+            <w:pPr>
+              <w:jc w:val="center"/>
+              <w:rPr>
+                <w:rFonts w:ascii="Times New Roman" w:hAnsi="Times New Roman" w:cs="Times New Roman"/>
+              </w:rPr>
+            </w:pPr>
+          </w:p>
+          <w:p>
+            <w:pPr>
+              <w:jc w:val="center"/>
+              <w:rPr>
+                <w:rFonts w:ascii="Times New Roman" w:hAnsi="Times New Roman" w:cs="Times New Roman"/>
+              </w:rPr>
+            </w:pPr>
+          </w:p>
+          <w:p>
+            <w:pPr>
+              <w:jc w:val="center"/>
+              <w:rPr>
+                <w:rFonts w:ascii="Times New Roman" w:hAnsi="Times New Roman" w:cs="Times New Roman"/>
+              </w:rPr>
+            </w:pPr>
+            <w:r>
+              <w:rPr>
+                <w:rFonts w:ascii="Times New Roman" w:hAnsi="Times New Roman" w:cs="Times New Roman"/>
+              </w:rPr>
+              <w:t xml:space="preserve">2:33pm </w:t>
+            </w:r>
+            <w:r>
+              <w:rPr>
+                <w:rFonts w:ascii="Times New Roman" w:hAnsi="Times New Roman" w:cs="Times New Roman"/>
+              </w:rPr>
+              <w:t>–</w:t>
+            </w:r>
+            <w:r>
+              <w:rPr>
+                <w:rFonts w:ascii="Times New Roman" w:hAnsi="Times New Roman" w:cs="Times New Roman"/>
+              </w:rPr>
+              <w:t xml:space="preserve"> </w:t>
+            </w:r>
+            <w:r>
+              <w:rPr>
+                <w:rFonts w:ascii="Times New Roman" w:hAnsi="Times New Roman" w:cs="Times New Roman"/>
+              </w:rPr>
+              <w:t>3:06pm</w:t>
+            </w:r>
+          </w:p>
+          <w:p>
+            <w:pPr>
+              <w:jc w:val="center"/>
+              <w:rPr>
+                <w:rFonts w:ascii="Times New Roman" w:hAnsi="Times New Roman" w:cs="Times New Roman"/>
+              </w:rPr>
+            </w:pPr>
+            <w:r>
+              <w:rPr>
+                <w:rFonts w:ascii="Times New Roman" w:hAnsi="Times New Roman" w:cs="Times New Roman"/>
+              </w:rPr>
+              <w:t>(36 minutos)</w:t>
+            </w:r>
+            <w:r>
+              <w:rPr>
+                <w:rFonts w:ascii="Times New Roman" w:hAnsi="Times New Roman" w:cs="Times New Roman"/>
+              </w:rPr>
+              <w:br/>
+            </w:r>
+          </w:p>
+          <w:p>
+            <w:pPr>
+              <w:jc w:val="center"/>
+              <w:rPr>
+                <w:rFonts w:ascii="Times New Roman" w:hAnsi="Times New Roman" w:cs="Times New Roman"/>
+              </w:rPr>
+            </w:pPr>
+          </w:p>
+          <w:p>
+            <w:pPr>
+              <w:jc w:val="center"/>
+              <w:rPr>
+                <w:rFonts w:ascii="Times New Roman" w:hAnsi="Times New Roman" w:cs="Times New Roman"/>
+              </w:rPr>
+            </w:pPr>
+          </w:p>
+          <w:p>
+            <w:pPr>
+              <w:jc w:val="center"/>
+              <w:rPr>
+                <w:rFonts w:ascii="Times New Roman" w:hAnsi="Times New Roman" w:cs="Times New Roman"/>
+              </w:rPr>
+            </w:pPr>
+          </w:p>
+          <w:p>
+            <w:pPr>
+              <w:jc w:val="center"/>
+              <w:rPr>
+                <w:rFonts w:ascii="Times New Roman" w:hAnsi="Times New Roman" w:cs="Times New Roman"/>
+              </w:rPr>
+            </w:pPr>
+          </w:p>
+          <w:p>
+            <w:pPr>
+              <w:jc w:val="center"/>
+              <w:rPr>
+                <w:rFonts w:ascii="Times New Roman" w:hAnsi="Times New Roman" w:cs="Times New Roman"/>
+              </w:rPr>
+            </w:pPr>
+          </w:p>
+          <w:p>
+            <w:pPr>
+              <w:jc w:val="center"/>
+              <w:rPr>
+                <w:rFonts w:ascii="Times New Roman" w:hAnsi="Times New Roman" w:cs="Times New Roman"/>
+              </w:rPr>
+            </w:pPr>
+          </w:p>
+          <w:p>
+            <w:pPr>
+              <w:jc w:val="center"/>
+              <w:rPr>
+                <w:rFonts w:ascii="Times New Roman" w:hAnsi="Times New Roman" w:cs="Times New Roman"/>
+              </w:rPr>
+            </w:pPr>
+            <w:r>
+              <w:rPr>
+                <w:rFonts w:ascii="Times New Roman" w:hAnsi="Times New Roman" w:cs="Times New Roman"/>
+              </w:rPr>
+              <w:t xml:space="preserve">6:35pm </w:t>
+            </w:r>
+            <w:r>
+              <w:rPr>
+                <w:rFonts w:ascii="Times New Roman" w:hAnsi="Times New Roman" w:cs="Times New Roman"/>
+              </w:rPr>
+              <w:t>–</w:t>
+            </w:r>
+            <w:r>
+              <w:rPr>
+                <w:rFonts w:ascii="Times New Roman" w:hAnsi="Times New Roman" w:cs="Times New Roman"/>
+              </w:rPr>
+              <w:t xml:space="preserve"> </w:t>
+            </w:r>
+            <w:r>
+              <w:rPr>
+                <w:rFonts w:ascii="Times New Roman" w:hAnsi="Times New Roman" w:cs="Times New Roman"/>
+              </w:rPr>
+              <w:t>6:45pm</w:t>
+            </w:r>
+          </w:p>
+          <w:p>
+            <w:pPr>
+              <w:jc w:val="center"/>
+              <w:rPr>
+                <w:rFonts w:ascii="Times New Roman" w:hAnsi="Times New Roman" w:cs="Times New Roman"/>
+              </w:rPr>
+            </w:pPr>
+            <w:r>
+              <w:rPr>
+                <w:rFonts w:ascii="Times New Roman" w:hAnsi="Times New Roman" w:cs="Times New Roman"/>
+              </w:rPr>
+              <w:t>(10 minutos)</w:t>
+            </w:r>
+          </w:p>
+          <w:p>
+            <w:pPr>
+              <w:jc w:val="center"/>
+              <w:rPr>
+                <w:rFonts w:ascii="Times New Roman" w:hAnsi="Times New Roman" w:cs="Times New Roman"/>
+              </w:rPr>
+            </w:pPr>
+          </w:p>
+          <w:p>
+            <w:pPr>
+              <w:jc w:val="center"/>
+              <w:rPr>
+                <w:rFonts w:ascii="Times New Roman" w:hAnsi="Times New Roman" w:cs="Times New Roman"/>
+              </w:rPr>
+            </w:pPr>
+          </w:p>
+          <w:p>
+            <w:pPr>
+              <w:jc w:val="center"/>
+              <w:rPr>
+                <w:rFonts w:ascii="Times New Roman" w:hAnsi="Times New Roman" w:cs="Times New Roman"/>
+              </w:rPr>
+            </w:pPr>
+          </w:p>
+          <w:p>
+            <w:pPr>
+              <w:jc w:val="center"/>
+              <w:rPr>
+                <w:rFonts w:ascii="Times New Roman" w:hAnsi="Times New Roman" w:cs="Times New Roman"/>
+              </w:rPr>
+            </w:pPr>
+          </w:p>
+          <w:p>
+            <w:pPr>
+              <w:jc w:val="center"/>
+              <w:rPr>
+                <w:rFonts w:ascii="Times New Roman" w:hAnsi="Times New Roman" w:cs="Times New Roman"/>
+              </w:rPr>
+            </w:pPr>
+          </w:p>
+          <w:p>
+            <w:pPr>
+              <w:jc w:val="center"/>
+              <w:rPr>
+                <w:rFonts w:ascii="Times New Roman" w:hAnsi="Times New Roman" w:cs="Times New Roman"/>
+              </w:rPr>
+            </w:pPr>
+          </w:p>
+          <w:p>
+            <w:pPr>
+              <w:jc w:val="center"/>
+              <w:rPr>
+                <w:rFonts w:ascii="Times New Roman" w:hAnsi="Times New Roman" w:cs="Times New Roman"/>
+              </w:rPr>
+            </w:pPr>
+          </w:p>
+          <w:p>
+            <w:pPr>
+              <w:jc w:val="center"/>
+              <w:rPr>
+                <w:rFonts w:ascii="Times New Roman" w:hAnsi="Times New Roman" w:cs="Times New Roman"/>
+              </w:rPr>
+            </w:pPr>
+          </w:p>
+          <w:p>
+            <w:pPr>
+              <w:jc w:val="center"/>
+              <w:rPr>
+                <w:rFonts w:ascii="Times New Roman" w:hAnsi="Times New Roman" w:cs="Times New Roman"/>
+              </w:rPr>
+            </w:pPr>
+          </w:p>
+          <w:p>
+            <w:pPr>
+              <w:jc w:val="center"/>
+              <w:rPr>
+                <w:rFonts w:ascii="Times New Roman" w:hAnsi="Times New Roman" w:cs="Times New Roman"/>
+              </w:rPr>
+            </w:pPr>
+          </w:p>
+          <w:p>
+            <w:pPr>
+              <w:jc w:val="center"/>
+              <w:rPr>
+                <w:rFonts w:ascii="Times New Roman" w:hAnsi="Times New Roman" w:cs="Times New Roman"/>
+              </w:rPr>
+            </w:pPr>
+          </w:p>
+          <w:p>
+            <w:pPr>
+              <w:jc w:val="center"/>
+              <w:rPr>
+                <w:rFonts w:ascii="Times New Roman" w:hAnsi="Times New Roman" w:cs="Times New Roman"/>
+              </w:rPr>
+            </w:pPr>
+          </w:p>
+          <w:p>
+            <w:pPr>
+              <w:jc w:val="center"/>
+              <w:rPr>
+                <w:rFonts w:ascii="Times New Roman" w:hAnsi="Times New Roman" w:cs="Times New Roman"/>
+              </w:rPr>
+            </w:pPr>
+          </w:p>
+          <w:p>
+            <w:pPr>
+              <w:jc w:val="center"/>
+              <w:rPr>
+                <w:rFonts w:ascii="Times New Roman" w:hAnsi="Times New Roman" w:cs="Times New Roman"/>
+              </w:rPr>
+            </w:pPr>
+          </w:p>
+          <w:p>
+            <w:pPr>
+              <w:jc w:val="center"/>
+              <w:rPr>
+                <w:rFonts w:ascii="Times New Roman" w:hAnsi="Times New Roman" w:cs="Times New Roman"/>
+              </w:rPr>
+            </w:pPr>
+          </w:p>
+          <w:p>
+            <w:pPr>
+              <w:jc w:val="center"/>
+              <w:rPr>
+                <w:rFonts w:ascii="Times New Roman" w:hAnsi="Times New Roman" w:cs="Times New Roman"/>
+              </w:rPr>
+            </w:pPr>
+          </w:p>
+          <w:p>
+            <w:pPr>
+              <w:jc w:val="center"/>
+              <w:rPr>
+                <w:rFonts w:ascii="Times New Roman" w:hAnsi="Times New Roman" w:cs="Times New Roman"/>
+              </w:rPr>
+            </w:pPr>
+          </w:p>
+          <w:p>
+            <w:pPr>
+              <w:rPr>
+                <w:rFonts w:ascii="Times New Roman" w:hAnsi="Times New Roman" w:cs="Times New Roman"/>
+              </w:rPr>
+            </w:pPr>
+          </w:p>
         </w:tc>
         <w:tc>
           <w:tcPr>
@@ -6584,6 +6922,60 @@
                 <w:rFonts w:ascii="Times New Roman" w:hAnsi="Times New Roman" w:cs="Times New Roman"/>
               </w:rPr>
             </w:pPr>
+          </w:p>
+          <w:p>
+            <w:pPr>
+              <w:rPr>
+                <w:rFonts w:ascii="Times New Roman" w:hAnsi="Times New Roman" w:cs="Times New Roman"/>
+              </w:rPr>
+            </w:pPr>
+            <w:r>
+              <w:rPr>
+                <w:rFonts w:ascii="Times New Roman" w:hAnsi="Times New Roman" w:cs="Times New Roman"/>
+              </w:rPr>
+              <w:t>Trabajo en los menús, mejorando y eliminando líneas innecesarias y que estaban causando errores, como llamadas recursivas (No subo git, no he terminado de modificar, pero debía hacer unas revisiones para un proyecto de fundamentos)</w:t>
+            </w:r>
+          </w:p>
+          <w:p>
+            <w:pPr>
+              <w:rPr>
+                <w:rFonts w:ascii="Times New Roman" w:hAnsi="Times New Roman" w:cs="Times New Roman"/>
+              </w:rPr>
+            </w:pPr>
+          </w:p>
+          <w:p>
+            <w:pPr>
+              <w:rPr>
+                <w:rFonts w:ascii="Times New Roman" w:hAnsi="Times New Roman" w:cs="Times New Roman"/>
+              </w:rPr>
+            </w:pPr>
+          </w:p>
+          <w:p>
+            <w:pPr>
+              <w:rPr>
+                <w:rFonts w:ascii="Times New Roman" w:hAnsi="Times New Roman" w:cs="Times New Roman"/>
+              </w:rPr>
+            </w:pPr>
+          </w:p>
+          <w:p>
+            <w:pPr>
+              <w:rPr>
+                <w:rFonts w:ascii="Times New Roman" w:hAnsi="Times New Roman" w:cs="Times New Roman"/>
+              </w:rPr>
+            </w:pPr>
+          </w:p>
+          <w:p>
+            <w:pPr>
+              <w:rPr>
+                <w:rFonts w:ascii="Times New Roman" w:hAnsi="Times New Roman" w:cs="Times New Roman"/>
+              </w:rPr>
+            </w:pPr>
+            <w:r>
+              <w:rPr>
+                <w:rFonts w:ascii="Times New Roman" w:hAnsi="Times New Roman" w:cs="Times New Roman"/>
+              </w:rPr>
+              <w:t>Se terminan los cambios sobre el menú que se estaban realizando con anterioridad.</w:t>
+            </w:r>
           </w:p>
         </w:tc>
       </w:tr>

</xml_diff>

<commit_message>
Se agrega la función auxiliar comprobar_asociado, por ahora solo esta conectada a eliminar_modelo
</commit_message>
<xml_diff>
--- a/documentacion/Documentación Externa (Not final).docx
+++ b/documentacion/Documentación Externa (Not final).docx
@@ -853,7 +853,25 @@
           <w:sz w:val="28"/>
           <w:szCs w:val="28"/>
         </w:rPr>
-        <w:t>y todos los archivos.txt que este necesita par su necesaria y efectiva ejecución.</w:t>
+        <w:t xml:space="preserve">y todos los archivos.txt que este necesita </w:t>
+      </w:r>
+      <w:proofErr w:type="spellStart"/>
+      <w:r>
+        <w:rPr>
+          <w:rFonts w:ascii="Times New Roman" w:hAnsi="Times New Roman" w:cs="Times New Roman"/>
+          <w:sz w:val="28"/>
+          <w:szCs w:val="28"/>
+        </w:rPr>
+        <w:t>par</w:t>
+      </w:r>
+      <w:proofErr w:type="spellEnd"/>
+      <w:r>
+        <w:rPr>
+          <w:rFonts w:ascii="Times New Roman" w:hAnsi="Times New Roman" w:cs="Times New Roman"/>
+          <w:sz w:val="28"/>
+          <w:szCs w:val="28"/>
+        </w:rPr>
+        <w:t xml:space="preserve"> su necesaria y efectiva ejecución.</w:t>
       </w:r>
     </w:p>
     <w:p>
@@ -2318,7 +2336,21 @@
         <w:rPr>
           <w:rFonts w:ascii="Times New Roman" w:hAnsi="Times New Roman" w:cs="Times New Roman"/>
         </w:rPr>
-        <w:t xml:space="preserve"> de manejar toda la logística de la empresa desde aquí, controlar las unidades, los conductores y las rutas, también un historial de que reservaciones se han hecho y cuanto dinero se ha recaudado hasta el momento.</w:t>
+        <w:t xml:space="preserve"> de manejar toda la logística de la empresa desde aquí, controlar las unidades, los conductores y las rutas, también un historial de que reservaciones se han hecho y </w:t>
+      </w:r>
+      <w:proofErr w:type="spellStart"/>
+      <w:r>
+        <w:rPr>
+          <w:rFonts w:ascii="Times New Roman" w:hAnsi="Times New Roman" w:cs="Times New Roman"/>
+        </w:rPr>
+        <w:t>cuanto</w:t>
+      </w:r>
+      <w:proofErr w:type="spellEnd"/>
+      <w:r>
+        <w:rPr>
+          <w:rFonts w:ascii="Times New Roman" w:hAnsi="Times New Roman" w:cs="Times New Roman"/>
+        </w:rPr>
+        <w:t xml:space="preserve"> dinero se ha recaudado hasta el momento.</w:t>
       </w:r>
     </w:p>
     <w:p>
@@ -6564,6 +6596,78 @@
                 <w:rFonts w:ascii="Times New Roman" w:hAnsi="Times New Roman" w:cs="Times New Roman"/>
               </w:rPr>
             </w:pPr>
+          </w:p>
+          <w:p>
+            <w:pPr>
+              <w:jc w:val="center"/>
+              <w:rPr>
+                <w:rFonts w:ascii="Times New Roman" w:hAnsi="Times New Roman" w:cs="Times New Roman"/>
+              </w:rPr>
+            </w:pPr>
+          </w:p>
+          <w:p>
+            <w:pPr>
+              <w:jc w:val="center"/>
+              <w:rPr>
+                <w:rFonts w:ascii="Times New Roman" w:hAnsi="Times New Roman" w:cs="Times New Roman"/>
+              </w:rPr>
+            </w:pPr>
+          </w:p>
+          <w:p>
+            <w:pPr>
+              <w:jc w:val="center"/>
+              <w:rPr>
+                <w:rFonts w:ascii="Times New Roman" w:hAnsi="Times New Roman" w:cs="Times New Roman"/>
+              </w:rPr>
+            </w:pPr>
+          </w:p>
+          <w:p>
+            <w:pPr>
+              <w:jc w:val="center"/>
+              <w:rPr>
+                <w:rFonts w:ascii="Times New Roman" w:hAnsi="Times New Roman" w:cs="Times New Roman"/>
+              </w:rPr>
+            </w:pPr>
+          </w:p>
+          <w:p>
+            <w:pPr>
+              <w:jc w:val="center"/>
+              <w:rPr>
+                <w:rFonts w:ascii="Times New Roman" w:hAnsi="Times New Roman" w:cs="Times New Roman"/>
+              </w:rPr>
+            </w:pPr>
+          </w:p>
+          <w:p>
+            <w:pPr>
+              <w:jc w:val="center"/>
+              <w:rPr>
+                <w:rFonts w:ascii="Times New Roman" w:hAnsi="Times New Roman" w:cs="Times New Roman"/>
+              </w:rPr>
+            </w:pPr>
+          </w:p>
+          <w:p>
+            <w:pPr>
+              <w:jc w:val="center"/>
+              <w:rPr>
+                <w:rFonts w:ascii="Times New Roman" w:hAnsi="Times New Roman" w:cs="Times New Roman"/>
+              </w:rPr>
+            </w:pPr>
+          </w:p>
+          <w:p>
+            <w:pPr>
+              <w:jc w:val="center"/>
+              <w:rPr>
+                <w:rFonts w:ascii="Times New Roman" w:hAnsi="Times New Roman" w:cs="Times New Roman"/>
+              </w:rPr>
+            </w:pPr>
+          </w:p>
+          <w:p>
+            <w:pPr>
+              <w:jc w:val="center"/>
+              <w:rPr>
+                <w:rFonts w:ascii="Times New Roman" w:hAnsi="Times New Roman" w:cs="Times New Roman"/>
+              </w:rPr>
+            </w:pPr>
             <w:r>
               <w:rPr>
                 <w:rFonts w:ascii="Times New Roman" w:hAnsi="Times New Roman" w:cs="Times New Roman"/>
@@ -6839,6 +6943,92 @@
                 <w:rFonts w:ascii="Times New Roman" w:hAnsi="Times New Roman" w:cs="Times New Roman"/>
               </w:rPr>
             </w:pPr>
+            <w:r>
+              <w:rPr>
+                <w:rFonts w:ascii="Times New Roman" w:hAnsi="Times New Roman" w:cs="Times New Roman"/>
+              </w:rPr>
+              <w:t xml:space="preserve">6:58pm </w:t>
+            </w:r>
+            <w:r>
+              <w:rPr>
+                <w:rFonts w:ascii="Times New Roman" w:hAnsi="Times New Roman" w:cs="Times New Roman"/>
+              </w:rPr>
+              <w:t>–</w:t>
+            </w:r>
+            <w:r>
+              <w:rPr>
+                <w:rFonts w:ascii="Times New Roman" w:hAnsi="Times New Roman" w:cs="Times New Roman"/>
+              </w:rPr>
+              <w:t xml:space="preserve"> </w:t>
+            </w:r>
+            <w:r>
+              <w:rPr>
+                <w:rFonts w:ascii="Times New Roman" w:hAnsi="Times New Roman" w:cs="Times New Roman"/>
+              </w:rPr>
+              <w:t>7:46pm</w:t>
+            </w:r>
+          </w:p>
+          <w:p>
+            <w:pPr>
+              <w:jc w:val="center"/>
+              <w:rPr>
+                <w:rFonts w:ascii="Times New Roman" w:hAnsi="Times New Roman" w:cs="Times New Roman"/>
+              </w:rPr>
+            </w:pPr>
+            <w:r>
+              <w:rPr>
+                <w:rFonts w:ascii="Times New Roman" w:hAnsi="Times New Roman" w:cs="Times New Roman"/>
+              </w:rPr>
+              <w:t>(48 minutos)</w:t>
+            </w:r>
+          </w:p>
+          <w:p>
+            <w:pPr>
+              <w:jc w:val="center"/>
+              <w:rPr>
+                <w:rFonts w:ascii="Times New Roman" w:hAnsi="Times New Roman" w:cs="Times New Roman"/>
+              </w:rPr>
+            </w:pPr>
+          </w:p>
+          <w:p>
+            <w:pPr>
+              <w:jc w:val="center"/>
+              <w:rPr>
+                <w:rFonts w:ascii="Times New Roman" w:hAnsi="Times New Roman" w:cs="Times New Roman"/>
+              </w:rPr>
+            </w:pPr>
+          </w:p>
+          <w:p>
+            <w:pPr>
+              <w:jc w:val="center"/>
+              <w:rPr>
+                <w:rFonts w:ascii="Times New Roman" w:hAnsi="Times New Roman" w:cs="Times New Roman"/>
+              </w:rPr>
+            </w:pPr>
+          </w:p>
+          <w:p>
+            <w:pPr>
+              <w:jc w:val="center"/>
+              <w:rPr>
+                <w:rFonts w:ascii="Times New Roman" w:hAnsi="Times New Roman" w:cs="Times New Roman"/>
+              </w:rPr>
+            </w:pPr>
+          </w:p>
+          <w:p>
+            <w:pPr>
+              <w:jc w:val="center"/>
+              <w:rPr>
+                <w:rFonts w:ascii="Times New Roman" w:hAnsi="Times New Roman" w:cs="Times New Roman"/>
+              </w:rPr>
+            </w:pPr>
+          </w:p>
+          <w:p>
+            <w:pPr>
+              <w:jc w:val="center"/>
+              <w:rPr>
+                <w:rFonts w:ascii="Times New Roman" w:hAnsi="Times New Roman" w:cs="Times New Roman"/>
+              </w:rPr>
+            </w:pPr>
           </w:p>
           <w:p>
             <w:pPr>
@@ -6963,18 +7153,63 @@
                 <w:rFonts w:ascii="Times New Roman" w:hAnsi="Times New Roman" w:cs="Times New Roman"/>
               </w:rPr>
             </w:pPr>
-          </w:p>
-          <w:p>
-            <w:pPr>
-              <w:rPr>
-                <w:rFonts w:ascii="Times New Roman" w:hAnsi="Times New Roman" w:cs="Times New Roman"/>
-              </w:rPr>
-            </w:pPr>
             <w:r>
               <w:rPr>
                 <w:rFonts w:ascii="Times New Roman" w:hAnsi="Times New Roman" w:cs="Times New Roman"/>
               </w:rPr>
               <w:t>Se terminan los cambios sobre el menú que se estaban realizando con anterioridad.</w:t>
+            </w:r>
+            <w:r>
+              <w:rPr>
+                <w:rFonts w:ascii="Times New Roman" w:hAnsi="Times New Roman" w:cs="Times New Roman"/>
+              </w:rPr>
+              <w:t xml:space="preserve"> (Ahora si se sube el commit)</w:t>
+            </w:r>
+          </w:p>
+          <w:p>
+            <w:pPr>
+              <w:rPr>
+                <w:rFonts w:ascii="Times New Roman" w:hAnsi="Times New Roman" w:cs="Times New Roman"/>
+              </w:rPr>
+            </w:pPr>
+          </w:p>
+          <w:p>
+            <w:pPr>
+              <w:rPr>
+                <w:rFonts w:ascii="Times New Roman" w:hAnsi="Times New Roman" w:cs="Times New Roman"/>
+              </w:rPr>
+            </w:pPr>
+          </w:p>
+          <w:p>
+            <w:pPr>
+              <w:rPr>
+                <w:rFonts w:ascii="Times New Roman" w:hAnsi="Times New Roman" w:cs="Times New Roman"/>
+              </w:rPr>
+            </w:pPr>
+          </w:p>
+          <w:p>
+            <w:pPr>
+              <w:rPr>
+                <w:rFonts w:ascii="Times New Roman" w:hAnsi="Times New Roman" w:cs="Times New Roman"/>
+              </w:rPr>
+            </w:pPr>
+            <w:r>
+              <w:rPr>
+                <w:rFonts w:ascii="Times New Roman" w:hAnsi="Times New Roman" w:cs="Times New Roman"/>
+              </w:rPr>
+              <w:t xml:space="preserve">Se crea la función auxiliar de </w:t>
+            </w:r>
+            <w:r>
+              <w:rPr>
+                <w:rFonts w:ascii="Times New Roman" w:hAnsi="Times New Roman" w:cs="Times New Roman"/>
+              </w:rPr>
+              <w:t>comprobar_asociado</w:t>
+            </w:r>
+            <w:r>
+              <w:rPr>
+                <w:rFonts w:ascii="Times New Roman" w:hAnsi="Times New Roman" w:cs="Times New Roman"/>
+              </w:rPr>
+              <w:t xml:space="preserve">, la cual nos va a ayudar a poder comprobar de manera general si dos archivos tienen elementos asociados (Todavía se esta probando) </w:t>
             </w:r>
           </w:p>
         </w:tc>

</xml_diff>

<commit_message>
Se termina de implementar la funcion para evitar que se eliminen elementos asociados y se trabaja en la documentación externa
</commit_message>
<xml_diff>
--- a/documentacion/Documentación Externa (Not final).docx
+++ b/documentacion/Documentación Externa (Not final).docx
@@ -853,25 +853,7 @@
           <w:sz w:val="28"/>
           <w:szCs w:val="28"/>
         </w:rPr>
-        <w:t xml:space="preserve">y todos los archivos.txt que este necesita </w:t>
-      </w:r>
-      <w:proofErr w:type="spellStart"/>
-      <w:r>
-        <w:rPr>
-          <w:rFonts w:ascii="Times New Roman" w:hAnsi="Times New Roman" w:cs="Times New Roman"/>
-          <w:sz w:val="28"/>
-          <w:szCs w:val="28"/>
-        </w:rPr>
-        <w:t>par</w:t>
-      </w:r>
-      <w:proofErr w:type="spellEnd"/>
-      <w:r>
-        <w:rPr>
-          <w:rFonts w:ascii="Times New Roman" w:hAnsi="Times New Roman" w:cs="Times New Roman"/>
-          <w:sz w:val="28"/>
-          <w:szCs w:val="28"/>
-        </w:rPr>
-        <w:t xml:space="preserve"> su necesaria y efectiva ejecución.</w:t>
+        <w:t>y todos los archivos.txt que este necesita par su necesaria y efectiva ejecución.</w:t>
       </w:r>
     </w:p>
     <w:p>
@@ -1991,6 +1973,11 @@
     </w:p>
     <w:p>
       <w:pPr>
+        <w:pStyle w:val="Prrafodelista"/>
+        <w:numPr>
+          <w:ilvl w:val="0"/>
+          <w:numId w:val="5"/>
+        </w:numPr>
         <w:jc w:val="both"/>
         <w:rPr>
           <w:rFonts w:ascii="Times New Roman" w:hAnsi="Times New Roman" w:cs="Times New Roman"/>
@@ -2004,31 +1991,7 @@
           <w:sz w:val="28"/>
           <w:szCs w:val="28"/>
         </w:rPr>
-        <w:t>(1</w:t>
-      </w:r>
-      <w:r>
-        <w:rPr>
-          <w:rFonts w:ascii="Times New Roman" w:hAnsi="Times New Roman" w:cs="Times New Roman"/>
-          <w:sz w:val="28"/>
-          <w:szCs w:val="28"/>
-        </w:rPr>
-        <w:t xml:space="preserve">) </w:t>
-      </w:r>
-      <w:r>
-        <w:rPr>
-          <w:rFonts w:ascii="Times New Roman" w:hAnsi="Times New Roman" w:cs="Times New Roman"/>
-          <w:sz w:val="28"/>
-          <w:szCs w:val="28"/>
-        </w:rPr>
-        <w:t>Incluir modelo</w:t>
-      </w:r>
-      <w:r>
-        <w:rPr>
-          <w:rFonts w:ascii="Times New Roman" w:hAnsi="Times New Roman" w:cs="Times New Roman"/>
-          <w:sz w:val="28"/>
-          <w:szCs w:val="28"/>
-        </w:rPr>
-        <w:t>: Esta opción nos permite agregar un nuevo modelo de autobús a el archivo “modelos.txt”, para agregar un nuevo modelo, el programa le pedirá los siguientes datos: Un modelo, una marca, cantidad de asientos y cantidad de espacios a pie</w:t>
+        <w:t>Incluir modelo: Esta opción nos permite agregar un nuevo modelo de autobús a el archivo “modelos.txt”, para agregar un nuevo modelo, el programa le pedirá los siguientes datos: Un modelo, una marca, cantidad de asientos y cantidad de espacios a pie</w:t>
       </w:r>
       <w:r>
         <w:rPr>
@@ -2059,231 +2022,484 @@
     </w:p>
     <w:p>
       <w:pPr>
+        <w:pStyle w:val="Prrafodelista"/>
+        <w:ind w:left="825"/>
         <w:jc w:val="both"/>
         <w:rPr>
           <w:rFonts w:ascii="Times New Roman" w:hAnsi="Times New Roman" w:cs="Times New Roman"/>
-        </w:rPr>
-      </w:pPr>
-    </w:p>
-    <w:p>
-      <w:pPr>
-        <w:jc w:val="center"/>
-        <w:rPr>
-          <w:rFonts w:ascii="Times New Roman" w:hAnsi="Times New Roman" w:cs="Times New Roman"/>
-          <w:sz w:val="28"/>
-          <w:szCs w:val="28"/>
-        </w:rPr>
-      </w:pPr>
-    </w:p>
-    <w:p>
-      <w:pPr>
-        <w:jc w:val="center"/>
-        <w:rPr>
-          <w:rFonts w:ascii="Times New Roman" w:hAnsi="Times New Roman" w:cs="Times New Roman"/>
-          <w:sz w:val="28"/>
-          <w:szCs w:val="28"/>
-        </w:rPr>
-      </w:pPr>
-    </w:p>
-    <w:p>
-      <w:pPr>
-        <w:jc w:val="center"/>
-        <w:rPr>
-          <w:rFonts w:ascii="Times New Roman" w:hAnsi="Times New Roman" w:cs="Times New Roman"/>
-          <w:sz w:val="28"/>
-          <w:szCs w:val="28"/>
-        </w:rPr>
-      </w:pPr>
-    </w:p>
-    <w:p>
-      <w:pPr>
-        <w:jc w:val="center"/>
-        <w:rPr>
-          <w:rFonts w:ascii="Times New Roman" w:hAnsi="Times New Roman" w:cs="Times New Roman"/>
-          <w:sz w:val="28"/>
-          <w:szCs w:val="28"/>
-        </w:rPr>
-      </w:pPr>
-    </w:p>
-    <w:p>
-      <w:pPr>
-        <w:jc w:val="center"/>
-        <w:rPr>
-          <w:rFonts w:ascii="Times New Roman" w:hAnsi="Times New Roman" w:cs="Times New Roman"/>
-          <w:sz w:val="28"/>
-          <w:szCs w:val="28"/>
-        </w:rPr>
-      </w:pPr>
-    </w:p>
-    <w:p>
-      <w:pPr>
-        <w:jc w:val="center"/>
-        <w:rPr>
-          <w:rFonts w:ascii="Times New Roman" w:hAnsi="Times New Roman" w:cs="Times New Roman"/>
-          <w:sz w:val="28"/>
-          <w:szCs w:val="28"/>
-        </w:rPr>
-      </w:pPr>
-    </w:p>
-    <w:p>
-      <w:pPr>
-        <w:jc w:val="center"/>
-        <w:rPr>
-          <w:rFonts w:ascii="Times New Roman" w:hAnsi="Times New Roman" w:cs="Times New Roman"/>
-          <w:sz w:val="28"/>
-          <w:szCs w:val="28"/>
-        </w:rPr>
-      </w:pPr>
-    </w:p>
-    <w:p>
-      <w:pPr>
-        <w:jc w:val="center"/>
-        <w:rPr>
-          <w:rFonts w:ascii="Times New Roman" w:hAnsi="Times New Roman" w:cs="Times New Roman"/>
-          <w:sz w:val="28"/>
-          <w:szCs w:val="28"/>
-        </w:rPr>
-      </w:pPr>
-    </w:p>
-    <w:p>
-      <w:pPr>
-        <w:jc w:val="center"/>
-        <w:rPr>
-          <w:rFonts w:ascii="Times New Roman" w:hAnsi="Times New Roman" w:cs="Times New Roman"/>
-          <w:sz w:val="28"/>
-          <w:szCs w:val="28"/>
-        </w:rPr>
-      </w:pPr>
-    </w:p>
-    <w:p>
-      <w:pPr>
-        <w:jc w:val="center"/>
-        <w:rPr>
-          <w:rFonts w:ascii="Times New Roman" w:hAnsi="Times New Roman" w:cs="Times New Roman"/>
-          <w:sz w:val="28"/>
-          <w:szCs w:val="28"/>
-        </w:rPr>
-      </w:pPr>
-    </w:p>
-    <w:p>
-      <w:pPr>
-        <w:jc w:val="center"/>
-        <w:rPr>
-          <w:rFonts w:ascii="Times New Roman" w:hAnsi="Times New Roman" w:cs="Times New Roman"/>
-          <w:sz w:val="28"/>
-          <w:szCs w:val="28"/>
-        </w:rPr>
-      </w:pPr>
-    </w:p>
-    <w:p>
-      <w:pPr>
-        <w:jc w:val="center"/>
-        <w:rPr>
-          <w:rFonts w:ascii="Times New Roman" w:hAnsi="Times New Roman" w:cs="Times New Roman"/>
-          <w:sz w:val="28"/>
-          <w:szCs w:val="28"/>
-        </w:rPr>
-      </w:pPr>
-    </w:p>
-    <w:p>
-      <w:pPr>
-        <w:jc w:val="center"/>
-        <w:rPr>
-          <w:rFonts w:ascii="Times New Roman" w:hAnsi="Times New Roman" w:cs="Times New Roman"/>
-          <w:sz w:val="28"/>
-          <w:szCs w:val="28"/>
-        </w:rPr>
-      </w:pPr>
-    </w:p>
-    <w:p>
-      <w:pPr>
-        <w:jc w:val="center"/>
-        <w:rPr>
-          <w:rFonts w:ascii="Times New Roman" w:hAnsi="Times New Roman" w:cs="Times New Roman"/>
-          <w:sz w:val="28"/>
-          <w:szCs w:val="28"/>
-        </w:rPr>
-      </w:pPr>
-    </w:p>
-    <w:p>
-      <w:pPr>
-        <w:jc w:val="center"/>
-        <w:rPr>
-          <w:rFonts w:ascii="Times New Roman" w:hAnsi="Times New Roman" w:cs="Times New Roman"/>
-          <w:sz w:val="28"/>
-          <w:szCs w:val="28"/>
-        </w:rPr>
-      </w:pPr>
-    </w:p>
-    <w:p>
-      <w:pPr>
-        <w:jc w:val="center"/>
-        <w:rPr>
-          <w:rFonts w:ascii="Times New Roman" w:hAnsi="Times New Roman" w:cs="Times New Roman"/>
-          <w:sz w:val="28"/>
-          <w:szCs w:val="28"/>
-        </w:rPr>
-      </w:pPr>
-    </w:p>
-    <w:p>
-      <w:pPr>
-        <w:jc w:val="center"/>
-        <w:rPr>
-          <w:rFonts w:ascii="Times New Roman" w:hAnsi="Times New Roman" w:cs="Times New Roman"/>
-          <w:sz w:val="28"/>
-          <w:szCs w:val="28"/>
-        </w:rPr>
-      </w:pPr>
-    </w:p>
-    <w:p>
-      <w:pPr>
-        <w:jc w:val="center"/>
-        <w:rPr>
-          <w:rFonts w:ascii="Times New Roman" w:hAnsi="Times New Roman" w:cs="Times New Roman"/>
-          <w:sz w:val="28"/>
-          <w:szCs w:val="28"/>
-        </w:rPr>
-      </w:pPr>
-    </w:p>
-    <w:p>
-      <w:pPr>
-        <w:jc w:val="center"/>
-        <w:rPr>
-          <w:rFonts w:ascii="Times New Roman" w:hAnsi="Times New Roman" w:cs="Times New Roman"/>
-          <w:sz w:val="28"/>
-          <w:szCs w:val="28"/>
-        </w:rPr>
-      </w:pPr>
-    </w:p>
-    <w:p>
-      <w:pPr>
-        <w:jc w:val="center"/>
-        <w:rPr>
-          <w:rFonts w:ascii="Times New Roman" w:hAnsi="Times New Roman" w:cs="Times New Roman"/>
-          <w:sz w:val="28"/>
-          <w:szCs w:val="28"/>
-        </w:rPr>
-      </w:pPr>
-    </w:p>
-    <w:p>
-      <w:pPr>
-        <w:jc w:val="center"/>
-        <w:rPr>
-          <w:rFonts w:ascii="Times New Roman" w:hAnsi="Times New Roman" w:cs="Times New Roman"/>
-          <w:b/>
-          <w:bCs/>
-          <w:sz w:val="28"/>
-          <w:szCs w:val="28"/>
-        </w:rPr>
-      </w:pPr>
-      <w:r>
-        <w:rPr>
-          <w:rFonts w:ascii="Times New Roman" w:hAnsi="Times New Roman" w:cs="Times New Roman"/>
-          <w:b/>
-          <w:bCs/>
-          <w:sz w:val="28"/>
-          <w:szCs w:val="28"/>
-        </w:rPr>
+          <w:sz w:val="28"/>
+          <w:szCs w:val="28"/>
+        </w:rPr>
+      </w:pPr>
+    </w:p>
+    <w:p>
+      <w:pPr>
+        <w:pStyle w:val="Prrafodelista"/>
+        <w:numPr>
+          <w:ilvl w:val="0"/>
+          <w:numId w:val="5"/>
+        </w:numPr>
+        <w:jc w:val="both"/>
+        <w:rPr>
+          <w:rFonts w:ascii="Times New Roman" w:hAnsi="Times New Roman" w:cs="Times New Roman"/>
+          <w:sz w:val="28"/>
+          <w:szCs w:val="28"/>
+        </w:rPr>
+      </w:pPr>
+      <w:r>
+        <w:rPr>
+          <w:rFonts w:ascii="Times New Roman" w:hAnsi="Times New Roman" w:cs="Times New Roman"/>
+          <w:sz w:val="28"/>
+          <w:szCs w:val="28"/>
+        </w:rPr>
+        <w:t>Eliminar modelo: Esta opción del programa le permite al usuario eliminar uno de los modelos antes registrados, para poder eliminar un modelo, se debe de cumplir con las siguientes condiciones:</w:t>
+      </w:r>
+    </w:p>
+    <w:p>
+      <w:pPr>
+        <w:pStyle w:val="Prrafodelista"/>
+        <w:numPr>
+          <w:ilvl w:val="0"/>
+          <w:numId w:val="7"/>
+        </w:numPr>
+        <w:jc w:val="both"/>
+        <w:rPr>
+          <w:rFonts w:ascii="Times New Roman" w:hAnsi="Times New Roman" w:cs="Times New Roman"/>
+          <w:sz w:val="28"/>
+          <w:szCs w:val="28"/>
+        </w:rPr>
+      </w:pPr>
+      <w:r>
+        <w:rPr>
+          <w:rFonts w:ascii="Times New Roman" w:hAnsi="Times New Roman" w:cs="Times New Roman"/>
+          <w:sz w:val="28"/>
+          <w:szCs w:val="28"/>
+        </w:rPr>
+        <w:t>El modelo a eliminar tiene que estar registrado en el archivo de “</w:t>
+      </w:r>
+      <w:r>
+        <w:rPr>
+          <w:rFonts w:ascii="Times New Roman" w:hAnsi="Times New Roman" w:cs="Times New Roman"/>
+          <w:sz w:val="28"/>
+          <w:szCs w:val="28"/>
+        </w:rPr>
+        <w:t>modelos</w:t>
+      </w:r>
+      <w:r>
+        <w:rPr>
+          <w:rFonts w:ascii="Times New Roman" w:hAnsi="Times New Roman" w:cs="Times New Roman"/>
+          <w:sz w:val="28"/>
+          <w:szCs w:val="28"/>
+        </w:rPr>
+        <w:t>.txt”</w:t>
+      </w:r>
+      <w:r>
+        <w:rPr>
+          <w:rFonts w:ascii="Times New Roman" w:hAnsi="Times New Roman" w:cs="Times New Roman"/>
+          <w:sz w:val="28"/>
+          <w:szCs w:val="28"/>
+        </w:rPr>
+        <w:t xml:space="preserve"> con antelación.</w:t>
+      </w:r>
+    </w:p>
+    <w:p>
+      <w:pPr>
+        <w:pStyle w:val="Prrafodelista"/>
+        <w:numPr>
+          <w:ilvl w:val="0"/>
+          <w:numId w:val="7"/>
+        </w:numPr>
+        <w:jc w:val="both"/>
+        <w:rPr>
+          <w:rFonts w:ascii="Times New Roman" w:hAnsi="Times New Roman" w:cs="Times New Roman"/>
+          <w:sz w:val="28"/>
+          <w:szCs w:val="28"/>
+        </w:rPr>
+      </w:pPr>
+      <w:r>
+        <w:rPr>
+          <w:rFonts w:ascii="Times New Roman" w:hAnsi="Times New Roman" w:cs="Times New Roman"/>
+          <w:sz w:val="28"/>
+          <w:szCs w:val="28"/>
+        </w:rPr>
+        <w:t xml:space="preserve">No se puede eliminar un modelo que ya este asociado a una unidad </w:t>
+      </w:r>
+    </w:p>
+    <w:p>
+      <w:pPr>
+        <w:ind w:left="825"/>
+        <w:jc w:val="both"/>
+        <w:rPr>
+          <w:rFonts w:ascii="Times New Roman" w:hAnsi="Times New Roman" w:cs="Times New Roman"/>
+          <w:sz w:val="28"/>
+          <w:szCs w:val="28"/>
+        </w:rPr>
+      </w:pPr>
+      <w:r>
+        <w:rPr>
+          <w:rFonts w:ascii="Times New Roman" w:hAnsi="Times New Roman" w:cs="Times New Roman"/>
+          <w:sz w:val="28"/>
+          <w:szCs w:val="28"/>
+        </w:rPr>
+        <w:t>Si cumple con todo lo mencionado, le dejara eliminar el modelo con solo insertar su descripción en el campo solicitado.</w:t>
+      </w:r>
+    </w:p>
+    <w:p>
+      <w:pPr>
+        <w:pStyle w:val="Prrafodelista"/>
+        <w:numPr>
+          <w:ilvl w:val="0"/>
+          <w:numId w:val="5"/>
+        </w:numPr>
+        <w:jc w:val="both"/>
+        <w:rPr>
+          <w:rFonts w:ascii="Times New Roman" w:hAnsi="Times New Roman" w:cs="Times New Roman"/>
+          <w:sz w:val="28"/>
+          <w:szCs w:val="28"/>
+        </w:rPr>
+      </w:pPr>
+      <w:r>
+        <w:rPr>
+          <w:rFonts w:ascii="Times New Roman" w:hAnsi="Times New Roman" w:cs="Times New Roman"/>
+          <w:sz w:val="28"/>
+          <w:szCs w:val="28"/>
+        </w:rPr>
+        <w:t xml:space="preserve"> Modificar modelo:</w:t>
+      </w:r>
+      <w:r>
+        <w:rPr>
+          <w:rFonts w:ascii="Times New Roman" w:hAnsi="Times New Roman" w:cs="Times New Roman"/>
+          <w:sz w:val="28"/>
+          <w:szCs w:val="28"/>
+        </w:rPr>
+        <w:t xml:space="preserve"> </w:t>
+      </w:r>
+      <w:r>
+        <w:rPr>
+          <w:rFonts w:ascii="Times New Roman" w:hAnsi="Times New Roman" w:cs="Times New Roman"/>
+          <w:sz w:val="28"/>
+          <w:szCs w:val="28"/>
+        </w:rPr>
+        <w:t>Esta opción del programa le permite al usuario e</w:t>
+      </w:r>
+      <w:r>
+        <w:rPr>
+          <w:rFonts w:ascii="Times New Roman" w:hAnsi="Times New Roman" w:cs="Times New Roman"/>
+          <w:sz w:val="28"/>
+          <w:szCs w:val="28"/>
+        </w:rPr>
+        <w:t>l modificar</w:t>
+      </w:r>
+      <w:r>
+        <w:rPr>
+          <w:rFonts w:ascii="Times New Roman" w:hAnsi="Times New Roman" w:cs="Times New Roman"/>
+          <w:sz w:val="28"/>
+          <w:szCs w:val="28"/>
+        </w:rPr>
+        <w:t xml:space="preserve"> uno de los modelos antes registrados, para poder </w:t>
+      </w:r>
+      <w:r>
+        <w:rPr>
+          <w:rFonts w:ascii="Times New Roman" w:hAnsi="Times New Roman" w:cs="Times New Roman"/>
+          <w:sz w:val="28"/>
+          <w:szCs w:val="28"/>
+        </w:rPr>
+        <w:t>modificar</w:t>
+      </w:r>
+      <w:r>
+        <w:rPr>
+          <w:rFonts w:ascii="Times New Roman" w:hAnsi="Times New Roman" w:cs="Times New Roman"/>
+          <w:sz w:val="28"/>
+          <w:szCs w:val="28"/>
+        </w:rPr>
+        <w:t xml:space="preserve"> un modelo, se debe de cumplir </w:t>
+      </w:r>
+      <w:r>
+        <w:rPr>
+          <w:rFonts w:ascii="Times New Roman" w:hAnsi="Times New Roman" w:cs="Times New Roman"/>
+          <w:sz w:val="28"/>
+          <w:szCs w:val="28"/>
+        </w:rPr>
+        <w:t>con que el modelo exista en el archivo de “modelos.txt”.</w:t>
+      </w:r>
+    </w:p>
+    <w:p>
+      <w:pPr>
+        <w:jc w:val="both"/>
+        <w:rPr>
+          <w:rFonts w:ascii="Times New Roman" w:hAnsi="Times New Roman" w:cs="Times New Roman"/>
+          <w:sz w:val="28"/>
+          <w:szCs w:val="28"/>
+        </w:rPr>
+      </w:pPr>
+    </w:p>
+    <w:p>
+      <w:pPr>
+        <w:jc w:val="both"/>
+        <w:rPr>
+          <w:rFonts w:ascii="Times New Roman" w:hAnsi="Times New Roman" w:cs="Times New Roman"/>
+          <w:sz w:val="28"/>
+          <w:szCs w:val="28"/>
+        </w:rPr>
+      </w:pPr>
+      <w:r>
+        <w:rPr>
+          <w:rFonts w:ascii="Times New Roman" w:hAnsi="Times New Roman" w:cs="Times New Roman"/>
+          <w:sz w:val="28"/>
+          <w:szCs w:val="28"/>
+        </w:rPr>
+        <w:lastRenderedPageBreak/>
+        <w:t xml:space="preserve">     </w:t>
+      </w:r>
+    </w:p>
+    <w:p>
+      <w:pPr>
+        <w:jc w:val="both"/>
+        <w:rPr>
+          <w:rFonts w:ascii="Times New Roman" w:hAnsi="Times New Roman" w:cs="Times New Roman"/>
+          <w:sz w:val="28"/>
+          <w:szCs w:val="28"/>
+        </w:rPr>
+      </w:pPr>
+    </w:p>
+    <w:p>
+      <w:pPr>
+        <w:jc w:val="both"/>
+        <w:rPr>
+          <w:rFonts w:ascii="Times New Roman" w:hAnsi="Times New Roman" w:cs="Times New Roman"/>
+        </w:rPr>
+      </w:pPr>
+    </w:p>
+    <w:p>
+      <w:pPr>
+        <w:jc w:val="center"/>
+        <w:rPr>
+          <w:rFonts w:ascii="Times New Roman" w:hAnsi="Times New Roman" w:cs="Times New Roman"/>
+          <w:sz w:val="28"/>
+          <w:szCs w:val="28"/>
+        </w:rPr>
+      </w:pPr>
+    </w:p>
+    <w:p>
+      <w:pPr>
+        <w:jc w:val="center"/>
+        <w:rPr>
+          <w:rFonts w:ascii="Times New Roman" w:hAnsi="Times New Roman" w:cs="Times New Roman"/>
+          <w:sz w:val="28"/>
+          <w:szCs w:val="28"/>
+        </w:rPr>
+      </w:pPr>
+    </w:p>
+    <w:p>
+      <w:pPr>
+        <w:jc w:val="center"/>
+        <w:rPr>
+          <w:rFonts w:ascii="Times New Roman" w:hAnsi="Times New Roman" w:cs="Times New Roman"/>
+          <w:sz w:val="28"/>
+          <w:szCs w:val="28"/>
+        </w:rPr>
+      </w:pPr>
+    </w:p>
+    <w:p>
+      <w:pPr>
+        <w:jc w:val="center"/>
+        <w:rPr>
+          <w:rFonts w:ascii="Times New Roman" w:hAnsi="Times New Roman" w:cs="Times New Roman"/>
+          <w:sz w:val="28"/>
+          <w:szCs w:val="28"/>
+        </w:rPr>
+      </w:pPr>
+    </w:p>
+    <w:p>
+      <w:pPr>
+        <w:jc w:val="center"/>
+        <w:rPr>
+          <w:rFonts w:ascii="Times New Roman" w:hAnsi="Times New Roman" w:cs="Times New Roman"/>
+          <w:sz w:val="28"/>
+          <w:szCs w:val="28"/>
+        </w:rPr>
+      </w:pPr>
+    </w:p>
+    <w:p>
+      <w:pPr>
+        <w:jc w:val="center"/>
+        <w:rPr>
+          <w:rFonts w:ascii="Times New Roman" w:hAnsi="Times New Roman" w:cs="Times New Roman"/>
+          <w:sz w:val="28"/>
+          <w:szCs w:val="28"/>
+        </w:rPr>
+      </w:pPr>
+    </w:p>
+    <w:p>
+      <w:pPr>
+        <w:jc w:val="center"/>
+        <w:rPr>
+          <w:rFonts w:ascii="Times New Roman" w:hAnsi="Times New Roman" w:cs="Times New Roman"/>
+          <w:sz w:val="28"/>
+          <w:szCs w:val="28"/>
+        </w:rPr>
+      </w:pPr>
+    </w:p>
+    <w:p>
+      <w:pPr>
+        <w:jc w:val="center"/>
+        <w:rPr>
+          <w:rFonts w:ascii="Times New Roman" w:hAnsi="Times New Roman" w:cs="Times New Roman"/>
+          <w:sz w:val="28"/>
+          <w:szCs w:val="28"/>
+        </w:rPr>
+      </w:pPr>
+    </w:p>
+    <w:p>
+      <w:pPr>
+        <w:jc w:val="center"/>
+        <w:rPr>
+          <w:rFonts w:ascii="Times New Roman" w:hAnsi="Times New Roman" w:cs="Times New Roman"/>
+          <w:sz w:val="28"/>
+          <w:szCs w:val="28"/>
+        </w:rPr>
+      </w:pPr>
+    </w:p>
+    <w:p>
+      <w:pPr>
+        <w:jc w:val="center"/>
+        <w:rPr>
+          <w:rFonts w:ascii="Times New Roman" w:hAnsi="Times New Roman" w:cs="Times New Roman"/>
+          <w:sz w:val="28"/>
+          <w:szCs w:val="28"/>
+        </w:rPr>
+      </w:pPr>
+    </w:p>
+    <w:p>
+      <w:pPr>
+        <w:jc w:val="center"/>
+        <w:rPr>
+          <w:rFonts w:ascii="Times New Roman" w:hAnsi="Times New Roman" w:cs="Times New Roman"/>
+          <w:sz w:val="28"/>
+          <w:szCs w:val="28"/>
+        </w:rPr>
+      </w:pPr>
+    </w:p>
+    <w:p>
+      <w:pPr>
+        <w:jc w:val="center"/>
+        <w:rPr>
+          <w:rFonts w:ascii="Times New Roman" w:hAnsi="Times New Roman" w:cs="Times New Roman"/>
+          <w:sz w:val="28"/>
+          <w:szCs w:val="28"/>
+        </w:rPr>
+      </w:pPr>
+    </w:p>
+    <w:p>
+      <w:pPr>
+        <w:jc w:val="center"/>
+        <w:rPr>
+          <w:rFonts w:ascii="Times New Roman" w:hAnsi="Times New Roman" w:cs="Times New Roman"/>
+          <w:sz w:val="28"/>
+          <w:szCs w:val="28"/>
+        </w:rPr>
+      </w:pPr>
+    </w:p>
+    <w:p>
+      <w:pPr>
+        <w:jc w:val="center"/>
+        <w:rPr>
+          <w:rFonts w:ascii="Times New Roman" w:hAnsi="Times New Roman" w:cs="Times New Roman"/>
+          <w:sz w:val="28"/>
+          <w:szCs w:val="28"/>
+        </w:rPr>
+      </w:pPr>
+    </w:p>
+    <w:p>
+      <w:pPr>
+        <w:jc w:val="center"/>
+        <w:rPr>
+          <w:rFonts w:ascii="Times New Roman" w:hAnsi="Times New Roman" w:cs="Times New Roman"/>
+          <w:sz w:val="28"/>
+          <w:szCs w:val="28"/>
+        </w:rPr>
+      </w:pPr>
+    </w:p>
+    <w:p>
+      <w:pPr>
+        <w:jc w:val="center"/>
+        <w:rPr>
+          <w:rFonts w:ascii="Times New Roman" w:hAnsi="Times New Roman" w:cs="Times New Roman"/>
+          <w:sz w:val="28"/>
+          <w:szCs w:val="28"/>
+        </w:rPr>
+      </w:pPr>
+    </w:p>
+    <w:p>
+      <w:pPr>
+        <w:jc w:val="center"/>
+        <w:rPr>
+          <w:rFonts w:ascii="Times New Roman" w:hAnsi="Times New Roman" w:cs="Times New Roman"/>
+          <w:sz w:val="28"/>
+          <w:szCs w:val="28"/>
+        </w:rPr>
+      </w:pPr>
+    </w:p>
+    <w:p>
+      <w:pPr>
+        <w:jc w:val="center"/>
+        <w:rPr>
+          <w:rFonts w:ascii="Times New Roman" w:hAnsi="Times New Roman" w:cs="Times New Roman"/>
+          <w:sz w:val="28"/>
+          <w:szCs w:val="28"/>
+        </w:rPr>
+      </w:pPr>
+    </w:p>
+    <w:p>
+      <w:pPr>
+        <w:jc w:val="center"/>
+        <w:rPr>
+          <w:rFonts w:ascii="Times New Roman" w:hAnsi="Times New Roman" w:cs="Times New Roman"/>
+          <w:sz w:val="28"/>
+          <w:szCs w:val="28"/>
+        </w:rPr>
+      </w:pPr>
+    </w:p>
+    <w:p>
+      <w:pPr>
+        <w:jc w:val="center"/>
+        <w:rPr>
+          <w:rFonts w:ascii="Times New Roman" w:hAnsi="Times New Roman" w:cs="Times New Roman"/>
+          <w:sz w:val="28"/>
+          <w:szCs w:val="28"/>
+        </w:rPr>
+      </w:pPr>
+    </w:p>
+    <w:p>
+      <w:pPr>
+        <w:jc w:val="center"/>
+        <w:rPr>
+          <w:rFonts w:ascii="Times New Roman" w:hAnsi="Times New Roman" w:cs="Times New Roman"/>
+          <w:sz w:val="28"/>
+          <w:szCs w:val="28"/>
+        </w:rPr>
+      </w:pPr>
+    </w:p>
+    <w:p>
+      <w:pPr>
+        <w:jc w:val="center"/>
+        <w:rPr>
+          <w:rFonts w:ascii="Times New Roman" w:hAnsi="Times New Roman" w:cs="Times New Roman"/>
+          <w:b/>
+          <w:bCs/>
+          <w:sz w:val="28"/>
+          <w:szCs w:val="28"/>
+        </w:rPr>
+      </w:pPr>
+      <w:r>
+        <w:rPr>
+          <w:rFonts w:ascii="Times New Roman" w:hAnsi="Times New Roman" w:cs="Times New Roman"/>
+          <w:b/>
+          <w:bCs/>
+          <w:sz w:val="28"/>
+          <w:szCs w:val="28"/>
+        </w:rPr>
+        <w:lastRenderedPageBreak/>
         <w:t>Descripción del Problema</w:t>
       </w:r>
     </w:p>
@@ -2338,14 +2554,12 @@
         </w:rPr>
         <w:t xml:space="preserve"> de manejar toda la logística de la empresa desde aquí, controlar las unidades, los conductores y las rutas, también un historial de que reservaciones se han hecho y </w:t>
       </w:r>
-      <w:proofErr w:type="spellStart"/>
-      <w:r>
-        <w:rPr>
-          <w:rFonts w:ascii="Times New Roman" w:hAnsi="Times New Roman" w:cs="Times New Roman"/>
-        </w:rPr>
-        <w:t>cuanto</w:t>
-      </w:r>
-      <w:proofErr w:type="spellEnd"/>
+      <w:r>
+        <w:rPr>
+          <w:rFonts w:ascii="Times New Roman" w:hAnsi="Times New Roman" w:cs="Times New Roman"/>
+        </w:rPr>
+        <w:t>cuánto</w:t>
+      </w:r>
       <w:r>
         <w:rPr>
           <w:rFonts w:ascii="Times New Roman" w:hAnsi="Times New Roman" w:cs="Times New Roman"/>
@@ -2529,6 +2743,7 @@
           <w:sz w:val="28"/>
           <w:szCs w:val="28"/>
         </w:rPr>
+        <w:lastRenderedPageBreak/>
         <w:t>Diseño del progra</w:t>
       </w:r>
       <w:r>
@@ -2807,6 +3022,7 @@
           <w:sz w:val="28"/>
           <w:szCs w:val="28"/>
         </w:rPr>
+        <w:lastRenderedPageBreak/>
         <w:t>Librerías Usadas</w:t>
       </w:r>
     </w:p>
@@ -3105,6 +3321,7 @@
           <w:sz w:val="28"/>
           <w:szCs w:val="28"/>
         </w:rPr>
+        <w:lastRenderedPageBreak/>
         <w:t>Análisis de Resultados</w:t>
       </w:r>
     </w:p>
@@ -3365,6 +3582,7 @@
           <w:sz w:val="28"/>
           <w:szCs w:val="28"/>
         </w:rPr>
+        <w:lastRenderedPageBreak/>
         <w:t>Bitácora de Trabajo</w:t>
       </w:r>
     </w:p>
@@ -3917,7 +4135,6 @@
               <w:rPr>
                 <w:rFonts w:ascii="Times New Roman" w:hAnsi="Times New Roman" w:cs="Times New Roman"/>
               </w:rPr>
-              <w:lastRenderedPageBreak/>
               <w:t>(12 minutos)</w:t>
             </w:r>
           </w:p>
@@ -3950,7 +4167,6 @@
               <w:rPr>
                 <w:rFonts w:ascii="Times New Roman" w:hAnsi="Times New Roman" w:cs="Times New Roman"/>
               </w:rPr>
-              <w:lastRenderedPageBreak/>
               <w:t>Avanzar con el sistema de inicio de sesión (admin)</w:t>
             </w:r>
             <w:r>
@@ -3969,14 +4185,7 @@
               <w:rPr>
                 <w:rFonts w:ascii="Times New Roman" w:hAnsi="Times New Roman" w:cs="Times New Roman"/>
               </w:rPr>
-              <w:t xml:space="preserve">Se intento lograr que el archivo se maneje con listas, por ahora lo dejo </w:t>
-            </w:r>
-            <w:r>
-              <w:rPr>
-                <w:rFonts w:ascii="Times New Roman" w:hAnsi="Times New Roman" w:cs="Times New Roman"/>
-              </w:rPr>
-              <w:lastRenderedPageBreak/>
-              <w:t>incompleto y en un archivo separado.</w:t>
+              <w:t>Se intento lograr que el archivo se maneje con listas, por ahora lo dejo incompleto y en un archivo separado.</w:t>
             </w:r>
           </w:p>
         </w:tc>
@@ -4752,63 +4961,6 @@
           </w:p>
           <w:p>
             <w:pPr>
-              <w:jc w:val="center"/>
-              <w:rPr>
-                <w:rFonts w:ascii="Times New Roman" w:hAnsi="Times New Roman" w:cs="Times New Roman"/>
-              </w:rPr>
-            </w:pPr>
-          </w:p>
-          <w:p>
-            <w:pPr>
-              <w:jc w:val="center"/>
-              <w:rPr>
-                <w:rFonts w:ascii="Times New Roman" w:hAnsi="Times New Roman" w:cs="Times New Roman"/>
-              </w:rPr>
-            </w:pPr>
-          </w:p>
-          <w:p>
-            <w:pPr>
-              <w:jc w:val="center"/>
-              <w:rPr>
-                <w:rFonts w:ascii="Times New Roman" w:hAnsi="Times New Roman" w:cs="Times New Roman"/>
-              </w:rPr>
-            </w:pPr>
-          </w:p>
-          <w:p>
-            <w:pPr>
-              <w:jc w:val="center"/>
-              <w:rPr>
-                <w:rFonts w:ascii="Times New Roman" w:hAnsi="Times New Roman" w:cs="Times New Roman"/>
-              </w:rPr>
-            </w:pPr>
-          </w:p>
-          <w:p>
-            <w:pPr>
-              <w:jc w:val="center"/>
-              <w:rPr>
-                <w:rFonts w:ascii="Times New Roman" w:hAnsi="Times New Roman" w:cs="Times New Roman"/>
-              </w:rPr>
-            </w:pPr>
-          </w:p>
-          <w:p>
-            <w:pPr>
-              <w:jc w:val="center"/>
-              <w:rPr>
-                <w:rFonts w:ascii="Times New Roman" w:hAnsi="Times New Roman" w:cs="Times New Roman"/>
-              </w:rPr>
-            </w:pPr>
-          </w:p>
-          <w:p>
-            <w:pPr>
-              <w:jc w:val="center"/>
-              <w:rPr>
-                <w:rFonts w:ascii="Times New Roman" w:hAnsi="Times New Roman" w:cs="Times New Roman"/>
-              </w:rPr>
-            </w:pPr>
-          </w:p>
-          <w:p>
-            <w:pPr>
-              <w:jc w:val="center"/>
               <w:rPr>
                 <w:rFonts w:ascii="Times New Roman" w:hAnsi="Times New Roman" w:cs="Times New Roman"/>
               </w:rPr>
@@ -4889,7 +5041,6 @@
               <w:rPr>
                 <w:rFonts w:ascii="Times New Roman" w:hAnsi="Times New Roman" w:cs="Times New Roman"/>
               </w:rPr>
-              <w:lastRenderedPageBreak/>
               <w:t>Se crea una función que nos ayudara a detectar repeticiones en un archivo txt deseado</w:t>
             </w:r>
             <w:r>
@@ -4926,48 +5077,6 @@
               </w:rPr>
               <w:t>Se crea la función de agregar modelos, por ahora solo pide los inputs, pero valida que los modelos no se repitan.</w:t>
             </w:r>
-          </w:p>
-          <w:p>
-            <w:pPr>
-              <w:rPr>
-                <w:rFonts w:ascii="Times New Roman" w:hAnsi="Times New Roman" w:cs="Times New Roman"/>
-              </w:rPr>
-            </w:pPr>
-          </w:p>
-          <w:p>
-            <w:pPr>
-              <w:rPr>
-                <w:rFonts w:ascii="Times New Roman" w:hAnsi="Times New Roman" w:cs="Times New Roman"/>
-              </w:rPr>
-            </w:pPr>
-          </w:p>
-          <w:p>
-            <w:pPr>
-              <w:rPr>
-                <w:rFonts w:ascii="Times New Roman" w:hAnsi="Times New Roman" w:cs="Times New Roman"/>
-              </w:rPr>
-            </w:pPr>
-          </w:p>
-          <w:p>
-            <w:pPr>
-              <w:rPr>
-                <w:rFonts w:ascii="Times New Roman" w:hAnsi="Times New Roman" w:cs="Times New Roman"/>
-              </w:rPr>
-            </w:pPr>
-          </w:p>
-          <w:p>
-            <w:pPr>
-              <w:rPr>
-                <w:rFonts w:ascii="Times New Roman" w:hAnsi="Times New Roman" w:cs="Times New Roman"/>
-              </w:rPr>
-            </w:pPr>
-          </w:p>
-          <w:p>
-            <w:pPr>
-              <w:rPr>
-                <w:rFonts w:ascii="Times New Roman" w:hAnsi="Times New Roman" w:cs="Times New Roman"/>
-              </w:rPr>
-            </w:pPr>
           </w:p>
           <w:p>
             <w:pPr>
@@ -5055,30 +5164,6 @@
           </w:p>
           <w:p>
             <w:pPr>
-              <w:jc w:val="center"/>
-              <w:rPr>
-                <w:rFonts w:ascii="Times New Roman" w:hAnsi="Times New Roman" w:cs="Times New Roman"/>
-              </w:rPr>
-            </w:pPr>
-          </w:p>
-          <w:p>
-            <w:pPr>
-              <w:jc w:val="center"/>
-              <w:rPr>
-                <w:rFonts w:ascii="Times New Roman" w:hAnsi="Times New Roman" w:cs="Times New Roman"/>
-              </w:rPr>
-            </w:pPr>
-          </w:p>
-          <w:p>
-            <w:pPr>
-              <w:jc w:val="center"/>
-              <w:rPr>
-                <w:rFonts w:ascii="Times New Roman" w:hAnsi="Times New Roman" w:cs="Times New Roman"/>
-              </w:rPr>
-            </w:pPr>
-          </w:p>
-          <w:p>
-            <w:pPr>
               <w:rPr>
                 <w:rFonts w:ascii="Times New Roman" w:hAnsi="Times New Roman" w:cs="Times New Roman"/>
               </w:rPr>
@@ -5097,6 +5182,148 @@
               </w:rPr>
               <w:t>1/10/2026</w:t>
             </w:r>
+          </w:p>
+          <w:p>
+            <w:pPr>
+              <w:jc w:val="center"/>
+              <w:rPr>
+                <w:rFonts w:ascii="Times New Roman" w:hAnsi="Times New Roman" w:cs="Times New Roman"/>
+              </w:rPr>
+            </w:pPr>
+          </w:p>
+          <w:p>
+            <w:pPr>
+              <w:jc w:val="center"/>
+              <w:rPr>
+                <w:rFonts w:ascii="Times New Roman" w:hAnsi="Times New Roman" w:cs="Times New Roman"/>
+              </w:rPr>
+            </w:pPr>
+          </w:p>
+          <w:p>
+            <w:pPr>
+              <w:jc w:val="center"/>
+              <w:rPr>
+                <w:rFonts w:ascii="Times New Roman" w:hAnsi="Times New Roman" w:cs="Times New Roman"/>
+              </w:rPr>
+            </w:pPr>
+          </w:p>
+          <w:p>
+            <w:pPr>
+              <w:jc w:val="center"/>
+              <w:rPr>
+                <w:rFonts w:ascii="Times New Roman" w:hAnsi="Times New Roman" w:cs="Times New Roman"/>
+              </w:rPr>
+            </w:pPr>
+          </w:p>
+          <w:p>
+            <w:pPr>
+              <w:jc w:val="center"/>
+              <w:rPr>
+                <w:rFonts w:ascii="Times New Roman" w:hAnsi="Times New Roman" w:cs="Times New Roman"/>
+              </w:rPr>
+            </w:pPr>
+          </w:p>
+          <w:p>
+            <w:pPr>
+              <w:jc w:val="center"/>
+              <w:rPr>
+                <w:rFonts w:ascii="Times New Roman" w:hAnsi="Times New Roman" w:cs="Times New Roman"/>
+              </w:rPr>
+            </w:pPr>
+          </w:p>
+          <w:p>
+            <w:pPr>
+              <w:jc w:val="center"/>
+              <w:rPr>
+                <w:rFonts w:ascii="Times New Roman" w:hAnsi="Times New Roman" w:cs="Times New Roman"/>
+              </w:rPr>
+            </w:pPr>
+          </w:p>
+          <w:p>
+            <w:pPr>
+              <w:jc w:val="center"/>
+              <w:rPr>
+                <w:rFonts w:ascii="Times New Roman" w:hAnsi="Times New Roman" w:cs="Times New Roman"/>
+              </w:rPr>
+            </w:pPr>
+          </w:p>
+          <w:p>
+            <w:pPr>
+              <w:jc w:val="center"/>
+              <w:rPr>
+                <w:rFonts w:ascii="Times New Roman" w:hAnsi="Times New Roman" w:cs="Times New Roman"/>
+              </w:rPr>
+            </w:pPr>
+          </w:p>
+          <w:p>
+            <w:pPr>
+              <w:jc w:val="center"/>
+              <w:rPr>
+                <w:rFonts w:ascii="Times New Roman" w:hAnsi="Times New Roman" w:cs="Times New Roman"/>
+              </w:rPr>
+            </w:pPr>
+          </w:p>
+          <w:p>
+            <w:pPr>
+              <w:jc w:val="center"/>
+              <w:rPr>
+                <w:rFonts w:ascii="Times New Roman" w:hAnsi="Times New Roman" w:cs="Times New Roman"/>
+              </w:rPr>
+            </w:pPr>
+          </w:p>
+          <w:p>
+            <w:pPr>
+              <w:jc w:val="center"/>
+              <w:rPr>
+                <w:rFonts w:ascii="Times New Roman" w:hAnsi="Times New Roman" w:cs="Times New Roman"/>
+              </w:rPr>
+            </w:pPr>
+          </w:p>
+          <w:p>
+            <w:pPr>
+              <w:jc w:val="center"/>
+              <w:rPr>
+                <w:rFonts w:ascii="Times New Roman" w:hAnsi="Times New Roman" w:cs="Times New Roman"/>
+              </w:rPr>
+            </w:pPr>
+          </w:p>
+          <w:p>
+            <w:pPr>
+              <w:jc w:val="center"/>
+              <w:rPr>
+                <w:rFonts w:ascii="Times New Roman" w:hAnsi="Times New Roman" w:cs="Times New Roman"/>
+              </w:rPr>
+            </w:pPr>
+          </w:p>
+          <w:p>
+            <w:pPr>
+              <w:jc w:val="center"/>
+              <w:rPr>
+                <w:rFonts w:ascii="Times New Roman" w:hAnsi="Times New Roman" w:cs="Times New Roman"/>
+              </w:rPr>
+            </w:pPr>
+          </w:p>
+          <w:p>
+            <w:pPr>
+              <w:jc w:val="center"/>
+              <w:rPr>
+                <w:rFonts w:ascii="Times New Roman" w:hAnsi="Times New Roman" w:cs="Times New Roman"/>
+              </w:rPr>
+            </w:pPr>
+            <w:r>
+              <w:rPr>
+                <w:rFonts w:ascii="Times New Roman" w:hAnsi="Times New Roman" w:cs="Times New Roman"/>
+              </w:rPr>
+              <w:t>1/10/2026</w:t>
+            </w:r>
+          </w:p>
+          <w:p>
+            <w:pPr>
+              <w:jc w:val="center"/>
+              <w:rPr>
+                <w:rFonts w:ascii="Times New Roman" w:hAnsi="Times New Roman" w:cs="Times New Roman"/>
+              </w:rPr>
+            </w:pPr>
           </w:p>
         </w:tc>
         <w:tc>
@@ -5389,6 +5616,13 @@
           <w:tcPr>
             <w:tcW w:w="2943" w:type="dxa"/>
           </w:tcPr>
+          <w:p>
+            <w:pPr>
+              <w:rPr>
+                <w:rFonts w:ascii="Times New Roman" w:hAnsi="Times New Roman" w:cs="Times New Roman"/>
+              </w:rPr>
+            </w:pPr>
+          </w:p>
           <w:p>
             <w:pPr>
               <w:rPr>
@@ -5698,6 +5932,220 @@
               <w:t>2/10/2026</w:t>
             </w:r>
           </w:p>
+          <w:p>
+            <w:pPr>
+              <w:jc w:val="center"/>
+              <w:rPr>
+                <w:rFonts w:ascii="Times New Roman" w:hAnsi="Times New Roman" w:cs="Times New Roman"/>
+              </w:rPr>
+            </w:pPr>
+          </w:p>
+          <w:p>
+            <w:pPr>
+              <w:jc w:val="center"/>
+              <w:rPr>
+                <w:rFonts w:ascii="Times New Roman" w:hAnsi="Times New Roman" w:cs="Times New Roman"/>
+              </w:rPr>
+            </w:pPr>
+          </w:p>
+          <w:p>
+            <w:pPr>
+              <w:jc w:val="center"/>
+              <w:rPr>
+                <w:rFonts w:ascii="Times New Roman" w:hAnsi="Times New Roman" w:cs="Times New Roman"/>
+              </w:rPr>
+            </w:pPr>
+          </w:p>
+          <w:p>
+            <w:pPr>
+              <w:jc w:val="center"/>
+              <w:rPr>
+                <w:rFonts w:ascii="Times New Roman" w:hAnsi="Times New Roman" w:cs="Times New Roman"/>
+              </w:rPr>
+            </w:pPr>
+          </w:p>
+          <w:p>
+            <w:pPr>
+              <w:jc w:val="center"/>
+              <w:rPr>
+                <w:rFonts w:ascii="Times New Roman" w:hAnsi="Times New Roman" w:cs="Times New Roman"/>
+              </w:rPr>
+            </w:pPr>
+          </w:p>
+          <w:p>
+            <w:pPr>
+              <w:jc w:val="center"/>
+              <w:rPr>
+                <w:rFonts w:ascii="Times New Roman" w:hAnsi="Times New Roman" w:cs="Times New Roman"/>
+              </w:rPr>
+            </w:pPr>
+          </w:p>
+          <w:p>
+            <w:pPr>
+              <w:jc w:val="center"/>
+              <w:rPr>
+                <w:rFonts w:ascii="Times New Roman" w:hAnsi="Times New Roman" w:cs="Times New Roman"/>
+              </w:rPr>
+            </w:pPr>
+          </w:p>
+          <w:p>
+            <w:pPr>
+              <w:jc w:val="center"/>
+              <w:rPr>
+                <w:rFonts w:ascii="Times New Roman" w:hAnsi="Times New Roman" w:cs="Times New Roman"/>
+              </w:rPr>
+            </w:pPr>
+          </w:p>
+          <w:p>
+            <w:pPr>
+              <w:jc w:val="center"/>
+              <w:rPr>
+                <w:rFonts w:ascii="Times New Roman" w:hAnsi="Times New Roman" w:cs="Times New Roman"/>
+              </w:rPr>
+            </w:pPr>
+          </w:p>
+          <w:p>
+            <w:pPr>
+              <w:jc w:val="center"/>
+              <w:rPr>
+                <w:rFonts w:ascii="Times New Roman" w:hAnsi="Times New Roman" w:cs="Times New Roman"/>
+              </w:rPr>
+            </w:pPr>
+          </w:p>
+          <w:p>
+            <w:pPr>
+              <w:jc w:val="center"/>
+              <w:rPr>
+                <w:rFonts w:ascii="Times New Roman" w:hAnsi="Times New Roman" w:cs="Times New Roman"/>
+              </w:rPr>
+            </w:pPr>
+          </w:p>
+          <w:p>
+            <w:pPr>
+              <w:jc w:val="center"/>
+              <w:rPr>
+                <w:rFonts w:ascii="Times New Roman" w:hAnsi="Times New Roman" w:cs="Times New Roman"/>
+              </w:rPr>
+            </w:pPr>
+          </w:p>
+          <w:p>
+            <w:pPr>
+              <w:jc w:val="center"/>
+              <w:rPr>
+                <w:rFonts w:ascii="Times New Roman" w:hAnsi="Times New Roman" w:cs="Times New Roman"/>
+              </w:rPr>
+            </w:pPr>
+          </w:p>
+          <w:p>
+            <w:pPr>
+              <w:jc w:val="center"/>
+              <w:rPr>
+                <w:rFonts w:ascii="Times New Roman" w:hAnsi="Times New Roman" w:cs="Times New Roman"/>
+              </w:rPr>
+            </w:pPr>
+          </w:p>
+          <w:p>
+            <w:pPr>
+              <w:jc w:val="center"/>
+              <w:rPr>
+                <w:rFonts w:ascii="Times New Roman" w:hAnsi="Times New Roman" w:cs="Times New Roman"/>
+              </w:rPr>
+            </w:pPr>
+          </w:p>
+          <w:p>
+            <w:pPr>
+              <w:jc w:val="center"/>
+              <w:rPr>
+                <w:rFonts w:ascii="Times New Roman" w:hAnsi="Times New Roman" w:cs="Times New Roman"/>
+              </w:rPr>
+            </w:pPr>
+          </w:p>
+          <w:p>
+            <w:pPr>
+              <w:jc w:val="center"/>
+              <w:rPr>
+                <w:rFonts w:ascii="Times New Roman" w:hAnsi="Times New Roman" w:cs="Times New Roman"/>
+              </w:rPr>
+            </w:pPr>
+          </w:p>
+          <w:p>
+            <w:pPr>
+              <w:jc w:val="center"/>
+              <w:rPr>
+                <w:rFonts w:ascii="Times New Roman" w:hAnsi="Times New Roman" w:cs="Times New Roman"/>
+              </w:rPr>
+            </w:pPr>
+          </w:p>
+          <w:p>
+            <w:pPr>
+              <w:jc w:val="center"/>
+              <w:rPr>
+                <w:rFonts w:ascii="Times New Roman" w:hAnsi="Times New Roman" w:cs="Times New Roman"/>
+              </w:rPr>
+            </w:pPr>
+          </w:p>
+          <w:p>
+            <w:pPr>
+              <w:jc w:val="center"/>
+              <w:rPr>
+                <w:rFonts w:ascii="Times New Roman" w:hAnsi="Times New Roman" w:cs="Times New Roman"/>
+              </w:rPr>
+            </w:pPr>
+          </w:p>
+          <w:p>
+            <w:pPr>
+              <w:jc w:val="center"/>
+              <w:rPr>
+                <w:rFonts w:ascii="Times New Roman" w:hAnsi="Times New Roman" w:cs="Times New Roman"/>
+              </w:rPr>
+            </w:pPr>
+          </w:p>
+          <w:p>
+            <w:pPr>
+              <w:jc w:val="center"/>
+              <w:rPr>
+                <w:rFonts w:ascii="Times New Roman" w:hAnsi="Times New Roman" w:cs="Times New Roman"/>
+              </w:rPr>
+            </w:pPr>
+          </w:p>
+          <w:p>
+            <w:pPr>
+              <w:jc w:val="center"/>
+              <w:rPr>
+                <w:rFonts w:ascii="Times New Roman" w:hAnsi="Times New Roman" w:cs="Times New Roman"/>
+              </w:rPr>
+            </w:pPr>
+          </w:p>
+          <w:p>
+            <w:pPr>
+              <w:jc w:val="center"/>
+              <w:rPr>
+                <w:rFonts w:ascii="Times New Roman" w:hAnsi="Times New Roman" w:cs="Times New Roman"/>
+              </w:rPr>
+            </w:pPr>
+          </w:p>
+          <w:p>
+            <w:pPr>
+              <w:jc w:val="center"/>
+              <w:rPr>
+                <w:rFonts w:ascii="Times New Roman" w:hAnsi="Times New Roman" w:cs="Times New Roman"/>
+              </w:rPr>
+            </w:pPr>
+          </w:p>
+          <w:p>
+            <w:pPr>
+              <w:jc w:val="center"/>
+              <w:rPr>
+                <w:rFonts w:ascii="Times New Roman" w:hAnsi="Times New Roman" w:cs="Times New Roman"/>
+              </w:rPr>
+            </w:pPr>
+            <w:r>
+              <w:rPr>
+                <w:rFonts w:ascii="Times New Roman" w:hAnsi="Times New Roman" w:cs="Times New Roman"/>
+              </w:rPr>
+              <w:t>2/10/2026</w:t>
+            </w:r>
+          </w:p>
         </w:tc>
         <w:tc>
           <w:tcPr>
@@ -5932,6 +6380,24 @@
               <w:jc w:val="center"/>
               <w:rPr>
                 <w:rFonts w:ascii="Times New Roman" w:hAnsi="Times New Roman" w:cs="Times New Roman"/>
+                <w:lang w:val="en-US"/>
+              </w:rPr>
+            </w:pPr>
+          </w:p>
+          <w:p>
+            <w:pPr>
+              <w:jc w:val="center"/>
+              <w:rPr>
+                <w:rFonts w:ascii="Times New Roman" w:hAnsi="Times New Roman" w:cs="Times New Roman"/>
+                <w:lang w:val="en-US"/>
+              </w:rPr>
+            </w:pPr>
+          </w:p>
+          <w:p>
+            <w:pPr>
+              <w:jc w:val="center"/>
+              <w:rPr>
+                <w:rFonts w:ascii="Times New Roman" w:hAnsi="Times New Roman" w:cs="Times New Roman"/>
               </w:rPr>
             </w:pPr>
             <w:r>
@@ -6076,6 +6542,54 @@
                 <w:rFonts w:ascii="Times New Roman" w:hAnsi="Times New Roman" w:cs="Times New Roman"/>
               </w:rPr>
             </w:pPr>
+          </w:p>
+          <w:p>
+            <w:pPr>
+              <w:jc w:val="center"/>
+              <w:rPr>
+                <w:rFonts w:ascii="Times New Roman" w:hAnsi="Times New Roman" w:cs="Times New Roman"/>
+              </w:rPr>
+            </w:pPr>
+          </w:p>
+          <w:p>
+            <w:pPr>
+              <w:jc w:val="center"/>
+              <w:rPr>
+                <w:rFonts w:ascii="Times New Roman" w:hAnsi="Times New Roman" w:cs="Times New Roman"/>
+              </w:rPr>
+            </w:pPr>
+          </w:p>
+          <w:p>
+            <w:pPr>
+              <w:jc w:val="center"/>
+              <w:rPr>
+                <w:rFonts w:ascii="Times New Roman" w:hAnsi="Times New Roman" w:cs="Times New Roman"/>
+              </w:rPr>
+            </w:pPr>
+          </w:p>
+          <w:p>
+            <w:pPr>
+              <w:jc w:val="center"/>
+              <w:rPr>
+                <w:rFonts w:ascii="Times New Roman" w:hAnsi="Times New Roman" w:cs="Times New Roman"/>
+              </w:rPr>
+            </w:pPr>
+          </w:p>
+          <w:p>
+            <w:pPr>
+              <w:jc w:val="center"/>
+              <w:rPr>
+                <w:rFonts w:ascii="Times New Roman" w:hAnsi="Times New Roman" w:cs="Times New Roman"/>
+              </w:rPr>
+            </w:pPr>
+          </w:p>
+          <w:p>
+            <w:pPr>
+              <w:jc w:val="center"/>
+              <w:rPr>
+                <w:rFonts w:ascii="Times New Roman" w:hAnsi="Times New Roman" w:cs="Times New Roman"/>
+              </w:rPr>
+            </w:pPr>
             <w:r>
               <w:rPr>
                 <w:rFonts w:ascii="Times New Roman" w:hAnsi="Times New Roman" w:cs="Times New Roman"/>
@@ -6118,6 +6632,132 @@
               </w:rPr>
               <w:t>)</w:t>
             </w:r>
+          </w:p>
+          <w:p>
+            <w:pPr>
+              <w:jc w:val="center"/>
+              <w:rPr>
+                <w:rFonts w:ascii="Times New Roman" w:hAnsi="Times New Roman" w:cs="Times New Roman"/>
+                <w:lang w:val="en-US"/>
+              </w:rPr>
+            </w:pPr>
+          </w:p>
+          <w:p>
+            <w:pPr>
+              <w:jc w:val="center"/>
+              <w:rPr>
+                <w:rFonts w:ascii="Times New Roman" w:hAnsi="Times New Roman" w:cs="Times New Roman"/>
+                <w:lang w:val="en-US"/>
+              </w:rPr>
+            </w:pPr>
+          </w:p>
+          <w:p>
+            <w:pPr>
+              <w:jc w:val="center"/>
+              <w:rPr>
+                <w:rFonts w:ascii="Times New Roman" w:hAnsi="Times New Roman" w:cs="Times New Roman"/>
+                <w:lang w:val="en-US"/>
+              </w:rPr>
+            </w:pPr>
+          </w:p>
+          <w:p>
+            <w:pPr>
+              <w:jc w:val="center"/>
+              <w:rPr>
+                <w:rFonts w:ascii="Times New Roman" w:hAnsi="Times New Roman" w:cs="Times New Roman"/>
+                <w:lang w:val="en-US"/>
+              </w:rPr>
+            </w:pPr>
+          </w:p>
+          <w:p>
+            <w:pPr>
+              <w:jc w:val="center"/>
+              <w:rPr>
+                <w:rFonts w:ascii="Times New Roman" w:hAnsi="Times New Roman" w:cs="Times New Roman"/>
+                <w:lang w:val="en-US"/>
+              </w:rPr>
+            </w:pPr>
+          </w:p>
+          <w:p>
+            <w:pPr>
+              <w:rPr>
+                <w:rFonts w:ascii="Times New Roman" w:hAnsi="Times New Roman" w:cs="Times New Roman"/>
+                <w:lang w:val="en-US"/>
+              </w:rPr>
+            </w:pPr>
+          </w:p>
+          <w:p>
+            <w:pPr>
+              <w:jc w:val="center"/>
+              <w:rPr>
+                <w:rFonts w:ascii="Times New Roman" w:hAnsi="Times New Roman" w:cs="Times New Roman"/>
+              </w:rPr>
+            </w:pPr>
+            <w:r>
+              <w:rPr>
+                <w:rFonts w:ascii="Times New Roman" w:hAnsi="Times New Roman" w:cs="Times New Roman"/>
+              </w:rPr>
+              <w:t>9:00pm – 10:07pm</w:t>
+            </w:r>
+          </w:p>
+          <w:p>
+            <w:pPr>
+              <w:jc w:val="center"/>
+              <w:rPr>
+                <w:rFonts w:ascii="Times New Roman" w:hAnsi="Times New Roman" w:cs="Times New Roman"/>
+              </w:rPr>
+            </w:pPr>
+            <w:r>
+              <w:rPr>
+                <w:rFonts w:ascii="Times New Roman" w:hAnsi="Times New Roman" w:cs="Times New Roman"/>
+              </w:rPr>
+              <w:t>(1 hora, 7 minutos)</w:t>
+            </w:r>
+          </w:p>
+          <w:p>
+            <w:pPr>
+              <w:jc w:val="center"/>
+              <w:rPr>
+                <w:rFonts w:ascii="Times New Roman" w:hAnsi="Times New Roman" w:cs="Times New Roman"/>
+                <w:lang w:val="en-US"/>
+              </w:rPr>
+            </w:pPr>
+          </w:p>
+          <w:p>
+            <w:pPr>
+              <w:jc w:val="center"/>
+              <w:rPr>
+                <w:rFonts w:ascii="Times New Roman" w:hAnsi="Times New Roman" w:cs="Times New Roman"/>
+                <w:lang w:val="en-US"/>
+              </w:rPr>
+            </w:pPr>
+          </w:p>
+          <w:p>
+            <w:pPr>
+              <w:jc w:val="center"/>
+              <w:rPr>
+                <w:rFonts w:ascii="Times New Roman" w:hAnsi="Times New Roman" w:cs="Times New Roman"/>
+                <w:lang w:val="en-US"/>
+              </w:rPr>
+            </w:pPr>
+          </w:p>
+          <w:p>
+            <w:pPr>
+              <w:jc w:val="center"/>
+              <w:rPr>
+                <w:rFonts w:ascii="Times New Roman" w:hAnsi="Times New Roman" w:cs="Times New Roman"/>
+                <w:lang w:val="en-US"/>
+              </w:rPr>
+            </w:pPr>
+          </w:p>
+          <w:p>
+            <w:pPr>
+              <w:jc w:val="center"/>
+              <w:rPr>
+                <w:rFonts w:ascii="Times New Roman" w:hAnsi="Times New Roman" w:cs="Times New Roman"/>
+                <w:lang w:val="en-US"/>
+              </w:rPr>
+            </w:pPr>
           </w:p>
         </w:tc>
         <w:tc>
@@ -6270,6 +6910,48 @@
                 <w:rFonts w:ascii="Times New Roman" w:hAnsi="Times New Roman" w:cs="Times New Roman"/>
               </w:rPr>
             </w:pPr>
+          </w:p>
+          <w:p>
+            <w:pPr>
+              <w:rPr>
+                <w:rFonts w:ascii="Times New Roman" w:hAnsi="Times New Roman" w:cs="Times New Roman"/>
+              </w:rPr>
+            </w:pPr>
+          </w:p>
+          <w:p>
+            <w:pPr>
+              <w:rPr>
+                <w:rFonts w:ascii="Times New Roman" w:hAnsi="Times New Roman" w:cs="Times New Roman"/>
+              </w:rPr>
+            </w:pPr>
+          </w:p>
+          <w:p>
+            <w:pPr>
+              <w:rPr>
+                <w:rFonts w:ascii="Times New Roman" w:hAnsi="Times New Roman" w:cs="Times New Roman"/>
+              </w:rPr>
+            </w:pPr>
+          </w:p>
+          <w:p>
+            <w:pPr>
+              <w:rPr>
+                <w:rFonts w:ascii="Times New Roman" w:hAnsi="Times New Roman" w:cs="Times New Roman"/>
+              </w:rPr>
+            </w:pPr>
+          </w:p>
+          <w:p>
+            <w:pPr>
+              <w:rPr>
+                <w:rFonts w:ascii="Times New Roman" w:hAnsi="Times New Roman" w:cs="Times New Roman"/>
+              </w:rPr>
+            </w:pPr>
+          </w:p>
+          <w:p>
+            <w:pPr>
+              <w:rPr>
+                <w:rFonts w:ascii="Times New Roman" w:hAnsi="Times New Roman" w:cs="Times New Roman"/>
+              </w:rPr>
+            </w:pPr>
             <w:r>
               <w:rPr>
                 <w:rFonts w:ascii="Times New Roman" w:hAnsi="Times New Roman" w:cs="Times New Roman"/>
@@ -6326,6 +7008,19 @@
                 <w:rFonts w:ascii="Times New Roman" w:hAnsi="Times New Roman" w:cs="Times New Roman"/>
               </w:rPr>
             </w:pPr>
+          </w:p>
+          <w:p>
+            <w:pPr>
+              <w:rPr>
+                <w:rFonts w:ascii="Times New Roman" w:hAnsi="Times New Roman" w:cs="Times New Roman"/>
+              </w:rPr>
+            </w:pPr>
+            <w:r>
+              <w:rPr>
+                <w:rFonts w:ascii="Times New Roman" w:hAnsi="Times New Roman" w:cs="Times New Roman"/>
+              </w:rPr>
+              <w:t>Se crean todas las funciones de la gestión de conductores, incluir, eliminar, modificar y mostrar conductores. Se enlazan al menú principal para que sea posible usarlas de manera eficaz. No tienen sus validaciones completas.</w:t>
+            </w:r>
           </w:p>
           <w:p>
             <w:pPr>
@@ -6360,64 +7055,273 @@
           </w:tcPr>
           <w:p>
             <w:pPr>
-              <w:jc w:val="center"/>
-              <w:rPr>
-                <w:rFonts w:ascii="Times New Roman" w:hAnsi="Times New Roman" w:cs="Times New Roman"/>
-              </w:rPr>
-            </w:pPr>
-          </w:p>
-          <w:p>
-            <w:pPr>
-              <w:jc w:val="center"/>
-              <w:rPr>
-                <w:rFonts w:ascii="Times New Roman" w:hAnsi="Times New Roman" w:cs="Times New Roman"/>
-              </w:rPr>
-            </w:pPr>
-          </w:p>
-          <w:p>
-            <w:pPr>
-              <w:jc w:val="center"/>
-              <w:rPr>
-                <w:rFonts w:ascii="Times New Roman" w:hAnsi="Times New Roman" w:cs="Times New Roman"/>
-              </w:rPr>
-            </w:pPr>
-          </w:p>
-          <w:p>
-            <w:pPr>
-              <w:jc w:val="center"/>
-              <w:rPr>
-                <w:rFonts w:ascii="Times New Roman" w:hAnsi="Times New Roman" w:cs="Times New Roman"/>
-              </w:rPr>
-            </w:pPr>
-          </w:p>
-          <w:p>
-            <w:pPr>
-              <w:jc w:val="center"/>
-              <w:rPr>
-                <w:rFonts w:ascii="Times New Roman" w:hAnsi="Times New Roman" w:cs="Times New Roman"/>
-              </w:rPr>
-            </w:pPr>
-          </w:p>
-          <w:p>
-            <w:pPr>
-              <w:jc w:val="center"/>
-              <w:rPr>
-                <w:rFonts w:ascii="Times New Roman" w:hAnsi="Times New Roman" w:cs="Times New Roman"/>
-              </w:rPr>
-            </w:pPr>
-          </w:p>
-          <w:p>
-            <w:pPr>
-              <w:jc w:val="center"/>
-              <w:rPr>
-                <w:rFonts w:ascii="Times New Roman" w:hAnsi="Times New Roman" w:cs="Times New Roman"/>
-              </w:rPr>
-            </w:pPr>
-            <w:r>
-              <w:rPr>
-                <w:rFonts w:ascii="Times New Roman" w:hAnsi="Times New Roman" w:cs="Times New Roman"/>
-              </w:rPr>
-              <w:t>2/10/2026</w:t>
+              <w:rPr>
+                <w:rFonts w:ascii="Times New Roman" w:hAnsi="Times New Roman" w:cs="Times New Roman"/>
+              </w:rPr>
+            </w:pPr>
+          </w:p>
+          <w:p>
+            <w:pPr>
+              <w:rPr>
+                <w:rFonts w:ascii="Times New Roman" w:hAnsi="Times New Roman" w:cs="Times New Roman"/>
+              </w:rPr>
+            </w:pPr>
+          </w:p>
+          <w:p>
+            <w:pPr>
+              <w:rPr>
+                <w:rFonts w:ascii="Times New Roman" w:hAnsi="Times New Roman" w:cs="Times New Roman"/>
+              </w:rPr>
+            </w:pPr>
+          </w:p>
+          <w:p>
+            <w:pPr>
+              <w:rPr>
+                <w:rFonts w:ascii="Times New Roman" w:hAnsi="Times New Roman" w:cs="Times New Roman"/>
+              </w:rPr>
+            </w:pPr>
+          </w:p>
+          <w:p>
+            <w:pPr>
+              <w:rPr>
+                <w:rFonts w:ascii="Times New Roman" w:hAnsi="Times New Roman" w:cs="Times New Roman"/>
+              </w:rPr>
+            </w:pPr>
+          </w:p>
+          <w:p>
+            <w:pPr>
+              <w:jc w:val="center"/>
+              <w:rPr>
+                <w:rFonts w:ascii="Times New Roman" w:hAnsi="Times New Roman" w:cs="Times New Roman"/>
+              </w:rPr>
+            </w:pPr>
+          </w:p>
+          <w:p>
+            <w:pPr>
+              <w:jc w:val="center"/>
+              <w:rPr>
+                <w:rFonts w:ascii="Times New Roman" w:hAnsi="Times New Roman" w:cs="Times New Roman"/>
+              </w:rPr>
+            </w:pPr>
+          </w:p>
+          <w:p>
+            <w:pPr>
+              <w:jc w:val="center"/>
+              <w:rPr>
+                <w:rFonts w:ascii="Times New Roman" w:hAnsi="Times New Roman" w:cs="Times New Roman"/>
+              </w:rPr>
+            </w:pPr>
+          </w:p>
+          <w:p>
+            <w:pPr>
+              <w:jc w:val="center"/>
+              <w:rPr>
+                <w:rFonts w:ascii="Times New Roman" w:hAnsi="Times New Roman" w:cs="Times New Roman"/>
+              </w:rPr>
+            </w:pPr>
+          </w:p>
+          <w:p>
+            <w:pPr>
+              <w:jc w:val="center"/>
+              <w:rPr>
+                <w:rFonts w:ascii="Times New Roman" w:hAnsi="Times New Roman" w:cs="Times New Roman"/>
+              </w:rPr>
+            </w:pPr>
+          </w:p>
+          <w:p>
+            <w:pPr>
+              <w:jc w:val="center"/>
+              <w:rPr>
+                <w:rFonts w:ascii="Times New Roman" w:hAnsi="Times New Roman" w:cs="Times New Roman"/>
+              </w:rPr>
+            </w:pPr>
+          </w:p>
+          <w:p>
+            <w:pPr>
+              <w:jc w:val="center"/>
+              <w:rPr>
+                <w:rFonts w:ascii="Times New Roman" w:hAnsi="Times New Roman" w:cs="Times New Roman"/>
+              </w:rPr>
+            </w:pPr>
+          </w:p>
+          <w:p>
+            <w:pPr>
+              <w:jc w:val="center"/>
+              <w:rPr>
+                <w:rFonts w:ascii="Times New Roman" w:hAnsi="Times New Roman" w:cs="Times New Roman"/>
+              </w:rPr>
+            </w:pPr>
+          </w:p>
+          <w:p>
+            <w:pPr>
+              <w:jc w:val="center"/>
+              <w:rPr>
+                <w:rFonts w:ascii="Times New Roman" w:hAnsi="Times New Roman" w:cs="Times New Roman"/>
+              </w:rPr>
+            </w:pPr>
+          </w:p>
+          <w:p>
+            <w:pPr>
+              <w:jc w:val="center"/>
+              <w:rPr>
+                <w:rFonts w:ascii="Times New Roman" w:hAnsi="Times New Roman" w:cs="Times New Roman"/>
+              </w:rPr>
+            </w:pPr>
+          </w:p>
+          <w:p>
+            <w:pPr>
+              <w:jc w:val="center"/>
+              <w:rPr>
+                <w:rFonts w:ascii="Times New Roman" w:hAnsi="Times New Roman" w:cs="Times New Roman"/>
+              </w:rPr>
+            </w:pPr>
+            <w:r>
+              <w:rPr>
+                <w:rFonts w:ascii="Times New Roman" w:hAnsi="Times New Roman" w:cs="Times New Roman"/>
+              </w:rPr>
+              <w:t>3/10/2026</w:t>
+            </w:r>
+          </w:p>
+          <w:p>
+            <w:pPr>
+              <w:jc w:val="center"/>
+              <w:rPr>
+                <w:rFonts w:ascii="Times New Roman" w:hAnsi="Times New Roman" w:cs="Times New Roman"/>
+              </w:rPr>
+            </w:pPr>
+          </w:p>
+          <w:p>
+            <w:pPr>
+              <w:jc w:val="center"/>
+              <w:rPr>
+                <w:rFonts w:ascii="Times New Roman" w:hAnsi="Times New Roman" w:cs="Times New Roman"/>
+              </w:rPr>
+            </w:pPr>
+          </w:p>
+          <w:p>
+            <w:pPr>
+              <w:jc w:val="center"/>
+              <w:rPr>
+                <w:rFonts w:ascii="Times New Roman" w:hAnsi="Times New Roman" w:cs="Times New Roman"/>
+              </w:rPr>
+            </w:pPr>
+          </w:p>
+          <w:p>
+            <w:pPr>
+              <w:jc w:val="center"/>
+              <w:rPr>
+                <w:rFonts w:ascii="Times New Roman" w:hAnsi="Times New Roman" w:cs="Times New Roman"/>
+              </w:rPr>
+            </w:pPr>
+          </w:p>
+          <w:p>
+            <w:pPr>
+              <w:jc w:val="center"/>
+              <w:rPr>
+                <w:rFonts w:ascii="Times New Roman" w:hAnsi="Times New Roman" w:cs="Times New Roman"/>
+              </w:rPr>
+            </w:pPr>
+          </w:p>
+          <w:p>
+            <w:pPr>
+              <w:jc w:val="center"/>
+              <w:rPr>
+                <w:rFonts w:ascii="Times New Roman" w:hAnsi="Times New Roman" w:cs="Times New Roman"/>
+              </w:rPr>
+            </w:pPr>
+          </w:p>
+          <w:p>
+            <w:pPr>
+              <w:jc w:val="center"/>
+              <w:rPr>
+                <w:rFonts w:ascii="Times New Roman" w:hAnsi="Times New Roman" w:cs="Times New Roman"/>
+              </w:rPr>
+            </w:pPr>
+          </w:p>
+          <w:p>
+            <w:pPr>
+              <w:jc w:val="center"/>
+              <w:rPr>
+                <w:rFonts w:ascii="Times New Roman" w:hAnsi="Times New Roman" w:cs="Times New Roman"/>
+              </w:rPr>
+            </w:pPr>
+          </w:p>
+          <w:p>
+            <w:pPr>
+              <w:jc w:val="center"/>
+              <w:rPr>
+                <w:rFonts w:ascii="Times New Roman" w:hAnsi="Times New Roman" w:cs="Times New Roman"/>
+              </w:rPr>
+            </w:pPr>
+          </w:p>
+          <w:p>
+            <w:pPr>
+              <w:jc w:val="center"/>
+              <w:rPr>
+                <w:rFonts w:ascii="Times New Roman" w:hAnsi="Times New Roman" w:cs="Times New Roman"/>
+              </w:rPr>
+            </w:pPr>
+          </w:p>
+          <w:p>
+            <w:pPr>
+              <w:jc w:val="center"/>
+              <w:rPr>
+                <w:rFonts w:ascii="Times New Roman" w:hAnsi="Times New Roman" w:cs="Times New Roman"/>
+              </w:rPr>
+            </w:pPr>
+          </w:p>
+          <w:p>
+            <w:pPr>
+              <w:jc w:val="center"/>
+              <w:rPr>
+                <w:rFonts w:ascii="Times New Roman" w:hAnsi="Times New Roman" w:cs="Times New Roman"/>
+              </w:rPr>
+            </w:pPr>
+          </w:p>
+          <w:p>
+            <w:pPr>
+              <w:jc w:val="center"/>
+              <w:rPr>
+                <w:rFonts w:ascii="Times New Roman" w:hAnsi="Times New Roman" w:cs="Times New Roman"/>
+              </w:rPr>
+            </w:pPr>
+          </w:p>
+          <w:p>
+            <w:pPr>
+              <w:jc w:val="center"/>
+              <w:rPr>
+                <w:rFonts w:ascii="Times New Roman" w:hAnsi="Times New Roman" w:cs="Times New Roman"/>
+              </w:rPr>
+            </w:pPr>
+          </w:p>
+          <w:p>
+            <w:pPr>
+              <w:jc w:val="center"/>
+              <w:rPr>
+                <w:rFonts w:ascii="Times New Roman" w:hAnsi="Times New Roman" w:cs="Times New Roman"/>
+              </w:rPr>
+            </w:pPr>
+          </w:p>
+          <w:p>
+            <w:pPr>
+              <w:jc w:val="center"/>
+              <w:rPr>
+                <w:rFonts w:ascii="Times New Roman" w:hAnsi="Times New Roman" w:cs="Times New Roman"/>
+              </w:rPr>
+            </w:pPr>
+          </w:p>
+          <w:p>
+            <w:pPr>
+              <w:jc w:val="center"/>
+              <w:rPr>
+                <w:rFonts w:ascii="Times New Roman" w:hAnsi="Times New Roman" w:cs="Times New Roman"/>
+              </w:rPr>
+            </w:pPr>
+            <w:r>
+              <w:rPr>
+                <w:rFonts w:ascii="Times New Roman" w:hAnsi="Times New Roman" w:cs="Times New Roman"/>
+              </w:rPr>
+              <w:t>3/10/2026</w:t>
             </w:r>
           </w:p>
         </w:tc>
@@ -6427,56 +7331,62 @@
           </w:tcPr>
           <w:p>
             <w:pPr>
-              <w:jc w:val="center"/>
-              <w:rPr>
-                <w:rFonts w:ascii="Times New Roman" w:hAnsi="Times New Roman" w:cs="Times New Roman"/>
-              </w:rPr>
-            </w:pPr>
-          </w:p>
-          <w:p>
-            <w:pPr>
-              <w:jc w:val="center"/>
-              <w:rPr>
-                <w:rFonts w:ascii="Times New Roman" w:hAnsi="Times New Roman" w:cs="Times New Roman"/>
-              </w:rPr>
-            </w:pPr>
-          </w:p>
-          <w:p>
-            <w:pPr>
-              <w:jc w:val="center"/>
-              <w:rPr>
-                <w:rFonts w:ascii="Times New Roman" w:hAnsi="Times New Roman" w:cs="Times New Roman"/>
-              </w:rPr>
-            </w:pPr>
-          </w:p>
-          <w:p>
-            <w:pPr>
-              <w:jc w:val="center"/>
-              <w:rPr>
-                <w:rFonts w:ascii="Times New Roman" w:hAnsi="Times New Roman" w:cs="Times New Roman"/>
-              </w:rPr>
-            </w:pPr>
-          </w:p>
-          <w:p>
-            <w:pPr>
-              <w:jc w:val="center"/>
-              <w:rPr>
-                <w:rFonts w:ascii="Times New Roman" w:hAnsi="Times New Roman" w:cs="Times New Roman"/>
-              </w:rPr>
-            </w:pPr>
-          </w:p>
-          <w:p>
-            <w:pPr>
-              <w:jc w:val="center"/>
-              <w:rPr>
-                <w:rFonts w:ascii="Times New Roman" w:hAnsi="Times New Roman" w:cs="Times New Roman"/>
-              </w:rPr>
-            </w:pPr>
-            <w:r>
-              <w:rPr>
-                <w:rFonts w:ascii="Times New Roman" w:hAnsi="Times New Roman" w:cs="Times New Roman"/>
-              </w:rPr>
-              <w:t xml:space="preserve">9:00pm </w:t>
+              <w:rPr>
+                <w:rFonts w:ascii="Times New Roman" w:hAnsi="Times New Roman" w:cs="Times New Roman"/>
+              </w:rPr>
+            </w:pPr>
+          </w:p>
+          <w:p>
+            <w:pPr>
+              <w:rPr>
+                <w:rFonts w:ascii="Times New Roman" w:hAnsi="Times New Roman" w:cs="Times New Roman"/>
+              </w:rPr>
+            </w:pPr>
+          </w:p>
+          <w:p>
+            <w:pPr>
+              <w:jc w:val="center"/>
+              <w:rPr>
+                <w:rFonts w:ascii="Times New Roman" w:hAnsi="Times New Roman" w:cs="Times New Roman"/>
+              </w:rPr>
+            </w:pPr>
+          </w:p>
+          <w:p>
+            <w:pPr>
+              <w:jc w:val="center"/>
+              <w:rPr>
+                <w:rFonts w:ascii="Times New Roman" w:hAnsi="Times New Roman" w:cs="Times New Roman"/>
+              </w:rPr>
+            </w:pPr>
+          </w:p>
+          <w:p>
+            <w:pPr>
+              <w:jc w:val="center"/>
+              <w:rPr>
+                <w:rFonts w:ascii="Times New Roman" w:hAnsi="Times New Roman" w:cs="Times New Roman"/>
+              </w:rPr>
+            </w:pPr>
+          </w:p>
+          <w:p>
+            <w:pPr>
+              <w:jc w:val="center"/>
+              <w:rPr>
+                <w:rFonts w:ascii="Times New Roman" w:hAnsi="Times New Roman" w:cs="Times New Roman"/>
+              </w:rPr>
+            </w:pPr>
+          </w:p>
+          <w:p>
+            <w:pPr>
+              <w:jc w:val="center"/>
+              <w:rPr>
+                <w:rFonts w:ascii="Times New Roman" w:hAnsi="Times New Roman" w:cs="Times New Roman"/>
+              </w:rPr>
+            </w:pPr>
+            <w:r>
+              <w:rPr>
+                <w:rFonts w:ascii="Times New Roman" w:hAnsi="Times New Roman" w:cs="Times New Roman"/>
+              </w:rPr>
+              <w:t xml:space="preserve">2:33pm </w:t>
             </w:r>
             <w:r>
               <w:rPr>
@@ -6494,22 +7404,366 @@
               <w:rPr>
                 <w:rFonts w:ascii="Times New Roman" w:hAnsi="Times New Roman" w:cs="Times New Roman"/>
               </w:rPr>
-              <w:t>10:07pm</w:t>
-            </w:r>
-          </w:p>
-          <w:p>
-            <w:pPr>
-              <w:jc w:val="center"/>
-              <w:rPr>
-                <w:rFonts w:ascii="Times New Roman" w:hAnsi="Times New Roman" w:cs="Times New Roman"/>
-              </w:rPr>
-            </w:pPr>
-            <w:r>
-              <w:rPr>
-                <w:rFonts w:ascii="Times New Roman" w:hAnsi="Times New Roman" w:cs="Times New Roman"/>
-              </w:rPr>
-              <w:t>(1 hora, 7 minutos)</w:t>
-            </w:r>
+              <w:t>3:06pm</w:t>
+            </w:r>
+          </w:p>
+          <w:p>
+            <w:pPr>
+              <w:jc w:val="center"/>
+              <w:rPr>
+                <w:rFonts w:ascii="Times New Roman" w:hAnsi="Times New Roman" w:cs="Times New Roman"/>
+              </w:rPr>
+            </w:pPr>
+            <w:r>
+              <w:rPr>
+                <w:rFonts w:ascii="Times New Roman" w:hAnsi="Times New Roman" w:cs="Times New Roman"/>
+              </w:rPr>
+              <w:t>(36 minutos)</w:t>
+            </w:r>
+            <w:r>
+              <w:rPr>
+                <w:rFonts w:ascii="Times New Roman" w:hAnsi="Times New Roman" w:cs="Times New Roman"/>
+              </w:rPr>
+              <w:br/>
+            </w:r>
+          </w:p>
+          <w:p>
+            <w:pPr>
+              <w:jc w:val="center"/>
+              <w:rPr>
+                <w:rFonts w:ascii="Times New Roman" w:hAnsi="Times New Roman" w:cs="Times New Roman"/>
+              </w:rPr>
+            </w:pPr>
+          </w:p>
+          <w:p>
+            <w:pPr>
+              <w:jc w:val="center"/>
+              <w:rPr>
+                <w:rFonts w:ascii="Times New Roman" w:hAnsi="Times New Roman" w:cs="Times New Roman"/>
+              </w:rPr>
+            </w:pPr>
+          </w:p>
+          <w:p>
+            <w:pPr>
+              <w:jc w:val="center"/>
+              <w:rPr>
+                <w:rFonts w:ascii="Times New Roman" w:hAnsi="Times New Roman" w:cs="Times New Roman"/>
+              </w:rPr>
+            </w:pPr>
+          </w:p>
+          <w:p>
+            <w:pPr>
+              <w:jc w:val="center"/>
+              <w:rPr>
+                <w:rFonts w:ascii="Times New Roman" w:hAnsi="Times New Roman" w:cs="Times New Roman"/>
+              </w:rPr>
+            </w:pPr>
+          </w:p>
+          <w:p>
+            <w:pPr>
+              <w:jc w:val="center"/>
+              <w:rPr>
+                <w:rFonts w:ascii="Times New Roman" w:hAnsi="Times New Roman" w:cs="Times New Roman"/>
+              </w:rPr>
+            </w:pPr>
+          </w:p>
+          <w:p>
+            <w:pPr>
+              <w:jc w:val="center"/>
+              <w:rPr>
+                <w:rFonts w:ascii="Times New Roman" w:hAnsi="Times New Roman" w:cs="Times New Roman"/>
+              </w:rPr>
+            </w:pPr>
+          </w:p>
+          <w:p>
+            <w:pPr>
+              <w:jc w:val="center"/>
+              <w:rPr>
+                <w:rFonts w:ascii="Times New Roman" w:hAnsi="Times New Roman" w:cs="Times New Roman"/>
+              </w:rPr>
+            </w:pPr>
+            <w:r>
+              <w:rPr>
+                <w:rFonts w:ascii="Times New Roman" w:hAnsi="Times New Roman" w:cs="Times New Roman"/>
+              </w:rPr>
+              <w:t xml:space="preserve">6:35pm </w:t>
+            </w:r>
+            <w:r>
+              <w:rPr>
+                <w:rFonts w:ascii="Times New Roman" w:hAnsi="Times New Roman" w:cs="Times New Roman"/>
+              </w:rPr>
+              <w:t>–</w:t>
+            </w:r>
+            <w:r>
+              <w:rPr>
+                <w:rFonts w:ascii="Times New Roman" w:hAnsi="Times New Roman" w:cs="Times New Roman"/>
+              </w:rPr>
+              <w:t xml:space="preserve"> </w:t>
+            </w:r>
+            <w:r>
+              <w:rPr>
+                <w:rFonts w:ascii="Times New Roman" w:hAnsi="Times New Roman" w:cs="Times New Roman"/>
+              </w:rPr>
+              <w:t>6:45pm</w:t>
+            </w:r>
+          </w:p>
+          <w:p>
+            <w:pPr>
+              <w:jc w:val="center"/>
+              <w:rPr>
+                <w:rFonts w:ascii="Times New Roman" w:hAnsi="Times New Roman" w:cs="Times New Roman"/>
+              </w:rPr>
+            </w:pPr>
+            <w:r>
+              <w:rPr>
+                <w:rFonts w:ascii="Times New Roman" w:hAnsi="Times New Roman" w:cs="Times New Roman"/>
+              </w:rPr>
+              <w:t>(10 minutos)</w:t>
+            </w:r>
+          </w:p>
+          <w:p>
+            <w:pPr>
+              <w:jc w:val="center"/>
+              <w:rPr>
+                <w:rFonts w:ascii="Times New Roman" w:hAnsi="Times New Roman" w:cs="Times New Roman"/>
+              </w:rPr>
+            </w:pPr>
+          </w:p>
+          <w:p>
+            <w:pPr>
+              <w:jc w:val="center"/>
+              <w:rPr>
+                <w:rFonts w:ascii="Times New Roman" w:hAnsi="Times New Roman" w:cs="Times New Roman"/>
+              </w:rPr>
+            </w:pPr>
+          </w:p>
+          <w:p>
+            <w:pPr>
+              <w:jc w:val="center"/>
+              <w:rPr>
+                <w:rFonts w:ascii="Times New Roman" w:hAnsi="Times New Roman" w:cs="Times New Roman"/>
+              </w:rPr>
+            </w:pPr>
+          </w:p>
+          <w:p>
+            <w:pPr>
+              <w:jc w:val="center"/>
+              <w:rPr>
+                <w:rFonts w:ascii="Times New Roman" w:hAnsi="Times New Roman" w:cs="Times New Roman"/>
+              </w:rPr>
+            </w:pPr>
+          </w:p>
+          <w:p>
+            <w:pPr>
+              <w:jc w:val="center"/>
+              <w:rPr>
+                <w:rFonts w:ascii="Times New Roman" w:hAnsi="Times New Roman" w:cs="Times New Roman"/>
+              </w:rPr>
+            </w:pPr>
+          </w:p>
+          <w:p>
+            <w:pPr>
+              <w:jc w:val="center"/>
+              <w:rPr>
+                <w:rFonts w:ascii="Times New Roman" w:hAnsi="Times New Roman" w:cs="Times New Roman"/>
+              </w:rPr>
+            </w:pPr>
+          </w:p>
+          <w:p>
+            <w:pPr>
+              <w:jc w:val="center"/>
+              <w:rPr>
+                <w:rFonts w:ascii="Times New Roman" w:hAnsi="Times New Roman" w:cs="Times New Roman"/>
+              </w:rPr>
+            </w:pPr>
+          </w:p>
+          <w:p>
+            <w:pPr>
+              <w:jc w:val="center"/>
+              <w:rPr>
+                <w:rFonts w:ascii="Times New Roman" w:hAnsi="Times New Roman" w:cs="Times New Roman"/>
+              </w:rPr>
+            </w:pPr>
+          </w:p>
+          <w:p>
+            <w:pPr>
+              <w:jc w:val="center"/>
+              <w:rPr>
+                <w:rFonts w:ascii="Times New Roman" w:hAnsi="Times New Roman" w:cs="Times New Roman"/>
+              </w:rPr>
+            </w:pPr>
+            <w:r>
+              <w:rPr>
+                <w:rFonts w:ascii="Times New Roman" w:hAnsi="Times New Roman" w:cs="Times New Roman"/>
+              </w:rPr>
+              <w:t xml:space="preserve">6:58pm </w:t>
+            </w:r>
+            <w:r>
+              <w:rPr>
+                <w:rFonts w:ascii="Times New Roman" w:hAnsi="Times New Roman" w:cs="Times New Roman"/>
+              </w:rPr>
+              <w:t>–</w:t>
+            </w:r>
+            <w:r>
+              <w:rPr>
+                <w:rFonts w:ascii="Times New Roman" w:hAnsi="Times New Roman" w:cs="Times New Roman"/>
+              </w:rPr>
+              <w:t xml:space="preserve"> </w:t>
+            </w:r>
+            <w:r>
+              <w:rPr>
+                <w:rFonts w:ascii="Times New Roman" w:hAnsi="Times New Roman" w:cs="Times New Roman"/>
+              </w:rPr>
+              <w:t>7:46pm</w:t>
+            </w:r>
+          </w:p>
+          <w:p>
+            <w:pPr>
+              <w:jc w:val="center"/>
+              <w:rPr>
+                <w:rFonts w:ascii="Times New Roman" w:hAnsi="Times New Roman" w:cs="Times New Roman"/>
+              </w:rPr>
+            </w:pPr>
+            <w:r>
+              <w:rPr>
+                <w:rFonts w:ascii="Times New Roman" w:hAnsi="Times New Roman" w:cs="Times New Roman"/>
+              </w:rPr>
+              <w:t>(48 minutos)</w:t>
+            </w:r>
+          </w:p>
+          <w:p>
+            <w:pPr>
+              <w:jc w:val="center"/>
+              <w:rPr>
+                <w:rFonts w:ascii="Times New Roman" w:hAnsi="Times New Roman" w:cs="Times New Roman"/>
+              </w:rPr>
+            </w:pPr>
+          </w:p>
+          <w:p>
+            <w:pPr>
+              <w:jc w:val="center"/>
+              <w:rPr>
+                <w:rFonts w:ascii="Times New Roman" w:hAnsi="Times New Roman" w:cs="Times New Roman"/>
+              </w:rPr>
+            </w:pPr>
+          </w:p>
+          <w:p>
+            <w:pPr>
+              <w:jc w:val="center"/>
+              <w:rPr>
+                <w:rFonts w:ascii="Times New Roman" w:hAnsi="Times New Roman" w:cs="Times New Roman"/>
+              </w:rPr>
+            </w:pPr>
+          </w:p>
+          <w:p>
+            <w:pPr>
+              <w:jc w:val="center"/>
+              <w:rPr>
+                <w:rFonts w:ascii="Times New Roman" w:hAnsi="Times New Roman" w:cs="Times New Roman"/>
+              </w:rPr>
+            </w:pPr>
+          </w:p>
+          <w:p>
+            <w:pPr>
+              <w:jc w:val="center"/>
+              <w:rPr>
+                <w:rFonts w:ascii="Times New Roman" w:hAnsi="Times New Roman" w:cs="Times New Roman"/>
+              </w:rPr>
+            </w:pPr>
+          </w:p>
+          <w:p>
+            <w:pPr>
+              <w:jc w:val="center"/>
+              <w:rPr>
+                <w:rFonts w:ascii="Times New Roman" w:hAnsi="Times New Roman" w:cs="Times New Roman"/>
+              </w:rPr>
+            </w:pPr>
+          </w:p>
+          <w:p>
+            <w:pPr>
+              <w:rPr>
+                <w:rFonts w:ascii="Times New Roman" w:hAnsi="Times New Roman" w:cs="Times New Roman"/>
+              </w:rPr>
+            </w:pPr>
+          </w:p>
+          <w:p>
+            <w:pPr>
+              <w:jc w:val="center"/>
+              <w:rPr>
+                <w:rFonts w:ascii="Times New Roman" w:hAnsi="Times New Roman" w:cs="Times New Roman"/>
+              </w:rPr>
+            </w:pPr>
+          </w:p>
+          <w:p>
+            <w:pPr>
+              <w:jc w:val="center"/>
+              <w:rPr>
+                <w:rFonts w:ascii="Times New Roman" w:hAnsi="Times New Roman" w:cs="Times New Roman"/>
+              </w:rPr>
+            </w:pPr>
+          </w:p>
+          <w:p>
+            <w:pPr>
+              <w:jc w:val="center"/>
+              <w:rPr>
+                <w:rFonts w:ascii="Times New Roman" w:hAnsi="Times New Roman" w:cs="Times New Roman"/>
+              </w:rPr>
+            </w:pPr>
+          </w:p>
+          <w:p>
+            <w:pPr>
+              <w:jc w:val="center"/>
+              <w:rPr>
+                <w:rFonts w:ascii="Times New Roman" w:hAnsi="Times New Roman" w:cs="Times New Roman"/>
+              </w:rPr>
+            </w:pPr>
+            <w:r>
+              <w:rPr>
+                <w:rFonts w:ascii="Times New Roman" w:hAnsi="Times New Roman" w:cs="Times New Roman"/>
+              </w:rPr>
+              <w:t xml:space="preserve">8:12pm </w:t>
+            </w:r>
+            <w:r>
+              <w:rPr>
+                <w:rFonts w:ascii="Times New Roman" w:hAnsi="Times New Roman" w:cs="Times New Roman"/>
+              </w:rPr>
+              <w:t>– 9:18ppm</w:t>
+            </w:r>
+          </w:p>
+          <w:p>
+            <w:pPr>
+              <w:jc w:val="center"/>
+              <w:rPr>
+                <w:rFonts w:ascii="Times New Roman" w:hAnsi="Times New Roman" w:cs="Times New Roman"/>
+              </w:rPr>
+            </w:pPr>
+            <w:r>
+              <w:rPr>
+                <w:rFonts w:ascii="Times New Roman" w:hAnsi="Times New Roman" w:cs="Times New Roman"/>
+              </w:rPr>
+              <w:t>(1 hora, 6 minutos)</w:t>
+            </w:r>
+            <w:r>
+              <w:rPr>
+                <w:rFonts w:ascii="Times New Roman" w:hAnsi="Times New Roman" w:cs="Times New Roman"/>
+              </w:rPr>
+              <w:t xml:space="preserve"> </w:t>
+            </w:r>
+          </w:p>
+          <w:p>
+            <w:pPr>
+              <w:jc w:val="center"/>
+              <w:rPr>
+                <w:rFonts w:ascii="Times New Roman" w:hAnsi="Times New Roman" w:cs="Times New Roman"/>
+              </w:rPr>
+            </w:pPr>
+          </w:p>
+          <w:p>
+            <w:pPr>
+              <w:rPr>
+                <w:rFonts w:ascii="Times New Roman" w:hAnsi="Times New Roman" w:cs="Times New Roman"/>
+              </w:rPr>
+            </w:pPr>
           </w:p>
         </w:tc>
         <w:tc>
@@ -6533,596 +7787,6 @@
               <w:rPr>
                 <w:rFonts w:ascii="Times New Roman" w:hAnsi="Times New Roman" w:cs="Times New Roman"/>
               </w:rPr>
-              <w:t>Se crean todas las funciones de la gestión de conductores, incluir, eliminar, modificar y mostrar conductores. Se enlazan al menú principal para que sea posible usarlas de manera eficaz. No tienen sus validaciones completas.</w:t>
-            </w:r>
-          </w:p>
-        </w:tc>
-      </w:tr>
-      <w:tr>
-        <w:trPr>
-          <w:trHeight w:val="3827"/>
-        </w:trPr>
-        <w:tc>
-          <w:tcPr>
-            <w:tcW w:w="2942" w:type="dxa"/>
-          </w:tcPr>
-          <w:p>
-            <w:pPr>
-              <w:rPr>
-                <w:rFonts w:ascii="Times New Roman" w:hAnsi="Times New Roman" w:cs="Times New Roman"/>
-              </w:rPr>
-            </w:pPr>
-          </w:p>
-          <w:p>
-            <w:pPr>
-              <w:rPr>
-                <w:rFonts w:ascii="Times New Roman" w:hAnsi="Times New Roman" w:cs="Times New Roman"/>
-              </w:rPr>
-            </w:pPr>
-          </w:p>
-          <w:p>
-            <w:pPr>
-              <w:rPr>
-                <w:rFonts w:ascii="Times New Roman" w:hAnsi="Times New Roman" w:cs="Times New Roman"/>
-              </w:rPr>
-            </w:pPr>
-          </w:p>
-          <w:p>
-            <w:pPr>
-              <w:rPr>
-                <w:rFonts w:ascii="Times New Roman" w:hAnsi="Times New Roman" w:cs="Times New Roman"/>
-              </w:rPr>
-            </w:pPr>
-          </w:p>
-          <w:p>
-            <w:pPr>
-              <w:rPr>
-                <w:rFonts w:ascii="Times New Roman" w:hAnsi="Times New Roman" w:cs="Times New Roman"/>
-              </w:rPr>
-            </w:pPr>
-          </w:p>
-          <w:p>
-            <w:pPr>
-              <w:jc w:val="center"/>
-              <w:rPr>
-                <w:rFonts w:ascii="Times New Roman" w:hAnsi="Times New Roman" w:cs="Times New Roman"/>
-              </w:rPr>
-            </w:pPr>
-          </w:p>
-          <w:p>
-            <w:pPr>
-              <w:jc w:val="center"/>
-              <w:rPr>
-                <w:rFonts w:ascii="Times New Roman" w:hAnsi="Times New Roman" w:cs="Times New Roman"/>
-              </w:rPr>
-            </w:pPr>
-          </w:p>
-          <w:p>
-            <w:pPr>
-              <w:jc w:val="center"/>
-              <w:rPr>
-                <w:rFonts w:ascii="Times New Roman" w:hAnsi="Times New Roman" w:cs="Times New Roman"/>
-              </w:rPr>
-            </w:pPr>
-          </w:p>
-          <w:p>
-            <w:pPr>
-              <w:jc w:val="center"/>
-              <w:rPr>
-                <w:rFonts w:ascii="Times New Roman" w:hAnsi="Times New Roman" w:cs="Times New Roman"/>
-              </w:rPr>
-            </w:pPr>
-          </w:p>
-          <w:p>
-            <w:pPr>
-              <w:jc w:val="center"/>
-              <w:rPr>
-                <w:rFonts w:ascii="Times New Roman" w:hAnsi="Times New Roman" w:cs="Times New Roman"/>
-              </w:rPr>
-            </w:pPr>
-          </w:p>
-          <w:p>
-            <w:pPr>
-              <w:jc w:val="center"/>
-              <w:rPr>
-                <w:rFonts w:ascii="Times New Roman" w:hAnsi="Times New Roman" w:cs="Times New Roman"/>
-              </w:rPr>
-            </w:pPr>
-          </w:p>
-          <w:p>
-            <w:pPr>
-              <w:jc w:val="center"/>
-              <w:rPr>
-                <w:rFonts w:ascii="Times New Roman" w:hAnsi="Times New Roman" w:cs="Times New Roman"/>
-              </w:rPr>
-            </w:pPr>
-          </w:p>
-          <w:p>
-            <w:pPr>
-              <w:jc w:val="center"/>
-              <w:rPr>
-                <w:rFonts w:ascii="Times New Roman" w:hAnsi="Times New Roman" w:cs="Times New Roman"/>
-              </w:rPr>
-            </w:pPr>
-          </w:p>
-          <w:p>
-            <w:pPr>
-              <w:jc w:val="center"/>
-              <w:rPr>
-                <w:rFonts w:ascii="Times New Roman" w:hAnsi="Times New Roman" w:cs="Times New Roman"/>
-              </w:rPr>
-            </w:pPr>
-          </w:p>
-          <w:p>
-            <w:pPr>
-              <w:jc w:val="center"/>
-              <w:rPr>
-                <w:rFonts w:ascii="Times New Roman" w:hAnsi="Times New Roman" w:cs="Times New Roman"/>
-              </w:rPr>
-            </w:pPr>
-          </w:p>
-          <w:p>
-            <w:pPr>
-              <w:jc w:val="center"/>
-              <w:rPr>
-                <w:rFonts w:ascii="Times New Roman" w:hAnsi="Times New Roman" w:cs="Times New Roman"/>
-              </w:rPr>
-            </w:pPr>
-            <w:r>
-              <w:rPr>
-                <w:rFonts w:ascii="Times New Roman" w:hAnsi="Times New Roman" w:cs="Times New Roman"/>
-              </w:rPr>
-              <w:t>3/10/2026</w:t>
-            </w:r>
-          </w:p>
-        </w:tc>
-        <w:tc>
-          <w:tcPr>
-            <w:tcW w:w="2943" w:type="dxa"/>
-          </w:tcPr>
-          <w:p>
-            <w:pPr>
-              <w:rPr>
-                <w:rFonts w:ascii="Times New Roman" w:hAnsi="Times New Roman" w:cs="Times New Roman"/>
-              </w:rPr>
-            </w:pPr>
-          </w:p>
-          <w:p>
-            <w:pPr>
-              <w:rPr>
-                <w:rFonts w:ascii="Times New Roman" w:hAnsi="Times New Roman" w:cs="Times New Roman"/>
-              </w:rPr>
-            </w:pPr>
-          </w:p>
-          <w:p>
-            <w:pPr>
-              <w:jc w:val="center"/>
-              <w:rPr>
-                <w:rFonts w:ascii="Times New Roman" w:hAnsi="Times New Roman" w:cs="Times New Roman"/>
-              </w:rPr>
-            </w:pPr>
-          </w:p>
-          <w:p>
-            <w:pPr>
-              <w:jc w:val="center"/>
-              <w:rPr>
-                <w:rFonts w:ascii="Times New Roman" w:hAnsi="Times New Roman" w:cs="Times New Roman"/>
-              </w:rPr>
-            </w:pPr>
-          </w:p>
-          <w:p>
-            <w:pPr>
-              <w:jc w:val="center"/>
-              <w:rPr>
-                <w:rFonts w:ascii="Times New Roman" w:hAnsi="Times New Roman" w:cs="Times New Roman"/>
-              </w:rPr>
-            </w:pPr>
-          </w:p>
-          <w:p>
-            <w:pPr>
-              <w:jc w:val="center"/>
-              <w:rPr>
-                <w:rFonts w:ascii="Times New Roman" w:hAnsi="Times New Roman" w:cs="Times New Roman"/>
-              </w:rPr>
-            </w:pPr>
-          </w:p>
-          <w:p>
-            <w:pPr>
-              <w:jc w:val="center"/>
-              <w:rPr>
-                <w:rFonts w:ascii="Times New Roman" w:hAnsi="Times New Roman" w:cs="Times New Roman"/>
-              </w:rPr>
-            </w:pPr>
-            <w:r>
-              <w:rPr>
-                <w:rFonts w:ascii="Times New Roman" w:hAnsi="Times New Roman" w:cs="Times New Roman"/>
-              </w:rPr>
-              <w:t xml:space="preserve">2:33pm </w:t>
-            </w:r>
-            <w:r>
-              <w:rPr>
-                <w:rFonts w:ascii="Times New Roman" w:hAnsi="Times New Roman" w:cs="Times New Roman"/>
-              </w:rPr>
-              <w:t>–</w:t>
-            </w:r>
-            <w:r>
-              <w:rPr>
-                <w:rFonts w:ascii="Times New Roman" w:hAnsi="Times New Roman" w:cs="Times New Roman"/>
-              </w:rPr>
-              <w:t xml:space="preserve"> </w:t>
-            </w:r>
-            <w:r>
-              <w:rPr>
-                <w:rFonts w:ascii="Times New Roman" w:hAnsi="Times New Roman" w:cs="Times New Roman"/>
-              </w:rPr>
-              <w:t>3:06pm</w:t>
-            </w:r>
-          </w:p>
-          <w:p>
-            <w:pPr>
-              <w:jc w:val="center"/>
-              <w:rPr>
-                <w:rFonts w:ascii="Times New Roman" w:hAnsi="Times New Roman" w:cs="Times New Roman"/>
-              </w:rPr>
-            </w:pPr>
-            <w:r>
-              <w:rPr>
-                <w:rFonts w:ascii="Times New Roman" w:hAnsi="Times New Roman" w:cs="Times New Roman"/>
-              </w:rPr>
-              <w:t>(36 minutos)</w:t>
-            </w:r>
-            <w:r>
-              <w:rPr>
-                <w:rFonts w:ascii="Times New Roman" w:hAnsi="Times New Roman" w:cs="Times New Roman"/>
-              </w:rPr>
-              <w:br/>
-            </w:r>
-          </w:p>
-          <w:p>
-            <w:pPr>
-              <w:jc w:val="center"/>
-              <w:rPr>
-                <w:rFonts w:ascii="Times New Roman" w:hAnsi="Times New Roman" w:cs="Times New Roman"/>
-              </w:rPr>
-            </w:pPr>
-          </w:p>
-          <w:p>
-            <w:pPr>
-              <w:jc w:val="center"/>
-              <w:rPr>
-                <w:rFonts w:ascii="Times New Roman" w:hAnsi="Times New Roman" w:cs="Times New Roman"/>
-              </w:rPr>
-            </w:pPr>
-          </w:p>
-          <w:p>
-            <w:pPr>
-              <w:jc w:val="center"/>
-              <w:rPr>
-                <w:rFonts w:ascii="Times New Roman" w:hAnsi="Times New Roman" w:cs="Times New Roman"/>
-              </w:rPr>
-            </w:pPr>
-          </w:p>
-          <w:p>
-            <w:pPr>
-              <w:jc w:val="center"/>
-              <w:rPr>
-                <w:rFonts w:ascii="Times New Roman" w:hAnsi="Times New Roman" w:cs="Times New Roman"/>
-              </w:rPr>
-            </w:pPr>
-          </w:p>
-          <w:p>
-            <w:pPr>
-              <w:jc w:val="center"/>
-              <w:rPr>
-                <w:rFonts w:ascii="Times New Roman" w:hAnsi="Times New Roman" w:cs="Times New Roman"/>
-              </w:rPr>
-            </w:pPr>
-          </w:p>
-          <w:p>
-            <w:pPr>
-              <w:jc w:val="center"/>
-              <w:rPr>
-                <w:rFonts w:ascii="Times New Roman" w:hAnsi="Times New Roman" w:cs="Times New Roman"/>
-              </w:rPr>
-            </w:pPr>
-          </w:p>
-          <w:p>
-            <w:pPr>
-              <w:jc w:val="center"/>
-              <w:rPr>
-                <w:rFonts w:ascii="Times New Roman" w:hAnsi="Times New Roman" w:cs="Times New Roman"/>
-              </w:rPr>
-            </w:pPr>
-            <w:r>
-              <w:rPr>
-                <w:rFonts w:ascii="Times New Roman" w:hAnsi="Times New Roman" w:cs="Times New Roman"/>
-              </w:rPr>
-              <w:t xml:space="preserve">6:35pm </w:t>
-            </w:r>
-            <w:r>
-              <w:rPr>
-                <w:rFonts w:ascii="Times New Roman" w:hAnsi="Times New Roman" w:cs="Times New Roman"/>
-              </w:rPr>
-              <w:t>–</w:t>
-            </w:r>
-            <w:r>
-              <w:rPr>
-                <w:rFonts w:ascii="Times New Roman" w:hAnsi="Times New Roman" w:cs="Times New Roman"/>
-              </w:rPr>
-              <w:t xml:space="preserve"> </w:t>
-            </w:r>
-            <w:r>
-              <w:rPr>
-                <w:rFonts w:ascii="Times New Roman" w:hAnsi="Times New Roman" w:cs="Times New Roman"/>
-              </w:rPr>
-              <w:t>6:45pm</w:t>
-            </w:r>
-          </w:p>
-          <w:p>
-            <w:pPr>
-              <w:jc w:val="center"/>
-              <w:rPr>
-                <w:rFonts w:ascii="Times New Roman" w:hAnsi="Times New Roman" w:cs="Times New Roman"/>
-              </w:rPr>
-            </w:pPr>
-            <w:r>
-              <w:rPr>
-                <w:rFonts w:ascii="Times New Roman" w:hAnsi="Times New Roman" w:cs="Times New Roman"/>
-              </w:rPr>
-              <w:t>(10 minutos)</w:t>
-            </w:r>
-          </w:p>
-          <w:p>
-            <w:pPr>
-              <w:jc w:val="center"/>
-              <w:rPr>
-                <w:rFonts w:ascii="Times New Roman" w:hAnsi="Times New Roman" w:cs="Times New Roman"/>
-              </w:rPr>
-            </w:pPr>
-          </w:p>
-          <w:p>
-            <w:pPr>
-              <w:jc w:val="center"/>
-              <w:rPr>
-                <w:rFonts w:ascii="Times New Roman" w:hAnsi="Times New Roman" w:cs="Times New Roman"/>
-              </w:rPr>
-            </w:pPr>
-          </w:p>
-          <w:p>
-            <w:pPr>
-              <w:jc w:val="center"/>
-              <w:rPr>
-                <w:rFonts w:ascii="Times New Roman" w:hAnsi="Times New Roman" w:cs="Times New Roman"/>
-              </w:rPr>
-            </w:pPr>
-          </w:p>
-          <w:p>
-            <w:pPr>
-              <w:jc w:val="center"/>
-              <w:rPr>
-                <w:rFonts w:ascii="Times New Roman" w:hAnsi="Times New Roman" w:cs="Times New Roman"/>
-              </w:rPr>
-            </w:pPr>
-          </w:p>
-          <w:p>
-            <w:pPr>
-              <w:jc w:val="center"/>
-              <w:rPr>
-                <w:rFonts w:ascii="Times New Roman" w:hAnsi="Times New Roman" w:cs="Times New Roman"/>
-              </w:rPr>
-            </w:pPr>
-          </w:p>
-          <w:p>
-            <w:pPr>
-              <w:jc w:val="center"/>
-              <w:rPr>
-                <w:rFonts w:ascii="Times New Roman" w:hAnsi="Times New Roman" w:cs="Times New Roman"/>
-              </w:rPr>
-            </w:pPr>
-          </w:p>
-          <w:p>
-            <w:pPr>
-              <w:jc w:val="center"/>
-              <w:rPr>
-                <w:rFonts w:ascii="Times New Roman" w:hAnsi="Times New Roman" w:cs="Times New Roman"/>
-              </w:rPr>
-            </w:pPr>
-          </w:p>
-          <w:p>
-            <w:pPr>
-              <w:jc w:val="center"/>
-              <w:rPr>
-                <w:rFonts w:ascii="Times New Roman" w:hAnsi="Times New Roman" w:cs="Times New Roman"/>
-              </w:rPr>
-            </w:pPr>
-          </w:p>
-          <w:p>
-            <w:pPr>
-              <w:jc w:val="center"/>
-              <w:rPr>
-                <w:rFonts w:ascii="Times New Roman" w:hAnsi="Times New Roman" w:cs="Times New Roman"/>
-              </w:rPr>
-            </w:pPr>
-            <w:r>
-              <w:rPr>
-                <w:rFonts w:ascii="Times New Roman" w:hAnsi="Times New Roman" w:cs="Times New Roman"/>
-              </w:rPr>
-              <w:t xml:space="preserve">6:58pm </w:t>
-            </w:r>
-            <w:r>
-              <w:rPr>
-                <w:rFonts w:ascii="Times New Roman" w:hAnsi="Times New Roman" w:cs="Times New Roman"/>
-              </w:rPr>
-              <w:t>–</w:t>
-            </w:r>
-            <w:r>
-              <w:rPr>
-                <w:rFonts w:ascii="Times New Roman" w:hAnsi="Times New Roman" w:cs="Times New Roman"/>
-              </w:rPr>
-              <w:t xml:space="preserve"> </w:t>
-            </w:r>
-            <w:r>
-              <w:rPr>
-                <w:rFonts w:ascii="Times New Roman" w:hAnsi="Times New Roman" w:cs="Times New Roman"/>
-              </w:rPr>
-              <w:t>7:46pm</w:t>
-            </w:r>
-          </w:p>
-          <w:p>
-            <w:pPr>
-              <w:jc w:val="center"/>
-              <w:rPr>
-                <w:rFonts w:ascii="Times New Roman" w:hAnsi="Times New Roman" w:cs="Times New Roman"/>
-              </w:rPr>
-            </w:pPr>
-            <w:r>
-              <w:rPr>
-                <w:rFonts w:ascii="Times New Roman" w:hAnsi="Times New Roman" w:cs="Times New Roman"/>
-              </w:rPr>
-              <w:t>(48 minutos)</w:t>
-            </w:r>
-          </w:p>
-          <w:p>
-            <w:pPr>
-              <w:jc w:val="center"/>
-              <w:rPr>
-                <w:rFonts w:ascii="Times New Roman" w:hAnsi="Times New Roman" w:cs="Times New Roman"/>
-              </w:rPr>
-            </w:pPr>
-          </w:p>
-          <w:p>
-            <w:pPr>
-              <w:jc w:val="center"/>
-              <w:rPr>
-                <w:rFonts w:ascii="Times New Roman" w:hAnsi="Times New Roman" w:cs="Times New Roman"/>
-              </w:rPr>
-            </w:pPr>
-          </w:p>
-          <w:p>
-            <w:pPr>
-              <w:jc w:val="center"/>
-              <w:rPr>
-                <w:rFonts w:ascii="Times New Roman" w:hAnsi="Times New Roman" w:cs="Times New Roman"/>
-              </w:rPr>
-            </w:pPr>
-          </w:p>
-          <w:p>
-            <w:pPr>
-              <w:jc w:val="center"/>
-              <w:rPr>
-                <w:rFonts w:ascii="Times New Roman" w:hAnsi="Times New Roman" w:cs="Times New Roman"/>
-              </w:rPr>
-            </w:pPr>
-          </w:p>
-          <w:p>
-            <w:pPr>
-              <w:jc w:val="center"/>
-              <w:rPr>
-                <w:rFonts w:ascii="Times New Roman" w:hAnsi="Times New Roman" w:cs="Times New Roman"/>
-              </w:rPr>
-            </w:pPr>
-          </w:p>
-          <w:p>
-            <w:pPr>
-              <w:jc w:val="center"/>
-              <w:rPr>
-                <w:rFonts w:ascii="Times New Roman" w:hAnsi="Times New Roman" w:cs="Times New Roman"/>
-              </w:rPr>
-            </w:pPr>
-          </w:p>
-          <w:p>
-            <w:pPr>
-              <w:jc w:val="center"/>
-              <w:rPr>
-                <w:rFonts w:ascii="Times New Roman" w:hAnsi="Times New Roman" w:cs="Times New Roman"/>
-              </w:rPr>
-            </w:pPr>
-          </w:p>
-          <w:p>
-            <w:pPr>
-              <w:jc w:val="center"/>
-              <w:rPr>
-                <w:rFonts w:ascii="Times New Roman" w:hAnsi="Times New Roman" w:cs="Times New Roman"/>
-              </w:rPr>
-            </w:pPr>
-          </w:p>
-          <w:p>
-            <w:pPr>
-              <w:jc w:val="center"/>
-              <w:rPr>
-                <w:rFonts w:ascii="Times New Roman" w:hAnsi="Times New Roman" w:cs="Times New Roman"/>
-              </w:rPr>
-            </w:pPr>
-          </w:p>
-          <w:p>
-            <w:pPr>
-              <w:jc w:val="center"/>
-              <w:rPr>
-                <w:rFonts w:ascii="Times New Roman" w:hAnsi="Times New Roman" w:cs="Times New Roman"/>
-              </w:rPr>
-            </w:pPr>
-          </w:p>
-          <w:p>
-            <w:pPr>
-              <w:jc w:val="center"/>
-              <w:rPr>
-                <w:rFonts w:ascii="Times New Roman" w:hAnsi="Times New Roman" w:cs="Times New Roman"/>
-              </w:rPr>
-            </w:pPr>
-          </w:p>
-          <w:p>
-            <w:pPr>
-              <w:jc w:val="center"/>
-              <w:rPr>
-                <w:rFonts w:ascii="Times New Roman" w:hAnsi="Times New Roman" w:cs="Times New Roman"/>
-              </w:rPr>
-            </w:pPr>
-          </w:p>
-          <w:p>
-            <w:pPr>
-              <w:jc w:val="center"/>
-              <w:rPr>
-                <w:rFonts w:ascii="Times New Roman" w:hAnsi="Times New Roman" w:cs="Times New Roman"/>
-              </w:rPr>
-            </w:pPr>
-          </w:p>
-          <w:p>
-            <w:pPr>
-              <w:jc w:val="center"/>
-              <w:rPr>
-                <w:rFonts w:ascii="Times New Roman" w:hAnsi="Times New Roman" w:cs="Times New Roman"/>
-              </w:rPr>
-            </w:pPr>
-          </w:p>
-          <w:p>
-            <w:pPr>
-              <w:rPr>
-                <w:rFonts w:ascii="Times New Roman" w:hAnsi="Times New Roman" w:cs="Times New Roman"/>
-              </w:rPr>
-            </w:pPr>
-          </w:p>
-        </w:tc>
-        <w:tc>
-          <w:tcPr>
-            <w:tcW w:w="2943" w:type="dxa"/>
-          </w:tcPr>
-          <w:p>
-            <w:pPr>
-              <w:rPr>
-                <w:rFonts w:ascii="Times New Roman" w:hAnsi="Times New Roman" w:cs="Times New Roman"/>
-              </w:rPr>
-            </w:pPr>
-          </w:p>
-          <w:p>
-            <w:pPr>
-              <w:rPr>
-                <w:rFonts w:ascii="Times New Roman" w:hAnsi="Times New Roman" w:cs="Times New Roman"/>
-              </w:rPr>
-            </w:pPr>
-            <w:r>
-              <w:rPr>
-                <w:rFonts w:ascii="Times New Roman" w:hAnsi="Times New Roman" w:cs="Times New Roman"/>
-              </w:rPr>
               <w:t>Trabajo en los menús, mejorando y eliminando líneas innecesarias y que estaban causando errores, como llamadas recursivas (No subo git, no he terminado de modificar, pero debía hacer unas revisiones para un proyecto de fundamentos)</w:t>
             </w:r>
           </w:p>
@@ -7197,6 +7861,7 @@
               <w:rPr>
                 <w:rFonts w:ascii="Times New Roman" w:hAnsi="Times New Roman" w:cs="Times New Roman"/>
               </w:rPr>
+              <w:lastRenderedPageBreak/>
               <w:t xml:space="preserve">Se crea la función auxiliar de </w:t>
             </w:r>
             <w:r>
@@ -7210,6 +7875,60 @@
                 <w:rFonts w:ascii="Times New Roman" w:hAnsi="Times New Roman" w:cs="Times New Roman"/>
               </w:rPr>
               <w:t xml:space="preserve">, la cual nos va a ayudar a poder comprobar de manera general si dos archivos tienen elementos asociados (Todavía se esta probando) </w:t>
+            </w:r>
+          </w:p>
+          <w:p>
+            <w:pPr>
+              <w:rPr>
+                <w:rFonts w:ascii="Times New Roman" w:hAnsi="Times New Roman" w:cs="Times New Roman"/>
+              </w:rPr>
+            </w:pPr>
+          </w:p>
+          <w:p>
+            <w:pPr>
+              <w:rPr>
+                <w:rFonts w:ascii="Times New Roman" w:hAnsi="Times New Roman" w:cs="Times New Roman"/>
+              </w:rPr>
+            </w:pPr>
+          </w:p>
+          <w:p>
+            <w:pPr>
+              <w:rPr>
+                <w:rFonts w:ascii="Times New Roman" w:hAnsi="Times New Roman" w:cs="Times New Roman"/>
+              </w:rPr>
+            </w:pPr>
+          </w:p>
+          <w:p>
+            <w:pPr>
+              <w:rPr>
+                <w:rFonts w:ascii="Times New Roman" w:hAnsi="Times New Roman" w:cs="Times New Roman"/>
+              </w:rPr>
+            </w:pPr>
+          </w:p>
+          <w:p>
+            <w:pPr>
+              <w:rPr>
+                <w:rFonts w:ascii="Times New Roman" w:hAnsi="Times New Roman" w:cs="Times New Roman"/>
+              </w:rPr>
+            </w:pPr>
+          </w:p>
+          <w:p>
+            <w:pPr>
+              <w:rPr>
+                <w:rFonts w:ascii="Times New Roman" w:hAnsi="Times New Roman" w:cs="Times New Roman"/>
+              </w:rPr>
+            </w:pPr>
+            <w:r>
+              <w:rPr>
+                <w:rFonts w:ascii="Times New Roman" w:hAnsi="Times New Roman" w:cs="Times New Roman"/>
+              </w:rPr>
+              <w:t>Se agrego la función comprobar asociado, solo a eliminar modelos, esto pues unidades y conductores solo la utilizan cuando requieren de una salida, y las salidas no se crearon.</w:t>
+            </w:r>
+            <w:r>
+              <w:rPr>
+                <w:rFonts w:ascii="Times New Roman" w:hAnsi="Times New Roman" w:cs="Times New Roman"/>
+              </w:rPr>
+              <w:t xml:space="preserve"> Se trabaja en el documento de documentación externa.</w:t>
             </w:r>
           </w:p>
         </w:tc>
@@ -7845,6 +8564,273 @@
     </w:lvl>
   </w:abstractNum>
   <w:abstractNum w:abstractNumId="2" w15:restartNumberingAfterBreak="0">
+    <w:nsid w:val="1CD968D8"/>
+    <w:multiLevelType w:val="hybridMultilevel"/>
+    <w:tmpl w:val="1BEEE78A"/>
+    <w:lvl w:ilvl="0" w:tplc="090ECB84">
+      <w:start w:val="1"/>
+      <w:numFmt w:val="decimal"/>
+      <w:lvlText w:val="%1."/>
+      <w:lvlJc w:val="left"/>
+      <w:pPr>
+        <w:ind w:left="1185" w:hanging="360"/>
+      </w:pPr>
+      <w:rPr>
+        <w:rFonts w:hint="default"/>
+      </w:rPr>
+    </w:lvl>
+    <w:lvl w:ilvl="1" w:tplc="140A0019" w:tentative="1">
+      <w:start w:val="1"/>
+      <w:numFmt w:val="lowerLetter"/>
+      <w:lvlText w:val="%2."/>
+      <w:lvlJc w:val="left"/>
+      <w:pPr>
+        <w:ind w:left="1905" w:hanging="360"/>
+      </w:pPr>
+    </w:lvl>
+    <w:lvl w:ilvl="2" w:tplc="140A001B" w:tentative="1">
+      <w:start w:val="1"/>
+      <w:numFmt w:val="lowerRoman"/>
+      <w:lvlText w:val="%3."/>
+      <w:lvlJc w:val="right"/>
+      <w:pPr>
+        <w:ind w:left="2625" w:hanging="180"/>
+      </w:pPr>
+    </w:lvl>
+    <w:lvl w:ilvl="3" w:tplc="140A000F" w:tentative="1">
+      <w:start w:val="1"/>
+      <w:numFmt w:val="decimal"/>
+      <w:lvlText w:val="%4."/>
+      <w:lvlJc w:val="left"/>
+      <w:pPr>
+        <w:ind w:left="3345" w:hanging="360"/>
+      </w:pPr>
+    </w:lvl>
+    <w:lvl w:ilvl="4" w:tplc="140A0019" w:tentative="1">
+      <w:start w:val="1"/>
+      <w:numFmt w:val="lowerLetter"/>
+      <w:lvlText w:val="%5."/>
+      <w:lvlJc w:val="left"/>
+      <w:pPr>
+        <w:ind w:left="4065" w:hanging="360"/>
+      </w:pPr>
+    </w:lvl>
+    <w:lvl w:ilvl="5" w:tplc="140A001B" w:tentative="1">
+      <w:start w:val="1"/>
+      <w:numFmt w:val="lowerRoman"/>
+      <w:lvlText w:val="%6."/>
+      <w:lvlJc w:val="right"/>
+      <w:pPr>
+        <w:ind w:left="4785" w:hanging="180"/>
+      </w:pPr>
+    </w:lvl>
+    <w:lvl w:ilvl="6" w:tplc="140A000F" w:tentative="1">
+      <w:start w:val="1"/>
+      <w:numFmt w:val="decimal"/>
+      <w:lvlText w:val="%7."/>
+      <w:lvlJc w:val="left"/>
+      <w:pPr>
+        <w:ind w:left="5505" w:hanging="360"/>
+      </w:pPr>
+    </w:lvl>
+    <w:lvl w:ilvl="7" w:tplc="140A0019" w:tentative="1">
+      <w:start w:val="1"/>
+      <w:numFmt w:val="lowerLetter"/>
+      <w:lvlText w:val="%8."/>
+      <w:lvlJc w:val="left"/>
+      <w:pPr>
+        <w:ind w:left="6225" w:hanging="360"/>
+      </w:pPr>
+    </w:lvl>
+    <w:lvl w:ilvl="8" w:tplc="140A001B" w:tentative="1">
+      <w:start w:val="1"/>
+      <w:numFmt w:val="lowerRoman"/>
+      <w:lvlText w:val="%9."/>
+      <w:lvlJc w:val="right"/>
+      <w:pPr>
+        <w:ind w:left="6945" w:hanging="180"/>
+      </w:pPr>
+    </w:lvl>
+  </w:abstractNum>
+  <w:abstractNum w:abstractNumId="3" w15:restartNumberingAfterBreak="0">
+    <w:nsid w:val="23041B01"/>
+    <w:multiLevelType w:val="hybridMultilevel"/>
+    <w:tmpl w:val="CBFAB474"/>
+    <w:lvl w:ilvl="0" w:tplc="7F5C806A">
+      <w:start w:val="1"/>
+      <w:numFmt w:val="upperLetter"/>
+      <w:lvlText w:val="%1."/>
+      <w:lvlJc w:val="left"/>
+      <w:pPr>
+        <w:ind w:left="1185" w:hanging="360"/>
+      </w:pPr>
+      <w:rPr>
+        <w:rFonts w:hint="default"/>
+      </w:rPr>
+    </w:lvl>
+    <w:lvl w:ilvl="1" w:tplc="140A0019" w:tentative="1">
+      <w:start w:val="1"/>
+      <w:numFmt w:val="lowerLetter"/>
+      <w:lvlText w:val="%2."/>
+      <w:lvlJc w:val="left"/>
+      <w:pPr>
+        <w:ind w:left="1905" w:hanging="360"/>
+      </w:pPr>
+    </w:lvl>
+    <w:lvl w:ilvl="2" w:tplc="140A001B" w:tentative="1">
+      <w:start w:val="1"/>
+      <w:numFmt w:val="lowerRoman"/>
+      <w:lvlText w:val="%3."/>
+      <w:lvlJc w:val="right"/>
+      <w:pPr>
+        <w:ind w:left="2625" w:hanging="180"/>
+      </w:pPr>
+    </w:lvl>
+    <w:lvl w:ilvl="3" w:tplc="140A000F" w:tentative="1">
+      <w:start w:val="1"/>
+      <w:numFmt w:val="decimal"/>
+      <w:lvlText w:val="%4."/>
+      <w:lvlJc w:val="left"/>
+      <w:pPr>
+        <w:ind w:left="3345" w:hanging="360"/>
+      </w:pPr>
+    </w:lvl>
+    <w:lvl w:ilvl="4" w:tplc="140A0019" w:tentative="1">
+      <w:start w:val="1"/>
+      <w:numFmt w:val="lowerLetter"/>
+      <w:lvlText w:val="%5."/>
+      <w:lvlJc w:val="left"/>
+      <w:pPr>
+        <w:ind w:left="4065" w:hanging="360"/>
+      </w:pPr>
+    </w:lvl>
+    <w:lvl w:ilvl="5" w:tplc="140A001B" w:tentative="1">
+      <w:start w:val="1"/>
+      <w:numFmt w:val="lowerRoman"/>
+      <w:lvlText w:val="%6."/>
+      <w:lvlJc w:val="right"/>
+      <w:pPr>
+        <w:ind w:left="4785" w:hanging="180"/>
+      </w:pPr>
+    </w:lvl>
+    <w:lvl w:ilvl="6" w:tplc="140A000F" w:tentative="1">
+      <w:start w:val="1"/>
+      <w:numFmt w:val="decimal"/>
+      <w:lvlText w:val="%7."/>
+      <w:lvlJc w:val="left"/>
+      <w:pPr>
+        <w:ind w:left="5505" w:hanging="360"/>
+      </w:pPr>
+    </w:lvl>
+    <w:lvl w:ilvl="7" w:tplc="140A0019" w:tentative="1">
+      <w:start w:val="1"/>
+      <w:numFmt w:val="lowerLetter"/>
+      <w:lvlText w:val="%8."/>
+      <w:lvlJc w:val="left"/>
+      <w:pPr>
+        <w:ind w:left="6225" w:hanging="360"/>
+      </w:pPr>
+    </w:lvl>
+    <w:lvl w:ilvl="8" w:tplc="140A001B" w:tentative="1">
+      <w:start w:val="1"/>
+      <w:numFmt w:val="lowerRoman"/>
+      <w:lvlText w:val="%9."/>
+      <w:lvlJc w:val="right"/>
+      <w:pPr>
+        <w:ind w:left="6945" w:hanging="180"/>
+      </w:pPr>
+    </w:lvl>
+  </w:abstractNum>
+  <w:abstractNum w:abstractNumId="4" w15:restartNumberingAfterBreak="0">
+    <w:nsid w:val="3BC23C8E"/>
+    <w:multiLevelType w:val="hybridMultilevel"/>
+    <w:tmpl w:val="9ADEB75C"/>
+    <w:lvl w:ilvl="0" w:tplc="308CEA42">
+      <w:start w:val="1"/>
+      <w:numFmt w:val="decimal"/>
+      <w:lvlText w:val="(%1)"/>
+      <w:lvlJc w:val="left"/>
+      <w:pPr>
+        <w:ind w:left="825" w:hanging="465"/>
+      </w:pPr>
+      <w:rPr>
+        <w:rFonts w:hint="default"/>
+      </w:rPr>
+    </w:lvl>
+    <w:lvl w:ilvl="1" w:tplc="140A0019" w:tentative="1">
+      <w:start w:val="1"/>
+      <w:numFmt w:val="lowerLetter"/>
+      <w:lvlText w:val="%2."/>
+      <w:lvlJc w:val="left"/>
+      <w:pPr>
+        <w:ind w:left="1440" w:hanging="360"/>
+      </w:pPr>
+    </w:lvl>
+    <w:lvl w:ilvl="2" w:tplc="140A001B" w:tentative="1">
+      <w:start w:val="1"/>
+      <w:numFmt w:val="lowerRoman"/>
+      <w:lvlText w:val="%3."/>
+      <w:lvlJc w:val="right"/>
+      <w:pPr>
+        <w:ind w:left="2160" w:hanging="180"/>
+      </w:pPr>
+    </w:lvl>
+    <w:lvl w:ilvl="3" w:tplc="140A000F" w:tentative="1">
+      <w:start w:val="1"/>
+      <w:numFmt w:val="decimal"/>
+      <w:lvlText w:val="%4."/>
+      <w:lvlJc w:val="left"/>
+      <w:pPr>
+        <w:ind w:left="2880" w:hanging="360"/>
+      </w:pPr>
+    </w:lvl>
+    <w:lvl w:ilvl="4" w:tplc="140A0019" w:tentative="1">
+      <w:start w:val="1"/>
+      <w:numFmt w:val="lowerLetter"/>
+      <w:lvlText w:val="%5."/>
+      <w:lvlJc w:val="left"/>
+      <w:pPr>
+        <w:ind w:left="3600" w:hanging="360"/>
+      </w:pPr>
+    </w:lvl>
+    <w:lvl w:ilvl="5" w:tplc="140A001B" w:tentative="1">
+      <w:start w:val="1"/>
+      <w:numFmt w:val="lowerRoman"/>
+      <w:lvlText w:val="%6."/>
+      <w:lvlJc w:val="right"/>
+      <w:pPr>
+        <w:ind w:left="4320" w:hanging="180"/>
+      </w:pPr>
+    </w:lvl>
+    <w:lvl w:ilvl="6" w:tplc="140A000F" w:tentative="1">
+      <w:start w:val="1"/>
+      <w:numFmt w:val="decimal"/>
+      <w:lvlText w:val="%7."/>
+      <w:lvlJc w:val="left"/>
+      <w:pPr>
+        <w:ind w:left="5040" w:hanging="360"/>
+      </w:pPr>
+    </w:lvl>
+    <w:lvl w:ilvl="7" w:tplc="140A0019" w:tentative="1">
+      <w:start w:val="1"/>
+      <w:numFmt w:val="lowerLetter"/>
+      <w:lvlText w:val="%8."/>
+      <w:lvlJc w:val="left"/>
+      <w:pPr>
+        <w:ind w:left="5760" w:hanging="360"/>
+      </w:pPr>
+    </w:lvl>
+    <w:lvl w:ilvl="8" w:tplc="140A001B" w:tentative="1">
+      <w:start w:val="1"/>
+      <w:numFmt w:val="lowerRoman"/>
+      <w:lvlText w:val="%9."/>
+      <w:lvlJc w:val="right"/>
+      <w:pPr>
+        <w:ind w:left="6480" w:hanging="180"/>
+      </w:pPr>
+    </w:lvl>
+  </w:abstractNum>
+  <w:abstractNum w:abstractNumId="5" w15:restartNumberingAfterBreak="0">
     <w:nsid w:val="43D74454"/>
     <w:multiLevelType w:val="hybridMultilevel"/>
     <w:tmpl w:val="82AEAE96"/>
@@ -7956,7 +8942,7 @@
       </w:rPr>
     </w:lvl>
   </w:abstractNum>
-  <w:abstractNum w:abstractNumId="3" w15:restartNumberingAfterBreak="0">
+  <w:abstractNum w:abstractNumId="6" w15:restartNumberingAfterBreak="0">
     <w:nsid w:val="7A3E6A95"/>
     <w:multiLevelType w:val="hybridMultilevel"/>
     <w:tmpl w:val="42F05424"/>
@@ -8046,16 +9032,25 @@
     </w:lvl>
   </w:abstractNum>
   <w:num w:numId="1" w16cid:durableId="1279412794">
-    <w:abstractNumId w:val="2"/>
+    <w:abstractNumId w:val="5"/>
   </w:num>
   <w:num w:numId="2" w16cid:durableId="2025595476">
     <w:abstractNumId w:val="0"/>
   </w:num>
   <w:num w:numId="3" w16cid:durableId="358046377">
-    <w:abstractNumId w:val="3"/>
+    <w:abstractNumId w:val="6"/>
   </w:num>
   <w:num w:numId="4" w16cid:durableId="1384211233">
     <w:abstractNumId w:val="1"/>
+  </w:num>
+  <w:num w:numId="5" w16cid:durableId="1364015995">
+    <w:abstractNumId w:val="4"/>
+  </w:num>
+  <w:num w:numId="6" w16cid:durableId="324211105">
+    <w:abstractNumId w:val="2"/>
+  </w:num>
+  <w:num w:numId="7" w16cid:durableId="166023725">
+    <w:abstractNumId w:val="3"/>
   </w:num>
 </w:numbering>
 </file>

</xml_diff>